<commit_message>
Data and design - batch for MEEG and .mat
Batch for MEEG inputs and .mat, including allowing regression targets
and covariates at the trial level
</commit_message>
<xml_diff>
--- a/manual/NewFunctions_12_2015.docx
+++ b/manual/NewFunctions_12_2015.docx
@@ -105,13 +105,7 @@
       </w:r>
       <w:proofErr w:type="spellEnd"/>
       <w:r>
-        <w:t xml:space="preserve"> </w:t>
-      </w:r>
-      <w:r>
-        <w:t>(as before)</w:t>
-      </w:r>
-      <w:r>
-        <w:t>, MEEG</w:t>
+        <w:t xml:space="preserve"> (as before), MEEG</w:t>
       </w:r>
       <w:r>
         <w:t xml:space="preserve"> (electrophysiological data in the SPM format)</w:t>
@@ -315,12 +309,7 @@
         <w:t>For both neuroimaging and MEEG, there are 2 new columns where regression targets and covariates can be entered per trial in each category</w:t>
       </w:r>
       <w:r>
-        <w:t xml:space="preserve"> (need to have same number of elements as the number of trial onsets</w:t>
-      </w:r>
-      <w:bookmarkStart w:id="0" w:name="_GoBack"/>
-      <w:bookmarkEnd w:id="0"/>
-      <w:r>
-        <w:t>)</w:t>
+        <w:t xml:space="preserve"> (need to have same number of elements as the number of trial onsets)</w:t>
       </w:r>
       <w:r>
         <w:t>.</w:t>
@@ -1241,7 +1230,31 @@
     <w:p/>
     <w:p>
       <w:r>
-        <w:t>I was not able to add regression targets and covariates per trial in the MEEG case of the design. I added it to the ‘no design case’ (which is the same as specifying one regression target/covariate per subject or image). This allows regression when having modalities with multiple images and modalities with only one image mixed/to be combined. I also added the option for the ‘specify design’ option, with one regression target/covariate vector per trial onset. This option is also implicit in the ‘multiple conditions’ case.</w:t>
+        <w:rPr>
+          <w:b/>
+        </w:rPr>
+        <w:t>Add regression targets and covariates per ‘trial’</w:t>
+      </w:r>
+      <w:r>
+        <w:t>:</w:t>
+      </w:r>
+      <w:r>
+        <w:t xml:space="preserve"> I added it to the ‘no design case’ (which is the same as specifying one regression target/covariate per subject or image). This allows regression when having modalities with multiple images and modalities with only one image mixed/to be combined. I also added the option for the ‘specify design’ option, with one regression target/covariate vector per trial onset. This option is also implicit in the ‘multiple conditions’ case</w:t>
+      </w:r>
+      <w:r>
+        <w:t xml:space="preserve"> (</w:t>
+      </w:r>
+      <w:r>
+        <w:t>only need the corresponding variables</w:t>
+      </w:r>
+      <w:r>
+        <w:t>)</w:t>
+      </w:r>
+      <w:r>
+        <w:t>.</w:t>
+      </w:r>
+      <w:r>
+        <w:t xml:space="preserve"> For MEEG events, need to go condition by condition to specify for each (given its name) the regression targets and/or covariates to input.</w:t>
       </w:r>
     </w:p>
     <w:p>
@@ -1252,8 +1265,8 @@
         <w:lastRenderedPageBreak/>
         <w:drawing>
           <wp:inline distT="0" distB="0" distL="0" distR="0" wp14:anchorId="78D8B7F2" wp14:editId="2D15A977">
-            <wp:extent cx="2847360" cy="3307030"/>
-            <wp:effectExtent l="0" t="0" r="0" b="8255"/>
+            <wp:extent cx="2950664" cy="3427012"/>
+            <wp:effectExtent l="0" t="0" r="2540" b="2540"/>
             <wp:docPr id="15" name="Picture 15" descr="C:\Users\parvizilab\Pictures\My Screen Shots\Screen Shot 01-25-16 at 05.26 PM.PNG"/>
             <wp:cNvGraphicFramePr>
               <a:graphicFrameLocks xmlns:a="http://schemas.openxmlformats.org/drawingml/2006/main" noChangeAspect="1"/>
@@ -1283,7 +1296,7 @@
                   <pic:spPr bwMode="auto">
                     <a:xfrm>
                       <a:off x="0" y="0"/>
-                      <a:ext cx="2881049" cy="3346158"/>
+                      <a:ext cx="2999144" cy="3483318"/>
                     </a:xfrm>
                     <a:prstGeom prst="rect">
                       <a:avLst/>
@@ -1305,8 +1318,8 @@
         </w:rPr>
         <w:drawing>
           <wp:inline distT="0" distB="0" distL="0" distR="0" wp14:anchorId="7CBFE707" wp14:editId="690EF26C">
-            <wp:extent cx="2838616" cy="3296875"/>
-            <wp:effectExtent l="0" t="0" r="0" b="0"/>
+            <wp:extent cx="2950487" cy="3426808"/>
+            <wp:effectExtent l="0" t="0" r="2540" b="2540"/>
             <wp:docPr id="14" name="Picture 14" descr="C:\Users\parvizilab\Pictures\My Screen Shots\Screen Shot 01-25-16 at 05.23 PM.PNG"/>
             <wp:cNvGraphicFramePr>
               <a:graphicFrameLocks xmlns:a="http://schemas.openxmlformats.org/drawingml/2006/main" noChangeAspect="1"/>
@@ -1336,7 +1349,7 @@
                   <pic:spPr bwMode="auto">
                     <a:xfrm>
                       <a:off x="0" y="0"/>
-                      <a:ext cx="2879983" cy="3344921"/>
+                      <a:ext cx="2965085" cy="3443763"/>
                     </a:xfrm>
                     <a:prstGeom prst="rect">
                       <a:avLst/>
@@ -1360,8 +1373,92 @@
       <w:r>
         <w:t>Fig 5: Batch inputs for regressions per trial in the ‘no design’ case (only one value allowed) or in the ‘specify conditions’ case (one value per trial onset expected).</w:t>
       </w:r>
+      <w:bookmarkStart w:id="0" w:name="_GoBack"/>
+      <w:bookmarkEnd w:id="0"/>
+    </w:p>
+    <w:p>
+      <w:r>
+        <w:rPr>
+          <w:noProof/>
+        </w:rPr>
+        <w:drawing>
+          <wp:anchor distT="0" distB="0" distL="114300" distR="114300" simplePos="0" relativeHeight="251658240" behindDoc="0" locked="0" layoutInCell="1" allowOverlap="1" wp14:anchorId="402922F4" wp14:editId="052ED03F">
+            <wp:simplePos x="0" y="0"/>
+            <wp:positionH relativeFrom="margin">
+              <wp:align>left</wp:align>
+            </wp:positionH>
+            <wp:positionV relativeFrom="paragraph">
+              <wp:posOffset>281940</wp:posOffset>
+            </wp:positionV>
+            <wp:extent cx="3285490" cy="3816350"/>
+            <wp:effectExtent l="0" t="0" r="0" b="0"/>
+            <wp:wrapSquare wrapText="bothSides"/>
+            <wp:docPr id="1" name="Picture 1" descr="C:\Users\parvizilab\Pictures\My Screen Shots\Screen Shot 01-26-16 at 12.38 PM.PNG"/>
+            <wp:cNvGraphicFramePr>
+              <a:graphicFrameLocks xmlns:a="http://schemas.openxmlformats.org/drawingml/2006/main" noChangeAspect="1"/>
+            </wp:cNvGraphicFramePr>
+            <a:graphic xmlns:a="http://schemas.openxmlformats.org/drawingml/2006/main">
+              <a:graphicData uri="http://schemas.openxmlformats.org/drawingml/2006/picture">
+                <pic:pic xmlns:pic="http://schemas.openxmlformats.org/drawingml/2006/picture">
+                  <pic:nvPicPr>
+                    <pic:cNvPr id="0" name="Picture 1" descr="C:\Users\parvizilab\Pictures\My Screen Shots\Screen Shot 01-26-16 at 12.38 PM.PNG"/>
+                    <pic:cNvPicPr>
+                      <a:picLocks noChangeAspect="1" noChangeArrowheads="1"/>
+                    </pic:cNvPicPr>
+                  </pic:nvPicPr>
+                  <pic:blipFill>
+                    <a:blip r:embed="rId14">
+                      <a:extLst>
+                        <a:ext uri="{28A0092B-C50C-407E-A947-70E740481C1C}">
+                          <a14:useLocalDpi xmlns:a14="http://schemas.microsoft.com/office/drawing/2010/main" val="0"/>
+                        </a:ext>
+                      </a:extLst>
+                    </a:blip>
+                    <a:srcRect/>
+                    <a:stretch>
+                      <a:fillRect/>
+                    </a:stretch>
+                  </pic:blipFill>
+                  <pic:spPr bwMode="auto">
+                    <a:xfrm>
+                      <a:off x="0" y="0"/>
+                      <a:ext cx="3285490" cy="3816350"/>
+                    </a:xfrm>
+                    <a:prstGeom prst="rect">
+                      <a:avLst/>
+                    </a:prstGeom>
+                    <a:noFill/>
+                    <a:ln>
+                      <a:noFill/>
+                    </a:ln>
+                  </pic:spPr>
+                </pic:pic>
+              </a:graphicData>
+            </a:graphic>
+            <wp14:sizeRelH relativeFrom="margin">
+              <wp14:pctWidth>0</wp14:pctWidth>
+            </wp14:sizeRelH>
+            <wp14:sizeRelV relativeFrom="margin">
+              <wp14:pctHeight>0</wp14:pctHeight>
+            </wp14:sizeRelV>
+          </wp:anchor>
+        </w:drawing>
+      </w:r>
     </w:p>
     <w:p/>
+    <w:p/>
+    <w:p>
+      <w:r>
+        <w:t>Fig 6: Add regression targets and/or covariates to a MEEG input design. For each condition (no need to fill in all conditions though), add a ‘Condition’, then specify its name, the covariate file (as previously), and/or the regression targets (by hand or can evaluate a variable from the workspace).</w:t>
+      </w:r>
+    </w:p>
+    <w:p/>
+    <w:p/>
+    <w:p/>
+    <w:p/>
+    <w:p/>
+    <w:p/>
+    <w:p/>
     <w:p>
       <w:pPr>
         <w:rPr>
@@ -1397,25 +1494,13 @@
         <w:rPr>
           <w:color w:val="C00000"/>
         </w:rPr>
-        <w:t>Add regression targets and covariates for each condition in the batch</w:t>
-      </w:r>
-      <w:r>
-        <w:rPr>
-          <w:color w:val="C00000"/>
-        </w:rPr>
-        <w:t xml:space="preserve"> for the ‘events in file’ option</w:t>
-      </w:r>
-      <w:r>
-        <w:rPr>
-          <w:color w:val="C00000"/>
-        </w:rPr>
-        <w:t xml:space="preserve"> (need to specify a repeat branch over the conditions, unless they specify a .mat with cells, one cell per condition)</w:t>
-      </w:r>
-      <w:r>
-        <w:rPr>
-          <w:color w:val="C00000"/>
-        </w:rPr>
-        <w:t>.</w:t>
+        <w:t>Test all options</w:t>
+      </w:r>
+      <w:r>
+        <w:rPr>
+          <w:color w:val="C00000"/>
+        </w:rPr>
+        <w:t>, especially in batch</w:t>
       </w:r>
     </w:p>
     <w:p>
@@ -1433,50 +1518,14 @@
         <w:rPr>
           <w:color w:val="C00000"/>
         </w:rPr>
-        <w:t>Test all options</w:t>
-      </w:r>
-      <w:r>
-        <w:rPr>
-          <w:color w:val="C00000"/>
-        </w:rPr>
-        <w:t>, especially in batch</w:t>
-      </w:r>
-    </w:p>
-    <w:p>
-      <w:pPr>
-        <w:pStyle w:val="ListParagraph"/>
-        <w:numPr>
-          <w:ilvl w:val="0"/>
-          <w:numId w:val="1"/>
-        </w:numPr>
-        <w:rPr>
-          <w:color w:val="C00000"/>
-        </w:rPr>
-      </w:pPr>
-      <w:r>
-        <w:rPr>
-          <w:color w:val="C00000"/>
-        </w:rPr>
         <w:t>Allow for ‘specify design’ when loading a .mat</w:t>
       </w:r>
-    </w:p>
-    <w:p>
-      <w:pPr>
-        <w:pStyle w:val="ListParagraph"/>
-      </w:pPr>
-    </w:p>
-    <w:p>
       <w:r>
         <w:br w:type="page"/>
       </w:r>
     </w:p>
     <w:p>
       <w:pPr>
-        <w:pStyle w:val="ListParagraph"/>
-      </w:pPr>
-    </w:p>
-    <w:p>
-      <w:pPr>
         <w:rPr>
           <w:b/>
         </w:rPr>
@@ -1485,6 +1534,7 @@
         <w:rPr>
           <w:b/>
         </w:rPr>
+        <w:lastRenderedPageBreak/>
         <w:t>Feature sets</w:t>
       </w:r>
     </w:p>
@@ -1520,7 +1570,7 @@
                     </pic:cNvPicPr>
                   </pic:nvPicPr>
                   <pic:blipFill>
-                    <a:blip r:embed="rId14">
+                    <a:blip r:embed="rId15">
                       <a:extLst>
                         <a:ext uri="{28A0092B-C50C-407E-A947-70E740481C1C}">
                           <a14:useLocalDpi xmlns:a14="http://schemas.microsoft.com/office/drawing/2010/main" val="0"/>
@@ -1604,7 +1654,7 @@
                     </pic:cNvPicPr>
                   </pic:nvPicPr>
                   <pic:blipFill>
-                    <a:blip r:embed="rId15">
+                    <a:blip r:embed="rId16">
                       <a:extLst>
                         <a:ext uri="{28A0092B-C50C-407E-A947-70E740481C1C}">
                           <a14:useLocalDpi xmlns:a14="http://schemas.microsoft.com/office/drawing/2010/main" val="0"/>
@@ -1653,6 +1703,7 @@
     <w:p/>
     <w:p>
       <w:r>
+        <w:lastRenderedPageBreak/>
         <w:t xml:space="preserve">The user can play on the channels, selecting them all or only some. Channels marked as bad in the MEEG object are displayed in red. It is possible to average the signal over the selected channels, or to build one kernel per channel. Similarly, the user can select a sub time window by specifying which </w:t>
       </w:r>
       <w:proofErr w:type="spellStart"/>
@@ -2087,79 +2138,79 @@
         <w:rPr>
           <w:rFonts w:ascii="Cambria" w:hAnsi="Cambria"/>
         </w:rPr>
+        <w:t>PRT.fs</w:t>
+      </w:r>
+      <w:proofErr w:type="spellEnd"/>
+      <w:r>
+        <w:rPr>
+          <w:rFonts w:ascii="Cambria" w:hAnsi="Cambria"/>
+        </w:rPr>
+        <w:t>(</w:t>
+      </w:r>
+      <w:proofErr w:type="gramEnd"/>
+      <w:r>
+        <w:rPr>
+          <w:rFonts w:ascii="Cambria" w:hAnsi="Cambria"/>
+        </w:rPr>
+        <w:t>1).modality</w:t>
+      </w:r>
+    </w:p>
+    <w:p>
+      <w:pPr>
+        <w:pStyle w:val="NoSpacing"/>
+        <w:numPr>
+          <w:ilvl w:val="0"/>
+          <w:numId w:val="2"/>
+        </w:numPr>
+        <w:rPr>
+          <w:rFonts w:ascii="Cambria" w:hAnsi="Cambria"/>
+        </w:rPr>
+      </w:pPr>
+      <w:proofErr w:type="spellStart"/>
+      <w:r>
+        <w:rPr>
+          <w:rFonts w:ascii="Cambria" w:hAnsi="Cambria"/>
+        </w:rPr>
+        <w:t>mod_name</w:t>
+      </w:r>
+      <w:proofErr w:type="spellEnd"/>
+      <w:r>
+        <w:rPr>
+          <w:rFonts w:ascii="Cambria" w:hAnsi="Cambria"/>
+        </w:rPr>
+        <w:t>: {'</w:t>
+      </w:r>
+      <w:proofErr w:type="spellStart"/>
+      <w:r>
+        <w:rPr>
+          <w:rFonts w:ascii="Cambria" w:hAnsi="Cambria"/>
+        </w:rPr>
+        <w:t>ECoG</w:t>
+      </w:r>
+      <w:proofErr w:type="spellEnd"/>
+      <w:r>
+        <w:rPr>
+          <w:rFonts w:ascii="Cambria" w:hAnsi="Cambria"/>
+        </w:rPr>
+        <w:t>'}</w:t>
+      </w:r>
+    </w:p>
+    <w:p>
+      <w:pPr>
+        <w:pStyle w:val="NoSpacing"/>
+        <w:numPr>
+          <w:ilvl w:val="0"/>
+          <w:numId w:val="2"/>
+        </w:numPr>
+        <w:rPr>
+          <w:rFonts w:ascii="Cambria" w:hAnsi="Cambria"/>
+        </w:rPr>
+      </w:pPr>
+      <w:r>
+        <w:rPr>
+          <w:rFonts w:ascii="Cambria" w:hAnsi="Cambria"/>
+        </w:rPr>
         <w:lastRenderedPageBreak/>
-        <w:t>PRT.fs</w:t>
-      </w:r>
-      <w:proofErr w:type="spellEnd"/>
-      <w:r>
-        <w:rPr>
-          <w:rFonts w:ascii="Cambria" w:hAnsi="Cambria"/>
-        </w:rPr>
-        <w:t>(</w:t>
-      </w:r>
-      <w:proofErr w:type="gramEnd"/>
-      <w:r>
-        <w:rPr>
-          <w:rFonts w:ascii="Cambria" w:hAnsi="Cambria"/>
-        </w:rPr>
-        <w:t>1).modality</w:t>
-      </w:r>
-    </w:p>
-    <w:p>
-      <w:pPr>
-        <w:pStyle w:val="NoSpacing"/>
-        <w:numPr>
-          <w:ilvl w:val="0"/>
-          <w:numId w:val="2"/>
-        </w:numPr>
-        <w:rPr>
-          <w:rFonts w:ascii="Cambria" w:hAnsi="Cambria"/>
-        </w:rPr>
-      </w:pPr>
-      <w:proofErr w:type="spellStart"/>
-      <w:r>
-        <w:rPr>
-          <w:rFonts w:ascii="Cambria" w:hAnsi="Cambria"/>
-        </w:rPr>
-        <w:t>mod_name</w:t>
-      </w:r>
-      <w:proofErr w:type="spellEnd"/>
-      <w:r>
-        <w:rPr>
-          <w:rFonts w:ascii="Cambria" w:hAnsi="Cambria"/>
-        </w:rPr>
-        <w:t>: {'</w:t>
-      </w:r>
-      <w:proofErr w:type="spellStart"/>
-      <w:r>
-        <w:rPr>
-          <w:rFonts w:ascii="Cambria" w:hAnsi="Cambria"/>
-        </w:rPr>
-        <w:t>ECoG</w:t>
-      </w:r>
-      <w:proofErr w:type="spellEnd"/>
-      <w:r>
-        <w:rPr>
-          <w:rFonts w:ascii="Cambria" w:hAnsi="Cambria"/>
-        </w:rPr>
-        <w:t>'}</w:t>
-      </w:r>
-    </w:p>
-    <w:p>
-      <w:pPr>
-        <w:pStyle w:val="NoSpacing"/>
-        <w:numPr>
-          <w:ilvl w:val="0"/>
-          <w:numId w:val="2"/>
-        </w:numPr>
-        <w:rPr>
-          <w:rFonts w:ascii="Cambria" w:hAnsi="Cambria"/>
-        </w:rPr>
-      </w:pPr>
-      <w:r>
-        <w:rPr>
-          <w:rFonts w:ascii="Cambria" w:hAnsi="Cambria"/>
-        </w:rPr>
         <w:t>aver: [0 0 0]</w:t>
       </w:r>
     </w:p>
@@ -2738,7 +2789,7 @@
                     </pic:cNvPicPr>
                   </pic:nvPicPr>
                   <pic:blipFill>
-                    <a:blip r:embed="rId16">
+                    <a:blip r:embed="rId17">
                       <a:extLst>
                         <a:ext uri="{28A0092B-C50C-407E-A947-70E740481C1C}">
                           <a14:useLocalDpi xmlns:a14="http://schemas.microsoft.com/office/drawing/2010/main" val="0"/>
@@ -3581,7 +3632,7 @@
                     </pic:cNvPicPr>
                   </pic:nvPicPr>
                   <pic:blipFill>
-                    <a:blip r:embed="rId17">
+                    <a:blip r:embed="rId18">
                       <a:extLst>
                         <a:ext uri="{28A0092B-C50C-407E-A947-70E740481C1C}">
                           <a14:useLocalDpi xmlns:a14="http://schemas.microsoft.com/office/drawing/2010/main" val="0"/>

</xml_diff>

<commit_message>
Summary of new 'Copy model' batch block
</commit_message>
<xml_diff>
--- a/manual/NewFunctions_12_2015.docx
+++ b/manual/NewFunctions_12_2015.docx
@@ -1373,8 +1373,6 @@
       <w:r>
         <w:t>Fig 5: Batch inputs for regressions per trial in the ‘no design’ case (only one value allowed) or in the ‘specify conditions’ case (one value per trial onset expected).</w:t>
       </w:r>
-      <w:bookmarkStart w:id="0" w:name="_GoBack"/>
-      <w:bookmarkEnd w:id="0"/>
     </w:p>
     <w:p>
       <w:r>
@@ -3694,7 +3692,128 @@
         <w:t xml:space="preserve">One main change in the code is how the selection of the best (set of) parameters is performed when performing a grid search. This is completely transparent for the user but instead of selecting the median of the best values, the code selects now the center of the largest stable area. </w:t>
       </w:r>
     </w:p>
+    <w:p>
+      <w:r>
+        <w:rPr>
+          <w:b/>
+        </w:rPr>
+        <w:lastRenderedPageBreak/>
+        <w:t>Added: new module to ‘Copy model’</w:t>
+      </w:r>
+      <w:r>
+        <w:t xml:space="preserve">. </w:t>
+      </w:r>
+    </w:p>
+    <w:p>
+      <w:r>
+        <w:t>It allows to select a previously specified model (no need for it to be run) and change a few options, namely: feature sets, machine (with hyper-parameters and nested CV) and/or kernel operations. Therefore the machine type (classification/regression), the selected samples and the outer CV will be copied into this new model.</w:t>
+      </w:r>
+    </w:p>
+    <w:p>
+      <w:r>
+        <w:t>Here is what the batch looks like:</w:t>
+      </w:r>
+    </w:p>
+    <w:p>
+      <w:r>
+        <w:rPr>
+          <w:noProof/>
+        </w:rPr>
+        <w:drawing>
+          <wp:anchor distT="0" distB="0" distL="114300" distR="114300" simplePos="0" relativeHeight="251659264" behindDoc="0" locked="0" layoutInCell="1" allowOverlap="1">
+            <wp:simplePos x="0" y="0"/>
+            <wp:positionH relativeFrom="column">
+              <wp:posOffset>0</wp:posOffset>
+            </wp:positionH>
+            <wp:positionV relativeFrom="paragraph">
+              <wp:posOffset>-1684</wp:posOffset>
+            </wp:positionV>
+            <wp:extent cx="4118174" cy="3888188"/>
+            <wp:effectExtent l="0" t="0" r="0" b="0"/>
+            <wp:wrapSquare wrapText="bothSides"/>
+            <wp:docPr id="2" name="Picture 2" descr="C:\Users\parvizilab\Pictures\My Screen Shots\Screen Shot 01-28-16 at 02.35 PM.PNG"/>
+            <wp:cNvGraphicFramePr>
+              <a:graphicFrameLocks xmlns:a="http://schemas.openxmlformats.org/drawingml/2006/main" noChangeAspect="1"/>
+            </wp:cNvGraphicFramePr>
+            <a:graphic xmlns:a="http://schemas.openxmlformats.org/drawingml/2006/main">
+              <a:graphicData uri="http://schemas.openxmlformats.org/drawingml/2006/picture">
+                <pic:pic xmlns:pic="http://schemas.openxmlformats.org/drawingml/2006/picture">
+                  <pic:nvPicPr>
+                    <pic:cNvPr id="0" name="Picture 1" descr="C:\Users\parvizilab\Pictures\My Screen Shots\Screen Shot 01-28-16 at 02.35 PM.PNG"/>
+                    <pic:cNvPicPr>
+                      <a:picLocks noChangeAspect="1" noChangeArrowheads="1"/>
+                    </pic:cNvPicPr>
+                  </pic:nvPicPr>
+                  <pic:blipFill>
+                    <a:blip r:embed="rId19">
+                      <a:extLst>
+                        <a:ext uri="{28A0092B-C50C-407E-A947-70E740481C1C}">
+                          <a14:useLocalDpi xmlns:a14="http://schemas.microsoft.com/office/drawing/2010/main" val="0"/>
+                        </a:ext>
+                      </a:extLst>
+                    </a:blip>
+                    <a:srcRect/>
+                    <a:stretch>
+                      <a:fillRect/>
+                    </a:stretch>
+                  </pic:blipFill>
+                  <pic:spPr bwMode="auto">
+                    <a:xfrm>
+                      <a:off x="0" y="0"/>
+                      <a:ext cx="4118174" cy="3888188"/>
+                    </a:xfrm>
+                    <a:prstGeom prst="rect">
+                      <a:avLst/>
+                    </a:prstGeom>
+                    <a:noFill/>
+                    <a:ln>
+                      <a:noFill/>
+                    </a:ln>
+                  </pic:spPr>
+                </pic:pic>
+              </a:graphicData>
+            </a:graphic>
+          </wp:anchor>
+        </w:drawing>
+      </w:r>
+    </w:p>
+    <w:p>
+      <w:r>
+        <w:t xml:space="preserve">Fig 3: ‘Copy model’ batch. You enter the name of the </w:t>
+      </w:r>
+      <w:proofErr w:type="spellStart"/>
+      <w:r>
+        <w:t>PRT.mat</w:t>
+      </w:r>
+      <w:proofErr w:type="spellEnd"/>
+      <w:r>
+        <w:t>, the name of the new model and the name of the model to copy. Then choose at least a ‘field’ to modify among ‘Feature set’ (one or multiple can be selected), ‘</w:t>
+      </w:r>
+      <w:r>
+        <w:t>Model type</w:t>
+      </w:r>
+      <w:r>
+        <w:t>’ (</w:t>
+      </w:r>
+      <w:r>
+        <w:t>with the hyper-parameters and the nested CV to re-specify</w:t>
+      </w:r>
+      <w:r>
+        <w:t>)</w:t>
+      </w:r>
+      <w:r>
+        <w:t xml:space="preserve"> and ‘Data operations’ (mean center by default, but others can be added). Those fields can be repeated to include changes in any of the 3 categories.</w:t>
+      </w:r>
+    </w:p>
     <w:p/>
+    <w:p/>
+    <w:p>
+      <w:bookmarkStart w:id="0" w:name="_GoBack"/>
+      <w:bookmarkEnd w:id="0"/>
+      <w:r>
+        <w:t xml:space="preserve"> </w:t>
+      </w:r>
+    </w:p>
     <w:p>
       <w:pPr>
         <w:rPr>
@@ -3766,6 +3885,24 @@
     </w:p>
     <w:p>
       <w:pPr>
+        <w:pStyle w:val="ListParagraph"/>
+        <w:numPr>
+          <w:ilvl w:val="0"/>
+          <w:numId w:val="7"/>
+        </w:numPr>
+        <w:rPr>
+          <w:color w:val="C00000"/>
+        </w:rPr>
+      </w:pPr>
+      <w:r>
+        <w:rPr>
+          <w:color w:val="C00000"/>
+        </w:rPr>
+        <w:t>Implement ‘copy model’ option</w:t>
+      </w:r>
+    </w:p>
+    <w:p>
+      <w:pPr>
         <w:rPr>
           <w:color w:val="C00000"/>
         </w:rPr>
@@ -3775,19 +3912,6 @@
           <w:color w:val="C00000"/>
         </w:rPr>
         <w:t>Both:</w:t>
-      </w:r>
-    </w:p>
-    <w:p>
-      <w:pPr>
-        <w:rPr>
-          <w:color w:val="C00000"/>
-        </w:rPr>
-      </w:pPr>
-      <w:r>
-        <w:rPr>
-          <w:color w:val="C00000"/>
-        </w:rPr>
-        <w:t>Have an option to load another model and change a few parameters. This is especially useful (and the only way to do) when comparing 2 models/feature sets with subsampling involved. Fields that could be modified easily: model name, feature set, machine, hyper-parameter (+ cross-validation? But would rather not).</w:t>
       </w:r>
     </w:p>
     <w:p>

</xml_diff>

<commit_message>
new function in batch
model and copy model
</commit_message>
<xml_diff>
--- a/manual/NewFunctions_12_2015.docx
+++ b/manual/NewFunctions_12_2015.docx
@@ -3677,10 +3677,70 @@
       </w:r>
     </w:p>
     <w:p>
-      <w:r>
+      <w:pPr>
         <w:rPr>
           <w:b/>
         </w:rPr>
+      </w:pPr>
+      <w:r>
+        <w:rPr>
+          <w:b/>
+        </w:rPr>
+        <w:t>Modified in the batch:</w:t>
+      </w:r>
+    </w:p>
+    <w:p>
+      <w:pPr>
+        <w:pStyle w:val="ListParagraph"/>
+        <w:numPr>
+          <w:ilvl w:val="0"/>
+          <w:numId w:val="7"/>
+        </w:numPr>
+      </w:pPr>
+      <w:r>
+        <w:t>Custom machine: allows for nested cross-validation and optimization of hyper-parameters</w:t>
+      </w:r>
+    </w:p>
+    <w:p>
+      <w:pPr>
+        <w:pStyle w:val="ListParagraph"/>
+        <w:numPr>
+          <w:ilvl w:val="0"/>
+          <w:numId w:val="7"/>
+        </w:numPr>
+      </w:pPr>
+      <w:r>
+        <w:t>No ‘custom’ cross-validation in nested CV option</w:t>
+      </w:r>
+    </w:p>
+    <w:p>
+      <w:pPr>
+        <w:pStyle w:val="ListParagraph"/>
+        <w:numPr>
+          <w:ilvl w:val="0"/>
+          <w:numId w:val="7"/>
+        </w:numPr>
+      </w:pPr>
+      <w:r>
+        <w:t>‘Leave-one-block-per-class-out’ and k-fold equivalent added in the nested CV option</w:t>
+      </w:r>
+    </w:p>
+    <w:p>
+      <w:r>
+        <w:lastRenderedPageBreak/>
+        <w:t>Note: these options are also available in the ‘Copy model’ block.</w:t>
+      </w:r>
+    </w:p>
+    <w:p>
+      <w:pPr>
+        <w:pStyle w:val="ListParagraph"/>
+      </w:pPr>
+    </w:p>
+    <w:p>
+      <w:r>
+        <w:rPr>
+          <w:b/>
+        </w:rPr>
         <w:t>Code</w:t>
       </w:r>
       <w:r>
@@ -3697,7 +3757,6 @@
         <w:rPr>
           <w:b/>
         </w:rPr>
-        <w:lastRenderedPageBreak/>
         <w:t>Added: new module to ‘Copy model’</w:t>
       </w:r>
       <w:r>
@@ -3808,98 +3867,135 @@
     <w:p/>
     <w:p/>
     <w:p>
+      <w:r>
+        <w:t xml:space="preserve"> </w:t>
+      </w:r>
+    </w:p>
+    <w:p>
+      <w:pPr>
+        <w:rPr>
+          <w:color w:val="C00000"/>
+        </w:rPr>
+      </w:pPr>
+      <w:r>
+        <w:rPr>
+          <w:b/>
+          <w:color w:val="C00000"/>
+        </w:rPr>
+        <w:t>To do</w:t>
+      </w:r>
+      <w:r>
+        <w:rPr>
+          <w:color w:val="C00000"/>
+        </w:rPr>
+        <w:t>:</w:t>
+      </w:r>
+    </w:p>
+    <w:p>
+      <w:pPr>
+        <w:rPr>
+          <w:color w:val="C00000"/>
+        </w:rPr>
+      </w:pPr>
+      <w:r>
+        <w:rPr>
+          <w:color w:val="C00000"/>
+        </w:rPr>
+        <w:t>GUI:</w:t>
+      </w:r>
+    </w:p>
+    <w:p>
+      <w:pPr>
+        <w:pStyle w:val="ListParagraph"/>
+        <w:numPr>
+          <w:ilvl w:val="0"/>
+          <w:numId w:val="7"/>
+        </w:numPr>
+        <w:rPr>
+          <w:color w:val="C00000"/>
+        </w:rPr>
+      </w:pPr>
+      <w:r>
+        <w:rPr>
+          <w:color w:val="C00000"/>
+        </w:rPr>
+        <w:t>Implement flag for independent models when multiple kernels</w:t>
+      </w:r>
+    </w:p>
+    <w:p>
+      <w:pPr>
+        <w:pStyle w:val="ListParagraph"/>
+        <w:numPr>
+          <w:ilvl w:val="0"/>
+          <w:numId w:val="7"/>
+        </w:numPr>
+        <w:rPr>
+          <w:color w:val="C00000"/>
+        </w:rPr>
+      </w:pPr>
+      <w:r>
+        <w:rPr>
+          <w:color w:val="C00000"/>
+        </w:rPr>
+        <w:t xml:space="preserve">Subsampling option not present yet </w:t>
+      </w:r>
+    </w:p>
+    <w:p>
+      <w:pPr>
+        <w:pStyle w:val="ListParagraph"/>
+        <w:numPr>
+          <w:ilvl w:val="0"/>
+          <w:numId w:val="7"/>
+        </w:numPr>
+        <w:rPr>
+          <w:color w:val="C00000"/>
+        </w:rPr>
+      </w:pPr>
+      <w:r>
+        <w:rPr>
+          <w:color w:val="C00000"/>
+        </w:rPr>
+        <w:lastRenderedPageBreak/>
+        <w:t>Implement ‘copy model’ option</w:t>
+      </w:r>
+    </w:p>
+    <w:p>
+      <w:pPr>
+        <w:rPr>
+          <w:color w:val="C00000"/>
+        </w:rPr>
+      </w:pPr>
+      <w:r>
+        <w:rPr>
+          <w:color w:val="C00000"/>
+        </w:rPr>
+        <w:t>Batch:</w:t>
+      </w:r>
+    </w:p>
+    <w:p>
+      <w:pPr>
+        <w:pStyle w:val="ListParagraph"/>
+        <w:numPr>
+          <w:ilvl w:val="0"/>
+          <w:numId w:val="7"/>
+        </w:numPr>
+        <w:rPr>
+          <w:color w:val="C00000"/>
+        </w:rPr>
+      </w:pPr>
+      <w:r>
+        <w:rPr>
+          <w:color w:val="C00000"/>
+        </w:rPr>
+        <w:t>Loading ‘copy model’ results in a ‘specify model’. How can that be corrected?</w:t>
+      </w:r>
+    </w:p>
+    <w:p>
+      <w:pPr>
+        <w:pStyle w:val="ListParagraph"/>
+      </w:pPr>
       <w:bookmarkStart w:id="0" w:name="_GoBack"/>
       <w:bookmarkEnd w:id="0"/>
-      <w:r>
-        <w:t xml:space="preserve"> </w:t>
-      </w:r>
-    </w:p>
-    <w:p>
-      <w:pPr>
-        <w:rPr>
-          <w:color w:val="C00000"/>
-        </w:rPr>
-      </w:pPr>
-      <w:r>
-        <w:rPr>
-          <w:b/>
-          <w:color w:val="C00000"/>
-        </w:rPr>
-        <w:t>To do</w:t>
-      </w:r>
-      <w:r>
-        <w:rPr>
-          <w:color w:val="C00000"/>
-        </w:rPr>
-        <w:t>:</w:t>
-      </w:r>
-    </w:p>
-    <w:p>
-      <w:pPr>
-        <w:rPr>
-          <w:color w:val="C00000"/>
-        </w:rPr>
-      </w:pPr>
-      <w:r>
-        <w:rPr>
-          <w:color w:val="C00000"/>
-        </w:rPr>
-        <w:t>GUI:</w:t>
-      </w:r>
-    </w:p>
-    <w:p>
-      <w:pPr>
-        <w:pStyle w:val="ListParagraph"/>
-        <w:numPr>
-          <w:ilvl w:val="0"/>
-          <w:numId w:val="7"/>
-        </w:numPr>
-        <w:rPr>
-          <w:color w:val="C00000"/>
-        </w:rPr>
-      </w:pPr>
-      <w:r>
-        <w:rPr>
-          <w:color w:val="C00000"/>
-        </w:rPr>
-        <w:t>Implement flag for independent models when multiple kernels</w:t>
-      </w:r>
-    </w:p>
-    <w:p>
-      <w:pPr>
-        <w:pStyle w:val="ListParagraph"/>
-        <w:numPr>
-          <w:ilvl w:val="0"/>
-          <w:numId w:val="7"/>
-        </w:numPr>
-        <w:rPr>
-          <w:color w:val="C00000"/>
-        </w:rPr>
-      </w:pPr>
-      <w:r>
-        <w:rPr>
-          <w:color w:val="C00000"/>
-        </w:rPr>
-        <w:t xml:space="preserve">Subsampling option not present yet </w:t>
-      </w:r>
-    </w:p>
-    <w:p>
-      <w:pPr>
-        <w:pStyle w:val="ListParagraph"/>
-        <w:numPr>
-          <w:ilvl w:val="0"/>
-          <w:numId w:val="7"/>
-        </w:numPr>
-        <w:rPr>
-          <w:color w:val="C00000"/>
-        </w:rPr>
-      </w:pPr>
-      <w:r>
-        <w:rPr>
-          <w:color w:val="C00000"/>
-        </w:rPr>
-        <w:t>Implement ‘copy model’ option</w:t>
-      </w:r>
     </w:p>
     <w:p>
       <w:pPr>

</xml_diff>

<commit_message>
Updated the NewFunctions_12_2015.docx for the .mat data format
</commit_message>
<xml_diff>
--- a/manual/NewFunctions_12_2015.docx
+++ b/manual/NewFunctions_12_2015.docx
@@ -1,6 +1,6 @@
 
 <file path=word/document.xml><?xml version="1.0" encoding="utf-8"?>
-<w:document xmlns:wpc="http://schemas.microsoft.com/office/word/2010/wordprocessingCanvas" xmlns:mc="http://schemas.openxmlformats.org/markup-compatibility/2006" xmlns:o="urn:schemas-microsoft-com:office:office" xmlns:r="http://schemas.openxmlformats.org/officeDocument/2006/relationships" xmlns:m="http://schemas.openxmlformats.org/officeDocument/2006/math" xmlns:v="urn:schemas-microsoft-com:vml" xmlns:wp14="http://schemas.microsoft.com/office/word/2010/wordprocessingDrawing" xmlns:wp="http://schemas.openxmlformats.org/drawingml/2006/wordprocessingDrawing" xmlns:w10="urn:schemas-microsoft-com:office:word" xmlns:w="http://schemas.openxmlformats.org/wordprocessingml/2006/main" xmlns:w14="http://schemas.microsoft.com/office/word/2010/wordml" xmlns:w15="http://schemas.microsoft.com/office/word/2012/wordml" xmlns:wpg="http://schemas.microsoft.com/office/word/2010/wordprocessingGroup" xmlns:wpi="http://schemas.microsoft.com/office/word/2010/wordprocessingInk" xmlns:wne="http://schemas.microsoft.com/office/word/2006/wordml" xmlns:wps="http://schemas.microsoft.com/office/word/2010/wordprocessingShape" mc:Ignorable="w14 w15 wp14">
+<w:document xmlns:wpc="http://schemas.microsoft.com/office/word/2010/wordprocessingCanvas" xmlns:mo="http://schemas.microsoft.com/office/mac/office/2008/main" xmlns:mc="http://schemas.openxmlformats.org/markup-compatibility/2006" xmlns:mv="urn:schemas-microsoft-com:mac:vml" xmlns:o="urn:schemas-microsoft-com:office:office" xmlns:r="http://schemas.openxmlformats.org/officeDocument/2006/relationships" xmlns:m="http://schemas.openxmlformats.org/officeDocument/2006/math" xmlns:v="urn:schemas-microsoft-com:vml" xmlns:wp14="http://schemas.microsoft.com/office/word/2010/wordprocessingDrawing" xmlns:wp="http://schemas.openxmlformats.org/drawingml/2006/wordprocessingDrawing" xmlns:w10="urn:schemas-microsoft-com:office:word" xmlns:w="http://schemas.openxmlformats.org/wordprocessingml/2006/main" xmlns:w14="http://schemas.microsoft.com/office/word/2010/wordml" xmlns:wpg="http://schemas.microsoft.com/office/word/2010/wordprocessingGroup" xmlns:wpi="http://schemas.microsoft.com/office/word/2010/wordprocessingInk" xmlns:wne="http://schemas.microsoft.com/office/word/2006/wordml" xmlns:wps="http://schemas.microsoft.com/office/word/2010/wordprocessingShape" mc:Ignorable="w14 wp14">
   <w:body>
     <w:p>
       <w:pPr>
@@ -11,80 +11,64 @@
           <w:u w:val="single"/>
         </w:rPr>
       </w:pPr>
-      <w:proofErr w:type="gramStart"/>
       <w:r>
         <w:rPr>
           <w:b/>
           <w:sz w:val="32"/>
           <w:u w:val="single"/>
         </w:rPr>
-        <w:t>What’s  new</w:t>
-      </w:r>
-      <w:proofErr w:type="gramEnd"/>
-      <w:r>
+        <w:t>What’s  new in PRoNTo v3.0 and to do</w:t>
+      </w:r>
+    </w:p>
+    <w:p/>
+    <w:p>
+      <w:pPr>
         <w:rPr>
           <w:b/>
-          <w:sz w:val="32"/>
-          <w:u w:val="single"/>
-        </w:rPr>
-        <w:t xml:space="preserve"> in </w:t>
-      </w:r>
-      <w:proofErr w:type="spellStart"/>
+        </w:rPr>
+      </w:pPr>
       <w:r>
         <w:rPr>
           <w:b/>
-          <w:sz w:val="32"/>
-          <w:u w:val="single"/>
-        </w:rPr>
-        <w:t>PRoNTo</w:t>
-      </w:r>
-      <w:proofErr w:type="spellEnd"/>
+        </w:rPr>
+        <w:t>Data and design</w:t>
+      </w:r>
+    </w:p>
+    <w:p/>
+    <w:p>
       <w:r>
         <w:rPr>
           <w:b/>
-          <w:sz w:val="32"/>
-          <w:u w:val="single"/>
-        </w:rPr>
-        <w:t xml:space="preserve"> v3.0 and to do</w:t>
-      </w:r>
-    </w:p>
-    <w:p/>
-    <w:p>
-      <w:pPr>
+        </w:rPr>
+        <w:t>Main interface</w:t>
+      </w:r>
+      <w:r>
+        <w:t>: Masks</w:t>
+      </w:r>
+      <w:r>
+        <w:t xml:space="preserve"> are set to ‘none’ for MEEG </w:t>
+      </w:r>
+      <w:r>
+        <w:rPr>
+          <w:color w:val="FF0000"/>
+        </w:rPr>
+        <w:t>and .mat</w:t>
+      </w:r>
+      <w:r>
+        <w:rPr>
+          <w:color w:val="FF0000"/>
+        </w:rPr>
+        <w:t xml:space="preserve"> types</w:t>
+      </w:r>
+      <w:r>
+        <w:t xml:space="preserve"> (see below).</w:t>
+      </w:r>
+    </w:p>
+    <w:p>
+      <w:r>
         <w:rPr>
           <w:b/>
         </w:rPr>
-      </w:pPr>
-      <w:r>
-        <w:rPr>
-          <w:b/>
-        </w:rPr>
-        <w:t>Data and design</w:t>
-      </w:r>
-    </w:p>
-    <w:p/>
-    <w:p>
-      <w:r>
-        <w:rPr>
-          <w:b/>
-        </w:rPr>
-        <w:t>Main interface</w:t>
-      </w:r>
-      <w:r>
-        <w:t>: Masks</w:t>
-      </w:r>
-      <w:r>
-        <w:t xml:space="preserve"> are set to ‘none’ for MEEG and .mat</w:t>
-      </w:r>
-      <w:r>
-        <w:t xml:space="preserve"> types (see below).</w:t>
-      </w:r>
-    </w:p>
-    <w:p>
-      <w:r>
-        <w:rPr>
-          <w:b/>
-        </w:rPr>
         <w:t>Modality</w:t>
       </w:r>
       <w:r>
@@ -97,21 +81,31 @@
         <w:t>’ offers</w:t>
       </w:r>
       <w:r>
-        <w:t xml:space="preserve"> three input formats to choose from: </w:t>
-      </w:r>
-      <w:proofErr w:type="spellStart"/>
-      <w:r>
-        <w:t>nifti</w:t>
-      </w:r>
-      <w:proofErr w:type="spellEnd"/>
-      <w:r>
-        <w:t xml:space="preserve"> (as before), MEEG</w:t>
+        <w:t xml:space="preserve"> three input formats to choose from: nifti (as before), MEEG</w:t>
       </w:r>
       <w:r>
         <w:t xml:space="preserve"> (electrophysiological data in the SPM format)</w:t>
       </w:r>
       <w:r>
-        <w:t xml:space="preserve"> or .mat (any type of matrix)</w:t>
+        <w:t xml:space="preserve"> or .mat </w:t>
+      </w:r>
+      <w:r>
+        <w:rPr>
+          <w:color w:val="FF0000"/>
+        </w:rPr>
+        <w:t>(any type of matrix</w:t>
+      </w:r>
+      <w:r>
+        <w:rPr>
+          <w:color w:val="FF0000"/>
+        </w:rPr>
+        <w:t xml:space="preserve"> or vector as long as it’s in .mat format</w:t>
+      </w:r>
+      <w:r>
+        <w:rPr>
+          <w:color w:val="FF0000"/>
+        </w:rPr>
+        <w:t>)</w:t>
       </w:r>
       <w:r>
         <w:t>.</w:t>
@@ -123,24 +117,14 @@
         <w:t>format</w:t>
       </w:r>
       <w:r>
-        <w:t xml:space="preserve"> selected. This is because the events should already be saved in the MEEG data (input: </w:t>
-      </w:r>
-      <w:proofErr w:type="spellStart"/>
-      <w:r>
-        <w:t>epoched</w:t>
-      </w:r>
-      <w:proofErr w:type="spellEnd"/>
-      <w:r>
-        <w:t xml:space="preserve"> signal). For </w:t>
-      </w:r>
-      <w:proofErr w:type="spellStart"/>
+        <w:t xml:space="preserve"> selected. This is because the events should already be saved in the MEEG data (input: epoched signal). For </w:t>
+      </w:r>
       <w:r>
         <w:t>nift</w:t>
       </w:r>
       <w:r>
         <w:t>i</w:t>
       </w:r>
-      <w:proofErr w:type="spellEnd"/>
       <w:r>
         <w:t xml:space="preserve"> inputs</w:t>
       </w:r>
@@ -148,22 +132,59 @@
         <w:t xml:space="preserve">, the options are the same as before. </w:t>
       </w:r>
       <w:r>
-        <w:t xml:space="preserve">For .mat, the option is ‘no design’. However, in the future, the ‘specify design’ option could be allowed. </w:t>
+        <w:rPr>
+          <w:color w:val="FF0000"/>
+        </w:rPr>
+        <w:t xml:space="preserve">For .mat, the </w:t>
+      </w:r>
+      <w:r>
+        <w:rPr>
+          <w:color w:val="FF0000"/>
+        </w:rPr>
+        <w:t xml:space="preserve">only </w:t>
+      </w:r>
+      <w:r>
+        <w:rPr>
+          <w:color w:val="FF0000"/>
+        </w:rPr>
+        <w:t>option</w:t>
+      </w:r>
+      <w:r>
+        <w:rPr>
+          <w:color w:val="FF0000"/>
+        </w:rPr>
+        <w:t xml:space="preserve"> available</w:t>
+      </w:r>
+      <w:r>
+        <w:rPr>
+          <w:color w:val="FF0000"/>
+        </w:rPr>
+        <w:t xml:space="preserve"> is ‘no design’.</w:t>
+      </w:r>
+      <w:r>
+        <w:t xml:space="preserve"> However, in the future, the ‘specify design’ option could be allowed. </w:t>
       </w:r>
       <w:r>
         <w:t>For MEEG, it will load automatically the ‘Events in file’. Clicking on ‘Events in file’ leads to the ‘specify design’ window.</w:t>
       </w:r>
     </w:p>
-    <w:p/>
     <w:p>
       <w:r>
         <w:rPr>
           <w:noProof/>
         </w:rPr>
         <w:drawing>
-          <wp:inline distT="0" distB="0" distL="0" distR="0">
-            <wp:extent cx="2881871" cy="2663687"/>
-            <wp:effectExtent l="0" t="0" r="0" b="3810"/>
+          <wp:anchor distT="0" distB="0" distL="114300" distR="114300" simplePos="0" relativeHeight="251660288" behindDoc="0" locked="0" layoutInCell="1" allowOverlap="1" wp14:anchorId="3426F4A2" wp14:editId="41983736">
+            <wp:simplePos x="0" y="0"/>
+            <wp:positionH relativeFrom="column">
+              <wp:posOffset>0</wp:posOffset>
+            </wp:positionH>
+            <wp:positionV relativeFrom="paragraph">
+              <wp:posOffset>229235</wp:posOffset>
+            </wp:positionV>
+            <wp:extent cx="2484120" cy="2296160"/>
+            <wp:effectExtent l="0" t="0" r="5080" b="0"/>
+            <wp:wrapSquare wrapText="bothSides"/>
             <wp:docPr id="8" name="Picture 8" descr="C:\Users\parvizilab\Pictures\My Screen Shots\Screen Shot 01-25-16 at 04.05 PM.PNG"/>
             <wp:cNvGraphicFramePr>
               <a:graphicFrameLocks xmlns:a="http://schemas.openxmlformats.org/drawingml/2006/main" noChangeAspect="1"/>
@@ -173,59 +194,6 @@
                 <pic:pic xmlns:pic="http://schemas.openxmlformats.org/drawingml/2006/picture">
                   <pic:nvPicPr>
                     <pic:cNvPr id="0" name="Picture 1" descr="C:\Users\parvizilab\Pictures\My Screen Shots\Screen Shot 01-25-16 at 04.05 PM.PNG"/>
-                    <pic:cNvPicPr>
-                      <a:picLocks noChangeAspect="1" noChangeArrowheads="1"/>
-                    </pic:cNvPicPr>
-                  </pic:nvPicPr>
-                  <pic:blipFill>
-                    <a:blip r:embed="rId5">
-                      <a:extLst>
-                        <a:ext uri="{28A0092B-C50C-407E-A947-70E740481C1C}">
-                          <a14:useLocalDpi xmlns:a14="http://schemas.microsoft.com/office/drawing/2010/main" val="0"/>
-                        </a:ext>
-                      </a:extLst>
-                    </a:blip>
-                    <a:srcRect/>
-                    <a:stretch>
-                      <a:fillRect/>
-                    </a:stretch>
-                  </pic:blipFill>
-                  <pic:spPr bwMode="auto">
-                    <a:xfrm>
-                      <a:off x="0" y="0"/>
-                      <a:ext cx="2931305" cy="2709379"/>
-                    </a:xfrm>
-                    <a:prstGeom prst="rect">
-                      <a:avLst/>
-                    </a:prstGeom>
-                    <a:noFill/>
-                    <a:ln>
-                      <a:noFill/>
-                    </a:ln>
-                  </pic:spPr>
-                </pic:pic>
-              </a:graphicData>
-            </a:graphic>
-          </wp:inline>
-        </w:drawing>
-      </w:r>
-      <w:r>
-        <w:rPr>
-          <w:noProof/>
-        </w:rPr>
-        <w:drawing>
-          <wp:inline distT="0" distB="0" distL="0" distR="0">
-            <wp:extent cx="2842560" cy="2639833"/>
-            <wp:effectExtent l="0" t="0" r="0" b="8255"/>
-            <wp:docPr id="9" name="Picture 9" descr="C:\Users\parvizilab\Pictures\My Screen Shots\Screen Shot 01-25-16 at 04.06 PM.PNG"/>
-            <wp:cNvGraphicFramePr>
-              <a:graphicFrameLocks xmlns:a="http://schemas.openxmlformats.org/drawingml/2006/main" noChangeAspect="1"/>
-            </wp:cNvGraphicFramePr>
-            <a:graphic xmlns:a="http://schemas.openxmlformats.org/drawingml/2006/main">
-              <a:graphicData uri="http://schemas.openxmlformats.org/drawingml/2006/picture">
-                <pic:pic xmlns:pic="http://schemas.openxmlformats.org/drawingml/2006/picture">
-                  <pic:nvPicPr>
-                    <pic:cNvPr id="0" name="Picture 2" descr="C:\Users\parvizilab\Pictures\My Screen Shots\Screen Shot 01-25-16 at 04.06 PM.PNG"/>
                     <pic:cNvPicPr>
                       <a:picLocks noChangeAspect="1" noChangeArrowheads="1"/>
                     </pic:cNvPicPr>
@@ -246,7 +214,7 @@
                   <pic:spPr bwMode="auto">
                     <a:xfrm>
                       <a:off x="0" y="0"/>
-                      <a:ext cx="2856807" cy="2653063"/>
+                      <a:ext cx="2484120" cy="2296160"/>
                     </a:xfrm>
                     <a:prstGeom prst="rect">
                       <a:avLst/>
@@ -255,6 +223,77 @@
                     <a:ln>
                       <a:noFill/>
                     </a:ln>
+                    <a:extLst>
+                      <a:ext uri="{FAA26D3D-D897-4be2-8F04-BA451C77F1D7}">
+                        <ma14:placeholderFlag xmlns:ma14="http://schemas.microsoft.com/office/mac/drawingml/2011/main"/>
+                      </a:ext>
+                    </a:extLst>
+                  </pic:spPr>
+                </pic:pic>
+              </a:graphicData>
+            </a:graphic>
+            <wp14:sizeRelH relativeFrom="page">
+              <wp14:pctWidth>0</wp14:pctWidth>
+            </wp14:sizeRelH>
+            <wp14:sizeRelV relativeFrom="page">
+              <wp14:pctHeight>0</wp14:pctHeight>
+            </wp14:sizeRelV>
+          </wp:anchor>
+        </w:drawing>
+      </w:r>
+    </w:p>
+    <w:p>
+      <w:r>
+        <w:rPr>
+          <w:noProof/>
+        </w:rPr>
+        <w:drawing>
+          <wp:inline distT="0" distB="0" distL="0" distR="0" wp14:anchorId="37ED30B4" wp14:editId="21722FE6">
+            <wp:extent cx="2461577" cy="2286020"/>
+            <wp:effectExtent l="0" t="0" r="2540" b="0"/>
+            <wp:docPr id="9" name="" descr="C:\Users\parvizilab\Pictures\My Screen Shots\Screen Shot 01-25-16 at 04.06 PM.PNG"/>
+            <wp:cNvGraphicFramePr>
+              <a:graphicFrameLocks xmlns:a="http://schemas.openxmlformats.org/drawingml/2006/main" noChangeAspect="1"/>
+            </wp:cNvGraphicFramePr>
+            <a:graphic xmlns:a="http://schemas.openxmlformats.org/drawingml/2006/main">
+              <a:graphicData uri="http://schemas.openxmlformats.org/drawingml/2006/picture">
+                <pic:pic xmlns:pic="http://schemas.openxmlformats.org/drawingml/2006/picture">
+                  <pic:nvPicPr>
+                    <pic:cNvPr id="0" name="Picture 2" descr="C:\Users\parvizilab\Pictures\My Screen Shots\Screen Shot 01-25-16 at 04.06 PM.PNG"/>
+                    <pic:cNvPicPr>
+                      <a:picLocks noChangeAspect="1" noChangeArrowheads="1"/>
+                    </pic:cNvPicPr>
+                  </pic:nvPicPr>
+                  <pic:blipFill>
+                    <a:blip r:embed="rId7">
+                      <a:extLst>
+                        <a:ext uri="{28A0092B-C50C-407E-A947-70E740481C1C}">
+                          <a14:useLocalDpi xmlns:a14="http://schemas.microsoft.com/office/drawing/2010/main" val="0"/>
+                        </a:ext>
+                      </a:extLst>
+                    </a:blip>
+                    <a:srcRect/>
+                    <a:stretch>
+                      <a:fillRect/>
+                    </a:stretch>
+                  </pic:blipFill>
+                  <pic:spPr bwMode="auto">
+                    <a:xfrm>
+                      <a:off x="0" y="0"/>
+                      <a:ext cx="2461577" cy="2286020"/>
+                    </a:xfrm>
+                    <a:prstGeom prst="rect">
+                      <a:avLst/>
+                    </a:prstGeom>
+                    <a:noFill/>
+                    <a:ln>
+                      <a:noFill/>
+                    </a:ln>
+                    <a:extLst>
+                      <a:ext uri="{FAA26D3D-D897-4be2-8F04-BA451C77F1D7}">
+                        <ma14:placeholderFlag xmlns:ma14="http://schemas.microsoft.com/office/mac/drawingml/2011/main"/>
+                      </a:ext>
+                    </a:extLst>
                   </pic:spPr>
                 </pic:pic>
               </a:graphicData>
@@ -264,11 +303,71 @@
       </w:r>
     </w:p>
     <w:p>
+      <w:r>
+        <w:rPr>
+          <w:noProof/>
+        </w:rPr>
+        <w:drawing>
+          <wp:inline distT="0" distB="0" distL="0" distR="0" wp14:anchorId="34A46179" wp14:editId="213C2D69">
+            <wp:extent cx="2447290" cy="2282825"/>
+            <wp:effectExtent l="0" t="0" r="0" b="3175"/>
+            <wp:docPr id="16" name=""/>
+            <wp:cNvGraphicFramePr>
+              <a:graphicFrameLocks xmlns:a="http://schemas.openxmlformats.org/drawingml/2006/main" noChangeAspect="1"/>
+            </wp:cNvGraphicFramePr>
+            <a:graphic xmlns:a="http://schemas.openxmlformats.org/drawingml/2006/main">
+              <a:graphicData uri="http://schemas.openxmlformats.org/drawingml/2006/picture">
+                <pic:pic xmlns:pic="http://schemas.openxmlformats.org/drawingml/2006/picture">
+                  <pic:nvPicPr>
+                    <pic:cNvPr id="0" name="Screen Shot 2016-02-02 at 11.24.12.png"/>
+                    <pic:cNvPicPr/>
+                  </pic:nvPicPr>
+                  <pic:blipFill>
+                    <a:blip r:embed="rId8">
+                      <a:extLst>
+                        <a:ext uri="{28A0092B-C50C-407E-A947-70E740481C1C}">
+                          <a14:useLocalDpi xmlns:a14="http://schemas.microsoft.com/office/drawing/2010/main" val="0"/>
+                        </a:ext>
+                      </a:extLst>
+                    </a:blip>
+                    <a:stretch>
+                      <a:fillRect/>
+                    </a:stretch>
+                  </pic:blipFill>
+                  <pic:spPr>
+                    <a:xfrm>
+                      <a:off x="0" y="0"/>
+                      <a:ext cx="2447290" cy="2282825"/>
+                    </a:xfrm>
+                    <a:prstGeom prst="rect">
+                      <a:avLst/>
+                    </a:prstGeom>
+                    <a:extLst>
+                      <a:ext uri="{FAA26D3D-D897-4be2-8F04-BA451C77F1D7}">
+                        <ma14:placeholderFlag xmlns:ma14="http://schemas.microsoft.com/office/mac/drawingml/2011/main"/>
+                      </a:ext>
+                    </a:extLst>
+                  </pic:spPr>
+                </pic:pic>
+              </a:graphicData>
+            </a:graphic>
+          </wp:inline>
+        </w:drawing>
+      </w:r>
+    </w:p>
+    <w:p>
       <w:pPr>
         <w:jc w:val="center"/>
       </w:pPr>
       <w:r>
-        <w:t>Fig. 1: Modality window with data type.</w:t>
+        <w:lastRenderedPageBreak/>
+        <w:t>Fig. 1: Modality window with data type</w:t>
+      </w:r>
+      <w:r>
+        <w:t xml:space="preserve"> (nifty, MEEG and .mat)</w:t>
+      </w:r>
+      <w:r>
+        <w:t>.</w:t>
       </w:r>
     </w:p>
     <w:p/>
@@ -287,23 +386,7 @@
     </w:p>
     <w:p>
       <w:r>
-        <w:t xml:space="preserve">The design window will be automatically filled with the events name, onsets (in seconds) and duration (in seconds). The units is set to seconds and the </w:t>
-      </w:r>
-      <w:proofErr w:type="spellStart"/>
-      <w:r>
-        <w:t>interscan</w:t>
-      </w:r>
-      <w:proofErr w:type="spellEnd"/>
-      <w:r>
-        <w:t xml:space="preserve"> interval corresponds to the </w:t>
-      </w:r>
-      <w:proofErr w:type="spellStart"/>
-      <w:r>
-        <w:t>intersample</w:t>
-      </w:r>
-      <w:proofErr w:type="spellEnd"/>
-      <w:r>
-        <w:t xml:space="preserve"> time (i.e. 1/sampling rate). </w:t>
+        <w:t xml:space="preserve">The design window will be automatically filled with the events name, onsets (in seconds) and duration (in seconds). The units is set to seconds and the interscan interval corresponds to the intersample time (i.e. 1/sampling rate). </w:t>
       </w:r>
       <w:r>
         <w:t>For both neuroimaging and MEEG, there are 2 new columns where regression targets and covariates can be entered per trial in each category</w:t>
@@ -323,9 +406,8 @@
         <w:rPr>
           <w:noProof/>
         </w:rPr>
-        <w:lastRenderedPageBreak/>
         <w:drawing>
-          <wp:inline distT="0" distB="0" distL="0" distR="0">
+          <wp:inline distT="0" distB="0" distL="0" distR="0" wp14:anchorId="1CA6CF71" wp14:editId="4670E1AA">
             <wp:extent cx="3181350" cy="2933159"/>
             <wp:effectExtent l="0" t="0" r="0" b="635"/>
             <wp:docPr id="3" name="Picture 3" descr="C:\Users\parvizilab\Pictures\My Screen Shots\Screen Shot 12-02-15 at 01.18 PM.PNG"/>
@@ -342,7 +424,7 @@
                     </pic:cNvPicPr>
                   </pic:nvPicPr>
                   <pic:blipFill>
-                    <a:blip r:embed="rId7">
+                    <a:blip r:embed="rId9">
                       <a:extLst>
                         <a:ext uri="{28A0092B-C50C-407E-A947-70E740481C1C}">
                           <a14:useLocalDpi xmlns:a14="http://schemas.microsoft.com/office/drawing/2010/main" val="0"/>
@@ -405,194 +487,165 @@
         <w:pStyle w:val="NoSpacing"/>
       </w:pPr>
       <w:r>
-        <w:t>In the modality field, a ‘type’ subfield was added, to account for the modality type. The same field was added to the ‘</w:t>
-      </w:r>
-      <w:proofErr w:type="spellStart"/>
-      <w:r>
+        <w:t>In the modality field, a ‘type’ subfield was added, to account for the modality type. The same field was added to the ‘PRT.masks’ as well.</w:t>
+      </w:r>
+    </w:p>
+    <w:p>
+      <w:pPr>
+        <w:pStyle w:val="NoSpacing"/>
+      </w:pPr>
+    </w:p>
+    <w:p>
+      <w:pPr>
+        <w:pStyle w:val="NoSpacing"/>
+        <w:rPr>
+          <w:rFonts w:ascii="Cambria" w:hAnsi="Cambria"/>
+        </w:rPr>
+      </w:pPr>
+      <w:r>
+        <w:rPr>
+          <w:rFonts w:ascii="Cambria" w:hAnsi="Cambria"/>
+        </w:rPr>
+        <w:t>PRT.group.subject.modality</w:t>
+      </w:r>
+    </w:p>
+    <w:p>
+      <w:pPr>
+        <w:pStyle w:val="NoSpacing"/>
+        <w:numPr>
+          <w:ilvl w:val="0"/>
+          <w:numId w:val="4"/>
+        </w:numPr>
+        <w:rPr>
+          <w:rFonts w:ascii="Cambria" w:hAnsi="Cambria"/>
+        </w:rPr>
+      </w:pPr>
+      <w:r>
+        <w:rPr>
+          <w:rFonts w:ascii="Cambria" w:hAnsi="Cambria"/>
+        </w:rPr>
+        <w:t>mod_name: 'ECoG'</w:t>
+      </w:r>
+    </w:p>
+    <w:p>
+      <w:pPr>
+        <w:pStyle w:val="NoSpacing"/>
+        <w:numPr>
+          <w:ilvl w:val="0"/>
+          <w:numId w:val="4"/>
+        </w:numPr>
+        <w:rPr>
+          <w:rFonts w:ascii="Cambria" w:hAnsi="Cambria"/>
+        </w:rPr>
+      </w:pPr>
+      <w:r>
+        <w:rPr>
+          <w:rFonts w:ascii="Cambria" w:hAnsi="Cambria"/>
+        </w:rPr>
+        <w:t>covar: []</w:t>
+      </w:r>
+    </w:p>
+    <w:p>
+      <w:pPr>
+        <w:pStyle w:val="NoSpacing"/>
+        <w:numPr>
+          <w:ilvl w:val="0"/>
+          <w:numId w:val="4"/>
+        </w:numPr>
+        <w:rPr>
+          <w:rFonts w:ascii="Cambria" w:hAnsi="Cambria"/>
+        </w:rPr>
+      </w:pPr>
+      <w:r>
+        <w:rPr>
+          <w:rFonts w:ascii="Cambria" w:hAnsi="Cambria"/>
+        </w:rPr>
+        <w:t>rt_subj: []</w:t>
+      </w:r>
+    </w:p>
+    <w:p>
+      <w:pPr>
+        <w:pStyle w:val="NoSpacing"/>
+        <w:numPr>
+          <w:ilvl w:val="0"/>
+          <w:numId w:val="4"/>
+        </w:numPr>
+        <w:rPr>
+          <w:rFonts w:ascii="Cambria" w:hAnsi="Cambria"/>
+        </w:rPr>
+      </w:pPr>
+      <w:r>
+        <w:rPr>
+          <w:rFonts w:ascii="Cambria" w:hAnsi="Cambria"/>
+        </w:rPr>
+        <w:t>design: [1x1 struct]</w:t>
+      </w:r>
+    </w:p>
+    <w:p>
+      <w:pPr>
+        <w:pStyle w:val="NoSpacing"/>
+        <w:numPr>
+          <w:ilvl w:val="0"/>
+          <w:numId w:val="4"/>
+        </w:numPr>
+        <w:rPr>
+          <w:rFonts w:ascii="Cambria" w:hAnsi="Cambria"/>
+        </w:rPr>
+      </w:pPr>
+      <w:r>
+        <w:rPr>
+          <w:rFonts w:ascii="Cambria" w:hAnsi="Cambria"/>
+        </w:rPr>
+        <w:t>scans: 'F:\Data\Faces_Vinitha\S14_64\Animal\preprocess\SPrtf_raeMfffdR_spm...'</w:t>
+      </w:r>
+    </w:p>
+    <w:p>
+      <w:pPr>
+        <w:pStyle w:val="NoSpacing"/>
+        <w:numPr>
+          <w:ilvl w:val="0"/>
+          <w:numId w:val="4"/>
+        </w:numPr>
+        <w:rPr>
+          <w:rFonts w:ascii="Cambria" w:hAnsi="Cambria"/>
+        </w:rPr>
+      </w:pPr>
+      <w:r>
+        <w:rPr>
+          <w:rFonts w:ascii="Cambria" w:hAnsi="Cambria"/>
+        </w:rPr>
+        <w:t>type: 'MEEG'</w:t>
+      </w:r>
+    </w:p>
+    <w:p>
+      <w:pPr>
+        <w:pStyle w:val="NoSpacing"/>
+        <w:ind w:left="720"/>
+        <w:rPr>
+          <w:rFonts w:ascii="Cambria" w:hAnsi="Cambria"/>
+        </w:rPr>
+      </w:pPr>
+    </w:p>
+    <w:p>
+      <w:pPr>
+        <w:pStyle w:val="NoSpacing"/>
+        <w:rPr>
+          <w:rFonts w:ascii="Cambria" w:hAnsi="Cambria"/>
+        </w:rPr>
+      </w:pPr>
+      <w:r>
+        <w:rPr>
+          <w:rFonts w:ascii="Cambria" w:hAnsi="Cambria"/>
+        </w:rPr>
         <w:t>PRT.masks</w:t>
       </w:r>
-      <w:proofErr w:type="spellEnd"/>
-      <w:r>
-        <w:t>’ as well.</w:t>
-      </w:r>
-    </w:p>
-    <w:p>
-      <w:pPr>
-        <w:pStyle w:val="NoSpacing"/>
-      </w:pPr>
-    </w:p>
-    <w:p>
-      <w:pPr>
-        <w:pStyle w:val="NoSpacing"/>
-        <w:rPr>
-          <w:rFonts w:ascii="Cambria" w:hAnsi="Cambria"/>
-        </w:rPr>
-      </w:pPr>
-      <w:proofErr w:type="spellStart"/>
-      <w:r>
-        <w:rPr>
-          <w:rFonts w:ascii="Cambria" w:hAnsi="Cambria"/>
-        </w:rPr>
-        <w:t>PRT.group.subject.modality</w:t>
-      </w:r>
-      <w:proofErr w:type="spellEnd"/>
-    </w:p>
-    <w:p>
-      <w:pPr>
-        <w:pStyle w:val="NoSpacing"/>
-        <w:numPr>
-          <w:ilvl w:val="0"/>
-          <w:numId w:val="4"/>
-        </w:numPr>
-        <w:rPr>
-          <w:rFonts w:ascii="Cambria" w:hAnsi="Cambria"/>
-        </w:rPr>
-      </w:pPr>
-      <w:proofErr w:type="spellStart"/>
-      <w:r>
-        <w:rPr>
-          <w:rFonts w:ascii="Cambria" w:hAnsi="Cambria"/>
-        </w:rPr>
-        <w:t>mod_name</w:t>
-      </w:r>
-      <w:proofErr w:type="spellEnd"/>
-      <w:r>
-        <w:rPr>
-          <w:rFonts w:ascii="Cambria" w:hAnsi="Cambria"/>
-        </w:rPr>
-        <w:t>: '</w:t>
-      </w:r>
-      <w:proofErr w:type="spellStart"/>
-      <w:r>
-        <w:rPr>
-          <w:rFonts w:ascii="Cambria" w:hAnsi="Cambria"/>
-        </w:rPr>
-        <w:t>ECoG</w:t>
-      </w:r>
-      <w:proofErr w:type="spellEnd"/>
-      <w:r>
-        <w:rPr>
-          <w:rFonts w:ascii="Cambria" w:hAnsi="Cambria"/>
-        </w:rPr>
-        <w:t>'</w:t>
-      </w:r>
-    </w:p>
-    <w:p>
-      <w:pPr>
-        <w:pStyle w:val="NoSpacing"/>
-        <w:numPr>
-          <w:ilvl w:val="0"/>
-          <w:numId w:val="4"/>
-        </w:numPr>
-        <w:rPr>
-          <w:rFonts w:ascii="Cambria" w:hAnsi="Cambria"/>
-        </w:rPr>
-      </w:pPr>
-      <w:proofErr w:type="spellStart"/>
-      <w:r>
-        <w:rPr>
-          <w:rFonts w:ascii="Cambria" w:hAnsi="Cambria"/>
-        </w:rPr>
-        <w:t>covar</w:t>
-      </w:r>
-      <w:proofErr w:type="spellEnd"/>
-      <w:r>
-        <w:rPr>
-          <w:rFonts w:ascii="Cambria" w:hAnsi="Cambria"/>
-        </w:rPr>
-        <w:t>: []</w:t>
-      </w:r>
-    </w:p>
-    <w:p>
-      <w:pPr>
-        <w:pStyle w:val="NoSpacing"/>
-        <w:numPr>
-          <w:ilvl w:val="0"/>
-          <w:numId w:val="4"/>
-        </w:numPr>
-        <w:rPr>
-          <w:rFonts w:ascii="Cambria" w:hAnsi="Cambria"/>
-        </w:rPr>
-      </w:pPr>
-      <w:proofErr w:type="spellStart"/>
-      <w:r>
-        <w:rPr>
-          <w:rFonts w:ascii="Cambria" w:hAnsi="Cambria"/>
-        </w:rPr>
-        <w:t>rt_subj</w:t>
-      </w:r>
-      <w:proofErr w:type="spellEnd"/>
-      <w:r>
-        <w:rPr>
-          <w:rFonts w:ascii="Cambria" w:hAnsi="Cambria"/>
-        </w:rPr>
-        <w:t>: []</w:t>
-      </w:r>
-    </w:p>
-    <w:p>
-      <w:pPr>
-        <w:pStyle w:val="NoSpacing"/>
-        <w:numPr>
-          <w:ilvl w:val="0"/>
-          <w:numId w:val="4"/>
-        </w:numPr>
-        <w:rPr>
-          <w:rFonts w:ascii="Cambria" w:hAnsi="Cambria"/>
-        </w:rPr>
-      </w:pPr>
-      <w:r>
-        <w:rPr>
-          <w:rFonts w:ascii="Cambria" w:hAnsi="Cambria"/>
-        </w:rPr>
-        <w:t xml:space="preserve">design: [1x1 </w:t>
-      </w:r>
-      <w:proofErr w:type="spellStart"/>
-      <w:r>
-        <w:rPr>
-          <w:rFonts w:ascii="Cambria" w:hAnsi="Cambria"/>
-        </w:rPr>
-        <w:t>struct</w:t>
-      </w:r>
-      <w:proofErr w:type="spellEnd"/>
-      <w:r>
-        <w:rPr>
-          <w:rFonts w:ascii="Cambria" w:hAnsi="Cambria"/>
-        </w:rPr>
-        <w:t>]</w:t>
-      </w:r>
-    </w:p>
-    <w:p>
-      <w:pPr>
-        <w:pStyle w:val="NoSpacing"/>
-        <w:numPr>
-          <w:ilvl w:val="0"/>
-          <w:numId w:val="4"/>
-        </w:numPr>
-        <w:rPr>
-          <w:rFonts w:ascii="Cambria" w:hAnsi="Cambria"/>
-        </w:rPr>
-      </w:pPr>
-      <w:proofErr w:type="gramStart"/>
-      <w:r>
-        <w:rPr>
-          <w:rFonts w:ascii="Cambria" w:hAnsi="Cambria"/>
-        </w:rPr>
-        <w:t>scans</w:t>
-      </w:r>
-      <w:proofErr w:type="gramEnd"/>
-      <w:r>
-        <w:rPr>
-          <w:rFonts w:ascii="Cambria" w:hAnsi="Cambria"/>
-        </w:rPr>
-        <w:t>: 'F:\Data\Faces_Vinitha\S14_64\Animal\preprocess\SPrtf_raeMfffdR_spm...'</w:t>
-      </w:r>
-    </w:p>
-    <w:p>
-      <w:pPr>
-        <w:pStyle w:val="NoSpacing"/>
-        <w:numPr>
-          <w:ilvl w:val="0"/>
-          <w:numId w:val="4"/>
+    </w:p>
+    <w:p>
+      <w:pPr>
+        <w:pStyle w:val="NoSpacing"/>
+        <w:numPr>
+          <w:ilvl w:val="0"/>
+          <w:numId w:val="5"/>
         </w:numPr>
         <w:rPr>
           <w:rFonts w:ascii="Cambria" w:hAnsi="Cambria"/>
@@ -608,31 +661,6 @@
     <w:p>
       <w:pPr>
         <w:pStyle w:val="NoSpacing"/>
-        <w:ind w:left="720"/>
-        <w:rPr>
-          <w:rFonts w:ascii="Cambria" w:hAnsi="Cambria"/>
-        </w:rPr>
-      </w:pPr>
-    </w:p>
-    <w:p>
-      <w:pPr>
-        <w:pStyle w:val="NoSpacing"/>
-        <w:rPr>
-          <w:rFonts w:ascii="Cambria" w:hAnsi="Cambria"/>
-        </w:rPr>
-      </w:pPr>
-      <w:proofErr w:type="spellStart"/>
-      <w:r>
-        <w:rPr>
-          <w:rFonts w:ascii="Cambria" w:hAnsi="Cambria"/>
-        </w:rPr>
-        <w:t>PRT.masks</w:t>
-      </w:r>
-      <w:proofErr w:type="spellEnd"/>
-    </w:p>
-    <w:p>
-      <w:pPr>
-        <w:pStyle w:val="NoSpacing"/>
         <w:numPr>
           <w:ilvl w:val="0"/>
           <w:numId w:val="5"/>
@@ -645,85 +673,27 @@
         <w:rPr>
           <w:rFonts w:ascii="Cambria" w:hAnsi="Cambria"/>
         </w:rPr>
-        <w:t>type: 'MEEG'</w:t>
-      </w:r>
-    </w:p>
-    <w:p>
-      <w:pPr>
-        <w:pStyle w:val="NoSpacing"/>
-        <w:numPr>
-          <w:ilvl w:val="0"/>
-          <w:numId w:val="5"/>
-        </w:numPr>
-        <w:rPr>
-          <w:rFonts w:ascii="Cambria" w:hAnsi="Cambria"/>
-        </w:rPr>
-      </w:pPr>
-      <w:proofErr w:type="spellStart"/>
-      <w:r>
-        <w:rPr>
-          <w:rFonts w:ascii="Cambria" w:hAnsi="Cambria"/>
-        </w:rPr>
-        <w:t>mod_name</w:t>
-      </w:r>
-      <w:proofErr w:type="spellEnd"/>
-      <w:r>
-        <w:rPr>
-          <w:rFonts w:ascii="Cambria" w:hAnsi="Cambria"/>
-        </w:rPr>
-        <w:t>: '</w:t>
-      </w:r>
-      <w:proofErr w:type="spellStart"/>
-      <w:r>
-        <w:rPr>
-          <w:rFonts w:ascii="Cambria" w:hAnsi="Cambria"/>
-        </w:rPr>
-        <w:t>ECoG</w:t>
-      </w:r>
-      <w:proofErr w:type="spellEnd"/>
+        <w:t>mod_name: 'ECoG</w:t>
+      </w:r>
     </w:p>
     <w:p/>
     <w:p>
       <w:r>
-        <w:t>The RT and covariates per trial are saved in the ‘</w:t>
-      </w:r>
-      <w:proofErr w:type="spellStart"/>
-      <w:r>
-        <w:t>conds</w:t>
-      </w:r>
-      <w:proofErr w:type="spellEnd"/>
-      <w:r>
-        <w:t>’ field of the ‘design’</w:t>
-      </w:r>
-    </w:p>
-    <w:p>
-      <w:pPr>
-        <w:pStyle w:val="NoSpacing"/>
-        <w:rPr>
-          <w:rFonts w:ascii="Cambria" w:hAnsi="Cambria"/>
-        </w:rPr>
-      </w:pPr>
-      <w:proofErr w:type="spellStart"/>
-      <w:proofErr w:type="gramStart"/>
-      <w:r>
-        <w:rPr>
-          <w:rFonts w:ascii="Cambria" w:hAnsi="Cambria"/>
-        </w:rPr>
-        <w:t>PRT.group.subject.modality.design.conds</w:t>
-      </w:r>
-      <w:proofErr w:type="spellEnd"/>
-      <w:r>
-        <w:rPr>
-          <w:rFonts w:ascii="Cambria" w:hAnsi="Cambria"/>
-        </w:rPr>
-        <w:t>(</w:t>
-      </w:r>
-      <w:proofErr w:type="gramEnd"/>
-      <w:r>
-        <w:rPr>
-          <w:rFonts w:ascii="Cambria" w:hAnsi="Cambria"/>
-        </w:rPr>
-        <w:t>1)</w:t>
+        <w:t>The RT and covariates per trial are saved in the ‘conds’ field of the ‘design’</w:t>
+      </w:r>
+    </w:p>
+    <w:p>
+      <w:pPr>
+        <w:pStyle w:val="NoSpacing"/>
+        <w:rPr>
+          <w:rFonts w:ascii="Cambria" w:hAnsi="Cambria"/>
+        </w:rPr>
+      </w:pPr>
+      <w:r>
+        <w:rPr>
+          <w:rFonts w:ascii="Cambria" w:hAnsi="Cambria"/>
+        </w:rPr>
+        <w:t>PRT.group.subject.modality.design.conds(1)</w:t>
       </w:r>
     </w:p>
     <w:p>
@@ -737,33 +707,11 @@
           <w:rFonts w:ascii="Cambria" w:hAnsi="Cambria"/>
         </w:rPr>
       </w:pPr>
-      <w:proofErr w:type="spellStart"/>
-      <w:r>
-        <w:rPr>
-          <w:rFonts w:ascii="Cambria" w:hAnsi="Cambria"/>
-        </w:rPr>
-        <w:t>cond_name</w:t>
-      </w:r>
-      <w:proofErr w:type="spellEnd"/>
-      <w:r>
-        <w:rPr>
-          <w:rFonts w:ascii="Cambria" w:hAnsi="Cambria"/>
-        </w:rPr>
-        <w:t>: '</w:t>
-      </w:r>
-      <w:proofErr w:type="spellStart"/>
-      <w:r>
-        <w:rPr>
-          <w:rFonts w:ascii="Cambria" w:hAnsi="Cambria"/>
-        </w:rPr>
-        <w:t>animal_F</w:t>
-      </w:r>
-      <w:proofErr w:type="spellEnd"/>
-      <w:r>
-        <w:rPr>
-          <w:rFonts w:ascii="Cambria" w:hAnsi="Cambria"/>
-        </w:rPr>
-        <w:t>'</w:t>
+      <w:r>
+        <w:rPr>
+          <w:rFonts w:ascii="Cambria" w:hAnsi="Cambria"/>
+        </w:rPr>
+        <w:t>cond_name: 'animal_F'</w:t>
       </w:r>
     </w:p>
     <w:p>
@@ -849,19 +797,11 @@
           <w:rFonts w:ascii="Cambria" w:hAnsi="Cambria"/>
         </w:rPr>
       </w:pPr>
-      <w:proofErr w:type="spellStart"/>
-      <w:r>
-        <w:rPr>
-          <w:rFonts w:ascii="Cambria" w:hAnsi="Cambria"/>
-        </w:rPr>
-        <w:t>discardedscans</w:t>
-      </w:r>
-      <w:proofErr w:type="spellEnd"/>
-      <w:r>
-        <w:rPr>
-          <w:rFonts w:ascii="Cambria" w:hAnsi="Cambria"/>
-        </w:rPr>
-        <w:t>: [0x1 double]</w:t>
+      <w:r>
+        <w:rPr>
+          <w:rFonts w:ascii="Cambria" w:hAnsi="Cambria"/>
+        </w:rPr>
+        <w:t>discardedscans: [0x1 double]</w:t>
       </w:r>
     </w:p>
     <w:p>
@@ -875,19 +815,11 @@
           <w:rFonts w:ascii="Cambria" w:hAnsi="Cambria"/>
         </w:rPr>
       </w:pPr>
-      <w:proofErr w:type="spellStart"/>
-      <w:r>
-        <w:rPr>
-          <w:rFonts w:ascii="Cambria" w:hAnsi="Cambria"/>
-        </w:rPr>
-        <w:t>hrfdiscardedscans</w:t>
-      </w:r>
-      <w:proofErr w:type="spellEnd"/>
-      <w:r>
-        <w:rPr>
-          <w:rFonts w:ascii="Cambria" w:hAnsi="Cambria"/>
-        </w:rPr>
-        <w:t>: []</w:t>
+      <w:r>
+        <w:rPr>
+          <w:rFonts w:ascii="Cambria" w:hAnsi="Cambria"/>
+        </w:rPr>
+        <w:t>hrfdiscardedscans: []</w:t>
       </w:r>
     </w:p>
     <w:p>
@@ -901,20 +833,11 @@
           <w:rFonts w:ascii="Cambria" w:hAnsi="Cambria"/>
         </w:rPr>
       </w:pPr>
-      <w:proofErr w:type="spellStart"/>
-      <w:r>
-        <w:rPr>
-          <w:rFonts w:ascii="Cambria" w:hAnsi="Cambria"/>
-        </w:rPr>
-        <w:lastRenderedPageBreak/>
-        <w:t>rt_trial</w:t>
-      </w:r>
-      <w:proofErr w:type="spellEnd"/>
-      <w:r>
-        <w:rPr>
-          <w:rFonts w:ascii="Cambria" w:hAnsi="Cambria"/>
-        </w:rPr>
-        <w:t>: []</w:t>
+      <w:r>
+        <w:rPr>
+          <w:rFonts w:ascii="Cambria" w:hAnsi="Cambria"/>
+        </w:rPr>
+        <w:t>rt_trial: []</w:t>
       </w:r>
     </w:p>
     <w:p>
@@ -928,19 +851,11 @@
           <w:rFonts w:ascii="Cambria" w:hAnsi="Cambria"/>
         </w:rPr>
       </w:pPr>
-      <w:proofErr w:type="spellStart"/>
-      <w:r>
-        <w:rPr>
-          <w:rFonts w:ascii="Cambria" w:hAnsi="Cambria"/>
-        </w:rPr>
-        <w:t>cov_trial</w:t>
-      </w:r>
-      <w:proofErr w:type="spellEnd"/>
-      <w:r>
-        <w:rPr>
-          <w:rFonts w:ascii="Cambria" w:hAnsi="Cambria"/>
-        </w:rPr>
-        <w:t>: []</w:t>
+      <w:r>
+        <w:rPr>
+          <w:rFonts w:ascii="Cambria" w:hAnsi="Cambria"/>
+        </w:rPr>
+        <w:t>cov_trial: []</w:t>
       </w:r>
     </w:p>
     <w:p/>
@@ -957,15 +872,7 @@
     </w:p>
     <w:p>
       <w:r>
-        <w:t>Those changes have been transposed to the batch: when choosing a modality, the ‘Data format’ field allows to choose between ‘</w:t>
-      </w:r>
-      <w:proofErr w:type="spellStart"/>
-      <w:r>
-        <w:t>nifti</w:t>
-      </w:r>
-      <w:proofErr w:type="spellEnd"/>
-      <w:r>
-        <w:t>’, ‘MEEG’ or ‘.mat’, whether the user specified the design by scans or by subjects. As the batch is not ‘dynamic’, the different design options specify for which data format they are available. The help of each field was also revised.</w:t>
+        <w:t>Those changes have been transposed to the batch: when choosing a modality, the ‘Data format’ field allows to choose between ‘nifti’, ‘MEEG’ or ‘.mat’, whether the user specified the design by scans or by subjects. As the batch is not ‘dynamic’, the different design options specify for which data format they are available. The help of each field was also revised.</w:t>
       </w:r>
     </w:p>
     <w:p>
@@ -974,7 +881,7 @@
           <w:noProof/>
         </w:rPr>
         <w:drawing>
-          <wp:inline distT="0" distB="0" distL="0" distR="0">
+          <wp:inline distT="0" distB="0" distL="0" distR="0" wp14:anchorId="738E18C3" wp14:editId="2D58E129">
             <wp:extent cx="2716972" cy="3164619"/>
             <wp:effectExtent l="0" t="0" r="7620" b="0"/>
             <wp:docPr id="10" name="Picture 10" descr="C:\Users\parvizilab\Pictures\My Screen Shots\Screen Shot 01-25-16 at 04.13 PM.PNG"/>
@@ -991,7 +898,7 @@
                     </pic:cNvPicPr>
                   </pic:nvPicPr>
                   <pic:blipFill>
-                    <a:blip r:embed="rId8">
+                    <a:blip r:embed="rId10">
                       <a:extLst>
                         <a:ext uri="{28A0092B-C50C-407E-A947-70E740481C1C}">
                           <a14:useLocalDpi xmlns:a14="http://schemas.microsoft.com/office/drawing/2010/main" val="0"/>
@@ -1027,7 +934,7 @@
           <w:noProof/>
         </w:rPr>
         <w:drawing>
-          <wp:inline distT="0" distB="0" distL="0" distR="0">
+          <wp:inline distT="0" distB="0" distL="0" distR="0" wp14:anchorId="45C2A029" wp14:editId="56871C8F">
             <wp:extent cx="2703444" cy="3148862"/>
             <wp:effectExtent l="0" t="0" r="1905" b="0"/>
             <wp:docPr id="11" name="Picture 11" descr="C:\Users\parvizilab\Pictures\My Screen Shots\Screen Shot 01-25-16 at 04.13 PM 001.PNG"/>
@@ -1044,7 +951,7 @@
                     </pic:cNvPicPr>
                   </pic:nvPicPr>
                   <pic:blipFill>
-                    <a:blip r:embed="rId9">
+                    <a:blip r:embed="rId11">
                       <a:extLst>
                         <a:ext uri="{28A0092B-C50C-407E-A947-70E740481C1C}">
                           <a14:useLocalDpi xmlns:a14="http://schemas.microsoft.com/office/drawing/2010/main" val="0"/>
@@ -1085,29 +992,74 @@
       </w:r>
     </w:p>
     <w:p>
-      <w:r>
-        <w:t>Regarding the masks, the user needs to specify a ‘mask’ for each modality, as before. However they need to choose a file only for the ‘</w:t>
-      </w:r>
-      <w:proofErr w:type="spellStart"/>
-      <w:r>
-        <w:t>nifti</w:t>
-      </w:r>
-      <w:proofErr w:type="spellEnd"/>
-      <w:r>
-        <w:t>’ input modalities. This is not optimal but might be less confusing. It is also easier in the code, as the number of masks serves as a check for all the modalities that are defined (i.e. checking number of modalities is the same across subjects and so on…). For MEEG or .mat, the type of modality is displayed but not further action is required.</w:t>
-      </w:r>
-    </w:p>
-    <w:p>
-      <w:r>
-        <w:t>In the code, checks make sure that the right type of design is selected for MEEG (‘Events in MEEG file’) or for .mat (‘no design’). This can easily be modified when extending the ‘.mat’ option to ‘</w:t>
-      </w:r>
-      <w:proofErr w:type="spellStart"/>
-      <w:r>
-        <w:t>new_design</w:t>
-      </w:r>
-      <w:proofErr w:type="spellEnd"/>
-      <w:r>
-        <w:t>’ later on. There is also a restriction that the number of files for either a MEEG or .mat modality should be 1 (everything should be contained in this specified file, for each subject and modality). Different runs of EEG/MEG experiments can be entered as different modalities and later concatenated in ‘trials’ at the feature set stage.</w:t>
+      <w:pPr>
+        <w:jc w:val="both"/>
+        <w:rPr>
+          <w:color w:val="FF0000"/>
+        </w:rPr>
+      </w:pPr>
+      <w:r>
+        <w:t xml:space="preserve">Regarding the masks, the user needs to specify a ‘mask’ for each modality, as before. However they need to choose a file only for the ‘nifti’ input modalities. This is not optimal but might be less confusing. It is also easier in the code, as the number of masks serves as a check for all the modalities that are defined (i.e. checking number of modalities is the same across subjects and so on…). For MEEG or .mat, </w:t>
+      </w:r>
+      <w:r>
+        <w:lastRenderedPageBreak/>
+        <w:t>the type of modality is displayed but not further action is required.</w:t>
+      </w:r>
+      <w:r>
+        <w:t xml:space="preserve"> </w:t>
+      </w:r>
+      <w:r>
+        <w:rPr>
+          <w:color w:val="FF0000"/>
+        </w:rPr>
+        <w:t xml:space="preserve">For .mat data the user can still </w:t>
+      </w:r>
+      <w:r>
+        <w:rPr>
+          <w:color w:val="FF0000"/>
+        </w:rPr>
+        <w:t xml:space="preserve">input </w:t>
+      </w:r>
+      <w:r>
+        <w:rPr>
+          <w:color w:val="FF0000"/>
+        </w:rPr>
+        <w:t>a mask</w:t>
+      </w:r>
+      <w:r>
+        <w:rPr>
+          <w:color w:val="FF0000"/>
+        </w:rPr>
+        <w:t xml:space="preserve"> (.mat file with the same dimensions as the original data and some variables set to zero) to select parts of the matrix. The division between first/second-level mask for .mat data is </w:t>
+      </w:r>
+      <w:r>
+        <w:rPr>
+          <w:color w:val="FF0000"/>
+        </w:rPr>
+        <w:t xml:space="preserve">highly </w:t>
+      </w:r>
+      <w:r>
+        <w:rPr>
+          <w:color w:val="FF0000"/>
+        </w:rPr>
+        <w:t>redundant therefore the first-level mask is not taken in</w:t>
+      </w:r>
+      <w:r>
+        <w:rPr>
+          <w:color w:val="FF0000"/>
+        </w:rPr>
+        <w:t>to account for this data format and doesn’</w:t>
+      </w:r>
+      <w:r>
+        <w:rPr>
+          <w:color w:val="FF0000"/>
+        </w:rPr>
+        <w:t>t need to be specified (actually it cannot be selected at the moment).</w:t>
+      </w:r>
+    </w:p>
+    <w:p>
+      <w:r>
+        <w:t>In the code, checks make sure that the right type of design is selected for MEEG (‘Events in MEEG file’) or for .mat (‘no design’). This can easily be modified when extending the ‘.mat’ option to ‘new_design’ later on. There is also a restriction that the number of files for either a MEEG or .mat modality should be 1 (everything should be contained in this specified file, for each subject and modality). Different runs of EEG/MEG experiments can be entered as different modalities and later concatenated in ‘trials’ at the feature set stage.</w:t>
       </w:r>
     </w:p>
     <w:p>
@@ -1115,9 +1067,8 @@
         <w:rPr>
           <w:noProof/>
         </w:rPr>
-        <w:lastRenderedPageBreak/>
         <w:drawing>
-          <wp:inline distT="0" distB="0" distL="0" distR="0">
+          <wp:inline distT="0" distB="0" distL="0" distR="0" wp14:anchorId="185F87B9" wp14:editId="23E67BA8">
             <wp:extent cx="2955902" cy="3442915"/>
             <wp:effectExtent l="0" t="0" r="0" b="5715"/>
             <wp:docPr id="12" name="Picture 12" descr="C:\Users\parvizilab\Pictures\My Screen Shots\Screen Shot 01-25-16 at 04.14 PM.PNG"/>
@@ -1134,7 +1085,7 @@
                     </pic:cNvPicPr>
                   </pic:nvPicPr>
                   <pic:blipFill>
-                    <a:blip r:embed="rId10">
+                    <a:blip r:embed="rId12">
                       <a:extLst>
                         <a:ext uri="{28A0092B-C50C-407E-A947-70E740481C1C}">
                           <a14:useLocalDpi xmlns:a14="http://schemas.microsoft.com/office/drawing/2010/main" val="0"/>
@@ -1170,7 +1121,7 @@
           <w:noProof/>
         </w:rPr>
         <w:drawing>
-          <wp:inline distT="0" distB="0" distL="0" distR="0">
+          <wp:inline distT="0" distB="0" distL="0" distR="0" wp14:anchorId="5C229F64" wp14:editId="3749A47B">
             <wp:extent cx="2957885" cy="3445225"/>
             <wp:effectExtent l="0" t="0" r="0" b="3175"/>
             <wp:docPr id="13" name="Picture 13" descr="C:\Users\parvizilab\Pictures\My Screen Shots\Screen Shot 01-25-16 at 04.19 PM.PNG"/>
@@ -1187,7 +1138,7 @@
                     </pic:cNvPicPr>
                   </pic:nvPicPr>
                   <pic:blipFill>
-                    <a:blip r:embed="rId11">
+                    <a:blip r:embed="rId13">
                       <a:extLst>
                         <a:ext uri="{28A0092B-C50C-407E-A947-70E740481C1C}">
                           <a14:useLocalDpi xmlns:a14="http://schemas.microsoft.com/office/drawing/2010/main" val="0"/>
@@ -1264,7 +1215,7 @@
         </w:rPr>
         <w:lastRenderedPageBreak/>
         <w:drawing>
-          <wp:inline distT="0" distB="0" distL="0" distR="0" wp14:anchorId="78D8B7F2" wp14:editId="2D15A977">
+          <wp:inline distT="0" distB="0" distL="0" distR="0" wp14:anchorId="1F37E4C4" wp14:editId="3E500420">
             <wp:extent cx="2950664" cy="3427012"/>
             <wp:effectExtent l="0" t="0" r="2540" b="2540"/>
             <wp:docPr id="15" name="Picture 15" descr="C:\Users\parvizilab\Pictures\My Screen Shots\Screen Shot 01-25-16 at 05.26 PM.PNG"/>
@@ -1281,7 +1232,7 @@
                     </pic:cNvPicPr>
                   </pic:nvPicPr>
                   <pic:blipFill>
-                    <a:blip r:embed="rId12">
+                    <a:blip r:embed="rId14">
                       <a:extLst>
                         <a:ext uri="{28A0092B-C50C-407E-A947-70E740481C1C}">
                           <a14:useLocalDpi xmlns:a14="http://schemas.microsoft.com/office/drawing/2010/main" val="0"/>
@@ -1317,7 +1268,7 @@
           <w:noProof/>
         </w:rPr>
         <w:drawing>
-          <wp:inline distT="0" distB="0" distL="0" distR="0" wp14:anchorId="7CBFE707" wp14:editId="690EF26C">
+          <wp:inline distT="0" distB="0" distL="0" distR="0" wp14:anchorId="1EBB200F" wp14:editId="0BC9B086">
             <wp:extent cx="2950487" cy="3426808"/>
             <wp:effectExtent l="0" t="0" r="2540" b="2540"/>
             <wp:docPr id="14" name="Picture 14" descr="C:\Users\parvizilab\Pictures\My Screen Shots\Screen Shot 01-25-16 at 05.23 PM.PNG"/>
@@ -1334,7 +1285,7 @@
                     </pic:cNvPicPr>
                   </pic:nvPicPr>
                   <pic:blipFill>
-                    <a:blip r:embed="rId13">
+                    <a:blip r:embed="rId15">
                       <a:extLst>
                         <a:ext uri="{28A0092B-C50C-407E-A947-70E740481C1C}">
                           <a14:useLocalDpi xmlns:a14="http://schemas.microsoft.com/office/drawing/2010/main" val="0"/>
@@ -1380,7 +1331,7 @@
           <w:noProof/>
         </w:rPr>
         <w:drawing>
-          <wp:anchor distT="0" distB="0" distL="114300" distR="114300" simplePos="0" relativeHeight="251658240" behindDoc="0" locked="0" layoutInCell="1" allowOverlap="1" wp14:anchorId="402922F4" wp14:editId="052ED03F">
+          <wp:anchor distT="0" distB="0" distL="114300" distR="114300" simplePos="0" relativeHeight="251658240" behindDoc="0" locked="0" layoutInCell="1" allowOverlap="1" wp14:anchorId="5385CCAF" wp14:editId="4F0A44C4">
             <wp:simplePos x="0" y="0"/>
             <wp:positionH relativeFrom="margin">
               <wp:align>left</wp:align>
@@ -1405,7 +1356,7 @@
                     </pic:cNvPicPr>
                   </pic:nvPicPr>
                   <pic:blipFill>
-                    <a:blip r:embed="rId14">
+                    <a:blip r:embed="rId16">
                       <a:extLst>
                         <a:ext uri="{28A0092B-C50C-407E-A947-70E740481C1C}">
                           <a14:useLocalDpi xmlns:a14="http://schemas.microsoft.com/office/drawing/2010/main" val="0"/>
@@ -1519,6 +1470,72 @@
         <w:t>Allow for ‘specify design’ when loading a .mat</w:t>
       </w:r>
       <w:r>
+        <w:rPr>
+          <w:color w:val="C00000"/>
+        </w:rPr>
+        <w:t xml:space="preserve"> </w:t>
+      </w:r>
+      <w:r>
+        <w:rPr>
+          <w:color w:val="FF0000"/>
+        </w:rPr>
+        <w:t>(this might not be necessary si</w:t>
+      </w:r>
+      <w:r>
+        <w:rPr>
+          <w:color w:val="FF0000"/>
+        </w:rPr>
+        <w:t>nce all the designs, including within-</w:t>
+      </w:r>
+      <w:r>
+        <w:rPr>
+          <w:color w:val="FF0000"/>
+        </w:rPr>
+        <w:t>subject</w:t>
+      </w:r>
+      <w:r>
+        <w:rPr>
+          <w:color w:val="FF0000"/>
+        </w:rPr>
+        <w:t xml:space="preserve"> designs,</w:t>
+      </w:r>
+      <w:r>
+        <w:rPr>
+          <w:color w:val="FF0000"/>
+        </w:rPr>
+        <w:t xml:space="preserve"> can be specified using the Group/Subject/Modality structure witho</w:t>
+      </w:r>
+      <w:r>
+        <w:rPr>
+          <w:color w:val="FF0000"/>
+        </w:rPr>
+        <w:t>ut messing up the Design functionality in Pronto</w:t>
+      </w:r>
+      <w:r>
+        <w:rPr>
+          <w:color w:val="FF0000"/>
+        </w:rPr>
+        <w:t>, which is optimized for time-series data.</w:t>
+      </w:r>
+      <w:r>
+        <w:rPr>
+          <w:color w:val="FF0000"/>
+        </w:rPr>
+        <w:t xml:space="preserve"> Examples of different designs can be included in a Tutorial in the Manual</w:t>
+      </w:r>
+      <w:r>
+        <w:rPr>
+          <w:color w:val="FF0000"/>
+        </w:rPr>
+        <w:t>)</w:t>
+      </w:r>
+      <w:r>
+        <w:rPr>
+          <w:color w:val="FF0000"/>
+        </w:rPr>
+        <w:t>.</w:t>
+      </w:r>
+      <w:r>
         <w:br w:type="page"/>
       </w:r>
     </w:p>
@@ -1551,7 +1568,7 @@
           <w:noProof/>
         </w:rPr>
         <w:drawing>
-          <wp:inline distT="0" distB="0" distL="0" distR="0">
+          <wp:inline distT="0" distB="0" distL="0" distR="0" wp14:anchorId="57FD0252" wp14:editId="204EEBF1">
             <wp:extent cx="2828925" cy="1199659"/>
             <wp:effectExtent l="0" t="0" r="0" b="635"/>
             <wp:docPr id="4" name="Picture 4" descr="C:\Users\parvizilab\Pictures\My Screen Shots\Screen Shot 12-02-15 at 01.26 PM.PNG"/>
@@ -1568,7 +1585,7 @@
                     </pic:cNvPicPr>
                   </pic:nvPicPr>
                   <pic:blipFill>
-                    <a:blip r:embed="rId15">
+                    <a:blip r:embed="rId17">
                       <a:extLst>
                         <a:ext uri="{28A0092B-C50C-407E-A947-70E740481C1C}">
                           <a14:useLocalDpi xmlns:a14="http://schemas.microsoft.com/office/drawing/2010/main" val="0"/>
@@ -1635,7 +1652,7 @@
           <w:noProof/>
         </w:rPr>
         <w:drawing>
-          <wp:inline distT="0" distB="0" distL="0" distR="0">
+          <wp:inline distT="0" distB="0" distL="0" distR="0" wp14:anchorId="0EBE4276" wp14:editId="34086E67">
             <wp:extent cx="4638675" cy="3671341"/>
             <wp:effectExtent l="0" t="0" r="0" b="5715"/>
             <wp:docPr id="5" name="Picture 5" descr="C:\Users\parvizilab\Pictures\My Screen Shots\Screen Shot 12-02-15 at 01.28 PM.PNG"/>
@@ -1652,7 +1669,7 @@
                     </pic:cNvPicPr>
                   </pic:nvPicPr>
                   <pic:blipFill>
-                    <a:blip r:embed="rId16">
+                    <a:blip r:embed="rId18">
                       <a:extLst>
                         <a:ext uri="{28A0092B-C50C-407E-A947-70E740481C1C}">
                           <a14:useLocalDpi xmlns:a14="http://schemas.microsoft.com/office/drawing/2010/main" val="0"/>
@@ -1702,31 +1719,7 @@
     <w:p>
       <w:r>
         <w:lastRenderedPageBreak/>
-        <w:t xml:space="preserve">The user can play on the channels, selecting them all or only some. Channels marked as bad in the MEEG object are displayed in red. It is possible to average the signal over the selected channels, or to build one kernel per channel. Similarly, the user can select a sub time window by specifying which </w:t>
-      </w:r>
-      <w:proofErr w:type="spellStart"/>
-      <w:r>
-        <w:t>ms</w:t>
-      </w:r>
-      <w:proofErr w:type="spellEnd"/>
-      <w:r>
-        <w:t xml:space="preserve"> to include in the kernel. The signal can then be averaged over time points, or one kernel can be built (per time point or per sub-time window of xx </w:t>
-      </w:r>
-      <w:proofErr w:type="spellStart"/>
-      <w:r>
-        <w:t>ms</w:t>
-      </w:r>
-      <w:proofErr w:type="spellEnd"/>
-      <w:r>
-        <w:t xml:space="preserve">). If the data set contain frequency information (i.e. multiple frequency bins), the user can select which bins to analyze, average the signal within the band of interest or build on kernel per frequency bin. It is not possible to average over one dimension and select multiple kernels for that same dimension (which is logical). It is however perfectly acceptable to build multiple kernels one more than one dimension (e.g. one kernel per channel and per sub-time window of 50ms). Frequent use with </w:t>
-      </w:r>
-      <w:proofErr w:type="spellStart"/>
-      <w:r>
-        <w:t>ECoG</w:t>
-      </w:r>
-      <w:proofErr w:type="spellEnd"/>
-      <w:r>
-        <w:t xml:space="preserve"> data: select all the good channels, time points after stimulus onset [0 350ms]</w:t>
+        <w:t>The user can play on the channels, selecting them all or only some. Channels marked as bad in the MEEG object are displayed in red. It is possible to average the signal over the selected channels, or to build one kernel per channel. Similarly, the user can select a sub time window by specifying which ms to include in the kernel. The signal can then be averaged over time points, or one kernel can be built (per time point or per sub-time window of xx ms). If the data set contain frequency information (i.e. multiple frequency bins), the user can select which bins to analyze, average the signal within the band of interest or build on kernel per frequency bin. It is not possible to average over one dimension and select multiple kernels for that same dimension (which is logical). It is however perfectly acceptable to build multiple kernels one more than one dimension (e.g. one kernel per channel and per sub-time window of 50ms). Frequent use with ECoG data: select all the good channels, time points after stimulus onset [0 350ms]</w:t>
       </w:r>
       <w:r>
         <w:t xml:space="preserve"> and the high frequency broadband (70 to 170 Hz), average the signal within the frequency band, build multiple kernels on the channels.</w:t>
@@ -1737,7 +1730,205 @@
         <w:t>In the main window, it is possible to concatenate multiple modalities (i.e. runs) in samples or to build one kernel per modality (e.g. EEG and MEG). This last option should however disappear soon as the code now allows to combine feature sets at the modelling level.</w:t>
       </w:r>
     </w:p>
+    <w:p>
+      <w:pPr>
+        <w:rPr>
+          <w:color w:val="FF0000"/>
+        </w:rPr>
+      </w:pPr>
+      <w:r>
+        <w:rPr>
+          <w:color w:val="FF0000"/>
+        </w:rPr>
+        <w:t xml:space="preserve">In the Prepare Feature Set module different .mat modalities can be combined (either by concatenation, if they have the same dimensions, or using MKL) as well as .mat and other modalities, such as nifti (using the MKL option). </w:t>
+      </w:r>
+      <w:r>
+        <w:rPr>
+          <w:color w:val="FF0000"/>
+        </w:rPr>
+        <w:t>Some of the option</w:t>
+      </w:r>
+      <w:r>
+        <w:rPr>
+          <w:color w:val="FF0000"/>
+        </w:rPr>
+        <w:t>s</w:t>
+      </w:r>
+      <w:r>
+        <w:rPr>
+          <w:color w:val="FF0000"/>
+        </w:rPr>
+        <w:t xml:space="preserve"> for </w:t>
+      </w:r>
+      <w:r>
+        <w:rPr>
+          <w:color w:val="FF0000"/>
+        </w:rPr>
+        <w:t>nifti</w:t>
+      </w:r>
+      <w:r>
+        <w:rPr>
+          <w:color w:val="FF0000"/>
+        </w:rPr>
+        <w:t xml:space="preserve"> data are disabled</w:t>
+      </w:r>
+      <w:r>
+        <w:rPr>
+          <w:color w:val="FF0000"/>
+        </w:rPr>
+        <w:t xml:space="preserve"> (e.g. Detrend and Scaling)</w:t>
+      </w:r>
+      <w:r>
+        <w:rPr>
+          <w:color w:val="FF0000"/>
+        </w:rPr>
+        <w:t xml:space="preserve"> when one selects a .mat type of modality but the user can specify a mask to pre-select part</w:t>
+      </w:r>
+      <w:r>
+        <w:rPr>
+          <w:color w:val="FF0000"/>
+        </w:rPr>
+        <w:t>s</w:t>
+      </w:r>
+      <w:r>
+        <w:rPr>
+          <w:color w:val="FF0000"/>
+        </w:rPr>
+        <w:t xml:space="preserve"> of the data</w:t>
+      </w:r>
+      <w:r>
+        <w:rPr>
+          <w:color w:val="FF0000"/>
+        </w:rPr>
+        <w:t xml:space="preserve"> in the same window</w:t>
+      </w:r>
+      <w:r>
+        <w:rPr>
+          <w:color w:val="FF0000"/>
+        </w:rPr>
+        <w:t xml:space="preserve"> (see Figure 3).</w:t>
+      </w:r>
+    </w:p>
+    <w:p>
+      <w:r>
+        <w:rPr>
+          <w:noProof/>
+        </w:rPr>
+        <w:drawing>
+          <wp:anchor distT="0" distB="0" distL="114300" distR="114300" simplePos="0" relativeHeight="251661312" behindDoc="0" locked="0" layoutInCell="1" allowOverlap="1" wp14:anchorId="35BFD6E4" wp14:editId="63B68C12">
+            <wp:simplePos x="0" y="0"/>
+            <wp:positionH relativeFrom="column">
+              <wp:posOffset>1371600</wp:posOffset>
+            </wp:positionH>
+            <wp:positionV relativeFrom="paragraph">
+              <wp:posOffset>15240</wp:posOffset>
+            </wp:positionV>
+            <wp:extent cx="3175000" cy="3771900"/>
+            <wp:effectExtent l="0" t="0" r="0" b="12700"/>
+            <wp:wrapSquare wrapText="bothSides"/>
+            <wp:docPr id="17" name="Picture 17"/>
+            <wp:cNvGraphicFramePr>
+              <a:graphicFrameLocks xmlns:a="http://schemas.openxmlformats.org/drawingml/2006/main" noChangeAspect="1"/>
+            </wp:cNvGraphicFramePr>
+            <a:graphic xmlns:a="http://schemas.openxmlformats.org/drawingml/2006/main">
+              <a:graphicData uri="http://schemas.openxmlformats.org/drawingml/2006/picture">
+                <pic:pic xmlns:pic="http://schemas.openxmlformats.org/drawingml/2006/picture">
+                  <pic:nvPicPr>
+                    <pic:cNvPr id="0" name="Screen Shot 2016-02-02 at 11.43.42.png"/>
+                    <pic:cNvPicPr/>
+                  </pic:nvPicPr>
+                  <pic:blipFill>
+                    <a:blip r:embed="rId19">
+                      <a:extLst>
+                        <a:ext uri="{28A0092B-C50C-407E-A947-70E740481C1C}">
+                          <a14:useLocalDpi xmlns:a14="http://schemas.microsoft.com/office/drawing/2010/main" val="0"/>
+                        </a:ext>
+                      </a:extLst>
+                    </a:blip>
+                    <a:stretch>
+                      <a:fillRect/>
+                    </a:stretch>
+                  </pic:blipFill>
+                  <pic:spPr>
+                    <a:xfrm>
+                      <a:off x="0" y="0"/>
+                      <a:ext cx="3175000" cy="3771900"/>
+                    </a:xfrm>
+                    <a:prstGeom prst="rect">
+                      <a:avLst/>
+                    </a:prstGeom>
+                    <a:extLst>
+                      <a:ext uri="{FAA26D3D-D897-4be2-8F04-BA451C77F1D7}">
+                        <ma14:placeholderFlag xmlns:ma14="http://schemas.microsoft.com/office/mac/drawingml/2011/main"/>
+                      </a:ext>
+                    </a:extLst>
+                  </pic:spPr>
+                </pic:pic>
+              </a:graphicData>
+            </a:graphic>
+            <wp14:sizeRelH relativeFrom="page">
+              <wp14:pctWidth>0</wp14:pctWidth>
+            </wp14:sizeRelH>
+            <wp14:sizeRelV relativeFrom="page">
+              <wp14:pctHeight>0</wp14:pctHeight>
+            </wp14:sizeRelV>
+          </wp:anchor>
+        </w:drawing>
+      </w:r>
+    </w:p>
     <w:p/>
+    <w:p/>
+    <w:p/>
+    <w:p/>
+    <w:p/>
+    <w:p/>
+    <w:p/>
+    <w:p/>
+    <w:p/>
+    <w:p/>
+    <w:p/>
+    <w:p/>
+    <w:p/>
+    <w:p>
+      <w:pPr>
+        <w:jc w:val="center"/>
+        <w:rPr>
+          <w:color w:val="FF0000"/>
+        </w:rPr>
+      </w:pPr>
+      <w:r>
+        <w:rPr>
+          <w:color w:val="FF0000"/>
+        </w:rPr>
+        <w:t>Figure 3: Options available for .mat data. Different masks</w:t>
+      </w:r>
+      <w:r>
+        <w:rPr>
+          <w:color w:val="FF0000"/>
+        </w:rPr>
+        <w:t xml:space="preserve"> for the same data</w:t>
+      </w:r>
+      <w:bookmarkStart w:id="0" w:name="_GoBack"/>
+      <w:bookmarkEnd w:id="0"/>
+      <w:r>
+        <w:rPr>
+          <w:color w:val="FF0000"/>
+        </w:rPr>
+        <w:t xml:space="preserve"> can be </w:t>
+      </w:r>
+      <w:r>
+        <w:rPr>
+          <w:color w:val="FF0000"/>
+        </w:rPr>
+        <w:t>specified</w:t>
+      </w:r>
+      <w:r>
+        <w:rPr>
+          <w:color w:val="FF0000"/>
+        </w:rPr>
+        <w:t xml:space="preserve"> here.</w:t>
+      </w:r>
+    </w:p>
     <w:p>
       <w:pPr>
         <w:rPr>
@@ -1748,6 +1939,7 @@
         <w:rPr>
           <w:b/>
         </w:rPr>
+        <w:lastRenderedPageBreak/>
         <w:t>Code</w:t>
       </w:r>
     </w:p>
@@ -1777,45 +1969,21 @@
     <w:p/>
     <w:p>
       <w:r>
-        <w:t xml:space="preserve">The PRT structure has been affected by these changes for the fs and </w:t>
-      </w:r>
-      <w:proofErr w:type="spellStart"/>
-      <w:r>
-        <w:t>fas</w:t>
-      </w:r>
-      <w:proofErr w:type="spellEnd"/>
-      <w:r>
-        <w:t>:</w:t>
-      </w:r>
-    </w:p>
-    <w:p>
-      <w:pPr>
-        <w:pStyle w:val="NoSpacing"/>
-        <w:rPr>
-          <w:rFonts w:ascii="Cambria" w:hAnsi="Cambria"/>
-        </w:rPr>
-      </w:pPr>
-      <w:proofErr w:type="spellStart"/>
-      <w:proofErr w:type="gramStart"/>
-      <w:r>
-        <w:rPr>
-          <w:rFonts w:ascii="Cambria" w:hAnsi="Cambria"/>
-        </w:rPr>
-        <w:t>PRT.fs</w:t>
-      </w:r>
-      <w:proofErr w:type="spellEnd"/>
-      <w:r>
-        <w:rPr>
-          <w:rFonts w:ascii="Cambria" w:hAnsi="Cambria"/>
-        </w:rPr>
-        <w:t>(</w:t>
-      </w:r>
-      <w:proofErr w:type="gramEnd"/>
-      <w:r>
-        <w:rPr>
-          <w:rFonts w:ascii="Cambria" w:hAnsi="Cambria"/>
-        </w:rPr>
-        <w:t>1)</w:t>
+        <w:t>The PRT structure has been affected by these changes for the fs and fas:</w:t>
+      </w:r>
+    </w:p>
+    <w:p>
+      <w:pPr>
+        <w:pStyle w:val="NoSpacing"/>
+        <w:rPr>
+          <w:rFonts w:ascii="Cambria" w:hAnsi="Cambria"/>
+        </w:rPr>
+      </w:pPr>
+      <w:r>
+        <w:rPr>
+          <w:rFonts w:ascii="Cambria" w:hAnsi="Cambria"/>
+        </w:rPr>
+        <w:t>PRT.fs(1)</w:t>
       </w:r>
     </w:p>
     <w:p>
@@ -1829,33 +1997,11 @@
           <w:rFonts w:ascii="Cambria" w:hAnsi="Cambria"/>
         </w:rPr>
       </w:pPr>
-      <w:proofErr w:type="spellStart"/>
-      <w:r>
-        <w:rPr>
-          <w:rFonts w:ascii="Cambria" w:hAnsi="Cambria"/>
-        </w:rPr>
-        <w:t>fs_name</w:t>
-      </w:r>
-      <w:proofErr w:type="spellEnd"/>
-      <w:r>
-        <w:rPr>
-          <w:rFonts w:ascii="Cambria" w:hAnsi="Cambria"/>
-        </w:rPr>
-        <w:t>: '</w:t>
-      </w:r>
-      <w:proofErr w:type="spellStart"/>
-      <w:r>
-        <w:rPr>
-          <w:rFonts w:ascii="Cambria" w:hAnsi="Cambria"/>
-        </w:rPr>
-        <w:t>TCChans</w:t>
-      </w:r>
-      <w:proofErr w:type="spellEnd"/>
-      <w:r>
-        <w:rPr>
-          <w:rFonts w:ascii="Cambria" w:hAnsi="Cambria"/>
-        </w:rPr>
-        <w:t>'</w:t>
+      <w:r>
+        <w:rPr>
+          <w:rFonts w:ascii="Cambria" w:hAnsi="Cambria"/>
+        </w:rPr>
+        <w:t>fs_name: 'TCChans'</w:t>
       </w:r>
     </w:p>
     <w:p>
@@ -1869,33 +2015,11 @@
           <w:rFonts w:ascii="Cambria" w:hAnsi="Cambria"/>
         </w:rPr>
       </w:pPr>
-      <w:proofErr w:type="spellStart"/>
-      <w:r>
-        <w:rPr>
-          <w:rFonts w:ascii="Cambria" w:hAnsi="Cambria"/>
-        </w:rPr>
-        <w:t>k_file</w:t>
-      </w:r>
-      <w:proofErr w:type="spellEnd"/>
-      <w:r>
-        <w:rPr>
-          <w:rFonts w:ascii="Cambria" w:hAnsi="Cambria"/>
-        </w:rPr>
-        <w:t>: '</w:t>
-      </w:r>
-      <w:proofErr w:type="spellStart"/>
-      <w:r>
-        <w:rPr>
-          <w:rFonts w:ascii="Cambria" w:hAnsi="Cambria"/>
-        </w:rPr>
-        <w:t>TCChans</w:t>
-      </w:r>
-      <w:proofErr w:type="spellEnd"/>
-      <w:r>
-        <w:rPr>
-          <w:rFonts w:ascii="Cambria" w:hAnsi="Cambria"/>
-        </w:rPr>
-        <w:t>'</w:t>
+      <w:r>
+        <w:rPr>
+          <w:rFonts w:ascii="Cambria" w:hAnsi="Cambria"/>
+        </w:rPr>
+        <w:t>k_file: 'TCChans'</w:t>
       </w:r>
     </w:p>
     <w:p>
@@ -1909,19 +2033,11 @@
           <w:rFonts w:ascii="Cambria" w:hAnsi="Cambria"/>
         </w:rPr>
       </w:pPr>
-      <w:proofErr w:type="spellStart"/>
-      <w:r>
-        <w:rPr>
-          <w:rFonts w:ascii="Cambria" w:hAnsi="Cambria"/>
-        </w:rPr>
-        <w:t>id_col_names</w:t>
-      </w:r>
-      <w:proofErr w:type="spellEnd"/>
-      <w:r>
-        <w:rPr>
-          <w:rFonts w:ascii="Cambria" w:hAnsi="Cambria"/>
-        </w:rPr>
-        <w:t>: {'group'  'subject'  'modality'  'condition'  'block'  'scan'}</w:t>
+      <w:r>
+        <w:rPr>
+          <w:rFonts w:ascii="Cambria" w:hAnsi="Cambria"/>
+        </w:rPr>
+        <w:t>id_col_names: {'group'  'subject'  'modality'  'condition'  'block'  'scan'}</w:t>
       </w:r>
     </w:p>
     <w:p>
@@ -1935,33 +2051,11 @@
           <w:rFonts w:ascii="Cambria" w:hAnsi="Cambria"/>
         </w:rPr>
       </w:pPr>
-      <w:proofErr w:type="spellStart"/>
-      <w:r>
-        <w:rPr>
-          <w:rFonts w:ascii="Cambria" w:hAnsi="Cambria"/>
-        </w:rPr>
-        <w:t>fas</w:t>
-      </w:r>
-      <w:proofErr w:type="spellEnd"/>
-      <w:r>
-        <w:rPr>
-          <w:rFonts w:ascii="Cambria" w:hAnsi="Cambria"/>
-        </w:rPr>
-        <w:t xml:space="preserve">: [1x1 </w:t>
-      </w:r>
-      <w:proofErr w:type="spellStart"/>
-      <w:r>
-        <w:rPr>
-          <w:rFonts w:ascii="Cambria" w:hAnsi="Cambria"/>
-        </w:rPr>
-        <w:t>struct</w:t>
-      </w:r>
-      <w:proofErr w:type="spellEnd"/>
-      <w:r>
-        <w:rPr>
-          <w:rFonts w:ascii="Cambria" w:hAnsi="Cambria"/>
-        </w:rPr>
-        <w:t>]</w:t>
+      <w:r>
+        <w:rPr>
+          <w:rFonts w:ascii="Cambria" w:hAnsi="Cambria"/>
+        </w:rPr>
+        <w:t>fas: [1x1 struct]</w:t>
       </w:r>
     </w:p>
     <w:p>
@@ -1979,21 +2073,7 @@
         <w:rPr>
           <w:rFonts w:ascii="Cambria" w:hAnsi="Cambria"/>
         </w:rPr>
-        <w:t xml:space="preserve">modality: [1x1 </w:t>
-      </w:r>
-      <w:proofErr w:type="spellStart"/>
-      <w:r>
-        <w:rPr>
-          <w:rFonts w:ascii="Cambria" w:hAnsi="Cambria"/>
-        </w:rPr>
-        <w:t>struct</w:t>
-      </w:r>
-      <w:proofErr w:type="spellEnd"/>
-      <w:r>
-        <w:rPr>
-          <w:rFonts w:ascii="Cambria" w:hAnsi="Cambria"/>
-        </w:rPr>
-        <w:t>]</w:t>
+        <w:t>modality: [1x1 struct]</w:t>
       </w:r>
     </w:p>
     <w:p>
@@ -2007,19 +2087,11 @@
           <w:rFonts w:ascii="Cambria" w:hAnsi="Cambria"/>
         </w:rPr>
       </w:pPr>
-      <w:proofErr w:type="spellStart"/>
-      <w:r>
-        <w:rPr>
-          <w:rFonts w:ascii="Cambria" w:hAnsi="Cambria"/>
-        </w:rPr>
-        <w:t>id_mat</w:t>
-      </w:r>
-      <w:proofErr w:type="spellEnd"/>
-      <w:r>
-        <w:rPr>
-          <w:rFonts w:ascii="Cambria" w:hAnsi="Cambria"/>
-        </w:rPr>
-        <w:t>: [550x6 double]</w:t>
+      <w:r>
+        <w:rPr>
+          <w:rFonts w:ascii="Cambria" w:hAnsi="Cambria"/>
+        </w:rPr>
+        <w:t>id_mat: [550x6 double]</w:t>
       </w:r>
     </w:p>
     <w:p>
@@ -2033,19 +2105,11 @@
           <w:rFonts w:ascii="Cambria" w:hAnsi="Cambria"/>
         </w:rPr>
       </w:pPr>
-      <w:proofErr w:type="spellStart"/>
-      <w:r>
-        <w:rPr>
-          <w:rFonts w:ascii="Cambria" w:hAnsi="Cambria"/>
-        </w:rPr>
-        <w:t>multkernelROI</w:t>
-      </w:r>
-      <w:proofErr w:type="spellEnd"/>
-      <w:r>
-        <w:rPr>
-          <w:rFonts w:ascii="Cambria" w:hAnsi="Cambria"/>
-        </w:rPr>
-        <w:t>: 1</w:t>
+      <w:r>
+        <w:rPr>
+          <w:rFonts w:ascii="Cambria" w:hAnsi="Cambria"/>
+        </w:rPr>
+        <w:t>multkernelROI: 1</w:t>
       </w:r>
     </w:p>
     <w:p>
@@ -2059,19 +2123,11 @@
           <w:rFonts w:ascii="Cambria" w:hAnsi="Cambria"/>
         </w:rPr>
       </w:pPr>
-      <w:proofErr w:type="spellStart"/>
-      <w:r>
-        <w:rPr>
-          <w:rFonts w:ascii="Cambria" w:hAnsi="Cambria"/>
-        </w:rPr>
-        <w:t>multkernel</w:t>
-      </w:r>
-      <w:proofErr w:type="spellEnd"/>
-      <w:r>
-        <w:rPr>
-          <w:rFonts w:ascii="Cambria" w:hAnsi="Cambria"/>
-        </w:rPr>
-        <w:t>: 0</w:t>
+      <w:r>
+        <w:rPr>
+          <w:rFonts w:ascii="Cambria" w:hAnsi="Cambria"/>
+        </w:rPr>
+        <w:t>multkernel: 0</w:t>
       </w:r>
     </w:p>
     <w:p>
@@ -2085,33 +2141,11 @@
           <w:rFonts w:ascii="Cambria" w:hAnsi="Cambria"/>
         </w:rPr>
       </w:pPr>
-      <w:proofErr w:type="spellStart"/>
-      <w:r>
-        <w:rPr>
-          <w:rFonts w:ascii="Cambria" w:hAnsi="Cambria"/>
-        </w:rPr>
-        <w:t>atlas_name</w:t>
-      </w:r>
-      <w:proofErr w:type="spellEnd"/>
-      <w:r>
-        <w:rPr>
-          <w:rFonts w:ascii="Cambria" w:hAnsi="Cambria"/>
-        </w:rPr>
-        <w:t>: '</w:t>
-      </w:r>
-      <w:proofErr w:type="spellStart"/>
-      <w:r>
-        <w:rPr>
-          <w:rFonts w:ascii="Cambria" w:hAnsi="Cambria"/>
-        </w:rPr>
-        <w:t>Ch_fr_tp</w:t>
-      </w:r>
-      <w:proofErr w:type="spellEnd"/>
-      <w:r>
-        <w:rPr>
-          <w:rFonts w:ascii="Cambria" w:hAnsi="Cambria"/>
-        </w:rPr>
-        <w:t>'</w:t>
+      <w:r>
+        <w:rPr>
+          <w:rFonts w:ascii="Cambria" w:hAnsi="Cambria"/>
+        </w:rPr>
+        <w:t>atlas_name: 'Ch_fr_tp'</w:t>
       </w:r>
     </w:p>
     <w:p>
@@ -2130,27 +2164,11 @@
           <w:rFonts w:ascii="Cambria" w:hAnsi="Cambria"/>
         </w:rPr>
       </w:pPr>
-      <w:proofErr w:type="spellStart"/>
-      <w:proofErr w:type="gramStart"/>
-      <w:r>
-        <w:rPr>
-          <w:rFonts w:ascii="Cambria" w:hAnsi="Cambria"/>
-        </w:rPr>
-        <w:t>PRT.fs</w:t>
-      </w:r>
-      <w:proofErr w:type="spellEnd"/>
-      <w:r>
-        <w:rPr>
-          <w:rFonts w:ascii="Cambria" w:hAnsi="Cambria"/>
-        </w:rPr>
-        <w:t>(</w:t>
-      </w:r>
-      <w:proofErr w:type="gramEnd"/>
-      <w:r>
-        <w:rPr>
-          <w:rFonts w:ascii="Cambria" w:hAnsi="Cambria"/>
-        </w:rPr>
-        <w:t>1).modality</w:t>
+      <w:r>
+        <w:rPr>
+          <w:rFonts w:ascii="Cambria" w:hAnsi="Cambria"/>
+        </w:rPr>
+        <w:t>PRT.fs(1).modality</w:t>
       </w:r>
     </w:p>
     <w:p>
@@ -2164,33 +2182,11 @@
           <w:rFonts w:ascii="Cambria" w:hAnsi="Cambria"/>
         </w:rPr>
       </w:pPr>
-      <w:proofErr w:type="spellStart"/>
-      <w:r>
-        <w:rPr>
-          <w:rFonts w:ascii="Cambria" w:hAnsi="Cambria"/>
-        </w:rPr>
-        <w:t>mod_name</w:t>
-      </w:r>
-      <w:proofErr w:type="spellEnd"/>
-      <w:r>
-        <w:rPr>
-          <w:rFonts w:ascii="Cambria" w:hAnsi="Cambria"/>
-        </w:rPr>
-        <w:t>: {'</w:t>
-      </w:r>
-      <w:proofErr w:type="spellStart"/>
-      <w:r>
-        <w:rPr>
-          <w:rFonts w:ascii="Cambria" w:hAnsi="Cambria"/>
-        </w:rPr>
-        <w:t>ECoG</w:t>
-      </w:r>
-      <w:proofErr w:type="spellEnd"/>
-      <w:r>
-        <w:rPr>
-          <w:rFonts w:ascii="Cambria" w:hAnsi="Cambria"/>
-        </w:rPr>
-        <w:t>'}</w:t>
+      <w:r>
+        <w:rPr>
+          <w:rFonts w:ascii="Cambria" w:hAnsi="Cambria"/>
+        </w:rPr>
+        <w:t>mod_name: {'ECoG'}</w:t>
       </w:r>
     </w:p>
     <w:p>
@@ -2208,258 +2204,172 @@
         <w:rPr>
           <w:rFonts w:ascii="Cambria" w:hAnsi="Cambria"/>
         </w:rPr>
+        <w:t>aver: [0 0 0]</w:t>
+      </w:r>
+    </w:p>
+    <w:p>
+      <w:pPr>
+        <w:pStyle w:val="NoSpacing"/>
+        <w:numPr>
+          <w:ilvl w:val="0"/>
+          <w:numId w:val="2"/>
+        </w:numPr>
+        <w:rPr>
+          <w:rFonts w:ascii="Cambria" w:hAnsi="Cambria"/>
+        </w:rPr>
+      </w:pPr>
+      <w:r>
+        <w:rPr>
+          <w:rFonts w:ascii="Cambria" w:hAnsi="Cambria"/>
+        </w:rPr>
+        <w:t>multkern: [1 0 0]</w:t>
+      </w:r>
+    </w:p>
+    <w:p>
+      <w:pPr>
+        <w:pStyle w:val="NoSpacing"/>
+        <w:numPr>
+          <w:ilvl w:val="0"/>
+          <w:numId w:val="2"/>
+        </w:numPr>
+        <w:rPr>
+          <w:rFonts w:ascii="Cambria" w:hAnsi="Cambria"/>
+        </w:rPr>
+      </w:pPr>
+      <w:r>
+        <w:rPr>
+          <w:rFonts w:ascii="Cambria" w:hAnsi="Cambria"/>
+        </w:rPr>
+        <w:t>normalise: [1x1 struct]</w:t>
+      </w:r>
+    </w:p>
+    <w:p>
+      <w:pPr>
+        <w:pStyle w:val="NoSpacing"/>
+        <w:numPr>
+          <w:ilvl w:val="0"/>
+          <w:numId w:val="2"/>
+        </w:numPr>
+        <w:rPr>
+          <w:rFonts w:ascii="Cambria" w:hAnsi="Cambria"/>
+        </w:rPr>
+      </w:pPr>
+      <w:r>
+        <w:rPr>
+          <w:rFonts w:ascii="Cambria" w:hAnsi="Cambria"/>
+        </w:rPr>
+        <w:t>idfeat_fas: [17199x1 double]</w:t>
+      </w:r>
+    </w:p>
+    <w:p>
+      <w:pPr>
+        <w:pStyle w:val="NoSpacing"/>
+        <w:numPr>
+          <w:ilvl w:val="0"/>
+          <w:numId w:val="2"/>
+        </w:numPr>
+        <w:rPr>
+          <w:rFonts w:ascii="Cambria" w:hAnsi="Cambria"/>
+        </w:rPr>
+      </w:pPr>
+      <w:r>
+        <w:rPr>
+          <w:rFonts w:ascii="Cambria" w:hAnsi="Cambria"/>
+        </w:rPr>
+        <w:t>dim_m: {[49x1 double]  [1]  [1x351 double]}</w:t>
+      </w:r>
+    </w:p>
+    <w:p>
+      <w:pPr>
+        <w:pStyle w:val="NoSpacing"/>
+        <w:numPr>
+          <w:ilvl w:val="0"/>
+          <w:numId w:val="2"/>
+        </w:numPr>
+        <w:rPr>
+          <w:rFonts w:ascii="Cambria" w:hAnsi="Cambria"/>
+        </w:rPr>
+      </w:pPr>
+      <w:r>
+        <w:rPr>
+          <w:rFonts w:ascii="Cambria" w:hAnsi="Cambria"/>
+        </w:rPr>
+        <w:t>idfeat_img: {49x1 cell}</w:t>
+      </w:r>
+    </w:p>
+    <w:p>
+      <w:pPr>
+        <w:pStyle w:val="NoSpacing"/>
+        <w:numPr>
+          <w:ilvl w:val="0"/>
+          <w:numId w:val="2"/>
+        </w:numPr>
+        <w:rPr>
+          <w:rFonts w:ascii="Cambria" w:hAnsi="Cambria"/>
+        </w:rPr>
+      </w:pPr>
+      <w:r>
+        <w:rPr>
+          <w:rFonts w:ascii="Cambria" w:hAnsi="Cambria"/>
+        </w:rPr>
+        <w:t>igood_kerns: [1x49 double]</w:t>
+      </w:r>
+    </w:p>
+    <w:p/>
+    <w:p>
+      <w:r>
+        <w:t>In PRT.fs.modality, the fields ‘aver’ and ‘multkern’ were added. They represent on which dimensions averaging or multiple kernels were performed. It is important for the construction of the weights later on. The ‘dim_m’ field also keeps the indexes of which channels, frequency bins and time points were used. Again, it is useful for the weights and the display of the weights (to obtain channel labels for example)</w:t>
+      </w:r>
+      <w:r>
+        <w:t>.</w:t>
+      </w:r>
+    </w:p>
+    <w:p>
+      <w:r>
+        <w:t>Regarding the file array structure, the hdr is the object of the first file for the first subject of the modality. It allows to keep the channel labels, time points and frequency bins, as we would for image orientation or so. ‘idfeat_img’ is empty as it is not possible/useful to have a 1</w:t>
+      </w:r>
+      <w:r>
+        <w:rPr>
+          <w:vertAlign w:val="superscript"/>
+        </w:rPr>
+        <w:t>st</w:t>
+      </w:r>
+      <w:r>
+        <w:t xml:space="preserve"> level mask.</w:t>
+      </w:r>
+    </w:p>
+    <w:p>
+      <w:pPr>
+        <w:pStyle w:val="NoSpacing"/>
+        <w:rPr>
+          <w:rFonts w:ascii="Cambria" w:hAnsi="Cambria"/>
+        </w:rPr>
+      </w:pPr>
+      <w:r>
+        <w:rPr>
+          <w:rFonts w:ascii="Cambria" w:hAnsi="Cambria"/>
+        </w:rPr>
+        <w:t>PRT.fas</w:t>
+      </w:r>
+    </w:p>
+    <w:p>
+      <w:pPr>
+        <w:pStyle w:val="NoSpacing"/>
+        <w:numPr>
+          <w:ilvl w:val="0"/>
+          <w:numId w:val="3"/>
+        </w:numPr>
+        <w:rPr>
+          <w:rFonts w:ascii="Cambria" w:hAnsi="Cambria"/>
+        </w:rPr>
+      </w:pPr>
+      <w:r>
+        <w:rPr>
+          <w:rFonts w:ascii="Cambria" w:hAnsi="Cambria"/>
+        </w:rPr>
         <w:lastRenderedPageBreak/>
-        <w:t>aver: [0 0 0]</w:t>
-      </w:r>
-    </w:p>
-    <w:p>
-      <w:pPr>
-        <w:pStyle w:val="NoSpacing"/>
-        <w:numPr>
-          <w:ilvl w:val="0"/>
-          <w:numId w:val="2"/>
-        </w:numPr>
-        <w:rPr>
-          <w:rFonts w:ascii="Cambria" w:hAnsi="Cambria"/>
-        </w:rPr>
-      </w:pPr>
-      <w:proofErr w:type="spellStart"/>
-      <w:r>
-        <w:rPr>
-          <w:rFonts w:ascii="Cambria" w:hAnsi="Cambria"/>
-        </w:rPr>
-        <w:t>multkern</w:t>
-      </w:r>
-      <w:proofErr w:type="spellEnd"/>
-      <w:r>
-        <w:rPr>
-          <w:rFonts w:ascii="Cambria" w:hAnsi="Cambria"/>
-        </w:rPr>
-        <w:t>: [1 0 0]</w:t>
-      </w:r>
-    </w:p>
-    <w:p>
-      <w:pPr>
-        <w:pStyle w:val="NoSpacing"/>
-        <w:numPr>
-          <w:ilvl w:val="0"/>
-          <w:numId w:val="2"/>
-        </w:numPr>
-        <w:rPr>
-          <w:rFonts w:ascii="Cambria" w:hAnsi="Cambria"/>
-        </w:rPr>
-      </w:pPr>
-      <w:proofErr w:type="spellStart"/>
-      <w:r>
-        <w:rPr>
-          <w:rFonts w:ascii="Cambria" w:hAnsi="Cambria"/>
-        </w:rPr>
-        <w:t>normalise</w:t>
-      </w:r>
-      <w:proofErr w:type="spellEnd"/>
-      <w:r>
-        <w:rPr>
-          <w:rFonts w:ascii="Cambria" w:hAnsi="Cambria"/>
-        </w:rPr>
-        <w:t xml:space="preserve">: [1x1 </w:t>
-      </w:r>
-      <w:proofErr w:type="spellStart"/>
-      <w:r>
-        <w:rPr>
-          <w:rFonts w:ascii="Cambria" w:hAnsi="Cambria"/>
-        </w:rPr>
-        <w:t>struct</w:t>
-      </w:r>
-      <w:proofErr w:type="spellEnd"/>
-      <w:r>
-        <w:rPr>
-          <w:rFonts w:ascii="Cambria" w:hAnsi="Cambria"/>
-        </w:rPr>
-        <w:t>]</w:t>
-      </w:r>
-    </w:p>
-    <w:p>
-      <w:pPr>
-        <w:pStyle w:val="NoSpacing"/>
-        <w:numPr>
-          <w:ilvl w:val="0"/>
-          <w:numId w:val="2"/>
-        </w:numPr>
-        <w:rPr>
-          <w:rFonts w:ascii="Cambria" w:hAnsi="Cambria"/>
-        </w:rPr>
-      </w:pPr>
-      <w:proofErr w:type="spellStart"/>
-      <w:r>
-        <w:rPr>
-          <w:rFonts w:ascii="Cambria" w:hAnsi="Cambria"/>
-        </w:rPr>
-        <w:t>idfeat_fas</w:t>
-      </w:r>
-      <w:proofErr w:type="spellEnd"/>
-      <w:r>
-        <w:rPr>
-          <w:rFonts w:ascii="Cambria" w:hAnsi="Cambria"/>
-        </w:rPr>
-        <w:t>: [17199x1 double]</w:t>
-      </w:r>
-    </w:p>
-    <w:p>
-      <w:pPr>
-        <w:pStyle w:val="NoSpacing"/>
-        <w:numPr>
-          <w:ilvl w:val="0"/>
-          <w:numId w:val="2"/>
-        </w:numPr>
-        <w:rPr>
-          <w:rFonts w:ascii="Cambria" w:hAnsi="Cambria"/>
-        </w:rPr>
-      </w:pPr>
-      <w:proofErr w:type="spellStart"/>
-      <w:r>
-        <w:rPr>
-          <w:rFonts w:ascii="Cambria" w:hAnsi="Cambria"/>
-        </w:rPr>
-        <w:t>dim_m</w:t>
-      </w:r>
-      <w:proofErr w:type="spellEnd"/>
-      <w:r>
-        <w:rPr>
-          <w:rFonts w:ascii="Cambria" w:hAnsi="Cambria"/>
-        </w:rPr>
-        <w:t>: {[49x1 double]  [1]  [1x351 double]}</w:t>
-      </w:r>
-    </w:p>
-    <w:p>
-      <w:pPr>
-        <w:pStyle w:val="NoSpacing"/>
-        <w:numPr>
-          <w:ilvl w:val="0"/>
-          <w:numId w:val="2"/>
-        </w:numPr>
-        <w:rPr>
-          <w:rFonts w:ascii="Cambria" w:hAnsi="Cambria"/>
-        </w:rPr>
-      </w:pPr>
-      <w:proofErr w:type="spellStart"/>
-      <w:r>
-        <w:rPr>
-          <w:rFonts w:ascii="Cambria" w:hAnsi="Cambria"/>
-        </w:rPr>
-        <w:t>idfeat_img</w:t>
-      </w:r>
-      <w:proofErr w:type="spellEnd"/>
-      <w:r>
-        <w:rPr>
-          <w:rFonts w:ascii="Cambria" w:hAnsi="Cambria"/>
-        </w:rPr>
-        <w:t>: {49x1 cell}</w:t>
-      </w:r>
-    </w:p>
-    <w:p>
-      <w:pPr>
-        <w:pStyle w:val="NoSpacing"/>
-        <w:numPr>
-          <w:ilvl w:val="0"/>
-          <w:numId w:val="2"/>
-        </w:numPr>
-        <w:rPr>
-          <w:rFonts w:ascii="Cambria" w:hAnsi="Cambria"/>
-        </w:rPr>
-      </w:pPr>
-      <w:proofErr w:type="spellStart"/>
-      <w:r>
-        <w:rPr>
-          <w:rFonts w:ascii="Cambria" w:hAnsi="Cambria"/>
-        </w:rPr>
-        <w:t>igood_kerns</w:t>
-      </w:r>
-      <w:proofErr w:type="spellEnd"/>
-      <w:r>
-        <w:rPr>
-          <w:rFonts w:ascii="Cambria" w:hAnsi="Cambria"/>
-        </w:rPr>
-        <w:t>: [1x49 double]</w:t>
-      </w:r>
-    </w:p>
-    <w:p/>
-    <w:p>
-      <w:r>
-        <w:t xml:space="preserve">In </w:t>
-      </w:r>
-      <w:proofErr w:type="spellStart"/>
-      <w:r>
-        <w:t>PRT.fs.modality</w:t>
-      </w:r>
-      <w:proofErr w:type="spellEnd"/>
-      <w:r>
-        <w:t>, the fields ‘aver’ and ‘</w:t>
-      </w:r>
-      <w:proofErr w:type="spellStart"/>
-      <w:r>
-        <w:t>multkern</w:t>
-      </w:r>
-      <w:proofErr w:type="spellEnd"/>
-      <w:r>
-        <w:t>’ were added. They represent on which dimensions averaging or multiple kernels were performed. It is important for the construction of the weights later on. The ‘</w:t>
-      </w:r>
-      <w:proofErr w:type="spellStart"/>
-      <w:r>
-        <w:t>dim_m</w:t>
-      </w:r>
-      <w:proofErr w:type="spellEnd"/>
-      <w:r>
-        <w:t>’ field also keeps the indexes of which channels, frequency bins and time points were used. Again, it is useful for the weights and the display of the weights (to obtain channel labels for example)</w:t>
-      </w:r>
-      <w:r>
-        <w:t>.</w:t>
-      </w:r>
-    </w:p>
-    <w:p>
-      <w:r>
-        <w:t xml:space="preserve">Regarding the file array structure, the </w:t>
-      </w:r>
-      <w:proofErr w:type="spellStart"/>
-      <w:r>
-        <w:t>hdr</w:t>
-      </w:r>
-      <w:proofErr w:type="spellEnd"/>
-      <w:r>
-        <w:t xml:space="preserve"> is the object of the first file for the first subject of the modality. It allows to keep the channel labels, time points and frequency bins, as we would for image orientation or so. ‘</w:t>
-      </w:r>
-      <w:proofErr w:type="spellStart"/>
-      <w:r>
-        <w:t>idfeat_img</w:t>
-      </w:r>
-      <w:proofErr w:type="spellEnd"/>
-      <w:r>
-        <w:t>’ is empty as it is not possible/useful to have a 1</w:t>
-      </w:r>
-      <w:r>
-        <w:rPr>
-          <w:vertAlign w:val="superscript"/>
-        </w:rPr>
-        <w:t>st</w:t>
-      </w:r>
-      <w:r>
-        <w:t xml:space="preserve"> level mask.</w:t>
-      </w:r>
-    </w:p>
-    <w:p>
-      <w:pPr>
-        <w:pStyle w:val="NoSpacing"/>
-        <w:rPr>
-          <w:rFonts w:ascii="Cambria" w:hAnsi="Cambria"/>
-        </w:rPr>
-      </w:pPr>
-      <w:proofErr w:type="spellStart"/>
-      <w:r>
-        <w:rPr>
-          <w:rFonts w:ascii="Cambria" w:hAnsi="Cambria"/>
-        </w:rPr>
-        <w:t>PRT.fas</w:t>
-      </w:r>
-      <w:proofErr w:type="spellEnd"/>
+        <w:t>mod_name: {'ECoG'}</w:t>
+      </w:r>
     </w:p>
     <w:p>
       <w:pPr>
@@ -2472,33 +2382,11 @@
           <w:rFonts w:ascii="Cambria" w:hAnsi="Cambria"/>
         </w:rPr>
       </w:pPr>
-      <w:proofErr w:type="spellStart"/>
-      <w:r>
-        <w:rPr>
-          <w:rFonts w:ascii="Cambria" w:hAnsi="Cambria"/>
-        </w:rPr>
-        <w:t>mod_name</w:t>
-      </w:r>
-      <w:proofErr w:type="spellEnd"/>
-      <w:r>
-        <w:rPr>
-          <w:rFonts w:ascii="Cambria" w:hAnsi="Cambria"/>
-        </w:rPr>
-        <w:t>: {'</w:t>
-      </w:r>
-      <w:proofErr w:type="spellStart"/>
-      <w:r>
-        <w:rPr>
-          <w:rFonts w:ascii="Cambria" w:hAnsi="Cambria"/>
-        </w:rPr>
-        <w:t>ECoG</w:t>
-      </w:r>
-      <w:proofErr w:type="spellEnd"/>
-      <w:r>
-        <w:rPr>
-          <w:rFonts w:ascii="Cambria" w:hAnsi="Cambria"/>
-        </w:rPr>
-        <w:t>'}</w:t>
+      <w:r>
+        <w:rPr>
+          <w:rFonts w:ascii="Cambria" w:hAnsi="Cambria"/>
+        </w:rPr>
+        <w:t>dat: [550x33696 file_array]</w:t>
       </w:r>
     </w:p>
     <w:p>
@@ -2512,33 +2400,11 @@
           <w:rFonts w:ascii="Cambria" w:hAnsi="Cambria"/>
         </w:rPr>
       </w:pPr>
-      <w:proofErr w:type="spellStart"/>
-      <w:r>
-        <w:rPr>
-          <w:rFonts w:ascii="Cambria" w:hAnsi="Cambria"/>
-        </w:rPr>
-        <w:t>dat</w:t>
-      </w:r>
-      <w:proofErr w:type="spellEnd"/>
-      <w:r>
-        <w:rPr>
-          <w:rFonts w:ascii="Cambria" w:hAnsi="Cambria"/>
-        </w:rPr>
-        <w:t xml:space="preserve">: [550x33696 </w:t>
-      </w:r>
-      <w:proofErr w:type="spellStart"/>
-      <w:r>
-        <w:rPr>
-          <w:rFonts w:ascii="Cambria" w:hAnsi="Cambria"/>
-        </w:rPr>
-        <w:t>file_array</w:t>
-      </w:r>
-      <w:proofErr w:type="spellEnd"/>
-      <w:r>
-        <w:rPr>
-          <w:rFonts w:ascii="Cambria" w:hAnsi="Cambria"/>
-        </w:rPr>
-        <w:t>]</w:t>
+      <w:r>
+        <w:rPr>
+          <w:rFonts w:ascii="Cambria" w:hAnsi="Cambria"/>
+        </w:rPr>
+        <w:t>hdr: [96x351x550 meeg]</w:t>
       </w:r>
     </w:p>
     <w:p>
@@ -2552,59 +2418,11 @@
           <w:rFonts w:ascii="Cambria" w:hAnsi="Cambria"/>
         </w:rPr>
       </w:pPr>
-      <w:proofErr w:type="spellStart"/>
-      <w:r>
-        <w:rPr>
-          <w:rFonts w:ascii="Cambria" w:hAnsi="Cambria"/>
-        </w:rPr>
-        <w:t>hdr</w:t>
-      </w:r>
-      <w:proofErr w:type="spellEnd"/>
-      <w:r>
-        <w:rPr>
-          <w:rFonts w:ascii="Cambria" w:hAnsi="Cambria"/>
-        </w:rPr>
-        <w:t xml:space="preserve">: [96x351x550 </w:t>
-      </w:r>
-      <w:proofErr w:type="spellStart"/>
-      <w:r>
-        <w:rPr>
-          <w:rFonts w:ascii="Cambria" w:hAnsi="Cambria"/>
-        </w:rPr>
-        <w:t>meeg</w:t>
-      </w:r>
-      <w:proofErr w:type="spellEnd"/>
-      <w:r>
-        <w:rPr>
-          <w:rFonts w:ascii="Cambria" w:hAnsi="Cambria"/>
-        </w:rPr>
-        <w:t>]</w:t>
-      </w:r>
-    </w:p>
-    <w:p>
-      <w:pPr>
-        <w:pStyle w:val="NoSpacing"/>
-        <w:numPr>
-          <w:ilvl w:val="0"/>
-          <w:numId w:val="3"/>
-        </w:numPr>
-        <w:rPr>
-          <w:rFonts w:ascii="Cambria" w:hAnsi="Cambria"/>
-        </w:rPr>
-      </w:pPr>
-      <w:proofErr w:type="spellStart"/>
-      <w:r>
-        <w:rPr>
-          <w:rFonts w:ascii="Cambria" w:hAnsi="Cambria"/>
-        </w:rPr>
-        <w:t>idfeat_img</w:t>
-      </w:r>
-      <w:proofErr w:type="spellEnd"/>
-      <w:r>
-        <w:rPr>
-          <w:rFonts w:ascii="Cambria" w:hAnsi="Cambria"/>
-        </w:rPr>
-        <w:t>: []</w:t>
+      <w:r>
+        <w:rPr>
+          <w:rFonts w:ascii="Cambria" w:hAnsi="Cambria"/>
+        </w:rPr>
+        <w:t>idfeat_img: []</w:t>
       </w:r>
     </w:p>
     <w:p>
@@ -2770,7 +2588,7 @@
           <w:noProof/>
         </w:rPr>
         <w:drawing>
-          <wp:inline distT="0" distB="0" distL="0" distR="0" wp14:anchorId="6278A37A" wp14:editId="49246513">
+          <wp:inline distT="0" distB="0" distL="0" distR="0" wp14:anchorId="42802E79" wp14:editId="4A83B59E">
             <wp:extent cx="3876675" cy="5400342"/>
             <wp:effectExtent l="0" t="0" r="0" b="0"/>
             <wp:docPr id="6" name="Picture 6" descr="C:\Users\parvizilab\Pictures\My Screen Shots\Screen Shot 12-02-15 at 02.01 PM.PNG"/>
@@ -2787,7 +2605,7 @@
                     </pic:cNvPicPr>
                   </pic:nvPicPr>
                   <pic:blipFill>
-                    <a:blip r:embed="rId17">
+                    <a:blip r:embed="rId20">
                       <a:extLst>
                         <a:ext uri="{28A0092B-C50C-407E-A947-70E740481C1C}">
                           <a14:useLocalDpi xmlns:a14="http://schemas.microsoft.com/office/drawing/2010/main" val="0"/>
@@ -2853,15 +2671,7 @@
         <w:t>In relation with this addition, a new cross-validation was added</w:t>
       </w:r>
       <w:r>
-        <w:t xml:space="preserve">: Leave-One-Block-per-Class-Out (and its k-folds counterpart). It gets complex with pooling and subsampling, as the code is selecting the trials condition by condition. I added a random shuffling of the train/test division in the class containing pooled categories to make sure that one category is not left aside entirely in one fold, another in another fold, </w:t>
-      </w:r>
-      <w:proofErr w:type="spellStart"/>
-      <w:r>
-        <w:t>etc</w:t>
-      </w:r>
-      <w:proofErr w:type="spellEnd"/>
-      <w:r>
-        <w:t xml:space="preserve">… </w:t>
+        <w:t xml:space="preserve">: Leave-One-Block-per-Class-Out (and its k-folds counterpart). It gets complex with pooling and subsampling, as the code is selecting the trials condition by condition. I added a random shuffling of the train/test division in the class containing pooled categories to make sure that one category is not left aside entirely in one fold, another in another fold, etc… </w:t>
       </w:r>
     </w:p>
     <w:p>
@@ -2875,45 +2685,27 @@
         <w:t>When multiple kernels are present, it is possible to build a MK</w:t>
       </w:r>
       <w:r>
-        <w:t xml:space="preserve">L model with all of them (or </w:t>
-      </w:r>
-      <w:proofErr w:type="spellStart"/>
-      <w:r>
-        <w:t>signle</w:t>
-      </w:r>
-      <w:proofErr w:type="spellEnd"/>
-      <w:r>
-        <w:t xml:space="preserve"> kernel and they are added) or use single kernel methods on each of them independently. There is an extra flag: ‘Use kernels independently’ Yes or No (default: No). This turned out to be useful for me, when I selected ‘significant channels’ (FDR corrected) on one session and used them in a multivariate way on another session. It is also useful to determine the ‘best’ kernel when looking at the MKL results. I would expect this to be replaced by a proper feature selection module though.</w:t>
-      </w:r>
-    </w:p>
-    <w:p>
-      <w:r>
-        <w:t xml:space="preserve">Changes to the PRT: if only one model, then as usual. Otherwise, </w:t>
-      </w:r>
-      <w:proofErr w:type="spellStart"/>
-      <w:r>
-        <w:t>PRT.model.output</w:t>
-      </w:r>
-      <w:proofErr w:type="spellEnd"/>
-      <w:r>
-        <w:t xml:space="preserve"> is the same size as the number of independent models.</w:t>
-      </w:r>
-    </w:p>
-    <w:p>
-      <w:pPr>
-        <w:pStyle w:val="NoSpacing"/>
-        <w:rPr>
-          <w:rFonts w:ascii="Cambria" w:hAnsi="Cambria"/>
-        </w:rPr>
-      </w:pPr>
-      <w:proofErr w:type="spellStart"/>
+        <w:t>L model with all of them (or signle kernel and they are added) or use single kernel methods on each of them independently. There is an extra flag: ‘Use kernels independently’ Yes or No (default: No). This turned out to be useful for me, when I selected ‘significant channels’ (FDR corrected) on one session and used them in a multivariate way on another session. It is also useful to determine the ‘best’ kernel when looking at the MKL results. I would expect this to be replaced by a proper feature selection module though.</w:t>
+      </w:r>
+    </w:p>
+    <w:p>
+      <w:r>
+        <w:t>Changes to the PRT: if only one model, then as usual. Otherwise, PRT.model.output is the same size as the number of independent models.</w:t>
+      </w:r>
+    </w:p>
+    <w:p>
+      <w:pPr>
+        <w:pStyle w:val="NoSpacing"/>
+        <w:rPr>
+          <w:rFonts w:ascii="Cambria" w:hAnsi="Cambria"/>
+        </w:rPr>
+      </w:pPr>
       <w:r>
         <w:rPr>
           <w:rFonts w:ascii="Cambria" w:hAnsi="Cambria"/>
         </w:rPr>
         <w:t>PRT.model</w:t>
       </w:r>
-      <w:proofErr w:type="spellEnd"/>
     </w:p>
     <w:p>
       <w:pPr>
@@ -2926,33 +2718,11 @@
           <w:rFonts w:ascii="Cambria" w:hAnsi="Cambria"/>
         </w:rPr>
       </w:pPr>
-      <w:proofErr w:type="spellStart"/>
-      <w:r>
-        <w:rPr>
-          <w:rFonts w:ascii="Cambria" w:hAnsi="Cambria"/>
-        </w:rPr>
-        <w:t>model_name</w:t>
-      </w:r>
-      <w:proofErr w:type="spellEnd"/>
-      <w:r>
-        <w:rPr>
-          <w:rFonts w:ascii="Cambria" w:hAnsi="Cambria"/>
-        </w:rPr>
-        <w:t>: '</w:t>
-      </w:r>
-      <w:proofErr w:type="spellStart"/>
-      <w:r>
-        <w:rPr>
-          <w:rFonts w:ascii="Cambria" w:hAnsi="Cambria"/>
-        </w:rPr>
-        <w:t>Indmod_SVM_F_NF_TCChans</w:t>
-      </w:r>
-      <w:proofErr w:type="spellEnd"/>
-      <w:r>
-        <w:rPr>
-          <w:rFonts w:ascii="Cambria" w:hAnsi="Cambria"/>
-        </w:rPr>
-        <w:t>'</w:t>
+      <w:r>
+        <w:rPr>
+          <w:rFonts w:ascii="Cambria" w:hAnsi="Cambria"/>
+        </w:rPr>
+        <w:t>model_name: 'Indmod_SVM_F_NF_TCChans'</w:t>
       </w:r>
     </w:p>
     <w:p>
@@ -2970,21 +2740,7 @@
         <w:rPr>
           <w:rFonts w:ascii="Cambria" w:hAnsi="Cambria"/>
         </w:rPr>
-        <w:t xml:space="preserve">input: [1x1 </w:t>
-      </w:r>
-      <w:proofErr w:type="spellStart"/>
-      <w:r>
-        <w:rPr>
-          <w:rFonts w:ascii="Cambria" w:hAnsi="Cambria"/>
-        </w:rPr>
-        <w:t>struct</w:t>
-      </w:r>
-      <w:proofErr w:type="spellEnd"/>
-      <w:r>
-        <w:rPr>
-          <w:rFonts w:ascii="Cambria" w:hAnsi="Cambria"/>
-        </w:rPr>
-        <w:t>]</w:t>
+        <w:t>input: [1x1 struct]</w:t>
       </w:r>
     </w:p>
     <w:p>
@@ -3002,21 +2758,7 @@
         <w:rPr>
           <w:rFonts w:ascii="Cambria" w:hAnsi="Cambria"/>
         </w:rPr>
-        <w:t xml:space="preserve">output: [1x49 </w:t>
-      </w:r>
-      <w:proofErr w:type="spellStart"/>
-      <w:r>
-        <w:rPr>
-          <w:rFonts w:ascii="Cambria" w:hAnsi="Cambria"/>
-        </w:rPr>
-        <w:t>struct</w:t>
-      </w:r>
-      <w:proofErr w:type="spellEnd"/>
-      <w:r>
-        <w:rPr>
-          <w:rFonts w:ascii="Cambria" w:hAnsi="Cambria"/>
-        </w:rPr>
-        <w:t>]</w:t>
+        <w:t>output: [1x49 struct]</w:t>
       </w:r>
     </w:p>
     <w:p>
@@ -3030,32 +2772,22 @@
     </w:p>
     <w:p>
       <w:r>
-        <w:t xml:space="preserve">Other fields were added to take into account the new functionalities (subsample, </w:t>
-      </w:r>
-      <w:proofErr w:type="spellStart"/>
-      <w:r>
-        <w:t>indmodels</w:t>
-      </w:r>
-      <w:proofErr w:type="spellEnd"/>
-      <w:r>
-        <w:t>):</w:t>
-      </w:r>
-    </w:p>
-    <w:p>
-      <w:pPr>
-        <w:pStyle w:val="NoSpacing"/>
-        <w:rPr>
-          <w:rFonts w:ascii="Cambria" w:hAnsi="Cambria"/>
-        </w:rPr>
-      </w:pPr>
-      <w:proofErr w:type="spellStart"/>
+        <w:t>Other fields were added to take into account the new functionalities (subsample, indmodels):</w:t>
+      </w:r>
+    </w:p>
+    <w:p>
+      <w:pPr>
+        <w:pStyle w:val="NoSpacing"/>
+        <w:rPr>
+          <w:rFonts w:ascii="Cambria" w:hAnsi="Cambria"/>
+        </w:rPr>
+      </w:pPr>
       <w:r>
         <w:rPr>
           <w:rFonts w:ascii="Cambria" w:hAnsi="Cambria"/>
         </w:rPr>
         <w:t>PRT.model.input</w:t>
       </w:r>
-      <w:proofErr w:type="spellEnd"/>
     </w:p>
     <w:p>
       <w:pPr>
@@ -3068,19 +2800,11 @@
           <w:rFonts w:ascii="Cambria" w:hAnsi="Cambria"/>
         </w:rPr>
       </w:pPr>
-      <w:proofErr w:type="spellStart"/>
-      <w:r>
-        <w:rPr>
-          <w:rFonts w:ascii="Cambria" w:hAnsi="Cambria"/>
-        </w:rPr>
-        <w:t>use_kernel</w:t>
-      </w:r>
-      <w:proofErr w:type="spellEnd"/>
-      <w:r>
-        <w:rPr>
-          <w:rFonts w:ascii="Cambria" w:hAnsi="Cambria"/>
-        </w:rPr>
-        <w:t>: 1</w:t>
+      <w:r>
+        <w:rPr>
+          <w:rFonts w:ascii="Cambria" w:hAnsi="Cambria"/>
+        </w:rPr>
+        <w:t>use_kernel: 1</w:t>
       </w:r>
     </w:p>
     <w:p>
@@ -3116,21 +2840,7 @@
         <w:rPr>
           <w:rFonts w:ascii="Cambria" w:hAnsi="Cambria"/>
         </w:rPr>
-        <w:t xml:space="preserve">machine: [1x1 </w:t>
-      </w:r>
-      <w:proofErr w:type="spellStart"/>
-      <w:r>
-        <w:rPr>
-          <w:rFonts w:ascii="Cambria" w:hAnsi="Cambria"/>
-        </w:rPr>
-        <w:t>struct</w:t>
-      </w:r>
-      <w:proofErr w:type="spellEnd"/>
-      <w:r>
-        <w:rPr>
-          <w:rFonts w:ascii="Cambria" w:hAnsi="Cambria"/>
-        </w:rPr>
-        <w:t>]</w:t>
+        <w:t>machine: [1x1 struct]</w:t>
       </w:r>
     </w:p>
     <w:p>
@@ -3144,19 +2854,11 @@
           <w:rFonts w:ascii="Cambria" w:hAnsi="Cambria"/>
         </w:rPr>
       </w:pPr>
-      <w:proofErr w:type="spellStart"/>
-      <w:r>
-        <w:rPr>
-          <w:rFonts w:ascii="Cambria" w:hAnsi="Cambria"/>
-        </w:rPr>
-        <w:t>use_nested_cv</w:t>
-      </w:r>
-      <w:proofErr w:type="spellEnd"/>
-      <w:r>
-        <w:rPr>
-          <w:rFonts w:ascii="Cambria" w:hAnsi="Cambria"/>
-        </w:rPr>
-        <w:t>: 0</w:t>
+      <w:r>
+        <w:rPr>
+          <w:rFonts w:ascii="Cambria" w:hAnsi="Cambria"/>
+        </w:rPr>
+        <w:t>use_nested_cv: 0</w:t>
       </w:r>
     </w:p>
     <w:p>
@@ -3170,19 +2872,11 @@
           <w:rFonts w:ascii="Cambria" w:hAnsi="Cambria"/>
         </w:rPr>
       </w:pPr>
-      <w:proofErr w:type="spellStart"/>
-      <w:r>
-        <w:rPr>
-          <w:rFonts w:ascii="Cambria" w:hAnsi="Cambria"/>
-        </w:rPr>
-        <w:t>nested_param</w:t>
-      </w:r>
-      <w:proofErr w:type="spellEnd"/>
-      <w:r>
-        <w:rPr>
-          <w:rFonts w:ascii="Cambria" w:hAnsi="Cambria"/>
-        </w:rPr>
-        <w:t>: []</w:t>
+      <w:r>
+        <w:rPr>
+          <w:rFonts w:ascii="Cambria" w:hAnsi="Cambria"/>
+        </w:rPr>
+        <w:t>nested_param: []</w:t>
       </w:r>
     </w:p>
     <w:p>
@@ -3214,19 +2908,11 @@
           <w:rFonts w:ascii="Cambria" w:hAnsi="Cambria"/>
         </w:rPr>
       </w:pPr>
-      <w:proofErr w:type="spellStart"/>
-      <w:r>
-        <w:rPr>
-          <w:rFonts w:ascii="Cambria" w:hAnsi="Cambria"/>
-        </w:rPr>
-        <w:t>indmodels</w:t>
-      </w:r>
-      <w:proofErr w:type="spellEnd"/>
-      <w:r>
-        <w:rPr>
-          <w:rFonts w:ascii="Cambria" w:hAnsi="Cambria"/>
-        </w:rPr>
-        <w:t>: 1</w:t>
+      <w:r>
+        <w:rPr>
+          <w:rFonts w:ascii="Cambria" w:hAnsi="Cambria"/>
+        </w:rPr>
+        <w:t>indmodels: 1</w:t>
       </w:r>
     </w:p>
     <w:p>
@@ -3244,21 +2930,7 @@
         <w:rPr>
           <w:rFonts w:ascii="Cambria" w:hAnsi="Cambria"/>
         </w:rPr>
-        <w:t xml:space="preserve">class: [1x2 </w:t>
-      </w:r>
-      <w:proofErr w:type="spellStart"/>
-      <w:r>
-        <w:rPr>
-          <w:rFonts w:ascii="Cambria" w:hAnsi="Cambria"/>
-        </w:rPr>
-        <w:t>struct</w:t>
-      </w:r>
-      <w:proofErr w:type="spellEnd"/>
-      <w:r>
-        <w:rPr>
-          <w:rFonts w:ascii="Cambria" w:hAnsi="Cambria"/>
-        </w:rPr>
-        <w:t>]</w:t>
+        <w:t>class: [1x2 struct]</w:t>
       </w:r>
     </w:p>
     <w:p>
@@ -3276,21 +2948,7 @@
         <w:rPr>
           <w:rFonts w:ascii="Cambria" w:hAnsi="Cambria"/>
         </w:rPr>
-        <w:t xml:space="preserve">fs: [1x1 </w:t>
-      </w:r>
-      <w:proofErr w:type="spellStart"/>
-      <w:r>
-        <w:rPr>
-          <w:rFonts w:ascii="Cambria" w:hAnsi="Cambria"/>
-        </w:rPr>
-        <w:t>struct</w:t>
-      </w:r>
-      <w:proofErr w:type="spellEnd"/>
-      <w:r>
-        <w:rPr>
-          <w:rFonts w:ascii="Cambria" w:hAnsi="Cambria"/>
-        </w:rPr>
-        <w:t>]</w:t>
+        <w:t>fs: [1x1 struct]</w:t>
       </w:r>
     </w:p>
     <w:p>
@@ -3304,19 +2962,11 @@
           <w:rFonts w:ascii="Cambria" w:hAnsi="Cambria"/>
         </w:rPr>
       </w:pPr>
-      <w:proofErr w:type="spellStart"/>
-      <w:r>
-        <w:rPr>
-          <w:rFonts w:ascii="Cambria" w:hAnsi="Cambria"/>
-        </w:rPr>
-        <w:t>samp_idx</w:t>
-      </w:r>
-      <w:proofErr w:type="spellEnd"/>
-      <w:r>
-        <w:rPr>
-          <w:rFonts w:ascii="Cambria" w:hAnsi="Cambria"/>
-        </w:rPr>
-        <w:t>: [71x1 double]</w:t>
+      <w:r>
+        <w:rPr>
+          <w:rFonts w:ascii="Cambria" w:hAnsi="Cambria"/>
+        </w:rPr>
+        <w:t>samp_idx: [71x1 double]</w:t>
       </w:r>
     </w:p>
     <w:p>
@@ -3330,19 +2980,11 @@
           <w:rFonts w:ascii="Cambria" w:hAnsi="Cambria"/>
         </w:rPr>
       </w:pPr>
-      <w:proofErr w:type="spellStart"/>
-      <w:r>
-        <w:rPr>
-          <w:rFonts w:ascii="Cambria" w:hAnsi="Cambria"/>
-        </w:rPr>
-        <w:t>include_allscans</w:t>
-      </w:r>
-      <w:proofErr w:type="spellEnd"/>
-      <w:r>
-        <w:rPr>
-          <w:rFonts w:ascii="Cambria" w:hAnsi="Cambria"/>
-        </w:rPr>
-        <w:t>: 0</w:t>
+      <w:r>
+        <w:rPr>
+          <w:rFonts w:ascii="Cambria" w:hAnsi="Cambria"/>
+        </w:rPr>
+        <w:t>include_allscans: 0</w:t>
       </w:r>
     </w:p>
     <w:p>
@@ -3374,20 +3016,12 @@
           <w:rFonts w:ascii="Cambria" w:hAnsi="Cambria"/>
         </w:rPr>
       </w:pPr>
-      <w:proofErr w:type="spellStart"/>
       <w:r>
         <w:rPr>
           <w:rFonts w:ascii="Cambria" w:hAnsi="Cambria"/>
         </w:rPr>
         <w:lastRenderedPageBreak/>
-        <w:t>targ_allscans</w:t>
-      </w:r>
-      <w:proofErr w:type="spellEnd"/>
-      <w:r>
-        <w:rPr>
-          <w:rFonts w:ascii="Cambria" w:hAnsi="Cambria"/>
-        </w:rPr>
-        <w:t>: [324x1 double]</w:t>
+        <w:t>targ_allscans: [324x1 double]</w:t>
       </w:r>
     </w:p>
     <w:p>
@@ -3401,19 +3035,11 @@
           <w:rFonts w:ascii="Cambria" w:hAnsi="Cambria"/>
         </w:rPr>
       </w:pPr>
-      <w:proofErr w:type="spellStart"/>
-      <w:r>
-        <w:rPr>
-          <w:rFonts w:ascii="Cambria" w:hAnsi="Cambria"/>
-        </w:rPr>
-        <w:t>covar</w:t>
-      </w:r>
-      <w:proofErr w:type="spellEnd"/>
-      <w:r>
-        <w:rPr>
-          <w:rFonts w:ascii="Cambria" w:hAnsi="Cambria"/>
-        </w:rPr>
-        <w:t>: [71x1 double]</w:t>
+      <w:r>
+        <w:rPr>
+          <w:rFonts w:ascii="Cambria" w:hAnsi="Cambria"/>
+        </w:rPr>
+        <w:t>covar: [71x1 double]</w:t>
       </w:r>
     </w:p>
     <w:p>
@@ -3427,19 +3053,11 @@
           <w:rFonts w:ascii="Cambria" w:hAnsi="Cambria"/>
         </w:rPr>
       </w:pPr>
-      <w:proofErr w:type="spellStart"/>
-      <w:r>
-        <w:rPr>
-          <w:rFonts w:ascii="Cambria" w:hAnsi="Cambria"/>
-        </w:rPr>
-        <w:t>cov_allscans</w:t>
-      </w:r>
-      <w:proofErr w:type="spellEnd"/>
-      <w:r>
-        <w:rPr>
-          <w:rFonts w:ascii="Cambria" w:hAnsi="Cambria"/>
-        </w:rPr>
-        <w:t>: [324x1 double]</w:t>
+      <w:r>
+        <w:rPr>
+          <w:rFonts w:ascii="Cambria" w:hAnsi="Cambria"/>
+        </w:rPr>
+        <w:t>cov_allscans: [324x1 double]</w:t>
       </w:r>
     </w:p>
     <w:p>
@@ -3453,19 +3071,11 @@
           <w:rFonts w:ascii="Cambria" w:hAnsi="Cambria"/>
         </w:rPr>
       </w:pPr>
-      <w:proofErr w:type="spellStart"/>
-      <w:r>
-        <w:rPr>
-          <w:rFonts w:ascii="Cambria" w:hAnsi="Cambria"/>
-        </w:rPr>
-        <w:t>cv_k</w:t>
-      </w:r>
-      <w:proofErr w:type="spellEnd"/>
-      <w:r>
-        <w:rPr>
-          <w:rFonts w:ascii="Cambria" w:hAnsi="Cambria"/>
-        </w:rPr>
-        <w:t>: 5</w:t>
+      <w:r>
+        <w:rPr>
+          <w:rFonts w:ascii="Cambria" w:hAnsi="Cambria"/>
+        </w:rPr>
+        <w:t>cv_k: 5</w:t>
       </w:r>
     </w:p>
     <w:p>
@@ -3479,19 +3089,11 @@
           <w:rFonts w:ascii="Cambria" w:hAnsi="Cambria"/>
         </w:rPr>
       </w:pPr>
-      <w:proofErr w:type="spellStart"/>
-      <w:r>
-        <w:rPr>
-          <w:rFonts w:ascii="Cambria" w:hAnsi="Cambria"/>
-        </w:rPr>
-        <w:t>cv_mat</w:t>
-      </w:r>
-      <w:proofErr w:type="spellEnd"/>
-      <w:r>
-        <w:rPr>
-          <w:rFonts w:ascii="Cambria" w:hAnsi="Cambria"/>
-        </w:rPr>
-        <w:t>: [71x5 double]</w:t>
+      <w:r>
+        <w:rPr>
+          <w:rFonts w:ascii="Cambria" w:hAnsi="Cambria"/>
+        </w:rPr>
+        <w:t>cv_mat: [71x5 double]</w:t>
       </w:r>
     </w:p>
     <w:p>
@@ -3505,33 +3107,11 @@
           <w:rFonts w:ascii="Cambria" w:hAnsi="Cambria"/>
         </w:rPr>
       </w:pPr>
-      <w:proofErr w:type="spellStart"/>
-      <w:r>
-        <w:rPr>
-          <w:rFonts w:ascii="Cambria" w:hAnsi="Cambria"/>
-        </w:rPr>
-        <w:t>cv_type</w:t>
-      </w:r>
-      <w:proofErr w:type="spellEnd"/>
-      <w:r>
-        <w:rPr>
-          <w:rFonts w:ascii="Cambria" w:hAnsi="Cambria"/>
-        </w:rPr>
-        <w:t>: '</w:t>
-      </w:r>
-      <w:proofErr w:type="spellStart"/>
-      <w:r>
-        <w:rPr>
-          <w:rFonts w:ascii="Cambria" w:hAnsi="Cambria"/>
-        </w:rPr>
-        <w:t>locbo</w:t>
-      </w:r>
-      <w:proofErr w:type="spellEnd"/>
-      <w:r>
-        <w:rPr>
-          <w:rFonts w:ascii="Cambria" w:hAnsi="Cambria"/>
-        </w:rPr>
-        <w:t>'</w:t>
+      <w:r>
+        <w:rPr>
+          <w:rFonts w:ascii="Cambria" w:hAnsi="Cambria"/>
+        </w:rPr>
+        <w:t>cv_type: 'locbo'</w:t>
       </w:r>
     </w:p>
     <w:p>
@@ -3545,19 +3125,11 @@
           <w:rFonts w:ascii="Cambria" w:hAnsi="Cambria"/>
         </w:rPr>
       </w:pPr>
-      <w:proofErr w:type="spellStart"/>
-      <w:r>
-        <w:rPr>
-          <w:rFonts w:ascii="Cambria" w:hAnsi="Cambria"/>
-        </w:rPr>
-        <w:t>cv_type_nested</w:t>
-      </w:r>
-      <w:proofErr w:type="spellEnd"/>
-      <w:r>
-        <w:rPr>
-          <w:rFonts w:ascii="Cambria" w:hAnsi="Cambria"/>
-        </w:rPr>
-        <w:t>: 'lobo'</w:t>
+      <w:r>
+        <w:rPr>
+          <w:rFonts w:ascii="Cambria" w:hAnsi="Cambria"/>
+        </w:rPr>
+        <w:t>cv_type_nested: 'lobo'</w:t>
       </w:r>
     </w:p>
     <w:p>
@@ -3571,19 +3143,11 @@
           <w:rFonts w:ascii="Cambria" w:hAnsi="Cambria"/>
         </w:rPr>
       </w:pPr>
-      <w:proofErr w:type="spellStart"/>
-      <w:r>
-        <w:rPr>
-          <w:rFonts w:ascii="Cambria" w:hAnsi="Cambria"/>
-        </w:rPr>
-        <w:t>cv_k_nested</w:t>
-      </w:r>
-      <w:proofErr w:type="spellEnd"/>
-      <w:r>
-        <w:rPr>
-          <w:rFonts w:ascii="Cambria" w:hAnsi="Cambria"/>
-        </w:rPr>
-        <w:t>: 0</w:t>
+      <w:r>
+        <w:rPr>
+          <w:rFonts w:ascii="Cambria" w:hAnsi="Cambria"/>
+        </w:rPr>
+        <w:t>cv_k_nested: 0</w:t>
       </w:r>
     </w:p>
     <w:p>
@@ -3613,7 +3177,7 @@
           <w:noProof/>
         </w:rPr>
         <w:drawing>
-          <wp:inline distT="0" distB="0" distL="0" distR="0">
+          <wp:inline distT="0" distB="0" distL="0" distR="0" wp14:anchorId="39DB4A30" wp14:editId="2CB9DA79">
             <wp:extent cx="4456634" cy="5181600"/>
             <wp:effectExtent l="0" t="0" r="1270" b="0"/>
             <wp:docPr id="7" name="Picture 7" descr="C:\Users\parvizilab\Pictures\My Screen Shots\Screen Shot 12-02-15 at 02.18 PM 001.PNG"/>
@@ -3630,7 +3194,7 @@
                     </pic:cNvPicPr>
                   </pic:nvPicPr>
                   <pic:blipFill>
-                    <a:blip r:embed="rId18">
+                    <a:blip r:embed="rId21">
                       <a:extLst>
                         <a:ext uri="{28A0092B-C50C-407E-A947-70E740481C1C}">
                           <a14:useLocalDpi xmlns:a14="http://schemas.microsoft.com/office/drawing/2010/main" val="0"/>
@@ -3779,7 +3343,7 @@
           <w:noProof/>
         </w:rPr>
         <w:drawing>
-          <wp:anchor distT="0" distB="0" distL="114300" distR="114300" simplePos="0" relativeHeight="251659264" behindDoc="0" locked="0" layoutInCell="1" allowOverlap="1">
+          <wp:anchor distT="0" distB="0" distL="114300" distR="114300" simplePos="0" relativeHeight="251659264" behindDoc="0" locked="0" layoutInCell="1" allowOverlap="1" wp14:anchorId="70FF0EEC" wp14:editId="03EC7211">
             <wp:simplePos x="0" y="0"/>
             <wp:positionH relativeFrom="column">
               <wp:posOffset>0</wp:posOffset>
@@ -3804,7 +3368,7 @@
                     </pic:cNvPicPr>
                   </pic:nvPicPr>
                   <pic:blipFill>
-                    <a:blip r:embed="rId19">
+                    <a:blip r:embed="rId22">
                       <a:extLst>
                         <a:ext uri="{28A0092B-C50C-407E-A947-70E740481C1C}">
                           <a14:useLocalDpi xmlns:a14="http://schemas.microsoft.com/office/drawing/2010/main" val="0"/>
@@ -3838,15 +3402,7 @@
     </w:p>
     <w:p>
       <w:r>
-        <w:t xml:space="preserve">Fig 3: ‘Copy model’ batch. You enter the name of the </w:t>
-      </w:r>
-      <w:proofErr w:type="spellStart"/>
-      <w:r>
-        <w:t>PRT.mat</w:t>
-      </w:r>
-      <w:proofErr w:type="spellEnd"/>
-      <w:r>
-        <w:t>, the name of the new model and the name of the model to copy. Then choose at least a ‘field’ to modify among ‘Feature set’ (one or multiple can be selected), ‘</w:t>
+        <w:t>Fig 3: ‘Copy model’ batch. You enter the name of the PRT.mat, the name of the new model and the name of the model to copy. Then choose at least a ‘field’ to modify among ‘Feature set’ (one or multiple can be selected), ‘</w:t>
       </w:r>
       <w:r>
         <w:t>Model type</w:t>
@@ -3937,6 +3493,7 @@
         <w:rPr>
           <w:color w:val="C00000"/>
         </w:rPr>
+        <w:lastRenderedPageBreak/>
         <w:t xml:space="preserve">Subsampling option not present yet </w:t>
       </w:r>
     </w:p>
@@ -3955,7 +3512,6 @@
         <w:rPr>
           <w:color w:val="C00000"/>
         </w:rPr>
-        <w:lastRenderedPageBreak/>
         <w:t>Implement ‘copy model’ option</w:t>
       </w:r>
     </w:p>
@@ -3994,8 +3550,6 @@
       <w:pPr>
         <w:pStyle w:val="ListParagraph"/>
       </w:pPr>
-      <w:bookmarkStart w:id="0" w:name="_GoBack"/>
-      <w:bookmarkEnd w:id="0"/>
     </w:p>
     <w:p>
       <w:pPr>
@@ -4020,35 +3574,7 @@
         <w:rPr>
           <w:color w:val="C00000"/>
         </w:rPr>
-        <w:t xml:space="preserve">Use AUC instead of balanced accuracy to select best </w:t>
-      </w:r>
-      <w:proofErr w:type="spellStart"/>
-      <w:r>
-        <w:rPr>
-          <w:color w:val="C00000"/>
-        </w:rPr>
-        <w:t>hyperparameter</w:t>
-      </w:r>
-      <w:proofErr w:type="spellEnd"/>
-      <w:r>
-        <w:rPr>
-          <w:color w:val="C00000"/>
-        </w:rPr>
-        <w:t xml:space="preserve">? More work should be done on how to select the best </w:t>
-      </w:r>
-      <w:proofErr w:type="spellStart"/>
-      <w:r>
-        <w:rPr>
-          <w:color w:val="C00000"/>
-        </w:rPr>
-        <w:t>hyperparameter</w:t>
-      </w:r>
-      <w:proofErr w:type="spellEnd"/>
-      <w:r>
-        <w:rPr>
-          <w:color w:val="C00000"/>
-        </w:rPr>
-        <w:t>.</w:t>
+        <w:t>Use AUC instead of balanced accuracy to select best hyperparameter? More work should be done on how to select the best hyperparameter.</w:t>
       </w:r>
     </w:p>
     <w:p>
@@ -4152,35 +3678,7 @@
         <w:rPr>
           <w:color w:val="C00000"/>
         </w:rPr>
-        <w:t xml:space="preserve">Not sure where to add the ‘Compare 2 models’. Maybe we can add </w:t>
-      </w:r>
-      <w:proofErr w:type="gramStart"/>
-      <w:r>
-        <w:rPr>
-          <w:color w:val="C00000"/>
-        </w:rPr>
-        <w:t>a</w:t>
-      </w:r>
-      <w:proofErr w:type="gramEnd"/>
-      <w:r>
-        <w:rPr>
-          <w:color w:val="C00000"/>
-        </w:rPr>
-        <w:t xml:space="preserve"> ‘</w:t>
-      </w:r>
-      <w:proofErr w:type="spellStart"/>
-      <w:r>
-        <w:rPr>
-          <w:color w:val="C00000"/>
-        </w:rPr>
-        <w:t>Utils</w:t>
-      </w:r>
-      <w:proofErr w:type="spellEnd"/>
-      <w:r>
-        <w:rPr>
-          <w:color w:val="C00000"/>
-        </w:rPr>
-        <w:t>’ category?</w:t>
+        <w:t>Not sure where to add the ‘Compare 2 models’. Maybe we can add a ‘Utils’ category?</w:t>
       </w:r>
     </w:p>
     <w:p>
@@ -4279,6 +3777,30 @@
       </w:r>
     </w:p>
     <w:p>
+      <w:pPr>
+        <w:pStyle w:val="ListParagraph"/>
+        <w:numPr>
+          <w:ilvl w:val="0"/>
+          <w:numId w:val="7"/>
+        </w:numPr>
+        <w:rPr>
+          <w:color w:val="FF0000"/>
+        </w:rPr>
+      </w:pPr>
+      <w:r>
+        <w:rPr>
+          <w:color w:val="FF0000"/>
+        </w:rPr>
+        <w:t>Calculate and save weights for .mat data in the same format as the original data (matrix or vector).</w:t>
+      </w:r>
+      <w:r>
+        <w:rPr>
+          <w:color w:val="FF0000"/>
+        </w:rPr>
+        <w:t xml:space="preserve"> This matrix can then be used by other software packages to construct better visualizations of the weights (e.g. using BrainViewer for connectivity).</w:t>
+      </w:r>
+    </w:p>
+    <w:p>
       <w:r>
         <w:br w:type="page"/>
       </w:r>
@@ -4327,29 +3849,7 @@
         <w:rPr>
           <w:color w:val="C00000"/>
         </w:rPr>
-        <w:t xml:space="preserve">Change from folds to </w:t>
-      </w:r>
-      <w:proofErr w:type="spellStart"/>
-      <w:proofErr w:type="gramStart"/>
-      <w:r>
-        <w:rPr>
-          <w:color w:val="C00000"/>
-        </w:rPr>
-        <w:t>PRT.model.output</w:t>
-      </w:r>
-      <w:proofErr w:type="spellEnd"/>
-      <w:r>
-        <w:rPr>
-          <w:color w:val="C00000"/>
-        </w:rPr>
-        <w:t>(</w:t>
-      </w:r>
-      <w:proofErr w:type="gramEnd"/>
-      <w:r>
-        <w:rPr>
-          <w:color w:val="C00000"/>
-        </w:rPr>
-        <w:t>k) when one model per kernel specified. This will display the average performance for each kernel instead of for each fold.</w:t>
+        <w:t>Change from folds to PRT.model.output(k) when one model per kernel specified. This will display the average performance for each kernel instead of for each fold.</w:t>
       </w:r>
     </w:p>
     <w:p>
@@ -4383,6 +3883,60 @@
           <w:color w:val="C00000"/>
         </w:rPr>
         <w:t>How to display MEEG weights and betas?</w:t>
+      </w:r>
+    </w:p>
+    <w:p>
+      <w:pPr>
+        <w:pStyle w:val="ListParagraph"/>
+        <w:numPr>
+          <w:ilvl w:val="0"/>
+          <w:numId w:val="7"/>
+        </w:numPr>
+        <w:rPr>
+          <w:color w:val="FF0000"/>
+        </w:rPr>
+      </w:pPr>
+      <w:r>
+        <w:rPr>
+          <w:color w:val="FF0000"/>
+        </w:rPr>
+        <w:t xml:space="preserve">Allow a very simple visualization of the .mat weights (e.g. display the weights </w:t>
+      </w:r>
+      <w:r>
+        <w:rPr>
+          <w:color w:val="FF0000"/>
+        </w:rPr>
+        <w:t xml:space="preserve">as a </w:t>
+      </w:r>
+      <w:r>
+        <w:rPr>
+          <w:color w:val="FF0000"/>
+        </w:rPr>
+        <w:t>color coded</w:t>
+      </w:r>
+      <w:r>
+        <w:rPr>
+          <w:color w:val="FF0000"/>
+        </w:rPr>
+        <w:t xml:space="preserve"> </w:t>
+      </w:r>
+      <w:r>
+        <w:rPr>
+          <w:color w:val="FF0000"/>
+        </w:rPr>
+        <w:t xml:space="preserve">matrix or </w:t>
+      </w:r>
+      <w:r>
+        <w:rPr>
+          <w:color w:val="FF0000"/>
+        </w:rPr>
+        <w:t xml:space="preserve">a box plot if the original data is </w:t>
+      </w:r>
+      <w:r>
+        <w:rPr>
+          <w:color w:val="FF0000"/>
+        </w:rPr>
+        <w:t>a vector).</w:t>
       </w:r>
     </w:p>
     <w:sectPr>
@@ -4396,8 +3950,8 @@
 </file>
 
 <file path=word/numbering.xml><?xml version="1.0" encoding="utf-8"?>
-<w:numbering xmlns:wpc="http://schemas.microsoft.com/office/word/2010/wordprocessingCanvas" xmlns:mc="http://schemas.openxmlformats.org/markup-compatibility/2006" xmlns:o="urn:schemas-microsoft-com:office:office" xmlns:r="http://schemas.openxmlformats.org/officeDocument/2006/relationships" xmlns:m="http://schemas.openxmlformats.org/officeDocument/2006/math" xmlns:v="urn:schemas-microsoft-com:vml" xmlns:wp14="http://schemas.microsoft.com/office/word/2010/wordprocessingDrawing" xmlns:wp="http://schemas.openxmlformats.org/drawingml/2006/wordprocessingDrawing" xmlns:w10="urn:schemas-microsoft-com:office:word" xmlns:w="http://schemas.openxmlformats.org/wordprocessingml/2006/main" xmlns:w14="http://schemas.microsoft.com/office/word/2010/wordml" xmlns:w15="http://schemas.microsoft.com/office/word/2012/wordml" xmlns:wpg="http://schemas.microsoft.com/office/word/2010/wordprocessingGroup" xmlns:wpi="http://schemas.microsoft.com/office/word/2010/wordprocessingInk" xmlns:wne="http://schemas.microsoft.com/office/word/2006/wordml" xmlns:wps="http://schemas.microsoft.com/office/word/2010/wordprocessingShape" mc:Ignorable="w14 w15 wp14">
-  <w:abstractNum w:abstractNumId="0" w15:restartNumberingAfterBreak="0">
+<w:numbering xmlns:wpc="http://schemas.microsoft.com/office/word/2010/wordprocessingCanvas" xmlns:mo="http://schemas.microsoft.com/office/mac/office/2008/main" xmlns:mc="http://schemas.openxmlformats.org/markup-compatibility/2006" xmlns:mv="urn:schemas-microsoft-com:mac:vml" xmlns:o="urn:schemas-microsoft-com:office:office" xmlns:r="http://schemas.openxmlformats.org/officeDocument/2006/relationships" xmlns:m="http://schemas.openxmlformats.org/officeDocument/2006/math" xmlns:v="urn:schemas-microsoft-com:vml" xmlns:wp14="http://schemas.microsoft.com/office/word/2010/wordprocessingDrawing" xmlns:wp="http://schemas.openxmlformats.org/drawingml/2006/wordprocessingDrawing" xmlns:w10="urn:schemas-microsoft-com:office:word" xmlns:w="http://schemas.openxmlformats.org/wordprocessingml/2006/main" xmlns:w14="http://schemas.microsoft.com/office/word/2010/wordml" xmlns:wpg="http://schemas.microsoft.com/office/word/2010/wordprocessingGroup" xmlns:wpi="http://schemas.microsoft.com/office/word/2010/wordprocessingInk" xmlns:wne="http://schemas.microsoft.com/office/word/2006/wordml" xmlns:wps="http://schemas.microsoft.com/office/word/2010/wordprocessingShape" mc:Ignorable="w14 wp14">
+  <w:abstractNum w:abstractNumId="0">
     <w:nsid w:val="0B031607"/>
     <w:multiLevelType w:val="hybridMultilevel"/>
     <w:tmpl w:val="188AE9FC"/>
@@ -4509,7 +4063,7 @@
       </w:rPr>
     </w:lvl>
   </w:abstractNum>
-  <w:abstractNum w:abstractNumId="1" w15:restartNumberingAfterBreak="0">
+  <w:abstractNum w:abstractNumId="1">
     <w:nsid w:val="0D84304B"/>
     <w:multiLevelType w:val="hybridMultilevel"/>
     <w:tmpl w:val="EB50169A"/>
@@ -4621,7 +4175,7 @@
       </w:rPr>
     </w:lvl>
   </w:abstractNum>
-  <w:abstractNum w:abstractNumId="2" w15:restartNumberingAfterBreak="0">
+  <w:abstractNum w:abstractNumId="2">
     <w:nsid w:val="27797ECF"/>
     <w:multiLevelType w:val="hybridMultilevel"/>
     <w:tmpl w:val="341EF100"/>
@@ -4733,7 +4287,7 @@
       </w:rPr>
     </w:lvl>
   </w:abstractNum>
-  <w:abstractNum w:abstractNumId="3" w15:restartNumberingAfterBreak="0">
+  <w:abstractNum w:abstractNumId="3">
     <w:nsid w:val="363D08DF"/>
     <w:multiLevelType w:val="hybridMultilevel"/>
     <w:tmpl w:val="1AD6CD34"/>
@@ -4845,7 +4399,7 @@
       </w:rPr>
     </w:lvl>
   </w:abstractNum>
-  <w:abstractNum w:abstractNumId="4" w15:restartNumberingAfterBreak="0">
+  <w:abstractNum w:abstractNumId="4">
     <w:nsid w:val="3B9333B8"/>
     <w:multiLevelType w:val="hybridMultilevel"/>
     <w:tmpl w:val="A502D1C8"/>
@@ -4957,7 +4511,7 @@
       </w:rPr>
     </w:lvl>
   </w:abstractNum>
-  <w:abstractNum w:abstractNumId="5" w15:restartNumberingAfterBreak="0">
+  <w:abstractNum w:abstractNumId="5">
     <w:nsid w:val="3C4E32FC"/>
     <w:multiLevelType w:val="hybridMultilevel"/>
     <w:tmpl w:val="766EDD44"/>
@@ -5069,7 +4623,7 @@
       </w:rPr>
     </w:lvl>
   </w:abstractNum>
-  <w:abstractNum w:abstractNumId="6" w15:restartNumberingAfterBreak="0">
+  <w:abstractNum w:abstractNumId="6">
     <w:nsid w:val="6A0E6508"/>
     <w:multiLevelType w:val="hybridMultilevel"/>
     <w:tmpl w:val="4020624C"/>
@@ -5206,7 +4760,7 @@
 </file>
 
 <file path=word/styles.xml><?xml version="1.0" encoding="utf-8"?>
-<w:styles xmlns:mc="http://schemas.openxmlformats.org/markup-compatibility/2006" xmlns:r="http://schemas.openxmlformats.org/officeDocument/2006/relationships" xmlns:w="http://schemas.openxmlformats.org/wordprocessingml/2006/main" xmlns:w14="http://schemas.microsoft.com/office/word/2010/wordml" xmlns:w15="http://schemas.microsoft.com/office/word/2012/wordml" mc:Ignorable="w14 w15">
+<w:styles xmlns:mc="http://schemas.openxmlformats.org/markup-compatibility/2006" xmlns:r="http://schemas.openxmlformats.org/officeDocument/2006/relationships" xmlns:w="http://schemas.openxmlformats.org/wordprocessingml/2006/main" xmlns:w14="http://schemas.microsoft.com/office/word/2010/wordml" mc:Ignorable="w14">
   <w:docDefaults>
     <w:rPrDefault>
       <w:rPr>
@@ -5222,378 +4776,153 @@
       </w:pPr>
     </w:pPrDefault>
   </w:docDefaults>
-  <w:latentStyles w:defLockedState="0" w:defUIPriority="99" w:defSemiHidden="0" w:defUnhideWhenUsed="0" w:defQFormat="0" w:count="371">
-    <w:lsdException w:name="Normal" w:uiPriority="0" w:qFormat="1"/>
-    <w:lsdException w:name="heading 1" w:uiPriority="9" w:qFormat="1"/>
-    <w:lsdException w:name="heading 2" w:semiHidden="1" w:uiPriority="9" w:unhideWhenUsed="1" w:qFormat="1"/>
-    <w:lsdException w:name="heading 3" w:semiHidden="1" w:uiPriority="9" w:unhideWhenUsed="1" w:qFormat="1"/>
-    <w:lsdException w:name="heading 4" w:semiHidden="1" w:uiPriority="9" w:unhideWhenUsed="1" w:qFormat="1"/>
-    <w:lsdException w:name="heading 5" w:semiHidden="1" w:uiPriority="9" w:unhideWhenUsed="1" w:qFormat="1"/>
-    <w:lsdException w:name="heading 6" w:semiHidden="1" w:uiPriority="9" w:unhideWhenUsed="1" w:qFormat="1"/>
-    <w:lsdException w:name="heading 7" w:semiHidden="1" w:uiPriority="9" w:unhideWhenUsed="1" w:qFormat="1"/>
-    <w:lsdException w:name="heading 8" w:semiHidden="1" w:uiPriority="9" w:unhideWhenUsed="1" w:qFormat="1"/>
-    <w:lsdException w:name="heading 9" w:semiHidden="1" w:uiPriority="9" w:unhideWhenUsed="1" w:qFormat="1"/>
-    <w:lsdException w:name="index 1" w:semiHidden="1" w:unhideWhenUsed="1"/>
-    <w:lsdException w:name="index 2" w:semiHidden="1" w:unhideWhenUsed="1"/>
-    <w:lsdException w:name="index 3" w:semiHidden="1" w:unhideWhenUsed="1"/>
-    <w:lsdException w:name="index 4" w:semiHidden="1" w:unhideWhenUsed="1"/>
-    <w:lsdException w:name="index 5" w:semiHidden="1" w:unhideWhenUsed="1"/>
-    <w:lsdException w:name="index 6" w:semiHidden="1" w:unhideWhenUsed="1"/>
-    <w:lsdException w:name="index 7" w:semiHidden="1" w:unhideWhenUsed="1"/>
-    <w:lsdException w:name="index 8" w:semiHidden="1" w:unhideWhenUsed="1"/>
-    <w:lsdException w:name="index 9" w:semiHidden="1" w:unhideWhenUsed="1"/>
-    <w:lsdException w:name="toc 1" w:semiHidden="1" w:uiPriority="39" w:unhideWhenUsed="1"/>
-    <w:lsdException w:name="toc 2" w:semiHidden="1" w:uiPriority="39" w:unhideWhenUsed="1"/>
-    <w:lsdException w:name="toc 3" w:semiHidden="1" w:uiPriority="39" w:unhideWhenUsed="1"/>
-    <w:lsdException w:name="toc 4" w:semiHidden="1" w:uiPriority="39" w:unhideWhenUsed="1"/>
-    <w:lsdException w:name="toc 5" w:semiHidden="1" w:uiPriority="39" w:unhideWhenUsed="1"/>
-    <w:lsdException w:name="toc 6" w:semiHidden="1" w:uiPriority="39" w:unhideWhenUsed="1"/>
-    <w:lsdException w:name="toc 7" w:semiHidden="1" w:uiPriority="39" w:unhideWhenUsed="1"/>
-    <w:lsdException w:name="toc 8" w:semiHidden="1" w:uiPriority="39" w:unhideWhenUsed="1"/>
-    <w:lsdException w:name="toc 9" w:semiHidden="1" w:uiPriority="39" w:unhideWhenUsed="1"/>
-    <w:lsdException w:name="Normal Indent" w:semiHidden="1" w:unhideWhenUsed="1"/>
-    <w:lsdException w:name="footnote text" w:semiHidden="1" w:unhideWhenUsed="1"/>
-    <w:lsdException w:name="annotation text" w:semiHidden="1" w:unhideWhenUsed="1"/>
-    <w:lsdException w:name="header" w:semiHidden="1" w:unhideWhenUsed="1"/>
-    <w:lsdException w:name="footer" w:semiHidden="1" w:unhideWhenUsed="1"/>
-    <w:lsdException w:name="index heading" w:semiHidden="1" w:unhideWhenUsed="1"/>
-    <w:lsdException w:name="caption" w:semiHidden="1" w:uiPriority="35" w:unhideWhenUsed="1" w:qFormat="1"/>
-    <w:lsdException w:name="table of figures" w:semiHidden="1" w:unhideWhenUsed="1"/>
-    <w:lsdException w:name="envelope address" w:semiHidden="1" w:unhideWhenUsed="1"/>
-    <w:lsdException w:name="envelope return" w:semiHidden="1" w:unhideWhenUsed="1"/>
-    <w:lsdException w:name="footnote reference" w:semiHidden="1" w:unhideWhenUsed="1"/>
-    <w:lsdException w:name="annotation reference" w:semiHidden="1" w:unhideWhenUsed="1"/>
-    <w:lsdException w:name="line number" w:semiHidden="1" w:unhideWhenUsed="1"/>
-    <w:lsdException w:name="page number" w:semiHidden="1" w:unhideWhenUsed="1"/>
-    <w:lsdException w:name="endnote reference" w:semiHidden="1" w:unhideWhenUsed="1"/>
-    <w:lsdException w:name="endnote text" w:semiHidden="1" w:unhideWhenUsed="1"/>
-    <w:lsdException w:name="table of authorities" w:semiHidden="1" w:unhideWhenUsed="1"/>
-    <w:lsdException w:name="macro" w:semiHidden="1" w:unhideWhenUsed="1"/>
-    <w:lsdException w:name="toa heading" w:semiHidden="1" w:unhideWhenUsed="1"/>
-    <w:lsdException w:name="List" w:semiHidden="1" w:unhideWhenUsed="1"/>
-    <w:lsdException w:name="List Bullet" w:semiHidden="1" w:unhideWhenUsed="1"/>
-    <w:lsdException w:name="List Number" w:semiHidden="1" w:unhideWhenUsed="1"/>
-    <w:lsdException w:name="List 2" w:semiHidden="1" w:unhideWhenUsed="1"/>
-    <w:lsdException w:name="List 3" w:semiHidden="1" w:unhideWhenUsed="1"/>
-    <w:lsdException w:name="List 4" w:semiHidden="1" w:unhideWhenUsed="1"/>
-    <w:lsdException w:name="List 5" w:semiHidden="1" w:unhideWhenUsed="1"/>
-    <w:lsdException w:name="List Bullet 2" w:semiHidden="1" w:unhideWhenUsed="1"/>
-    <w:lsdException w:name="List Bullet 3" w:semiHidden="1" w:unhideWhenUsed="1"/>
-    <w:lsdException w:name="List Bullet 4" w:semiHidden="1" w:unhideWhenUsed="1"/>
-    <w:lsdException w:name="List Bullet 5" w:semiHidden="1" w:unhideWhenUsed="1"/>
-    <w:lsdException w:name="List Number 2" w:semiHidden="1" w:unhideWhenUsed="1"/>
-    <w:lsdException w:name="List Number 3" w:semiHidden="1" w:unhideWhenUsed="1"/>
-    <w:lsdException w:name="List Number 4" w:semiHidden="1" w:unhideWhenUsed="1"/>
-    <w:lsdException w:name="List Number 5" w:semiHidden="1" w:unhideWhenUsed="1"/>
-    <w:lsdException w:name="Title" w:uiPriority="10" w:qFormat="1"/>
-    <w:lsdException w:name="Closing" w:semiHidden="1" w:unhideWhenUsed="1"/>
-    <w:lsdException w:name="Signature" w:semiHidden="1" w:unhideWhenUsed="1"/>
-    <w:lsdException w:name="Default Paragraph Font" w:semiHidden="1" w:uiPriority="1" w:unhideWhenUsed="1"/>
-    <w:lsdException w:name="Body Text" w:semiHidden="1" w:unhideWhenUsed="1"/>
-    <w:lsdException w:name="Body Text Indent" w:semiHidden="1" w:unhideWhenUsed="1"/>
-    <w:lsdException w:name="List Continue" w:semiHidden="1" w:unhideWhenUsed="1"/>
-    <w:lsdException w:name="List Continue 2" w:semiHidden="1" w:unhideWhenUsed="1"/>
-    <w:lsdException w:name="List Continue 3" w:semiHidden="1" w:unhideWhenUsed="1"/>
-    <w:lsdException w:name="List Continue 4" w:semiHidden="1" w:unhideWhenUsed="1"/>
-    <w:lsdException w:name="List Continue 5" w:semiHidden="1" w:unhideWhenUsed="1"/>
-    <w:lsdException w:name="Message Header" w:semiHidden="1" w:unhideWhenUsed="1"/>
-    <w:lsdException w:name="Subtitle" w:uiPriority="11" w:qFormat="1"/>
-    <w:lsdException w:name="Salutation" w:semiHidden="1" w:unhideWhenUsed="1"/>
-    <w:lsdException w:name="Date" w:semiHidden="1" w:unhideWhenUsed="1"/>
-    <w:lsdException w:name="Body Text First Indent" w:semiHidden="1" w:unhideWhenUsed="1"/>
-    <w:lsdException w:name="Body Text First Indent 2" w:semiHidden="1" w:unhideWhenUsed="1"/>
-    <w:lsdException w:name="Note Heading" w:semiHidden="1" w:unhideWhenUsed="1"/>
-    <w:lsdException w:name="Body Text 2" w:semiHidden="1" w:unhideWhenUsed="1"/>
-    <w:lsdException w:name="Body Text 3" w:semiHidden="1" w:unhideWhenUsed="1"/>
-    <w:lsdException w:name="Body Text Indent 2" w:semiHidden="1" w:unhideWhenUsed="1"/>
-    <w:lsdException w:name="Body Text Indent 3" w:semiHidden="1" w:unhideWhenUsed="1"/>
-    <w:lsdException w:name="Block Text" w:semiHidden="1" w:unhideWhenUsed="1"/>
-    <w:lsdException w:name="Hyperlink" w:semiHidden="1" w:unhideWhenUsed="1"/>
-    <w:lsdException w:name="FollowedHyperlink" w:semiHidden="1" w:unhideWhenUsed="1"/>
-    <w:lsdException w:name="Strong" w:uiPriority="22" w:qFormat="1"/>
-    <w:lsdException w:name="Emphasis" w:uiPriority="20" w:qFormat="1"/>
-    <w:lsdException w:name="Document Map" w:semiHidden="1" w:unhideWhenUsed="1"/>
-    <w:lsdException w:name="Plain Text" w:semiHidden="1" w:unhideWhenUsed="1"/>
-    <w:lsdException w:name="E-mail Signature" w:semiHidden="1" w:unhideWhenUsed="1"/>
-    <w:lsdException w:name="HTML Top of Form" w:semiHidden="1" w:unhideWhenUsed="1"/>
-    <w:lsdException w:name="HTML Bottom of Form" w:semiHidden="1" w:unhideWhenUsed="1"/>
-    <w:lsdException w:name="Normal (Web)" w:semiHidden="1" w:unhideWhenUsed="1"/>
-    <w:lsdException w:name="HTML Acronym" w:semiHidden="1" w:unhideWhenUsed="1"/>
-    <w:lsdException w:name="HTML Address" w:semiHidden="1" w:unhideWhenUsed="1"/>
-    <w:lsdException w:name="HTML Cite" w:semiHidden="1" w:unhideWhenUsed="1"/>
-    <w:lsdException w:name="HTML Code" w:semiHidden="1" w:unhideWhenUsed="1"/>
-    <w:lsdException w:name="HTML Definition" w:semiHidden="1" w:unhideWhenUsed="1"/>
-    <w:lsdException w:name="HTML Keyboard" w:semiHidden="1" w:unhideWhenUsed="1"/>
-    <w:lsdException w:name="HTML Preformatted" w:semiHidden="1" w:unhideWhenUsed="1"/>
-    <w:lsdException w:name="HTML Sample" w:semiHidden="1" w:unhideWhenUsed="1"/>
-    <w:lsdException w:name="HTML Typewriter" w:semiHidden="1" w:unhideWhenUsed="1"/>
-    <w:lsdException w:name="HTML Variable" w:semiHidden="1" w:unhideWhenUsed="1"/>
-    <w:lsdException w:name="Normal Table" w:semiHidden="1" w:unhideWhenUsed="1"/>
-    <w:lsdException w:name="annotation subject" w:semiHidden="1" w:unhideWhenUsed="1"/>
-    <w:lsdException w:name="No List" w:semiHidden="1" w:unhideWhenUsed="1"/>
-    <w:lsdException w:name="Outline List 1" w:semiHidden="1" w:unhideWhenUsed="1"/>
-    <w:lsdException w:name="Outline List 2" w:semiHidden="1" w:unhideWhenUsed="1"/>
-    <w:lsdException w:name="Outline List 3" w:semiHidden="1" w:unhideWhenUsed="1"/>
-    <w:lsdException w:name="Table Simple 1" w:semiHidden="1" w:unhideWhenUsed="1"/>
-    <w:lsdException w:name="Table Simple 2" w:semiHidden="1" w:unhideWhenUsed="1"/>
-    <w:lsdException w:name="Table Simple 3" w:semiHidden="1" w:unhideWhenUsed="1"/>
-    <w:lsdException w:name="Table Classic 1" w:semiHidden="1" w:unhideWhenUsed="1"/>
-    <w:lsdException w:name="Table Classic 2" w:semiHidden="1" w:unhideWhenUsed="1"/>
-    <w:lsdException w:name="Table Classic 3" w:semiHidden="1" w:unhideWhenUsed="1"/>
-    <w:lsdException w:name="Table Classic 4" w:semiHidden="1" w:unhideWhenUsed="1"/>
-    <w:lsdException w:name="Table Colorful 1" w:semiHidden="1" w:unhideWhenUsed="1"/>
-    <w:lsdException w:name="Table Colorful 2" w:semiHidden="1" w:unhideWhenUsed="1"/>
-    <w:lsdException w:name="Table Colorful 3" w:semiHidden="1" w:unhideWhenUsed="1"/>
-    <w:lsdException w:name="Table Columns 1" w:semiHidden="1" w:unhideWhenUsed="1"/>
-    <w:lsdException w:name="Table Columns 2" w:semiHidden="1" w:unhideWhenUsed="1"/>
-    <w:lsdException w:name="Table Columns 3" w:semiHidden="1" w:unhideWhenUsed="1"/>
-    <w:lsdException w:name="Table Columns 4" w:semiHidden="1" w:unhideWhenUsed="1"/>
-    <w:lsdException w:name="Table Columns 5" w:semiHidden="1" w:unhideWhenUsed="1"/>
-    <w:lsdException w:name="Table Grid 1" w:semiHidden="1" w:unhideWhenUsed="1"/>
-    <w:lsdException w:name="Table Grid 2" w:semiHidden="1" w:unhideWhenUsed="1"/>
-    <w:lsdException w:name="Table Grid 3" w:semiHidden="1" w:unhideWhenUsed="1"/>
-    <w:lsdException w:name="Table Grid 4" w:semiHidden="1" w:unhideWhenUsed="1"/>
-    <w:lsdException w:name="Table Grid 5" w:semiHidden="1" w:unhideWhenUsed="1"/>
-    <w:lsdException w:name="Table Grid 6" w:semiHidden="1" w:unhideWhenUsed="1"/>
-    <w:lsdException w:name="Table Grid 7" w:semiHidden="1" w:unhideWhenUsed="1"/>
-    <w:lsdException w:name="Table Grid 8" w:semiHidden="1" w:unhideWhenUsed="1"/>
-    <w:lsdException w:name="Table List 1" w:semiHidden="1" w:unhideWhenUsed="1"/>
-    <w:lsdException w:name="Table List 2" w:semiHidden="1" w:unhideWhenUsed="1"/>
-    <w:lsdException w:name="Table List 3" w:semiHidden="1" w:unhideWhenUsed="1"/>
-    <w:lsdException w:name="Table List 4" w:semiHidden="1" w:unhideWhenUsed="1"/>
-    <w:lsdException w:name="Table List 5" w:semiHidden="1" w:unhideWhenUsed="1"/>
-    <w:lsdException w:name="Table List 6" w:semiHidden="1" w:unhideWhenUsed="1"/>
-    <w:lsdException w:name="Table List 7" w:semiHidden="1" w:unhideWhenUsed="1"/>
-    <w:lsdException w:name="Table List 8" w:semiHidden="1" w:unhideWhenUsed="1"/>
-    <w:lsdException w:name="Table 3D effects 1" w:semiHidden="1" w:unhideWhenUsed="1"/>
-    <w:lsdException w:name="Table 3D effects 2" w:semiHidden="1" w:unhideWhenUsed="1"/>
-    <w:lsdException w:name="Table 3D effects 3" w:semiHidden="1" w:unhideWhenUsed="1"/>
-    <w:lsdException w:name="Table Contemporary" w:semiHidden="1" w:unhideWhenUsed="1"/>
-    <w:lsdException w:name="Table Elegant" w:semiHidden="1" w:unhideWhenUsed="1"/>
-    <w:lsdException w:name="Table Professional" w:semiHidden="1" w:unhideWhenUsed="1"/>
-    <w:lsdException w:name="Table Subtle 1" w:semiHidden="1" w:unhideWhenUsed="1"/>
-    <w:lsdException w:name="Table Subtle 2" w:semiHidden="1" w:unhideWhenUsed="1"/>
-    <w:lsdException w:name="Table Web 1" w:semiHidden="1" w:unhideWhenUsed="1"/>
-    <w:lsdException w:name="Table Web 2" w:semiHidden="1" w:unhideWhenUsed="1"/>
-    <w:lsdException w:name="Table Web 3" w:semiHidden="1" w:unhideWhenUsed="1"/>
-    <w:lsdException w:name="Balloon Text" w:semiHidden="1" w:unhideWhenUsed="1"/>
-    <w:lsdException w:name="Table Grid" w:uiPriority="39"/>
-    <w:lsdException w:name="Table Theme" w:semiHidden="1" w:unhideWhenUsed="1"/>
-    <w:lsdException w:name="Placeholder Text" w:semiHidden="1"/>
-    <w:lsdException w:name="No Spacing" w:uiPriority="1" w:qFormat="1"/>
-    <w:lsdException w:name="Light Shading" w:uiPriority="60"/>
-    <w:lsdException w:name="Light List" w:uiPriority="61"/>
-    <w:lsdException w:name="Light Grid" w:uiPriority="62"/>
-    <w:lsdException w:name="Medium Shading 1" w:uiPriority="63"/>
-    <w:lsdException w:name="Medium Shading 2" w:uiPriority="64"/>
-    <w:lsdException w:name="Medium List 1" w:uiPriority="65"/>
-    <w:lsdException w:name="Medium List 2" w:uiPriority="66"/>
-    <w:lsdException w:name="Medium Grid 1" w:uiPriority="67"/>
-    <w:lsdException w:name="Medium Grid 2" w:uiPriority="68"/>
-    <w:lsdException w:name="Medium Grid 3" w:uiPriority="69"/>
-    <w:lsdException w:name="Dark List" w:uiPriority="70"/>
-    <w:lsdException w:name="Colorful Shading" w:uiPriority="71"/>
-    <w:lsdException w:name="Colorful List" w:uiPriority="72"/>
-    <w:lsdException w:name="Colorful Grid" w:uiPriority="73"/>
-    <w:lsdException w:name="Light Shading Accent 1" w:uiPriority="60"/>
-    <w:lsdException w:name="Light List Accent 1" w:uiPriority="61"/>
-    <w:lsdException w:name="Light Grid Accent 1" w:uiPriority="62"/>
-    <w:lsdException w:name="Medium Shading 1 Accent 1" w:uiPriority="63"/>
-    <w:lsdException w:name="Medium Shading 2 Accent 1" w:uiPriority="64"/>
-    <w:lsdException w:name="Medium List 1 Accent 1" w:uiPriority="65"/>
-    <w:lsdException w:name="Revision" w:semiHidden="1"/>
-    <w:lsdException w:name="List Paragraph" w:uiPriority="34" w:qFormat="1"/>
-    <w:lsdException w:name="Quote" w:uiPriority="29" w:qFormat="1"/>
-    <w:lsdException w:name="Intense Quote" w:uiPriority="30" w:qFormat="1"/>
-    <w:lsdException w:name="Medium List 2 Accent 1" w:uiPriority="66"/>
-    <w:lsdException w:name="Medium Grid 1 Accent 1" w:uiPriority="67"/>
-    <w:lsdException w:name="Medium Grid 2 Accent 1" w:uiPriority="68"/>
-    <w:lsdException w:name="Medium Grid 3 Accent 1" w:uiPriority="69"/>
-    <w:lsdException w:name="Dark List Accent 1" w:uiPriority="70"/>
-    <w:lsdException w:name="Colorful Shading Accent 1" w:uiPriority="71"/>
-    <w:lsdException w:name="Colorful List Accent 1" w:uiPriority="72"/>
-    <w:lsdException w:name="Colorful Grid Accent 1" w:uiPriority="73"/>
-    <w:lsdException w:name="Light Shading Accent 2" w:uiPriority="60"/>
-    <w:lsdException w:name="Light List Accent 2" w:uiPriority="61"/>
-    <w:lsdException w:name="Light Grid Accent 2" w:uiPriority="62"/>
-    <w:lsdException w:name="Medium Shading 1 Accent 2" w:uiPriority="63"/>
-    <w:lsdException w:name="Medium Shading 2 Accent 2" w:uiPriority="64"/>
-    <w:lsdException w:name="Medium List 1 Accent 2" w:uiPriority="65"/>
-    <w:lsdException w:name="Medium List 2 Accent 2" w:uiPriority="66"/>
-    <w:lsdException w:name="Medium Grid 1 Accent 2" w:uiPriority="67"/>
-    <w:lsdException w:name="Medium Grid 2 Accent 2" w:uiPriority="68"/>
-    <w:lsdException w:name="Medium Grid 3 Accent 2" w:uiPriority="69"/>
-    <w:lsdException w:name="Dark List Accent 2" w:uiPriority="70"/>
-    <w:lsdException w:name="Colorful Shading Accent 2" w:uiPriority="71"/>
-    <w:lsdException w:name="Colorful List Accent 2" w:uiPriority="72"/>
-    <w:lsdException w:name="Colorful Grid Accent 2" w:uiPriority="73"/>
-    <w:lsdException w:name="Light Shading Accent 3" w:uiPriority="60"/>
-    <w:lsdException w:name="Light List Accent 3" w:uiPriority="61"/>
-    <w:lsdException w:name="Light Grid Accent 3" w:uiPriority="62"/>
-    <w:lsdException w:name="Medium Shading 1 Accent 3" w:uiPriority="63"/>
-    <w:lsdException w:name="Medium Shading 2 Accent 3" w:uiPriority="64"/>
-    <w:lsdException w:name="Medium List 1 Accent 3" w:uiPriority="65"/>
-    <w:lsdException w:name="Medium List 2 Accent 3" w:uiPriority="66"/>
-    <w:lsdException w:name="Medium Grid 1 Accent 3" w:uiPriority="67"/>
-    <w:lsdException w:name="Medium Grid 2 Accent 3" w:uiPriority="68"/>
-    <w:lsdException w:name="Medium Grid 3 Accent 3" w:uiPriority="69"/>
-    <w:lsdException w:name="Dark List Accent 3" w:uiPriority="70"/>
-    <w:lsdException w:name="Colorful Shading Accent 3" w:uiPriority="71"/>
-    <w:lsdException w:name="Colorful List Accent 3" w:uiPriority="72"/>
-    <w:lsdException w:name="Colorful Grid Accent 3" w:uiPriority="73"/>
-    <w:lsdException w:name="Light Shading Accent 4" w:uiPriority="60"/>
-    <w:lsdException w:name="Light List Accent 4" w:uiPriority="61"/>
-    <w:lsdException w:name="Light Grid Accent 4" w:uiPriority="62"/>
-    <w:lsdException w:name="Medium Shading 1 Accent 4" w:uiPriority="63"/>
-    <w:lsdException w:name="Medium Shading 2 Accent 4" w:uiPriority="64"/>
-    <w:lsdException w:name="Medium List 1 Accent 4" w:uiPriority="65"/>
-    <w:lsdException w:name="Medium List 2 Accent 4" w:uiPriority="66"/>
-    <w:lsdException w:name="Medium Grid 1 Accent 4" w:uiPriority="67"/>
-    <w:lsdException w:name="Medium Grid 2 Accent 4" w:uiPriority="68"/>
-    <w:lsdException w:name="Medium Grid 3 Accent 4" w:uiPriority="69"/>
-    <w:lsdException w:name="Dark List Accent 4" w:uiPriority="70"/>
-    <w:lsdException w:name="Colorful Shading Accent 4" w:uiPriority="71"/>
-    <w:lsdException w:name="Colorful List Accent 4" w:uiPriority="72"/>
-    <w:lsdException w:name="Colorful Grid Accent 4" w:uiPriority="73"/>
-    <w:lsdException w:name="Light Shading Accent 5" w:uiPriority="60"/>
-    <w:lsdException w:name="Light List Accent 5" w:uiPriority="61"/>
-    <w:lsdException w:name="Light Grid Accent 5" w:uiPriority="62"/>
-    <w:lsdException w:name="Medium Shading 1 Accent 5" w:uiPriority="63"/>
-    <w:lsdException w:name="Medium Shading 2 Accent 5" w:uiPriority="64"/>
-    <w:lsdException w:name="Medium List 1 Accent 5" w:uiPriority="65"/>
-    <w:lsdException w:name="Medium List 2 Accent 5" w:uiPriority="66"/>
-    <w:lsdException w:name="Medium Grid 1 Accent 5" w:uiPriority="67"/>
-    <w:lsdException w:name="Medium Grid 2 Accent 5" w:uiPriority="68"/>
-    <w:lsdException w:name="Medium Grid 3 Accent 5" w:uiPriority="69"/>
-    <w:lsdException w:name="Dark List Accent 5" w:uiPriority="70"/>
-    <w:lsdException w:name="Colorful Shading Accent 5" w:uiPriority="71"/>
-    <w:lsdException w:name="Colorful List Accent 5" w:uiPriority="72"/>
-    <w:lsdException w:name="Colorful Grid Accent 5" w:uiPriority="73"/>
-    <w:lsdException w:name="Light Shading Accent 6" w:uiPriority="60"/>
-    <w:lsdException w:name="Light List Accent 6" w:uiPriority="61"/>
-    <w:lsdException w:name="Light Grid Accent 6" w:uiPriority="62"/>
-    <w:lsdException w:name="Medium Shading 1 Accent 6" w:uiPriority="63"/>
-    <w:lsdException w:name="Medium Shading 2 Accent 6" w:uiPriority="64"/>
-    <w:lsdException w:name="Medium List 1 Accent 6" w:uiPriority="65"/>
-    <w:lsdException w:name="Medium List 2 Accent 6" w:uiPriority="66"/>
-    <w:lsdException w:name="Medium Grid 1 Accent 6" w:uiPriority="67"/>
-    <w:lsdException w:name="Medium Grid 2 Accent 6" w:uiPriority="68"/>
-    <w:lsdException w:name="Medium Grid 3 Accent 6" w:uiPriority="69"/>
-    <w:lsdException w:name="Dark List Accent 6" w:uiPriority="70"/>
-    <w:lsdException w:name="Colorful Shading Accent 6" w:uiPriority="71"/>
-    <w:lsdException w:name="Colorful List Accent 6" w:uiPriority="72"/>
-    <w:lsdException w:name="Colorful Grid Accent 6" w:uiPriority="73"/>
-    <w:lsdException w:name="Subtle Emphasis" w:uiPriority="19" w:qFormat="1"/>
-    <w:lsdException w:name="Intense Emphasis" w:uiPriority="21" w:qFormat="1"/>
-    <w:lsdException w:name="Subtle Reference" w:uiPriority="31" w:qFormat="1"/>
-    <w:lsdException w:name="Intense Reference" w:uiPriority="32" w:qFormat="1"/>
-    <w:lsdException w:name="Book Title" w:uiPriority="33" w:qFormat="1"/>
-    <w:lsdException w:name="Bibliography" w:semiHidden="1" w:uiPriority="37" w:unhideWhenUsed="1"/>
-    <w:lsdException w:name="TOC Heading" w:semiHidden="1" w:uiPriority="39" w:unhideWhenUsed="1" w:qFormat="1"/>
-    <w:lsdException w:name="Plain Table 1" w:uiPriority="41"/>
-    <w:lsdException w:name="Plain Table 2" w:uiPriority="42"/>
-    <w:lsdException w:name="Plain Table 3" w:uiPriority="43"/>
-    <w:lsdException w:name="Plain Table 4" w:uiPriority="44"/>
-    <w:lsdException w:name="Plain Table 5" w:uiPriority="45"/>
-    <w:lsdException w:name="Grid Table Light" w:uiPriority="40"/>
-    <w:lsdException w:name="Grid Table 1 Light" w:uiPriority="46"/>
-    <w:lsdException w:name="Grid Table 2" w:uiPriority="47"/>
-    <w:lsdException w:name="Grid Table 3" w:uiPriority="48"/>
-    <w:lsdException w:name="Grid Table 4" w:uiPriority="49"/>
-    <w:lsdException w:name="Grid Table 5 Dark" w:uiPriority="50"/>
-    <w:lsdException w:name="Grid Table 6 Colorful" w:uiPriority="51"/>
-    <w:lsdException w:name="Grid Table 7 Colorful" w:uiPriority="52"/>
-    <w:lsdException w:name="Grid Table 1 Light Accent 1" w:uiPriority="46"/>
-    <w:lsdException w:name="Grid Table 2 Accent 1" w:uiPriority="47"/>
-    <w:lsdException w:name="Grid Table 3 Accent 1" w:uiPriority="48"/>
-    <w:lsdException w:name="Grid Table 4 Accent 1" w:uiPriority="49"/>
-    <w:lsdException w:name="Grid Table 5 Dark Accent 1" w:uiPriority="50"/>
-    <w:lsdException w:name="Grid Table 6 Colorful Accent 1" w:uiPriority="51"/>
-    <w:lsdException w:name="Grid Table 7 Colorful Accent 1" w:uiPriority="52"/>
-    <w:lsdException w:name="Grid Table 1 Light Accent 2" w:uiPriority="46"/>
-    <w:lsdException w:name="Grid Table 2 Accent 2" w:uiPriority="47"/>
-    <w:lsdException w:name="Grid Table 3 Accent 2" w:uiPriority="48"/>
-    <w:lsdException w:name="Grid Table 4 Accent 2" w:uiPriority="49"/>
-    <w:lsdException w:name="Grid Table 5 Dark Accent 2" w:uiPriority="50"/>
-    <w:lsdException w:name="Grid Table 6 Colorful Accent 2" w:uiPriority="51"/>
-    <w:lsdException w:name="Grid Table 7 Colorful Accent 2" w:uiPriority="52"/>
-    <w:lsdException w:name="Grid Table 1 Light Accent 3" w:uiPriority="46"/>
-    <w:lsdException w:name="Grid Table 2 Accent 3" w:uiPriority="47"/>
-    <w:lsdException w:name="Grid Table 3 Accent 3" w:uiPriority="48"/>
-    <w:lsdException w:name="Grid Table 4 Accent 3" w:uiPriority="49"/>
-    <w:lsdException w:name="Grid Table 5 Dark Accent 3" w:uiPriority="50"/>
-    <w:lsdException w:name="Grid Table 6 Colorful Accent 3" w:uiPriority="51"/>
-    <w:lsdException w:name="Grid Table 7 Colorful Accent 3" w:uiPriority="52"/>
-    <w:lsdException w:name="Grid Table 1 Light Accent 4" w:uiPriority="46"/>
-    <w:lsdException w:name="Grid Table 2 Accent 4" w:uiPriority="47"/>
-    <w:lsdException w:name="Grid Table 3 Accent 4" w:uiPriority="48"/>
-    <w:lsdException w:name="Grid Table 4 Accent 4" w:uiPriority="49"/>
-    <w:lsdException w:name="Grid Table 5 Dark Accent 4" w:uiPriority="50"/>
-    <w:lsdException w:name="Grid Table 6 Colorful Accent 4" w:uiPriority="51"/>
-    <w:lsdException w:name="Grid Table 7 Colorful Accent 4" w:uiPriority="52"/>
-    <w:lsdException w:name="Grid Table 1 Light Accent 5" w:uiPriority="46"/>
-    <w:lsdException w:name="Grid Table 2 Accent 5" w:uiPriority="47"/>
-    <w:lsdException w:name="Grid Table 3 Accent 5" w:uiPriority="48"/>
-    <w:lsdException w:name="Grid Table 4 Accent 5" w:uiPriority="49"/>
-    <w:lsdException w:name="Grid Table 5 Dark Accent 5" w:uiPriority="50"/>
-    <w:lsdException w:name="Grid Table 6 Colorful Accent 5" w:uiPriority="51"/>
-    <w:lsdException w:name="Grid Table 7 Colorful Accent 5" w:uiPriority="52"/>
-    <w:lsdException w:name="Grid Table 1 Light Accent 6" w:uiPriority="46"/>
-    <w:lsdException w:name="Grid Table 2 Accent 6" w:uiPriority="47"/>
-    <w:lsdException w:name="Grid Table 3 Accent 6" w:uiPriority="48"/>
-    <w:lsdException w:name="Grid Table 4 Accent 6" w:uiPriority="49"/>
-    <w:lsdException w:name="Grid Table 5 Dark Accent 6" w:uiPriority="50"/>
-    <w:lsdException w:name="Grid Table 6 Colorful Accent 6" w:uiPriority="51"/>
-    <w:lsdException w:name="Grid Table 7 Colorful Accent 6" w:uiPriority="52"/>
-    <w:lsdException w:name="List Table 1 Light" w:uiPriority="46"/>
-    <w:lsdException w:name="List Table 2" w:uiPriority="47"/>
-    <w:lsdException w:name="List Table 3" w:uiPriority="48"/>
-    <w:lsdException w:name="List Table 4" w:uiPriority="49"/>
-    <w:lsdException w:name="List Table 5 Dark" w:uiPriority="50"/>
-    <w:lsdException w:name="List Table 6 Colorful" w:uiPriority="51"/>
-    <w:lsdException w:name="List Table 7 Colorful" w:uiPriority="52"/>
-    <w:lsdException w:name="List Table 1 Light Accent 1" w:uiPriority="46"/>
-    <w:lsdException w:name="List Table 2 Accent 1" w:uiPriority="47"/>
-    <w:lsdException w:name="List Table 3 Accent 1" w:uiPriority="48"/>
-    <w:lsdException w:name="List Table 4 Accent 1" w:uiPriority="49"/>
-    <w:lsdException w:name="List Table 5 Dark Accent 1" w:uiPriority="50"/>
-    <w:lsdException w:name="List Table 6 Colorful Accent 1" w:uiPriority="51"/>
-    <w:lsdException w:name="List Table 7 Colorful Accent 1" w:uiPriority="52"/>
-    <w:lsdException w:name="List Table 1 Light Accent 2" w:uiPriority="46"/>
-    <w:lsdException w:name="List Table 2 Accent 2" w:uiPriority="47"/>
-    <w:lsdException w:name="List Table 3 Accent 2" w:uiPriority="48"/>
-    <w:lsdException w:name="List Table 4 Accent 2" w:uiPriority="49"/>
-    <w:lsdException w:name="List Table 5 Dark Accent 2" w:uiPriority="50"/>
-    <w:lsdException w:name="List Table 6 Colorful Accent 2" w:uiPriority="51"/>
-    <w:lsdException w:name="List Table 7 Colorful Accent 2" w:uiPriority="52"/>
-    <w:lsdException w:name="List Table 1 Light Accent 3" w:uiPriority="46"/>
-    <w:lsdException w:name="List Table 2 Accent 3" w:uiPriority="47"/>
-    <w:lsdException w:name="List Table 3 Accent 3" w:uiPriority="48"/>
-    <w:lsdException w:name="List Table 4 Accent 3" w:uiPriority="49"/>
-    <w:lsdException w:name="List Table 5 Dark Accent 3" w:uiPriority="50"/>
-    <w:lsdException w:name="List Table 6 Colorful Accent 3" w:uiPriority="51"/>
-    <w:lsdException w:name="List Table 7 Colorful Accent 3" w:uiPriority="52"/>
-    <w:lsdException w:name="List Table 1 Light Accent 4" w:uiPriority="46"/>
-    <w:lsdException w:name="List Table 2 Accent 4" w:uiPriority="47"/>
-    <w:lsdException w:name="List Table 3 Accent 4" w:uiPriority="48"/>
-    <w:lsdException w:name="List Table 4 Accent 4" w:uiPriority="49"/>
-    <w:lsdException w:name="List Table 5 Dark Accent 4" w:uiPriority="50"/>
-    <w:lsdException w:name="List Table 6 Colorful Accent 4" w:uiPriority="51"/>
-    <w:lsdException w:name="List Table 7 Colorful Accent 4" w:uiPriority="52"/>
-    <w:lsdException w:name="List Table 1 Light Accent 5" w:uiPriority="46"/>
-    <w:lsdException w:name="List Table 2 Accent 5" w:uiPriority="47"/>
-    <w:lsdException w:name="List Table 3 Accent 5" w:uiPriority="48"/>
-    <w:lsdException w:name="List Table 4 Accent 5" w:uiPriority="49"/>
-    <w:lsdException w:name="List Table 5 Dark Accent 5" w:uiPriority="50"/>
-    <w:lsdException w:name="List Table 6 Colorful Accent 5" w:uiPriority="51"/>
-    <w:lsdException w:name="List Table 7 Colorful Accent 5" w:uiPriority="52"/>
-    <w:lsdException w:name="List Table 1 Light Accent 6" w:uiPriority="46"/>
-    <w:lsdException w:name="List Table 2 Accent 6" w:uiPriority="47"/>
-    <w:lsdException w:name="List Table 3 Accent 6" w:uiPriority="48"/>
-    <w:lsdException w:name="List Table 4 Accent 6" w:uiPriority="49"/>
-    <w:lsdException w:name="List Table 5 Dark Accent 6" w:uiPriority="50"/>
-    <w:lsdException w:name="List Table 6 Colorful Accent 6" w:uiPriority="51"/>
-    <w:lsdException w:name="List Table 7 Colorful Accent 6" w:uiPriority="52"/>
+  <w:latentStyles w:defLockedState="0" w:defUIPriority="99" w:defSemiHidden="1" w:defUnhideWhenUsed="1" w:defQFormat="0" w:count="276">
+    <w:lsdException w:name="Normal" w:semiHidden="0" w:uiPriority="0" w:unhideWhenUsed="0" w:qFormat="1"/>
+    <w:lsdException w:name="heading 1" w:semiHidden="0" w:uiPriority="9" w:unhideWhenUsed="0" w:qFormat="1"/>
+    <w:lsdException w:name="heading 2" w:uiPriority="9" w:qFormat="1"/>
+    <w:lsdException w:name="heading 3" w:uiPriority="9" w:qFormat="1"/>
+    <w:lsdException w:name="heading 4" w:uiPriority="9" w:qFormat="1"/>
+    <w:lsdException w:name="heading 5" w:uiPriority="9" w:qFormat="1"/>
+    <w:lsdException w:name="heading 6" w:uiPriority="9" w:qFormat="1"/>
+    <w:lsdException w:name="heading 7" w:uiPriority="9" w:qFormat="1"/>
+    <w:lsdException w:name="heading 8" w:uiPriority="9" w:qFormat="1"/>
+    <w:lsdException w:name="heading 9" w:uiPriority="9" w:qFormat="1"/>
+    <w:lsdException w:name="toc 1" w:uiPriority="39"/>
+    <w:lsdException w:name="toc 2" w:uiPriority="39"/>
+    <w:lsdException w:name="toc 3" w:uiPriority="39"/>
+    <w:lsdException w:name="toc 4" w:uiPriority="39"/>
+    <w:lsdException w:name="toc 5" w:uiPriority="39"/>
+    <w:lsdException w:name="toc 6" w:uiPriority="39"/>
+    <w:lsdException w:name="toc 7" w:uiPriority="39"/>
+    <w:lsdException w:name="toc 8" w:uiPriority="39"/>
+    <w:lsdException w:name="toc 9" w:uiPriority="39"/>
+    <w:lsdException w:name="caption" w:uiPriority="35" w:qFormat="1"/>
+    <w:lsdException w:name="Title" w:semiHidden="0" w:uiPriority="10" w:unhideWhenUsed="0" w:qFormat="1"/>
+    <w:lsdException w:name="Default Paragraph Font" w:uiPriority="1"/>
+    <w:lsdException w:name="Subtitle" w:semiHidden="0" w:uiPriority="11" w:unhideWhenUsed="0" w:qFormat="1"/>
+    <w:lsdException w:name="Strong" w:semiHidden="0" w:uiPriority="22" w:unhideWhenUsed="0" w:qFormat="1"/>
+    <w:lsdException w:name="Emphasis" w:semiHidden="0" w:uiPriority="20" w:unhideWhenUsed="0" w:qFormat="1"/>
+    <w:lsdException w:name="Table Grid" w:semiHidden="0" w:uiPriority="39" w:unhideWhenUsed="0"/>
+    <w:lsdException w:name="Note Level 1" w:semiHidden="0" w:unhideWhenUsed="0"/>
+    <w:lsdException w:name="Note Level 2" w:semiHidden="0" w:unhideWhenUsed="0"/>
+    <w:lsdException w:name="Note Level 3" w:semiHidden="0" w:unhideWhenUsed="0"/>
+    <w:lsdException w:name="Note Level 4" w:semiHidden="0" w:unhideWhenUsed="0"/>
+    <w:lsdException w:name="Note Level 5" w:semiHidden="0" w:unhideWhenUsed="0"/>
+    <w:lsdException w:name="Note Level 6" w:semiHidden="0" w:unhideWhenUsed="0"/>
+    <w:lsdException w:name="Note Level 7" w:semiHidden="0" w:unhideWhenUsed="0"/>
+    <w:lsdException w:name="Note Level 8" w:semiHidden="0" w:unhideWhenUsed="0"/>
+    <w:lsdException w:name="Note Level 9" w:semiHidden="0" w:unhideWhenUsed="0"/>
+    <w:lsdException w:name="Placeholder Text" w:unhideWhenUsed="0"/>
+    <w:lsdException w:name="No Spacing" w:semiHidden="0" w:uiPriority="1" w:unhideWhenUsed="0" w:qFormat="1"/>
+    <w:lsdException w:name="Light Shading" w:semiHidden="0" w:uiPriority="60" w:unhideWhenUsed="0"/>
+    <w:lsdException w:name="Light List" w:semiHidden="0" w:uiPriority="61" w:unhideWhenUsed="0"/>
+    <w:lsdException w:name="Light Grid" w:semiHidden="0" w:uiPriority="62" w:unhideWhenUsed="0"/>
+    <w:lsdException w:name="Medium Shading 1" w:semiHidden="0" w:uiPriority="63" w:unhideWhenUsed="0"/>
+    <w:lsdException w:name="Medium Shading 2" w:semiHidden="0" w:uiPriority="64" w:unhideWhenUsed="0"/>
+    <w:lsdException w:name="Medium List 1" w:semiHidden="0" w:uiPriority="65" w:unhideWhenUsed="0"/>
+    <w:lsdException w:name="Medium List 2" w:semiHidden="0" w:uiPriority="66" w:unhideWhenUsed="0"/>
+    <w:lsdException w:name="Medium Grid 1" w:semiHidden="0" w:uiPriority="67" w:unhideWhenUsed="0"/>
+    <w:lsdException w:name="Medium Grid 2" w:semiHidden="0" w:uiPriority="68" w:unhideWhenUsed="0"/>
+    <w:lsdException w:name="Medium Grid 3" w:semiHidden="0" w:uiPriority="69" w:unhideWhenUsed="0"/>
+    <w:lsdException w:name="Dark List" w:semiHidden="0" w:uiPriority="70" w:unhideWhenUsed="0"/>
+    <w:lsdException w:name="Colorful Shading" w:semiHidden="0" w:uiPriority="71" w:unhideWhenUsed="0"/>
+    <w:lsdException w:name="Colorful List" w:semiHidden="0" w:uiPriority="72" w:unhideWhenUsed="0"/>
+    <w:lsdException w:name="Colorful Grid" w:semiHidden="0" w:uiPriority="73" w:unhideWhenUsed="0"/>
+    <w:lsdException w:name="Light Shading Accent 1" w:semiHidden="0" w:uiPriority="60" w:unhideWhenUsed="0"/>
+    <w:lsdException w:name="Light List Accent 1" w:semiHidden="0" w:uiPriority="61" w:unhideWhenUsed="0"/>
+    <w:lsdException w:name="Light Grid Accent 1" w:semiHidden="0" w:uiPriority="62" w:unhideWhenUsed="0"/>
+    <w:lsdException w:name="Medium Shading 1 Accent 1" w:semiHidden="0" w:uiPriority="63" w:unhideWhenUsed="0"/>
+    <w:lsdException w:name="Medium Shading 2 Accent 1" w:semiHidden="0" w:uiPriority="64" w:unhideWhenUsed="0"/>
+    <w:lsdException w:name="Medium List 1 Accent 1" w:semiHidden="0" w:uiPriority="65" w:unhideWhenUsed="0"/>
+    <w:lsdException w:name="Revision" w:unhideWhenUsed="0"/>
+    <w:lsdException w:name="List Paragraph" w:semiHidden="0" w:uiPriority="34" w:unhideWhenUsed="0" w:qFormat="1"/>
+    <w:lsdException w:name="Quote" w:semiHidden="0" w:uiPriority="29" w:unhideWhenUsed="0" w:qFormat="1"/>
+    <w:lsdException w:name="Intense Quote" w:semiHidden="0" w:uiPriority="30" w:unhideWhenUsed="0" w:qFormat="1"/>
+    <w:lsdException w:name="Medium List 2 Accent 1" w:semiHidden="0" w:uiPriority="66" w:unhideWhenUsed="0"/>
+    <w:lsdException w:name="Medium Grid 1 Accent 1" w:semiHidden="0" w:uiPriority="67" w:unhideWhenUsed="0"/>
+    <w:lsdException w:name="Medium Grid 2 Accent 1" w:semiHidden="0" w:uiPriority="68" w:unhideWhenUsed="0"/>
+    <w:lsdException w:name="Medium Grid 3 Accent 1" w:semiHidden="0" w:uiPriority="69" w:unhideWhenUsed="0"/>
+    <w:lsdException w:name="Dark List Accent 1" w:semiHidden="0" w:uiPriority="70" w:unhideWhenUsed="0"/>
+    <w:lsdException w:name="Colorful Shading Accent 1" w:semiHidden="0" w:uiPriority="71" w:unhideWhenUsed="0"/>
+    <w:lsdException w:name="Colorful List Accent 1" w:semiHidden="0" w:uiPriority="72" w:unhideWhenUsed="0"/>
+    <w:lsdException w:name="Colorful Grid Accent 1" w:semiHidden="0" w:uiPriority="73" w:unhideWhenUsed="0"/>
+    <w:lsdException w:name="Light Shading Accent 2" w:semiHidden="0" w:uiPriority="60" w:unhideWhenUsed="0"/>
+    <w:lsdException w:name="Light List Accent 2" w:semiHidden="0" w:uiPriority="61" w:unhideWhenUsed="0"/>
+    <w:lsdException w:name="Light Grid Accent 2" w:semiHidden="0" w:uiPriority="62" w:unhideWhenUsed="0"/>
+    <w:lsdException w:name="Medium Shading 1 Accent 2" w:semiHidden="0" w:uiPriority="63" w:unhideWhenUsed="0"/>
+    <w:lsdException w:name="Medium Shading 2 Accent 2" w:semiHidden="0" w:uiPriority="64" w:unhideWhenUsed="0"/>
+    <w:lsdException w:name="Medium List 1 Accent 2" w:semiHidden="0" w:uiPriority="65" w:unhideWhenUsed="0"/>
+    <w:lsdException w:name="Medium List 2 Accent 2" w:semiHidden="0" w:uiPriority="66" w:unhideWhenUsed="0"/>
+    <w:lsdException w:name="Medium Grid 1 Accent 2" w:semiHidden="0" w:uiPriority="67" w:unhideWhenUsed="0"/>
+    <w:lsdException w:name="Medium Grid 2 Accent 2" w:semiHidden="0" w:uiPriority="68" w:unhideWhenUsed="0"/>
+    <w:lsdException w:name="Medium Grid 3 Accent 2" w:semiHidden="0" w:uiPriority="69" w:unhideWhenUsed="0"/>
+    <w:lsdException w:name="Dark List Accent 2" w:semiHidden="0" w:uiPriority="70" w:unhideWhenUsed="0"/>
+    <w:lsdException w:name="Colorful Shading Accent 2" w:semiHidden="0" w:uiPriority="71" w:unhideWhenUsed="0"/>
+    <w:lsdException w:name="Colorful List Accent 2" w:semiHidden="0" w:uiPriority="72" w:unhideWhenUsed="0"/>
+    <w:lsdException w:name="Colorful Grid Accent 2" w:semiHidden="0" w:uiPriority="73" w:unhideWhenUsed="0"/>
+    <w:lsdException w:name="Light Shading Accent 3" w:semiHidden="0" w:uiPriority="60" w:unhideWhenUsed="0"/>
+    <w:lsdException w:name="Light List Accent 3" w:semiHidden="0" w:uiPriority="61" w:unhideWhenUsed="0"/>
+    <w:lsdException w:name="Light Grid Accent 3" w:semiHidden="0" w:uiPriority="62" w:unhideWhenUsed="0"/>
+    <w:lsdException w:name="Medium Shading 1 Accent 3" w:semiHidden="0" w:uiPriority="63" w:unhideWhenUsed="0"/>
+    <w:lsdException w:name="Medium Shading 2 Accent 3" w:semiHidden="0" w:uiPriority="64" w:unhideWhenUsed="0"/>
+    <w:lsdException w:name="Medium List 1 Accent 3" w:semiHidden="0" w:uiPriority="65" w:unhideWhenUsed="0"/>
+    <w:lsdException w:name="Medium List 2 Accent 3" w:semiHidden="0" w:uiPriority="66" w:unhideWhenUsed="0"/>
+    <w:lsdException w:name="Medium Grid 1 Accent 3" w:semiHidden="0" w:uiPriority="67" w:unhideWhenUsed="0"/>
+    <w:lsdException w:name="Medium Grid 2 Accent 3" w:semiHidden="0" w:uiPriority="68" w:unhideWhenUsed="0"/>
+    <w:lsdException w:name="Medium Grid 3 Accent 3" w:semiHidden="0" w:uiPriority="69" w:unhideWhenUsed="0"/>
+    <w:lsdException w:name="Dark List Accent 3" w:semiHidden="0" w:uiPriority="70" w:unhideWhenUsed="0"/>
+    <w:lsdException w:name="Colorful Shading Accent 3" w:semiHidden="0" w:uiPriority="71" w:unhideWhenUsed="0"/>
+    <w:lsdException w:name="Colorful List Accent 3" w:semiHidden="0" w:uiPriority="72" w:unhideWhenUsed="0"/>
+    <w:lsdException w:name="Colorful Grid Accent 3" w:semiHidden="0" w:uiPriority="73" w:unhideWhenUsed="0"/>
+    <w:lsdException w:name="Light Shading Accent 4" w:semiHidden="0" w:uiPriority="60" w:unhideWhenUsed="0"/>
+    <w:lsdException w:name="Light List Accent 4" w:semiHidden="0" w:uiPriority="61" w:unhideWhenUsed="0"/>
+    <w:lsdException w:name="Light Grid Accent 4" w:semiHidden="0" w:uiPriority="62" w:unhideWhenUsed="0"/>
+    <w:lsdException w:name="Medium Shading 1 Accent 4" w:semiHidden="0" w:uiPriority="63" w:unhideWhenUsed="0"/>
+    <w:lsdException w:name="Medium Shading 2 Accent 4" w:semiHidden="0" w:uiPriority="64" w:unhideWhenUsed="0"/>
+    <w:lsdException w:name="Medium List 1 Accent 4" w:semiHidden="0" w:uiPriority="65" w:unhideWhenUsed="0"/>
+    <w:lsdException w:name="Medium List 2 Accent 4" w:semiHidden="0" w:uiPriority="66" w:unhideWhenUsed="0"/>
+    <w:lsdException w:name="Medium Grid 1 Accent 4" w:semiHidden="0" w:uiPriority="67" w:unhideWhenUsed="0"/>
+    <w:lsdException w:name="Medium Grid 2 Accent 4" w:semiHidden="0" w:uiPriority="68" w:unhideWhenUsed="0"/>
+    <w:lsdException w:name="Medium Grid 3 Accent 4" w:semiHidden="0" w:uiPriority="69" w:unhideWhenUsed="0"/>
+    <w:lsdException w:name="Dark List Accent 4" w:semiHidden="0" w:uiPriority="70" w:unhideWhenUsed="0"/>
+    <w:lsdException w:name="Colorful Shading Accent 4" w:semiHidden="0" w:uiPriority="71" w:unhideWhenUsed="0"/>
+    <w:lsdException w:name="Colorful List Accent 4" w:semiHidden="0" w:uiPriority="72" w:unhideWhenUsed="0"/>
+    <w:lsdException w:name="Colorful Grid Accent 4" w:semiHidden="0" w:uiPriority="73" w:unhideWhenUsed="0"/>
+    <w:lsdException w:name="Light Shading Accent 5" w:semiHidden="0" w:uiPriority="60" w:unhideWhenUsed="0"/>
+    <w:lsdException w:name="Light List Accent 5" w:semiHidden="0" w:uiPriority="61" w:unhideWhenUsed="0"/>
+    <w:lsdException w:name="Light Grid Accent 5" w:semiHidden="0" w:uiPriority="62" w:unhideWhenUsed="0"/>
+    <w:lsdException w:name="Medium Shading 1 Accent 5" w:semiHidden="0" w:uiPriority="63" w:unhideWhenUsed="0"/>
+    <w:lsdException w:name="Medium Shading 2 Accent 5" w:semiHidden="0" w:uiPriority="64" w:unhideWhenUsed="0"/>
+    <w:lsdException w:name="Medium List 1 Accent 5" w:semiHidden="0" w:uiPriority="65" w:unhideWhenUsed="0"/>
+    <w:lsdException w:name="Medium List 2 Accent 5" w:semiHidden="0" w:uiPriority="66" w:unhideWhenUsed="0"/>
+    <w:lsdException w:name="Medium Grid 1 Accent 5" w:semiHidden="0" w:uiPriority="67" w:unhideWhenUsed="0"/>
+    <w:lsdException w:name="Medium Grid 2 Accent 5" w:semiHidden="0" w:uiPriority="68" w:unhideWhenUsed="0"/>
+    <w:lsdException w:name="Medium Grid 3 Accent 5" w:semiHidden="0" w:uiPriority="69" w:unhideWhenUsed="0"/>
+    <w:lsdException w:name="Dark List Accent 5" w:semiHidden="0" w:uiPriority="70" w:unhideWhenUsed="0"/>
+    <w:lsdException w:name="Colorful Shading Accent 5" w:semiHidden="0" w:uiPriority="71" w:unhideWhenUsed="0"/>
+    <w:lsdException w:name="Colorful List Accent 5" w:semiHidden="0" w:uiPriority="72" w:unhideWhenUsed="0"/>
+    <w:lsdException w:name="Colorful Grid Accent 5" w:semiHidden="0" w:uiPriority="73" w:unhideWhenUsed="0"/>
+    <w:lsdException w:name="Light Shading Accent 6" w:semiHidden="0" w:uiPriority="60" w:unhideWhenUsed="0"/>
+    <w:lsdException w:name="Light List Accent 6" w:semiHidden="0" w:uiPriority="61" w:unhideWhenUsed="0"/>
+    <w:lsdException w:name="Light Grid Accent 6" w:semiHidden="0" w:uiPriority="62" w:unhideWhenUsed="0"/>
+    <w:lsdException w:name="Medium Shading 1 Accent 6" w:semiHidden="0" w:uiPriority="63" w:unhideWhenUsed="0"/>
+    <w:lsdException w:name="Medium Shading 2 Accent 6" w:semiHidden="0" w:uiPriority="64" w:unhideWhenUsed="0"/>
+    <w:lsdException w:name="Medium List 1 Accent 6" w:semiHidden="0" w:uiPriority="65" w:unhideWhenUsed="0"/>
+    <w:lsdException w:name="Medium List 2 Accent 6" w:semiHidden="0" w:uiPriority="66" w:unhideWhenUsed="0"/>
+    <w:lsdException w:name="Medium Grid 1 Accent 6" w:semiHidden="0" w:uiPriority="67" w:unhideWhenUsed="0"/>
+    <w:lsdException w:name="Medium Grid 2 Accent 6" w:semiHidden="0" w:uiPriority="68" w:unhideWhenUsed="0"/>
+    <w:lsdException w:name="Medium Grid 3 Accent 6" w:semiHidden="0" w:uiPriority="69" w:unhideWhenUsed="0"/>
+    <w:lsdException w:name="Dark List Accent 6" w:semiHidden="0" w:uiPriority="70" w:unhideWhenUsed="0"/>
+    <w:lsdException w:name="Colorful Shading Accent 6" w:semiHidden="0" w:uiPriority="71" w:unhideWhenUsed="0"/>
+    <w:lsdException w:name="Colorful List Accent 6" w:semiHidden="0" w:uiPriority="72" w:unhideWhenUsed="0"/>
+    <w:lsdException w:name="Colorful Grid Accent 6" w:semiHidden="0" w:uiPriority="73" w:unhideWhenUsed="0"/>
+    <w:lsdException w:name="Subtle Emphasis" w:semiHidden="0" w:uiPriority="19" w:unhideWhenUsed="0" w:qFormat="1"/>
+    <w:lsdException w:name="Intense Emphasis" w:semiHidden="0" w:uiPriority="21" w:unhideWhenUsed="0" w:qFormat="1"/>
+    <w:lsdException w:name="Subtle Reference" w:semiHidden="0" w:uiPriority="31" w:unhideWhenUsed="0" w:qFormat="1"/>
+    <w:lsdException w:name="Intense Reference" w:semiHidden="0" w:uiPriority="32" w:unhideWhenUsed="0" w:qFormat="1"/>
+    <w:lsdException w:name="Book Title" w:semiHidden="0" w:uiPriority="33" w:unhideWhenUsed="0" w:qFormat="1"/>
+    <w:lsdException w:name="Bibliography" w:uiPriority="37"/>
+    <w:lsdException w:name="TOC Heading" w:uiPriority="39" w:qFormat="1"/>
   </w:latentStyles>
   <w:style w:type="paragraph" w:default="1" w:styleId="Normal">
     <w:name w:val="Normal"/>
@@ -5646,6 +4975,285 @@
       <w:spacing w:after="0" w:line="240" w:lineRule="auto"/>
     </w:pPr>
   </w:style>
+  <w:style w:type="paragraph" w:styleId="BalloonText">
+    <w:name w:val="Balloon Text"/>
+    <w:basedOn w:val="Normal"/>
+    <w:link w:val="BalloonTextChar"/>
+    <w:uiPriority w:val="99"/>
+    <w:semiHidden/>
+    <w:unhideWhenUsed/>
+    <w:rsid w:val="00763CAA"/>
+    <w:pPr>
+      <w:spacing w:after="0" w:line="240" w:lineRule="auto"/>
+    </w:pPr>
+    <w:rPr>
+      <w:rFonts w:ascii="Lucida Grande" w:hAnsi="Lucida Grande" w:cs="Lucida Grande"/>
+      <w:sz w:val="18"/>
+      <w:szCs w:val="18"/>
+    </w:rPr>
+  </w:style>
+  <w:style w:type="character" w:customStyle="1" w:styleId="BalloonTextChar">
+    <w:name w:val="Balloon Text Char"/>
+    <w:basedOn w:val="DefaultParagraphFont"/>
+    <w:link w:val="BalloonText"/>
+    <w:uiPriority w:val="99"/>
+    <w:semiHidden/>
+    <w:rsid w:val="00763CAA"/>
+    <w:rPr>
+      <w:rFonts w:ascii="Lucida Grande" w:hAnsi="Lucida Grande" w:cs="Lucida Grande"/>
+      <w:sz w:val="18"/>
+      <w:szCs w:val="18"/>
+    </w:rPr>
+  </w:style>
+</w:styles>
+</file>
+
+<file path=word/stylesWithEffects.xml><?xml version="1.0" encoding="utf-8"?>
+<w:styles xmlns:wpc="http://schemas.microsoft.com/office/word/2010/wordprocessingCanvas" xmlns:mo="http://schemas.microsoft.com/office/mac/office/2008/main" xmlns:mc="http://schemas.openxmlformats.org/markup-compatibility/2006" xmlns:mv="urn:schemas-microsoft-com:mac:vml" xmlns:o="urn:schemas-microsoft-com:office:office" xmlns:r="http://schemas.openxmlformats.org/officeDocument/2006/relationships" xmlns:m="http://schemas.openxmlformats.org/officeDocument/2006/math" xmlns:v="urn:schemas-microsoft-com:vml" xmlns:wp14="http://schemas.microsoft.com/office/word/2010/wordprocessingDrawing" xmlns:wp="http://schemas.openxmlformats.org/drawingml/2006/wordprocessingDrawing" xmlns:w10="urn:schemas-microsoft-com:office:word" xmlns:w="http://schemas.openxmlformats.org/wordprocessingml/2006/main" xmlns:w14="http://schemas.microsoft.com/office/word/2010/wordml" xmlns:wpg="http://schemas.microsoft.com/office/word/2010/wordprocessingGroup" xmlns:wpi="http://schemas.microsoft.com/office/word/2010/wordprocessingInk" xmlns:wne="http://schemas.microsoft.com/office/word/2006/wordml" xmlns:wps="http://schemas.microsoft.com/office/word/2010/wordprocessingShape" mc:Ignorable="w14 wp14">
+  <w:docDefaults>
+    <w:rPrDefault>
+      <w:rPr>
+        <w:rFonts w:asciiTheme="minorHAnsi" w:eastAsiaTheme="minorHAnsi" w:hAnsiTheme="minorHAnsi" w:cstheme="minorBidi"/>
+        <w:sz w:val="22"/>
+        <w:szCs w:val="22"/>
+        <w:lang w:val="en-US" w:eastAsia="en-US" w:bidi="ar-SA"/>
+      </w:rPr>
+    </w:rPrDefault>
+    <w:pPrDefault>
+      <w:pPr>
+        <w:spacing w:after="160" w:line="259" w:lineRule="auto"/>
+      </w:pPr>
+    </w:pPrDefault>
+  </w:docDefaults>
+  <w:latentStyles w:defLockedState="0" w:defUIPriority="99" w:defSemiHidden="1" w:defUnhideWhenUsed="1" w:defQFormat="0" w:count="276">
+    <w:lsdException w:name="Normal" w:semiHidden="0" w:uiPriority="0" w:unhideWhenUsed="0" w:qFormat="1"/>
+    <w:lsdException w:name="heading 1" w:semiHidden="0" w:uiPriority="9" w:unhideWhenUsed="0" w:qFormat="1"/>
+    <w:lsdException w:name="heading 2" w:uiPriority="9" w:qFormat="1"/>
+    <w:lsdException w:name="heading 3" w:uiPriority="9" w:qFormat="1"/>
+    <w:lsdException w:name="heading 4" w:uiPriority="9" w:qFormat="1"/>
+    <w:lsdException w:name="heading 5" w:uiPriority="9" w:qFormat="1"/>
+    <w:lsdException w:name="heading 6" w:uiPriority="9" w:qFormat="1"/>
+    <w:lsdException w:name="heading 7" w:uiPriority="9" w:qFormat="1"/>
+    <w:lsdException w:name="heading 8" w:uiPriority="9" w:qFormat="1"/>
+    <w:lsdException w:name="heading 9" w:uiPriority="9" w:qFormat="1"/>
+    <w:lsdException w:name="toc 1" w:uiPriority="39"/>
+    <w:lsdException w:name="toc 2" w:uiPriority="39"/>
+    <w:lsdException w:name="toc 3" w:uiPriority="39"/>
+    <w:lsdException w:name="toc 4" w:uiPriority="39"/>
+    <w:lsdException w:name="toc 5" w:uiPriority="39"/>
+    <w:lsdException w:name="toc 6" w:uiPriority="39"/>
+    <w:lsdException w:name="toc 7" w:uiPriority="39"/>
+    <w:lsdException w:name="toc 8" w:uiPriority="39"/>
+    <w:lsdException w:name="toc 9" w:uiPriority="39"/>
+    <w:lsdException w:name="caption" w:uiPriority="35" w:qFormat="1"/>
+    <w:lsdException w:name="Title" w:semiHidden="0" w:uiPriority="10" w:unhideWhenUsed="0" w:qFormat="1"/>
+    <w:lsdException w:name="Default Paragraph Font" w:uiPriority="1"/>
+    <w:lsdException w:name="Subtitle" w:semiHidden="0" w:uiPriority="11" w:unhideWhenUsed="0" w:qFormat="1"/>
+    <w:lsdException w:name="Strong" w:semiHidden="0" w:uiPriority="22" w:unhideWhenUsed="0" w:qFormat="1"/>
+    <w:lsdException w:name="Emphasis" w:semiHidden="0" w:uiPriority="20" w:unhideWhenUsed="0" w:qFormat="1"/>
+    <w:lsdException w:name="Table Grid" w:semiHidden="0" w:uiPriority="39" w:unhideWhenUsed="0"/>
+    <w:lsdException w:name="Note Level 1" w:semiHidden="0" w:unhideWhenUsed="0"/>
+    <w:lsdException w:name="Note Level 2" w:semiHidden="0" w:unhideWhenUsed="0"/>
+    <w:lsdException w:name="Note Level 3" w:semiHidden="0" w:unhideWhenUsed="0"/>
+    <w:lsdException w:name="Note Level 4" w:semiHidden="0" w:unhideWhenUsed="0"/>
+    <w:lsdException w:name="Note Level 5" w:semiHidden="0" w:unhideWhenUsed="0"/>
+    <w:lsdException w:name="Note Level 6" w:semiHidden="0" w:unhideWhenUsed="0"/>
+    <w:lsdException w:name="Note Level 7" w:semiHidden="0" w:unhideWhenUsed="0"/>
+    <w:lsdException w:name="Note Level 8" w:semiHidden="0" w:unhideWhenUsed="0"/>
+    <w:lsdException w:name="Note Level 9" w:semiHidden="0" w:unhideWhenUsed="0"/>
+    <w:lsdException w:name="Placeholder Text" w:unhideWhenUsed="0"/>
+    <w:lsdException w:name="No Spacing" w:semiHidden="0" w:uiPriority="1" w:unhideWhenUsed="0" w:qFormat="1"/>
+    <w:lsdException w:name="Light Shading" w:semiHidden="0" w:uiPriority="60" w:unhideWhenUsed="0"/>
+    <w:lsdException w:name="Light List" w:semiHidden="0" w:uiPriority="61" w:unhideWhenUsed="0"/>
+    <w:lsdException w:name="Light Grid" w:semiHidden="0" w:uiPriority="62" w:unhideWhenUsed="0"/>
+    <w:lsdException w:name="Medium Shading 1" w:semiHidden="0" w:uiPriority="63" w:unhideWhenUsed="0"/>
+    <w:lsdException w:name="Medium Shading 2" w:semiHidden="0" w:uiPriority="64" w:unhideWhenUsed="0"/>
+    <w:lsdException w:name="Medium List 1" w:semiHidden="0" w:uiPriority="65" w:unhideWhenUsed="0"/>
+    <w:lsdException w:name="Medium List 2" w:semiHidden="0" w:uiPriority="66" w:unhideWhenUsed="0"/>
+    <w:lsdException w:name="Medium Grid 1" w:semiHidden="0" w:uiPriority="67" w:unhideWhenUsed="0"/>
+    <w:lsdException w:name="Medium Grid 2" w:semiHidden="0" w:uiPriority="68" w:unhideWhenUsed="0"/>
+    <w:lsdException w:name="Medium Grid 3" w:semiHidden="0" w:uiPriority="69" w:unhideWhenUsed="0"/>
+    <w:lsdException w:name="Dark List" w:semiHidden="0" w:uiPriority="70" w:unhideWhenUsed="0"/>
+    <w:lsdException w:name="Colorful Shading" w:semiHidden="0" w:uiPriority="71" w:unhideWhenUsed="0"/>
+    <w:lsdException w:name="Colorful List" w:semiHidden="0" w:uiPriority="72" w:unhideWhenUsed="0"/>
+    <w:lsdException w:name="Colorful Grid" w:semiHidden="0" w:uiPriority="73" w:unhideWhenUsed="0"/>
+    <w:lsdException w:name="Light Shading Accent 1" w:semiHidden="0" w:uiPriority="60" w:unhideWhenUsed="0"/>
+    <w:lsdException w:name="Light List Accent 1" w:semiHidden="0" w:uiPriority="61" w:unhideWhenUsed="0"/>
+    <w:lsdException w:name="Light Grid Accent 1" w:semiHidden="0" w:uiPriority="62" w:unhideWhenUsed="0"/>
+    <w:lsdException w:name="Medium Shading 1 Accent 1" w:semiHidden="0" w:uiPriority="63" w:unhideWhenUsed="0"/>
+    <w:lsdException w:name="Medium Shading 2 Accent 1" w:semiHidden="0" w:uiPriority="64" w:unhideWhenUsed="0"/>
+    <w:lsdException w:name="Medium List 1 Accent 1" w:semiHidden="0" w:uiPriority="65" w:unhideWhenUsed="0"/>
+    <w:lsdException w:name="Revision" w:unhideWhenUsed="0"/>
+    <w:lsdException w:name="List Paragraph" w:semiHidden="0" w:uiPriority="34" w:unhideWhenUsed="0" w:qFormat="1"/>
+    <w:lsdException w:name="Quote" w:semiHidden="0" w:uiPriority="29" w:unhideWhenUsed="0" w:qFormat="1"/>
+    <w:lsdException w:name="Intense Quote" w:semiHidden="0" w:uiPriority="30" w:unhideWhenUsed="0" w:qFormat="1"/>
+    <w:lsdException w:name="Medium List 2 Accent 1" w:semiHidden="0" w:uiPriority="66" w:unhideWhenUsed="0"/>
+    <w:lsdException w:name="Medium Grid 1 Accent 1" w:semiHidden="0" w:uiPriority="67" w:unhideWhenUsed="0"/>
+    <w:lsdException w:name="Medium Grid 2 Accent 1" w:semiHidden="0" w:uiPriority="68" w:unhideWhenUsed="0"/>
+    <w:lsdException w:name="Medium Grid 3 Accent 1" w:semiHidden="0" w:uiPriority="69" w:unhideWhenUsed="0"/>
+    <w:lsdException w:name="Dark List Accent 1" w:semiHidden="0" w:uiPriority="70" w:unhideWhenUsed="0"/>
+    <w:lsdException w:name="Colorful Shading Accent 1" w:semiHidden="0" w:uiPriority="71" w:unhideWhenUsed="0"/>
+    <w:lsdException w:name="Colorful List Accent 1" w:semiHidden="0" w:uiPriority="72" w:unhideWhenUsed="0"/>
+    <w:lsdException w:name="Colorful Grid Accent 1" w:semiHidden="0" w:uiPriority="73" w:unhideWhenUsed="0"/>
+    <w:lsdException w:name="Light Shading Accent 2" w:semiHidden="0" w:uiPriority="60" w:unhideWhenUsed="0"/>
+    <w:lsdException w:name="Light List Accent 2" w:semiHidden="0" w:uiPriority="61" w:unhideWhenUsed="0"/>
+    <w:lsdException w:name="Light Grid Accent 2" w:semiHidden="0" w:uiPriority="62" w:unhideWhenUsed="0"/>
+    <w:lsdException w:name="Medium Shading 1 Accent 2" w:semiHidden="0" w:uiPriority="63" w:unhideWhenUsed="0"/>
+    <w:lsdException w:name="Medium Shading 2 Accent 2" w:semiHidden="0" w:uiPriority="64" w:unhideWhenUsed="0"/>
+    <w:lsdException w:name="Medium List 1 Accent 2" w:semiHidden="0" w:uiPriority="65" w:unhideWhenUsed="0"/>
+    <w:lsdException w:name="Medium List 2 Accent 2" w:semiHidden="0" w:uiPriority="66" w:unhideWhenUsed="0"/>
+    <w:lsdException w:name="Medium Grid 1 Accent 2" w:semiHidden="0" w:uiPriority="67" w:unhideWhenUsed="0"/>
+    <w:lsdException w:name="Medium Grid 2 Accent 2" w:semiHidden="0" w:uiPriority="68" w:unhideWhenUsed="0"/>
+    <w:lsdException w:name="Medium Grid 3 Accent 2" w:semiHidden="0" w:uiPriority="69" w:unhideWhenUsed="0"/>
+    <w:lsdException w:name="Dark List Accent 2" w:semiHidden="0" w:uiPriority="70" w:unhideWhenUsed="0"/>
+    <w:lsdException w:name="Colorful Shading Accent 2" w:semiHidden="0" w:uiPriority="71" w:unhideWhenUsed="0"/>
+    <w:lsdException w:name="Colorful List Accent 2" w:semiHidden="0" w:uiPriority="72" w:unhideWhenUsed="0"/>
+    <w:lsdException w:name="Colorful Grid Accent 2" w:semiHidden="0" w:uiPriority="73" w:unhideWhenUsed="0"/>
+    <w:lsdException w:name="Light Shading Accent 3" w:semiHidden="0" w:uiPriority="60" w:unhideWhenUsed="0"/>
+    <w:lsdException w:name="Light List Accent 3" w:semiHidden="0" w:uiPriority="61" w:unhideWhenUsed="0"/>
+    <w:lsdException w:name="Light Grid Accent 3" w:semiHidden="0" w:uiPriority="62" w:unhideWhenUsed="0"/>
+    <w:lsdException w:name="Medium Shading 1 Accent 3" w:semiHidden="0" w:uiPriority="63" w:unhideWhenUsed="0"/>
+    <w:lsdException w:name="Medium Shading 2 Accent 3" w:semiHidden="0" w:uiPriority="64" w:unhideWhenUsed="0"/>
+    <w:lsdException w:name="Medium List 1 Accent 3" w:semiHidden="0" w:uiPriority="65" w:unhideWhenUsed="0"/>
+    <w:lsdException w:name="Medium List 2 Accent 3" w:semiHidden="0" w:uiPriority="66" w:unhideWhenUsed="0"/>
+    <w:lsdException w:name="Medium Grid 1 Accent 3" w:semiHidden="0" w:uiPriority="67" w:unhideWhenUsed="0"/>
+    <w:lsdException w:name="Medium Grid 2 Accent 3" w:semiHidden="0" w:uiPriority="68" w:unhideWhenUsed="0"/>
+    <w:lsdException w:name="Medium Grid 3 Accent 3" w:semiHidden="0" w:uiPriority="69" w:unhideWhenUsed="0"/>
+    <w:lsdException w:name="Dark List Accent 3" w:semiHidden="0" w:uiPriority="70" w:unhideWhenUsed="0"/>
+    <w:lsdException w:name="Colorful Shading Accent 3" w:semiHidden="0" w:uiPriority="71" w:unhideWhenUsed="0"/>
+    <w:lsdException w:name="Colorful List Accent 3" w:semiHidden="0" w:uiPriority="72" w:unhideWhenUsed="0"/>
+    <w:lsdException w:name="Colorful Grid Accent 3" w:semiHidden="0" w:uiPriority="73" w:unhideWhenUsed="0"/>
+    <w:lsdException w:name="Light Shading Accent 4" w:semiHidden="0" w:uiPriority="60" w:unhideWhenUsed="0"/>
+    <w:lsdException w:name="Light List Accent 4" w:semiHidden="0" w:uiPriority="61" w:unhideWhenUsed="0"/>
+    <w:lsdException w:name="Light Grid Accent 4" w:semiHidden="0" w:uiPriority="62" w:unhideWhenUsed="0"/>
+    <w:lsdException w:name="Medium Shading 1 Accent 4" w:semiHidden="0" w:uiPriority="63" w:unhideWhenUsed="0"/>
+    <w:lsdException w:name="Medium Shading 2 Accent 4" w:semiHidden="0" w:uiPriority="64" w:unhideWhenUsed="0"/>
+    <w:lsdException w:name="Medium List 1 Accent 4" w:semiHidden="0" w:uiPriority="65" w:unhideWhenUsed="0"/>
+    <w:lsdException w:name="Medium List 2 Accent 4" w:semiHidden="0" w:uiPriority="66" w:unhideWhenUsed="0"/>
+    <w:lsdException w:name="Medium Grid 1 Accent 4" w:semiHidden="0" w:uiPriority="67" w:unhideWhenUsed="0"/>
+    <w:lsdException w:name="Medium Grid 2 Accent 4" w:semiHidden="0" w:uiPriority="68" w:unhideWhenUsed="0"/>
+    <w:lsdException w:name="Medium Grid 3 Accent 4" w:semiHidden="0" w:uiPriority="69" w:unhideWhenUsed="0"/>
+    <w:lsdException w:name="Dark List Accent 4" w:semiHidden="0" w:uiPriority="70" w:unhideWhenUsed="0"/>
+    <w:lsdException w:name="Colorful Shading Accent 4" w:semiHidden="0" w:uiPriority="71" w:unhideWhenUsed="0"/>
+    <w:lsdException w:name="Colorful List Accent 4" w:semiHidden="0" w:uiPriority="72" w:unhideWhenUsed="0"/>
+    <w:lsdException w:name="Colorful Grid Accent 4" w:semiHidden="0" w:uiPriority="73" w:unhideWhenUsed="0"/>
+    <w:lsdException w:name="Light Shading Accent 5" w:semiHidden="0" w:uiPriority="60" w:unhideWhenUsed="0"/>
+    <w:lsdException w:name="Light List Accent 5" w:semiHidden="0" w:uiPriority="61" w:unhideWhenUsed="0"/>
+    <w:lsdException w:name="Light Grid Accent 5" w:semiHidden="0" w:uiPriority="62" w:unhideWhenUsed="0"/>
+    <w:lsdException w:name="Medium Shading 1 Accent 5" w:semiHidden="0" w:uiPriority="63" w:unhideWhenUsed="0"/>
+    <w:lsdException w:name="Medium Shading 2 Accent 5" w:semiHidden="0" w:uiPriority="64" w:unhideWhenUsed="0"/>
+    <w:lsdException w:name="Medium List 1 Accent 5" w:semiHidden="0" w:uiPriority="65" w:unhideWhenUsed="0"/>
+    <w:lsdException w:name="Medium List 2 Accent 5" w:semiHidden="0" w:uiPriority="66" w:unhideWhenUsed="0"/>
+    <w:lsdException w:name="Medium Grid 1 Accent 5" w:semiHidden="0" w:uiPriority="67" w:unhideWhenUsed="0"/>
+    <w:lsdException w:name="Medium Grid 2 Accent 5" w:semiHidden="0" w:uiPriority="68" w:unhideWhenUsed="0"/>
+    <w:lsdException w:name="Medium Grid 3 Accent 5" w:semiHidden="0" w:uiPriority="69" w:unhideWhenUsed="0"/>
+    <w:lsdException w:name="Dark List Accent 5" w:semiHidden="0" w:uiPriority="70" w:unhideWhenUsed="0"/>
+    <w:lsdException w:name="Colorful Shading Accent 5" w:semiHidden="0" w:uiPriority="71" w:unhideWhenUsed="0"/>
+    <w:lsdException w:name="Colorful List Accent 5" w:semiHidden="0" w:uiPriority="72" w:unhideWhenUsed="0"/>
+    <w:lsdException w:name="Colorful Grid Accent 5" w:semiHidden="0" w:uiPriority="73" w:unhideWhenUsed="0"/>
+    <w:lsdException w:name="Light Shading Accent 6" w:semiHidden="0" w:uiPriority="60" w:unhideWhenUsed="0"/>
+    <w:lsdException w:name="Light List Accent 6" w:semiHidden="0" w:uiPriority="61" w:unhideWhenUsed="0"/>
+    <w:lsdException w:name="Light Grid Accent 6" w:semiHidden="0" w:uiPriority="62" w:unhideWhenUsed="0"/>
+    <w:lsdException w:name="Medium Shading 1 Accent 6" w:semiHidden="0" w:uiPriority="63" w:unhideWhenUsed="0"/>
+    <w:lsdException w:name="Medium Shading 2 Accent 6" w:semiHidden="0" w:uiPriority="64" w:unhideWhenUsed="0"/>
+    <w:lsdException w:name="Medium List 1 Accent 6" w:semiHidden="0" w:uiPriority="65" w:unhideWhenUsed="0"/>
+    <w:lsdException w:name="Medium List 2 Accent 6" w:semiHidden="0" w:uiPriority="66" w:unhideWhenUsed="0"/>
+    <w:lsdException w:name="Medium Grid 1 Accent 6" w:semiHidden="0" w:uiPriority="67" w:unhideWhenUsed="0"/>
+    <w:lsdException w:name="Medium Grid 2 Accent 6" w:semiHidden="0" w:uiPriority="68" w:unhideWhenUsed="0"/>
+    <w:lsdException w:name="Medium Grid 3 Accent 6" w:semiHidden="0" w:uiPriority="69" w:unhideWhenUsed="0"/>
+    <w:lsdException w:name="Dark List Accent 6" w:semiHidden="0" w:uiPriority="70" w:unhideWhenUsed="0"/>
+    <w:lsdException w:name="Colorful Shading Accent 6" w:semiHidden="0" w:uiPriority="71" w:unhideWhenUsed="0"/>
+    <w:lsdException w:name="Colorful List Accent 6" w:semiHidden="0" w:uiPriority="72" w:unhideWhenUsed="0"/>
+    <w:lsdException w:name="Colorful Grid Accent 6" w:semiHidden="0" w:uiPriority="73" w:unhideWhenUsed="0"/>
+    <w:lsdException w:name="Subtle Emphasis" w:semiHidden="0" w:uiPriority="19" w:unhideWhenUsed="0" w:qFormat="1"/>
+    <w:lsdException w:name="Intense Emphasis" w:semiHidden="0" w:uiPriority="21" w:unhideWhenUsed="0" w:qFormat="1"/>
+    <w:lsdException w:name="Subtle Reference" w:semiHidden="0" w:uiPriority="31" w:unhideWhenUsed="0" w:qFormat="1"/>
+    <w:lsdException w:name="Intense Reference" w:semiHidden="0" w:uiPriority="32" w:unhideWhenUsed="0" w:qFormat="1"/>
+    <w:lsdException w:name="Book Title" w:semiHidden="0" w:uiPriority="33" w:unhideWhenUsed="0" w:qFormat="1"/>
+    <w:lsdException w:name="Bibliography" w:uiPriority="37"/>
+    <w:lsdException w:name="TOC Heading" w:uiPriority="39" w:qFormat="1"/>
+  </w:latentStyles>
+  <w:style w:type="paragraph" w:default="1" w:styleId="Normal">
+    <w:name w:val="Normal"/>
+    <w:qFormat/>
+  </w:style>
+  <w:style w:type="character" w:default="1" w:styleId="DefaultParagraphFont">
+    <w:name w:val="Default Paragraph Font"/>
+    <w:uiPriority w:val="1"/>
+    <w:semiHidden/>
+    <w:unhideWhenUsed/>
+  </w:style>
+  <w:style w:type="table" w:default="1" w:styleId="TableNormal">
+    <w:name w:val="Normal Table"/>
+    <w:uiPriority w:val="99"/>
+    <w:semiHidden/>
+    <w:unhideWhenUsed/>
+    <w:tblPr>
+      <w:tblInd w:w="0" w:type="dxa"/>
+      <w:tblCellMar>
+        <w:top w:w="0" w:type="dxa"/>
+        <w:left w:w="108" w:type="dxa"/>
+        <w:bottom w:w="0" w:type="dxa"/>
+        <w:right w:w="108" w:type="dxa"/>
+      </w:tblCellMar>
+    </w:tblPr>
+  </w:style>
+  <w:style w:type="numbering" w:default="1" w:styleId="NoList">
+    <w:name w:val="No List"/>
+    <w:uiPriority w:val="99"/>
+    <w:semiHidden/>
+    <w:unhideWhenUsed/>
+  </w:style>
+  <w:style w:type="paragraph" w:styleId="ListParagraph">
+    <w:name w:val="List Paragraph"/>
+    <w:basedOn w:val="Normal"/>
+    <w:uiPriority w:val="34"/>
+    <w:qFormat/>
+    <w:rsid w:val="005572EC"/>
+    <w:pPr>
+      <w:ind w:left="720"/>
+      <w:contextualSpacing/>
+    </w:pPr>
+  </w:style>
+  <w:style w:type="paragraph" w:styleId="NoSpacing">
+    <w:name w:val="No Spacing"/>
+    <w:uiPriority w:val="1"/>
+    <w:qFormat/>
+    <w:rsid w:val="004624D6"/>
+    <w:pPr>
+      <w:spacing w:after="0" w:line="240" w:lineRule="auto"/>
+    </w:pPr>
+  </w:style>
+  <w:style w:type="paragraph" w:styleId="BalloonText">
+    <w:name w:val="Balloon Text"/>
+    <w:basedOn w:val="Normal"/>
+    <w:link w:val="BalloonTextChar"/>
+    <w:uiPriority w:val="99"/>
+    <w:semiHidden/>
+    <w:unhideWhenUsed/>
+    <w:rsid w:val="00763CAA"/>
+    <w:pPr>
+      <w:spacing w:after="0" w:line="240" w:lineRule="auto"/>
+    </w:pPr>
+    <w:rPr>
+      <w:rFonts w:ascii="Lucida Grande" w:hAnsi="Lucida Grande" w:cs="Lucida Grande"/>
+      <w:sz w:val="18"/>
+      <w:szCs w:val="18"/>
+    </w:rPr>
+  </w:style>
+  <w:style w:type="character" w:customStyle="1" w:styleId="BalloonTextChar">
+    <w:name w:val="Balloon Text Char"/>
+    <w:basedOn w:val="DefaultParagraphFont"/>
+    <w:link w:val="BalloonText"/>
+    <w:uiPriority w:val="99"/>
+    <w:semiHidden/>
+    <w:rsid w:val="00763CAA"/>
+    <w:rPr>
+      <w:rFonts w:ascii="Lucida Grande" w:hAnsi="Lucida Grande" w:cs="Lucida Grande"/>
+      <w:sz w:val="18"/>
+      <w:szCs w:val="18"/>
+    </w:rPr>
+  </w:style>
 </w:styles>
 </file>
 
@@ -5692,7 +5300,7 @@
     </a:clrScheme>
     <a:fontScheme name="Office">
       <a:majorFont>
-        <a:latin typeface="Calibri Light" panose="020F0302020204030204"/>
+        <a:latin typeface="Calibri Light"/>
         <a:ea typeface=""/>
         <a:cs typeface=""/>
         <a:font script="Jpan" typeface="ＭＳ ゴシック"/>
@@ -5727,7 +5335,7 @@
         <a:font script="Geor" typeface="Sylfaen"/>
       </a:majorFont>
       <a:minorFont>
-        <a:latin typeface="Calibri" panose="020F0502020204030204"/>
+        <a:latin typeface="Calibri"/>
         <a:ea typeface=""/>
         <a:cs typeface=""/>
         <a:font script="Jpan" typeface="ＭＳ 明朝"/>
@@ -5904,7 +5512,7 @@
   <a:extraClrSchemeLst/>
   <a:extLst>
     <a:ext uri="{05A4C25C-085E-4340-85A3-A5531E510DB2}">
-      <thm15:themeFamily xmlns:thm15="http://schemas.microsoft.com/office/thememl/2012/main" name="Office Theme" id="{62F939B6-93AF-4DB8-9C6B-D6C7DFDC589F}" vid="{4A3C46E8-61CC-4603-A589-7422A47A8E4A}"/>
+      <thm15:themeFamily xmlns:thm15="http://schemas.microsoft.com/office/thememl/2012/main" xmlns="" name="Office Theme" id="{62F939B6-93AF-4DB8-9C6B-D6C7DFDC589F}" vid="{4A3C46E8-61CC-4603-A589-7422A47A8E4A}"/>
     </a:ext>
   </a:extLst>
 </a:theme>

</xml_diff>

<commit_message>
batch for MEEG and mat formats - feature set
to be continued for MEEG. Should work for mat (but not tested).
</commit_message>
<xml_diff>
--- a/manual/NewFunctions_12_2015.docx
+++ b/manual/NewFunctions_12_2015.docx
@@ -1,6 +1,6 @@
 
 <file path=word/document.xml><?xml version="1.0" encoding="utf-8"?>
-<w:document xmlns:wpc="http://schemas.microsoft.com/office/word/2010/wordprocessingCanvas" xmlns:mo="http://schemas.microsoft.com/office/mac/office/2008/main" xmlns:mc="http://schemas.openxmlformats.org/markup-compatibility/2006" xmlns:mv="urn:schemas-microsoft-com:mac:vml" xmlns:o="urn:schemas-microsoft-com:office:office" xmlns:r="http://schemas.openxmlformats.org/officeDocument/2006/relationships" xmlns:m="http://schemas.openxmlformats.org/officeDocument/2006/math" xmlns:v="urn:schemas-microsoft-com:vml" xmlns:wp14="http://schemas.microsoft.com/office/word/2010/wordprocessingDrawing" xmlns:wp="http://schemas.openxmlformats.org/drawingml/2006/wordprocessingDrawing" xmlns:w10="urn:schemas-microsoft-com:office:word" xmlns:w="http://schemas.openxmlformats.org/wordprocessingml/2006/main" xmlns:w14="http://schemas.microsoft.com/office/word/2010/wordml" xmlns:wpg="http://schemas.microsoft.com/office/word/2010/wordprocessingGroup" xmlns:wpi="http://schemas.microsoft.com/office/word/2010/wordprocessingInk" xmlns:wne="http://schemas.microsoft.com/office/word/2006/wordml" xmlns:wps="http://schemas.microsoft.com/office/word/2010/wordprocessingShape" mc:Ignorable="w14 wp14">
+<w:document xmlns:wpc="http://schemas.microsoft.com/office/word/2010/wordprocessingCanvas" xmlns:mc="http://schemas.openxmlformats.org/markup-compatibility/2006" xmlns:o="urn:schemas-microsoft-com:office:office" xmlns:r="http://schemas.openxmlformats.org/officeDocument/2006/relationships" xmlns:m="http://schemas.openxmlformats.org/officeDocument/2006/math" xmlns:v="urn:schemas-microsoft-com:vml" xmlns:wp14="http://schemas.microsoft.com/office/word/2010/wordprocessingDrawing" xmlns:wp="http://schemas.openxmlformats.org/drawingml/2006/wordprocessingDrawing" xmlns:w10="urn:schemas-microsoft-com:office:word" xmlns:w="http://schemas.openxmlformats.org/wordprocessingml/2006/main" xmlns:w14="http://schemas.microsoft.com/office/word/2010/wordml" xmlns:w15="http://schemas.microsoft.com/office/word/2012/wordml" xmlns:wpg="http://schemas.microsoft.com/office/word/2010/wordprocessingGroup" xmlns:wpi="http://schemas.microsoft.com/office/word/2010/wordprocessingInk" xmlns:wne="http://schemas.microsoft.com/office/word/2006/wordml" xmlns:wps="http://schemas.microsoft.com/office/word/2010/wordprocessingShape" mc:Ignorable="w14 w15 wp14">
   <w:body>
     <w:p>
       <w:pPr>
@@ -11,13 +11,41 @@
           <w:u w:val="single"/>
         </w:rPr>
       </w:pPr>
+      <w:proofErr w:type="gramStart"/>
       <w:r>
         <w:rPr>
           <w:b/>
           <w:sz w:val="32"/>
           <w:u w:val="single"/>
         </w:rPr>
-        <w:t>What’s  new in PRoNTo v3.0 and to do</w:t>
+        <w:t>What’s  new</w:t>
+      </w:r>
+      <w:proofErr w:type="gramEnd"/>
+      <w:r>
+        <w:rPr>
+          <w:b/>
+          <w:sz w:val="32"/>
+          <w:u w:val="single"/>
+        </w:rPr>
+        <w:t xml:space="preserve"> in </w:t>
+      </w:r>
+      <w:proofErr w:type="spellStart"/>
+      <w:r>
+        <w:rPr>
+          <w:b/>
+          <w:sz w:val="32"/>
+          <w:u w:val="single"/>
+        </w:rPr>
+        <w:t>PRoNTo</w:t>
+      </w:r>
+      <w:proofErr w:type="spellEnd"/>
+      <w:r>
+        <w:rPr>
+          <w:b/>
+          <w:sz w:val="32"/>
+          <w:u w:val="single"/>
+        </w:rPr>
+        <w:t xml:space="preserve"> v3.0 and to do</w:t>
       </w:r>
     </w:p>
     <w:p/>
@@ -81,7 +109,15 @@
         <w:t>’ offers</w:t>
       </w:r>
       <w:r>
-        <w:t xml:space="preserve"> three input formats to choose from: nifti (as before), MEEG</w:t>
+        <w:t xml:space="preserve"> three input formats to choose from: </w:t>
+      </w:r>
+      <w:proofErr w:type="spellStart"/>
+      <w:r>
+        <w:t>nifti</w:t>
+      </w:r>
+      <w:proofErr w:type="spellEnd"/>
+      <w:r>
+        <w:t xml:space="preserve"> (as before), MEEG</w:t>
       </w:r>
       <w:r>
         <w:t xml:space="preserve"> (electrophysiological data in the SPM format)</w:t>
@@ -117,14 +153,24 @@
         <w:t>format</w:t>
       </w:r>
       <w:r>
-        <w:t xml:space="preserve"> selected. This is because the events should already be saved in the MEEG data (input: epoched signal). For </w:t>
-      </w:r>
+        <w:t xml:space="preserve"> selected. This is because the events should already be saved in the MEEG data (input: </w:t>
+      </w:r>
+      <w:proofErr w:type="spellStart"/>
+      <w:r>
+        <w:t>epoched</w:t>
+      </w:r>
+      <w:proofErr w:type="spellEnd"/>
+      <w:r>
+        <w:t xml:space="preserve"> signal). For </w:t>
+      </w:r>
+      <w:proofErr w:type="spellStart"/>
       <w:r>
         <w:t>nift</w:t>
       </w:r>
       <w:r>
         <w:t>i</w:t>
       </w:r>
+      <w:proofErr w:type="spellEnd"/>
       <w:r>
         <w:t xml:space="preserve"> inputs</w:t>
       </w:r>
@@ -199,7 +245,7 @@
                     </pic:cNvPicPr>
                   </pic:nvPicPr>
                   <pic:blipFill>
-                    <a:blip r:embed="rId6">
+                    <a:blip r:embed="rId5">
                       <a:extLst>
                         <a:ext uri="{28A0092B-C50C-407E-A947-70E740481C1C}">
                           <a14:useLocalDpi xmlns:a14="http://schemas.microsoft.com/office/drawing/2010/main" val="0"/>
@@ -225,7 +271,7 @@
                     </a:ln>
                     <a:extLst>
                       <a:ext uri="{FAA26D3D-D897-4be2-8F04-BA451C77F1D7}">
-                        <ma14:placeholderFlag xmlns:ma14="http://schemas.microsoft.com/office/mac/drawingml/2011/main"/>
+                        <ma14:placeholderFlag xmlns:ma14="http://schemas.microsoft.com/office/mac/drawingml/2011/main" xmlns:w="http://schemas.openxmlformats.org/wordprocessingml/2006/main" xmlns:w10="urn:schemas-microsoft-com:office:word" xmlns:v="urn:schemas-microsoft-com:vml" xmlns:o="urn:schemas-microsoft-com:office:office" xmlns:mv="urn:schemas-microsoft-com:mac:vml" xmlns:mo="http://schemas.microsoft.com/office/mac/office/2008/main" xmlns=""/>
                       </a:ext>
                     </a:extLst>
                   </pic:spPr>
@@ -265,7 +311,7 @@
                     </pic:cNvPicPr>
                   </pic:nvPicPr>
                   <pic:blipFill>
-                    <a:blip r:embed="rId7">
+                    <a:blip r:embed="rId6">
                       <a:extLst>
                         <a:ext uri="{28A0092B-C50C-407E-A947-70E740481C1C}">
                           <a14:useLocalDpi xmlns:a14="http://schemas.microsoft.com/office/drawing/2010/main" val="0"/>
@@ -291,7 +337,7 @@
                     </a:ln>
                     <a:extLst>
                       <a:ext uri="{FAA26D3D-D897-4be2-8F04-BA451C77F1D7}">
-                        <ma14:placeholderFlag xmlns:ma14="http://schemas.microsoft.com/office/mac/drawingml/2011/main"/>
+                        <ma14:placeholderFlag xmlns:ma14="http://schemas.microsoft.com/office/mac/drawingml/2011/main" xmlns:w="http://schemas.openxmlformats.org/wordprocessingml/2006/main" xmlns:w10="urn:schemas-microsoft-com:office:word" xmlns:v="urn:schemas-microsoft-com:vml" xmlns:o="urn:schemas-microsoft-com:office:office" xmlns:mv="urn:schemas-microsoft-com:mac:vml" xmlns:mo="http://schemas.microsoft.com/office/mac/office/2008/main" xmlns=""/>
                       </a:ext>
                     </a:extLst>
                   </pic:spPr>
@@ -323,7 +369,7 @@
                     <pic:cNvPicPr/>
                   </pic:nvPicPr>
                   <pic:blipFill>
-                    <a:blip r:embed="rId8">
+                    <a:blip r:embed="rId7">
                       <a:extLst>
                         <a:ext uri="{28A0092B-C50C-407E-A947-70E740481C1C}">
                           <a14:useLocalDpi xmlns:a14="http://schemas.microsoft.com/office/drawing/2010/main" val="0"/>
@@ -344,7 +390,7 @@
                     </a:prstGeom>
                     <a:extLst>
                       <a:ext uri="{FAA26D3D-D897-4be2-8F04-BA451C77F1D7}">
-                        <ma14:placeholderFlag xmlns:ma14="http://schemas.microsoft.com/office/mac/drawingml/2011/main"/>
+                        <ma14:placeholderFlag xmlns:ma14="http://schemas.microsoft.com/office/mac/drawingml/2011/main" xmlns:w="http://schemas.openxmlformats.org/wordprocessingml/2006/main" xmlns:w10="urn:schemas-microsoft-com:office:word" xmlns:v="urn:schemas-microsoft-com:vml" xmlns:o="urn:schemas-microsoft-com:office:office" xmlns:mv="urn:schemas-microsoft-com:mac:vml" xmlns:mo="http://schemas.microsoft.com/office/mac/office/2008/main" xmlns=""/>
                       </a:ext>
                     </a:extLst>
                   </pic:spPr>
@@ -386,7 +432,23 @@
     </w:p>
     <w:p>
       <w:r>
-        <w:t xml:space="preserve">The design window will be automatically filled with the events name, onsets (in seconds) and duration (in seconds). The units is set to seconds and the interscan interval corresponds to the intersample time (i.e. 1/sampling rate). </w:t>
+        <w:t xml:space="preserve">The design window will be automatically filled with the events name, onsets (in seconds) and duration (in seconds). The units is set to seconds and the </w:t>
+      </w:r>
+      <w:proofErr w:type="spellStart"/>
+      <w:r>
+        <w:t>interscan</w:t>
+      </w:r>
+      <w:proofErr w:type="spellEnd"/>
+      <w:r>
+        <w:t xml:space="preserve"> interval corresponds to the </w:t>
+      </w:r>
+      <w:proofErr w:type="spellStart"/>
+      <w:r>
+        <w:t>intersample</w:t>
+      </w:r>
+      <w:proofErr w:type="spellEnd"/>
+      <w:r>
+        <w:t xml:space="preserve"> time (i.e. 1/sampling rate). </w:t>
       </w:r>
       <w:r>
         <w:t>For both neuroimaging and MEEG, there are 2 new columns where regression targets and covariates can be entered per trial in each category</w:t>
@@ -424,7 +486,7 @@
                     </pic:cNvPicPr>
                   </pic:nvPicPr>
                   <pic:blipFill>
-                    <a:blip r:embed="rId9">
+                    <a:blip r:embed="rId8">
                       <a:extLst>
                         <a:ext uri="{28A0092B-C50C-407E-A947-70E740481C1C}">
                           <a14:useLocalDpi xmlns:a14="http://schemas.microsoft.com/office/drawing/2010/main" val="0"/>
@@ -487,27 +549,37 @@
         <w:pStyle w:val="NoSpacing"/>
       </w:pPr>
       <w:r>
-        <w:t>In the modality field, a ‘type’ subfield was added, to account for the modality type. The same field was added to the ‘PRT.masks’ as well.</w:t>
-      </w:r>
-    </w:p>
-    <w:p>
-      <w:pPr>
-        <w:pStyle w:val="NoSpacing"/>
-      </w:pPr>
-    </w:p>
-    <w:p>
-      <w:pPr>
-        <w:pStyle w:val="NoSpacing"/>
-        <w:rPr>
-          <w:rFonts w:ascii="Cambria" w:hAnsi="Cambria"/>
-        </w:rPr>
-      </w:pPr>
+        <w:t>In the modality field, a ‘type’ subfield was added, to account for the modality type. The same field was added to the ‘</w:t>
+      </w:r>
+      <w:proofErr w:type="spellStart"/>
+      <w:r>
+        <w:t>PRT.masks</w:t>
+      </w:r>
+      <w:proofErr w:type="spellEnd"/>
+      <w:r>
+        <w:t>’ as well.</w:t>
+      </w:r>
+    </w:p>
+    <w:p>
+      <w:pPr>
+        <w:pStyle w:val="NoSpacing"/>
+      </w:pPr>
+    </w:p>
+    <w:p>
+      <w:pPr>
+        <w:pStyle w:val="NoSpacing"/>
+        <w:rPr>
+          <w:rFonts w:ascii="Cambria" w:hAnsi="Cambria"/>
+        </w:rPr>
+      </w:pPr>
+      <w:proofErr w:type="spellStart"/>
       <w:r>
         <w:rPr>
           <w:rFonts w:ascii="Cambria" w:hAnsi="Cambria"/>
         </w:rPr>
         <w:t>PRT.group.subject.modality</w:t>
       </w:r>
+      <w:proofErr w:type="spellEnd"/>
     </w:p>
     <w:p>
       <w:pPr>
@@ -520,11 +592,33 @@
           <w:rFonts w:ascii="Cambria" w:hAnsi="Cambria"/>
         </w:rPr>
       </w:pPr>
-      <w:r>
-        <w:rPr>
-          <w:rFonts w:ascii="Cambria" w:hAnsi="Cambria"/>
-        </w:rPr>
-        <w:t>mod_name: 'ECoG'</w:t>
+      <w:proofErr w:type="spellStart"/>
+      <w:r>
+        <w:rPr>
+          <w:rFonts w:ascii="Cambria" w:hAnsi="Cambria"/>
+        </w:rPr>
+        <w:t>mod_name</w:t>
+      </w:r>
+      <w:proofErr w:type="spellEnd"/>
+      <w:r>
+        <w:rPr>
+          <w:rFonts w:ascii="Cambria" w:hAnsi="Cambria"/>
+        </w:rPr>
+        <w:t>: '</w:t>
+      </w:r>
+      <w:proofErr w:type="spellStart"/>
+      <w:r>
+        <w:rPr>
+          <w:rFonts w:ascii="Cambria" w:hAnsi="Cambria"/>
+        </w:rPr>
+        <w:t>ECoG</w:t>
+      </w:r>
+      <w:proofErr w:type="spellEnd"/>
+      <w:r>
+        <w:rPr>
+          <w:rFonts w:ascii="Cambria" w:hAnsi="Cambria"/>
+        </w:rPr>
+        <w:t>'</w:t>
       </w:r>
     </w:p>
     <w:p>
@@ -538,11 +632,19 @@
           <w:rFonts w:ascii="Cambria" w:hAnsi="Cambria"/>
         </w:rPr>
       </w:pPr>
-      <w:r>
-        <w:rPr>
-          <w:rFonts w:ascii="Cambria" w:hAnsi="Cambria"/>
-        </w:rPr>
-        <w:t>covar: []</w:t>
+      <w:proofErr w:type="spellStart"/>
+      <w:r>
+        <w:rPr>
+          <w:rFonts w:ascii="Cambria" w:hAnsi="Cambria"/>
+        </w:rPr>
+        <w:t>covar</w:t>
+      </w:r>
+      <w:proofErr w:type="spellEnd"/>
+      <w:r>
+        <w:rPr>
+          <w:rFonts w:ascii="Cambria" w:hAnsi="Cambria"/>
+        </w:rPr>
+        <w:t>: []</w:t>
       </w:r>
     </w:p>
     <w:p>
@@ -556,11 +658,19 @@
           <w:rFonts w:ascii="Cambria" w:hAnsi="Cambria"/>
         </w:rPr>
       </w:pPr>
-      <w:r>
-        <w:rPr>
-          <w:rFonts w:ascii="Cambria" w:hAnsi="Cambria"/>
-        </w:rPr>
-        <w:t>rt_subj: []</w:t>
+      <w:proofErr w:type="spellStart"/>
+      <w:r>
+        <w:rPr>
+          <w:rFonts w:ascii="Cambria" w:hAnsi="Cambria"/>
+        </w:rPr>
+        <w:t>rt_subj</w:t>
+      </w:r>
+      <w:proofErr w:type="spellEnd"/>
+      <w:r>
+        <w:rPr>
+          <w:rFonts w:ascii="Cambria" w:hAnsi="Cambria"/>
+        </w:rPr>
+        <w:t>: []</w:t>
       </w:r>
     </w:p>
     <w:p>
@@ -578,7 +688,21 @@
         <w:rPr>
           <w:rFonts w:ascii="Cambria" w:hAnsi="Cambria"/>
         </w:rPr>
-        <w:t>design: [1x1 struct]</w:t>
+        <w:t xml:space="preserve">design: [1x1 </w:t>
+      </w:r>
+      <w:proofErr w:type="spellStart"/>
+      <w:r>
+        <w:rPr>
+          <w:rFonts w:ascii="Cambria" w:hAnsi="Cambria"/>
+        </w:rPr>
+        <w:t>struct</w:t>
+      </w:r>
+      <w:proofErr w:type="spellEnd"/>
+      <w:r>
+        <w:rPr>
+          <w:rFonts w:ascii="Cambria" w:hAnsi="Cambria"/>
+        </w:rPr>
+        <w:t>]</w:t>
       </w:r>
     </w:p>
     <w:p>
@@ -592,11 +716,19 @@
           <w:rFonts w:ascii="Cambria" w:hAnsi="Cambria"/>
         </w:rPr>
       </w:pPr>
-      <w:r>
-        <w:rPr>
-          <w:rFonts w:ascii="Cambria" w:hAnsi="Cambria"/>
-        </w:rPr>
-        <w:t>scans: 'F:\Data\Faces_Vinitha\S14_64\Animal\preprocess\SPrtf_raeMfffdR_spm...'</w:t>
+      <w:proofErr w:type="gramStart"/>
+      <w:r>
+        <w:rPr>
+          <w:rFonts w:ascii="Cambria" w:hAnsi="Cambria"/>
+        </w:rPr>
+        <w:t>scans</w:t>
+      </w:r>
+      <w:proofErr w:type="gramEnd"/>
+      <w:r>
+        <w:rPr>
+          <w:rFonts w:ascii="Cambria" w:hAnsi="Cambria"/>
+        </w:rPr>
+        <w:t>: 'F:\Data\Faces_Vinitha\S14_64\Animal\preprocess\SPrtf_raeMfffdR_spm...'</w:t>
       </w:r>
     </w:p>
     <w:p>
@@ -633,12 +765,14 @@
           <w:rFonts w:ascii="Cambria" w:hAnsi="Cambria"/>
         </w:rPr>
       </w:pPr>
+      <w:proofErr w:type="spellStart"/>
       <w:r>
         <w:rPr>
           <w:rFonts w:ascii="Cambria" w:hAnsi="Cambria"/>
         </w:rPr>
         <w:t>PRT.masks</w:t>
       </w:r>
+      <w:proofErr w:type="spellEnd"/>
     </w:p>
     <w:p>
       <w:pPr>
@@ -669,31 +803,71 @@
           <w:rFonts w:ascii="Cambria" w:hAnsi="Cambria"/>
         </w:rPr>
       </w:pPr>
-      <w:r>
-        <w:rPr>
-          <w:rFonts w:ascii="Cambria" w:hAnsi="Cambria"/>
-        </w:rPr>
-        <w:t>mod_name: 'ECoG</w:t>
-      </w:r>
+      <w:proofErr w:type="spellStart"/>
+      <w:r>
+        <w:rPr>
+          <w:rFonts w:ascii="Cambria" w:hAnsi="Cambria"/>
+        </w:rPr>
+        <w:t>mod_name</w:t>
+      </w:r>
+      <w:proofErr w:type="spellEnd"/>
+      <w:r>
+        <w:rPr>
+          <w:rFonts w:ascii="Cambria" w:hAnsi="Cambria"/>
+        </w:rPr>
+        <w:t>: '</w:t>
+      </w:r>
+      <w:proofErr w:type="spellStart"/>
+      <w:r>
+        <w:rPr>
+          <w:rFonts w:ascii="Cambria" w:hAnsi="Cambria"/>
+        </w:rPr>
+        <w:t>ECoG</w:t>
+      </w:r>
+      <w:proofErr w:type="spellEnd"/>
     </w:p>
     <w:p/>
     <w:p>
       <w:r>
-        <w:t>The RT and covariates per trial are saved in the ‘conds’ field of the ‘design’</w:t>
-      </w:r>
-    </w:p>
-    <w:p>
-      <w:pPr>
-        <w:pStyle w:val="NoSpacing"/>
-        <w:rPr>
-          <w:rFonts w:ascii="Cambria" w:hAnsi="Cambria"/>
-        </w:rPr>
-      </w:pPr>
-      <w:r>
-        <w:rPr>
-          <w:rFonts w:ascii="Cambria" w:hAnsi="Cambria"/>
-        </w:rPr>
-        <w:t>PRT.group.subject.modality.design.conds(1)</w:t>
+        <w:t>The RT and covariates per trial are saved in the ‘</w:t>
+      </w:r>
+      <w:proofErr w:type="spellStart"/>
+      <w:r>
+        <w:t>conds</w:t>
+      </w:r>
+      <w:proofErr w:type="spellEnd"/>
+      <w:r>
+        <w:t>’ field of the ‘design’</w:t>
+      </w:r>
+    </w:p>
+    <w:p>
+      <w:pPr>
+        <w:pStyle w:val="NoSpacing"/>
+        <w:rPr>
+          <w:rFonts w:ascii="Cambria" w:hAnsi="Cambria"/>
+        </w:rPr>
+      </w:pPr>
+      <w:proofErr w:type="spellStart"/>
+      <w:proofErr w:type="gramStart"/>
+      <w:r>
+        <w:rPr>
+          <w:rFonts w:ascii="Cambria" w:hAnsi="Cambria"/>
+        </w:rPr>
+        <w:t>PRT.group.subject.modality.design.conds</w:t>
+      </w:r>
+      <w:proofErr w:type="spellEnd"/>
+      <w:r>
+        <w:rPr>
+          <w:rFonts w:ascii="Cambria" w:hAnsi="Cambria"/>
+        </w:rPr>
+        <w:t>(</w:t>
+      </w:r>
+      <w:proofErr w:type="gramEnd"/>
+      <w:r>
+        <w:rPr>
+          <w:rFonts w:ascii="Cambria" w:hAnsi="Cambria"/>
+        </w:rPr>
+        <w:t>1)</w:t>
       </w:r>
     </w:p>
     <w:p>
@@ -707,11 +881,33 @@
           <w:rFonts w:ascii="Cambria" w:hAnsi="Cambria"/>
         </w:rPr>
       </w:pPr>
-      <w:r>
-        <w:rPr>
-          <w:rFonts w:ascii="Cambria" w:hAnsi="Cambria"/>
-        </w:rPr>
-        <w:t>cond_name: 'animal_F'</w:t>
+      <w:proofErr w:type="spellStart"/>
+      <w:r>
+        <w:rPr>
+          <w:rFonts w:ascii="Cambria" w:hAnsi="Cambria"/>
+        </w:rPr>
+        <w:t>cond_name</w:t>
+      </w:r>
+      <w:proofErr w:type="spellEnd"/>
+      <w:r>
+        <w:rPr>
+          <w:rFonts w:ascii="Cambria" w:hAnsi="Cambria"/>
+        </w:rPr>
+        <w:t>: '</w:t>
+      </w:r>
+      <w:proofErr w:type="spellStart"/>
+      <w:r>
+        <w:rPr>
+          <w:rFonts w:ascii="Cambria" w:hAnsi="Cambria"/>
+        </w:rPr>
+        <w:t>animal_F</w:t>
+      </w:r>
+      <w:proofErr w:type="spellEnd"/>
+      <w:r>
+        <w:rPr>
+          <w:rFonts w:ascii="Cambria" w:hAnsi="Cambria"/>
+        </w:rPr>
+        <w:t>'</w:t>
       </w:r>
     </w:p>
     <w:p>
@@ -797,11 +993,19 @@
           <w:rFonts w:ascii="Cambria" w:hAnsi="Cambria"/>
         </w:rPr>
       </w:pPr>
-      <w:r>
-        <w:rPr>
-          <w:rFonts w:ascii="Cambria" w:hAnsi="Cambria"/>
-        </w:rPr>
-        <w:t>discardedscans: [0x1 double]</w:t>
+      <w:proofErr w:type="spellStart"/>
+      <w:r>
+        <w:rPr>
+          <w:rFonts w:ascii="Cambria" w:hAnsi="Cambria"/>
+        </w:rPr>
+        <w:t>discardedscans</w:t>
+      </w:r>
+      <w:proofErr w:type="spellEnd"/>
+      <w:r>
+        <w:rPr>
+          <w:rFonts w:ascii="Cambria" w:hAnsi="Cambria"/>
+        </w:rPr>
+        <w:t>: [0x1 double]</w:t>
       </w:r>
     </w:p>
     <w:p>
@@ -815,11 +1019,19 @@
           <w:rFonts w:ascii="Cambria" w:hAnsi="Cambria"/>
         </w:rPr>
       </w:pPr>
-      <w:r>
-        <w:rPr>
-          <w:rFonts w:ascii="Cambria" w:hAnsi="Cambria"/>
-        </w:rPr>
-        <w:t>hrfdiscardedscans: []</w:t>
+      <w:proofErr w:type="spellStart"/>
+      <w:r>
+        <w:rPr>
+          <w:rFonts w:ascii="Cambria" w:hAnsi="Cambria"/>
+        </w:rPr>
+        <w:t>hrfdiscardedscans</w:t>
+      </w:r>
+      <w:proofErr w:type="spellEnd"/>
+      <w:r>
+        <w:rPr>
+          <w:rFonts w:ascii="Cambria" w:hAnsi="Cambria"/>
+        </w:rPr>
+        <w:t>: []</w:t>
       </w:r>
     </w:p>
     <w:p>
@@ -833,11 +1045,19 @@
           <w:rFonts w:ascii="Cambria" w:hAnsi="Cambria"/>
         </w:rPr>
       </w:pPr>
-      <w:r>
-        <w:rPr>
-          <w:rFonts w:ascii="Cambria" w:hAnsi="Cambria"/>
-        </w:rPr>
-        <w:t>rt_trial: []</w:t>
+      <w:proofErr w:type="spellStart"/>
+      <w:r>
+        <w:rPr>
+          <w:rFonts w:ascii="Cambria" w:hAnsi="Cambria"/>
+        </w:rPr>
+        <w:t>rt_trial</w:t>
+      </w:r>
+      <w:proofErr w:type="spellEnd"/>
+      <w:r>
+        <w:rPr>
+          <w:rFonts w:ascii="Cambria" w:hAnsi="Cambria"/>
+        </w:rPr>
+        <w:t>: []</w:t>
       </w:r>
     </w:p>
     <w:p>
@@ -851,11 +1071,19 @@
           <w:rFonts w:ascii="Cambria" w:hAnsi="Cambria"/>
         </w:rPr>
       </w:pPr>
-      <w:r>
-        <w:rPr>
-          <w:rFonts w:ascii="Cambria" w:hAnsi="Cambria"/>
-        </w:rPr>
-        <w:t>cov_trial: []</w:t>
+      <w:proofErr w:type="spellStart"/>
+      <w:r>
+        <w:rPr>
+          <w:rFonts w:ascii="Cambria" w:hAnsi="Cambria"/>
+        </w:rPr>
+        <w:t>cov_trial</w:t>
+      </w:r>
+      <w:proofErr w:type="spellEnd"/>
+      <w:r>
+        <w:rPr>
+          <w:rFonts w:ascii="Cambria" w:hAnsi="Cambria"/>
+        </w:rPr>
+        <w:t>: []</w:t>
       </w:r>
     </w:p>
     <w:p/>
@@ -872,7 +1100,15 @@
     </w:p>
     <w:p>
       <w:r>
-        <w:t>Those changes have been transposed to the batch: when choosing a modality, the ‘Data format’ field allows to choose between ‘nifti’, ‘MEEG’ or ‘.mat’, whether the user specified the design by scans or by subjects. As the batch is not ‘dynamic’, the different design options specify for which data format they are available. The help of each field was also revised.</w:t>
+        <w:t>Those changes have been transposed to the batch: when choosing a modality, the ‘Data format’ field allows to choose between ‘</w:t>
+      </w:r>
+      <w:proofErr w:type="spellStart"/>
+      <w:r>
+        <w:t>nifti</w:t>
+      </w:r>
+      <w:proofErr w:type="spellEnd"/>
+      <w:r>
+        <w:t>’, ‘MEEG’ or ‘.mat’, whether the user specified the design by scans or by subjects. As the batch is not ‘dynamic’, the different design options specify for which data format they are available. The help of each field was also revised.</w:t>
       </w:r>
     </w:p>
     <w:p>
@@ -898,7 +1134,7 @@
                     </pic:cNvPicPr>
                   </pic:nvPicPr>
                   <pic:blipFill>
-                    <a:blip r:embed="rId10">
+                    <a:blip r:embed="rId9">
                       <a:extLst>
                         <a:ext uri="{28A0092B-C50C-407E-A947-70E740481C1C}">
                           <a14:useLocalDpi xmlns:a14="http://schemas.microsoft.com/office/drawing/2010/main" val="0"/>
@@ -951,7 +1187,7 @@
                     </pic:cNvPicPr>
                   </pic:nvPicPr>
                   <pic:blipFill>
-                    <a:blip r:embed="rId11">
+                    <a:blip r:embed="rId10">
                       <a:extLst>
                         <a:ext uri="{28A0092B-C50C-407E-A947-70E740481C1C}">
                           <a14:useLocalDpi xmlns:a14="http://schemas.microsoft.com/office/drawing/2010/main" val="0"/>
@@ -999,7 +1235,15 @@
         </w:rPr>
       </w:pPr>
       <w:r>
-        <w:t xml:space="preserve">Regarding the masks, the user needs to specify a ‘mask’ for each modality, as before. However they need to choose a file only for the ‘nifti’ input modalities. This is not optimal but might be less confusing. It is also easier in the code, as the number of masks serves as a check for all the modalities that are defined (i.e. checking number of modalities is the same across subjects and so on…). For MEEG or .mat, </w:t>
+        <w:t>Regarding the masks, the user needs to specify a ‘mask’ for each modality, as before. However they need to choose a file only for the ‘</w:t>
+      </w:r>
+      <w:proofErr w:type="spellStart"/>
+      <w:r>
+        <w:t>nifti</w:t>
+      </w:r>
+      <w:proofErr w:type="spellEnd"/>
+      <w:r>
+        <w:t xml:space="preserve">’ input modalities. This is not optimal but might be less confusing. It is also easier in the code, as the number of masks serves as a check for all the modalities that are defined (i.e. checking number of modalities is the same across subjects and so on…). For MEEG or .mat, </w:t>
       </w:r>
       <w:r>
         <w:lastRenderedPageBreak/>
@@ -1059,7 +1303,15 @@
     </w:p>
     <w:p>
       <w:r>
-        <w:t>In the code, checks make sure that the right type of design is selected for MEEG (‘Events in MEEG file’) or for .mat (‘no design’). This can easily be modified when extending the ‘.mat’ option to ‘new_design’ later on. There is also a restriction that the number of files for either a MEEG or .mat modality should be 1 (everything should be contained in this specified file, for each subject and modality). Different runs of EEG/MEG experiments can be entered as different modalities and later concatenated in ‘trials’ at the feature set stage.</w:t>
+        <w:t>In the code, checks make sure that the right type of design is selected for MEEG (‘Events in MEEG file’) or for .mat (‘no design’). This can easily be modified when extending the ‘.mat’ option to ‘</w:t>
+      </w:r>
+      <w:proofErr w:type="spellStart"/>
+      <w:r>
+        <w:t>new_design</w:t>
+      </w:r>
+      <w:proofErr w:type="spellEnd"/>
+      <w:r>
+        <w:t>’ later on. There is also a restriction that the number of files for either a MEEG or .mat modality should be 1 (everything should be contained in this specified file, for each subject and modality). Different runs of EEG/MEG experiments can be entered as different modalities and later concatenated in ‘trials’ at the feature set stage.</w:t>
       </w:r>
     </w:p>
     <w:p>
@@ -1085,7 +1337,7 @@
                     </pic:cNvPicPr>
                   </pic:nvPicPr>
                   <pic:blipFill>
-                    <a:blip r:embed="rId12">
+                    <a:blip r:embed="rId11">
                       <a:extLst>
                         <a:ext uri="{28A0092B-C50C-407E-A947-70E740481C1C}">
                           <a14:useLocalDpi xmlns:a14="http://schemas.microsoft.com/office/drawing/2010/main" val="0"/>
@@ -1138,7 +1390,7 @@
                     </pic:cNvPicPr>
                   </pic:nvPicPr>
                   <pic:blipFill>
-                    <a:blip r:embed="rId13">
+                    <a:blip r:embed="rId12">
                       <a:extLst>
                         <a:ext uri="{28A0092B-C50C-407E-A947-70E740481C1C}">
                           <a14:useLocalDpi xmlns:a14="http://schemas.microsoft.com/office/drawing/2010/main" val="0"/>
@@ -1232,7 +1484,7 @@
                     </pic:cNvPicPr>
                   </pic:nvPicPr>
                   <pic:blipFill>
-                    <a:blip r:embed="rId14">
+                    <a:blip r:embed="rId13">
                       <a:extLst>
                         <a:ext uri="{28A0092B-C50C-407E-A947-70E740481C1C}">
                           <a14:useLocalDpi xmlns:a14="http://schemas.microsoft.com/office/drawing/2010/main" val="0"/>
@@ -1285,7 +1537,7 @@
                     </pic:cNvPicPr>
                   </pic:nvPicPr>
                   <pic:blipFill>
-                    <a:blip r:embed="rId15">
+                    <a:blip r:embed="rId14">
                       <a:extLst>
                         <a:ext uri="{28A0092B-C50C-407E-A947-70E740481C1C}">
                           <a14:useLocalDpi xmlns:a14="http://schemas.microsoft.com/office/drawing/2010/main" val="0"/>
@@ -1356,7 +1608,7 @@
                     </pic:cNvPicPr>
                   </pic:nvPicPr>
                   <pic:blipFill>
-                    <a:blip r:embed="rId16">
+                    <a:blip r:embed="rId15">
                       <a:extLst>
                         <a:ext uri="{28A0092B-C50C-407E-A947-70E740481C1C}">
                           <a14:useLocalDpi xmlns:a14="http://schemas.microsoft.com/office/drawing/2010/main" val="0"/>
@@ -1536,6 +1788,12 @@
         <w:t>.</w:t>
       </w:r>
       <w:r>
+        <w:rPr>
+          <w:color w:val="FF0000"/>
+        </w:rPr>
+        <w:t xml:space="preserve"> Jessica: time series with multiple subjects could not be entered using the group/subject/modality design. It would also be a pain to do so for within subject. I think there should not be this limitation for .mat.</w:t>
+      </w:r>
+      <w:r>
         <w:br w:type="page"/>
       </w:r>
     </w:p>
@@ -1585,7 +1843,7 @@
                     </pic:cNvPicPr>
                   </pic:nvPicPr>
                   <pic:blipFill>
-                    <a:blip r:embed="rId17">
+                    <a:blip r:embed="rId16">
                       <a:extLst>
                         <a:ext uri="{28A0092B-C50C-407E-A947-70E740481C1C}">
                           <a14:useLocalDpi xmlns:a14="http://schemas.microsoft.com/office/drawing/2010/main" val="0"/>
@@ -1669,7 +1927,7 @@
                     </pic:cNvPicPr>
                   </pic:nvPicPr>
                   <pic:blipFill>
-                    <a:blip r:embed="rId18">
+                    <a:blip r:embed="rId17">
                       <a:extLst>
                         <a:ext uri="{28A0092B-C50C-407E-A947-70E740481C1C}">
                           <a14:useLocalDpi xmlns:a14="http://schemas.microsoft.com/office/drawing/2010/main" val="0"/>
@@ -1719,7 +1977,31 @@
     <w:p>
       <w:r>
         <w:lastRenderedPageBreak/>
-        <w:t>The user can play on the channels, selecting them all or only some. Channels marked as bad in the MEEG object are displayed in red. It is possible to average the signal over the selected channels, or to build one kernel per channel. Similarly, the user can select a sub time window by specifying which ms to include in the kernel. The signal can then be averaged over time points, or one kernel can be built (per time point or per sub-time window of xx ms). If the data set contain frequency information (i.e. multiple frequency bins), the user can select which bins to analyze, average the signal within the band of interest or build on kernel per frequency bin. It is not possible to average over one dimension and select multiple kernels for that same dimension (which is logical). It is however perfectly acceptable to build multiple kernels one more than one dimension (e.g. one kernel per channel and per sub-time window of 50ms). Frequent use with ECoG data: select all the good channels, time points after stimulus onset [0 350ms]</w:t>
+        <w:t xml:space="preserve">The user can play on the channels, selecting them all or only some. Channels marked as bad in the MEEG object are displayed in red. It is possible to average the signal over the selected channels, or to build one kernel per channel. Similarly, the user can select a sub time window by specifying which </w:t>
+      </w:r>
+      <w:proofErr w:type="spellStart"/>
+      <w:r>
+        <w:t>ms</w:t>
+      </w:r>
+      <w:proofErr w:type="spellEnd"/>
+      <w:r>
+        <w:t xml:space="preserve"> to include in the kernel. The signal can then be averaged over time points, or one kernel can be built (per time point or per sub-time window of xx </w:t>
+      </w:r>
+      <w:proofErr w:type="spellStart"/>
+      <w:r>
+        <w:t>ms</w:t>
+      </w:r>
+      <w:proofErr w:type="spellEnd"/>
+      <w:r>
+        <w:t xml:space="preserve">). If the data set contain frequency information (i.e. multiple frequency bins), the user can select which bins to analyze, average the signal within the band of interest or build on kernel per frequency bin. It is not possible to average over one dimension and select multiple kernels for that same dimension (which is logical). It is however perfectly acceptable to build multiple kernels one more than one dimension (e.g. one kernel per channel and per sub-time window of 50ms). Frequent use with </w:t>
+      </w:r>
+      <w:proofErr w:type="spellStart"/>
+      <w:r>
+        <w:t>ECoG</w:t>
+      </w:r>
+      <w:proofErr w:type="spellEnd"/>
+      <w:r>
+        <w:t xml:space="preserve"> data: select all the good channels, time points after stimulus onset [0 350ms]</w:t>
       </w:r>
       <w:r>
         <w:t xml:space="preserve"> and the high frequency broadband (70 to 170 Hz), average the signal within the frequency band, build multiple kernels on the channels.</w:t>
@@ -1740,7 +2022,21 @@
         <w:rPr>
           <w:color w:val="FF0000"/>
         </w:rPr>
-        <w:t xml:space="preserve">In the Prepare Feature Set module different .mat modalities can be combined (either by concatenation, if they have the same dimensions, or using MKL) as well as .mat and other modalities, such as nifti (using the MKL option). </w:t>
+        <w:t xml:space="preserve">In the Prepare Feature Set module different .mat modalities can be combined (either by concatenation, if they have the same dimensions, or using MKL) as well as .mat and other modalities, such as </w:t>
+      </w:r>
+      <w:proofErr w:type="spellStart"/>
+      <w:r>
+        <w:rPr>
+          <w:color w:val="FF0000"/>
+        </w:rPr>
+        <w:t>nifti</w:t>
+      </w:r>
+      <w:proofErr w:type="spellEnd"/>
+      <w:r>
+        <w:rPr>
+          <w:color w:val="FF0000"/>
+        </w:rPr>
+        <w:t xml:space="preserve"> (using the MKL option). </w:t>
       </w:r>
       <w:r>
         <w:rPr>
@@ -1760,12 +2056,14 @@
         </w:rPr>
         <w:t xml:space="preserve"> for </w:t>
       </w:r>
+      <w:proofErr w:type="spellStart"/>
       <w:r>
         <w:rPr>
           <w:color w:val="FF0000"/>
         </w:rPr>
         <w:t>nifti</w:t>
       </w:r>
+      <w:proofErr w:type="spellEnd"/>
       <w:r>
         <w:rPr>
           <w:color w:val="FF0000"/>
@@ -1776,7 +2074,21 @@
         <w:rPr>
           <w:color w:val="FF0000"/>
         </w:rPr>
-        <w:t xml:space="preserve"> (e.g. Detrend and Scaling)</w:t>
+        <w:t xml:space="preserve"> (e.g. </w:t>
+      </w:r>
+      <w:proofErr w:type="spellStart"/>
+      <w:r>
+        <w:rPr>
+          <w:color w:val="FF0000"/>
+        </w:rPr>
+        <w:t>Detrend</w:t>
+      </w:r>
+      <w:proofErr w:type="spellEnd"/>
+      <w:r>
+        <w:rPr>
+          <w:color w:val="FF0000"/>
+        </w:rPr>
+        <w:t xml:space="preserve"> and Scaling)</w:t>
       </w:r>
       <w:r>
         <w:rPr>
@@ -1838,7 +2150,7 @@
                     <pic:cNvPicPr/>
                   </pic:nvPicPr>
                   <pic:blipFill>
-                    <a:blip r:embed="rId19">
+                    <a:blip r:embed="rId18">
                       <a:extLst>
                         <a:ext uri="{28A0092B-C50C-407E-A947-70E740481C1C}">
                           <a14:useLocalDpi xmlns:a14="http://schemas.microsoft.com/office/drawing/2010/main" val="0"/>
@@ -1859,7 +2171,7 @@
                     </a:prstGeom>
                     <a:extLst>
                       <a:ext uri="{FAA26D3D-D897-4be2-8F04-BA451C77F1D7}">
-                        <ma14:placeholderFlag xmlns:ma14="http://schemas.microsoft.com/office/mac/drawingml/2011/main"/>
+                        <ma14:placeholderFlag xmlns:ma14="http://schemas.microsoft.com/office/mac/drawingml/2011/main" xmlns:w="http://schemas.openxmlformats.org/wordprocessingml/2006/main" xmlns:w10="urn:schemas-microsoft-com:office:word" xmlns:v="urn:schemas-microsoft-com:vml" xmlns:o="urn:schemas-microsoft-com:office:office" xmlns:mv="urn:schemas-microsoft-com:mac:vml" xmlns:mo="http://schemas.microsoft.com/office/mac/office/2008/main" xmlns=""/>
                       </a:ext>
                     </a:extLst>
                   </pic:spPr>
@@ -1967,21 +2279,45 @@
     <w:p/>
     <w:p>
       <w:r>
-        <w:t>The PRT structure has been affected by these changes for the fs and fas:</w:t>
-      </w:r>
-    </w:p>
-    <w:p>
-      <w:pPr>
-        <w:pStyle w:val="NoSpacing"/>
-        <w:rPr>
-          <w:rFonts w:ascii="Cambria" w:hAnsi="Cambria"/>
-        </w:rPr>
-      </w:pPr>
-      <w:r>
-        <w:rPr>
-          <w:rFonts w:ascii="Cambria" w:hAnsi="Cambria"/>
-        </w:rPr>
-        <w:t>PRT.fs(1)</w:t>
+        <w:t xml:space="preserve">The PRT structure has been affected by these changes for the fs and </w:t>
+      </w:r>
+      <w:proofErr w:type="spellStart"/>
+      <w:r>
+        <w:t>fas</w:t>
+      </w:r>
+      <w:proofErr w:type="spellEnd"/>
+      <w:r>
+        <w:t>:</w:t>
+      </w:r>
+    </w:p>
+    <w:p>
+      <w:pPr>
+        <w:pStyle w:val="NoSpacing"/>
+        <w:rPr>
+          <w:rFonts w:ascii="Cambria" w:hAnsi="Cambria"/>
+        </w:rPr>
+      </w:pPr>
+      <w:proofErr w:type="spellStart"/>
+      <w:proofErr w:type="gramStart"/>
+      <w:r>
+        <w:rPr>
+          <w:rFonts w:ascii="Cambria" w:hAnsi="Cambria"/>
+        </w:rPr>
+        <w:t>PRT.fs</w:t>
+      </w:r>
+      <w:proofErr w:type="spellEnd"/>
+      <w:r>
+        <w:rPr>
+          <w:rFonts w:ascii="Cambria" w:hAnsi="Cambria"/>
+        </w:rPr>
+        <w:t>(</w:t>
+      </w:r>
+      <w:proofErr w:type="gramEnd"/>
+      <w:r>
+        <w:rPr>
+          <w:rFonts w:ascii="Cambria" w:hAnsi="Cambria"/>
+        </w:rPr>
+        <w:t>1)</w:t>
       </w:r>
     </w:p>
     <w:p>
@@ -1995,11 +2331,33 @@
           <w:rFonts w:ascii="Cambria" w:hAnsi="Cambria"/>
         </w:rPr>
       </w:pPr>
-      <w:r>
-        <w:rPr>
-          <w:rFonts w:ascii="Cambria" w:hAnsi="Cambria"/>
-        </w:rPr>
-        <w:t>fs_name: 'TCChans'</w:t>
+      <w:proofErr w:type="spellStart"/>
+      <w:r>
+        <w:rPr>
+          <w:rFonts w:ascii="Cambria" w:hAnsi="Cambria"/>
+        </w:rPr>
+        <w:t>fs_name</w:t>
+      </w:r>
+      <w:proofErr w:type="spellEnd"/>
+      <w:r>
+        <w:rPr>
+          <w:rFonts w:ascii="Cambria" w:hAnsi="Cambria"/>
+        </w:rPr>
+        <w:t>: '</w:t>
+      </w:r>
+      <w:proofErr w:type="spellStart"/>
+      <w:r>
+        <w:rPr>
+          <w:rFonts w:ascii="Cambria" w:hAnsi="Cambria"/>
+        </w:rPr>
+        <w:t>TCChans</w:t>
+      </w:r>
+      <w:proofErr w:type="spellEnd"/>
+      <w:r>
+        <w:rPr>
+          <w:rFonts w:ascii="Cambria" w:hAnsi="Cambria"/>
+        </w:rPr>
+        <w:t>'</w:t>
       </w:r>
     </w:p>
     <w:p>
@@ -2013,11 +2371,33 @@
           <w:rFonts w:ascii="Cambria" w:hAnsi="Cambria"/>
         </w:rPr>
       </w:pPr>
-      <w:r>
-        <w:rPr>
-          <w:rFonts w:ascii="Cambria" w:hAnsi="Cambria"/>
-        </w:rPr>
-        <w:t>k_file: 'TCChans'</w:t>
+      <w:proofErr w:type="spellStart"/>
+      <w:r>
+        <w:rPr>
+          <w:rFonts w:ascii="Cambria" w:hAnsi="Cambria"/>
+        </w:rPr>
+        <w:t>k_file</w:t>
+      </w:r>
+      <w:proofErr w:type="spellEnd"/>
+      <w:r>
+        <w:rPr>
+          <w:rFonts w:ascii="Cambria" w:hAnsi="Cambria"/>
+        </w:rPr>
+        <w:t>: '</w:t>
+      </w:r>
+      <w:proofErr w:type="spellStart"/>
+      <w:r>
+        <w:rPr>
+          <w:rFonts w:ascii="Cambria" w:hAnsi="Cambria"/>
+        </w:rPr>
+        <w:t>TCChans</w:t>
+      </w:r>
+      <w:proofErr w:type="spellEnd"/>
+      <w:r>
+        <w:rPr>
+          <w:rFonts w:ascii="Cambria" w:hAnsi="Cambria"/>
+        </w:rPr>
+        <w:t>'</w:t>
       </w:r>
     </w:p>
     <w:p>
@@ -2031,11 +2411,19 @@
           <w:rFonts w:ascii="Cambria" w:hAnsi="Cambria"/>
         </w:rPr>
       </w:pPr>
-      <w:r>
-        <w:rPr>
-          <w:rFonts w:ascii="Cambria" w:hAnsi="Cambria"/>
-        </w:rPr>
-        <w:t>id_col_names: {'group'  'subject'  'modality'  'condition'  'block'  'scan'}</w:t>
+      <w:proofErr w:type="spellStart"/>
+      <w:r>
+        <w:rPr>
+          <w:rFonts w:ascii="Cambria" w:hAnsi="Cambria"/>
+        </w:rPr>
+        <w:t>id_col_names</w:t>
+      </w:r>
+      <w:proofErr w:type="spellEnd"/>
+      <w:r>
+        <w:rPr>
+          <w:rFonts w:ascii="Cambria" w:hAnsi="Cambria"/>
+        </w:rPr>
+        <w:t>: {'group'  'subject'  'modality'  'condition'  'block'  'scan'}</w:t>
       </w:r>
     </w:p>
     <w:p>
@@ -2049,11 +2437,33 @@
           <w:rFonts w:ascii="Cambria" w:hAnsi="Cambria"/>
         </w:rPr>
       </w:pPr>
-      <w:r>
-        <w:rPr>
-          <w:rFonts w:ascii="Cambria" w:hAnsi="Cambria"/>
-        </w:rPr>
-        <w:t>fas: [1x1 struct]</w:t>
+      <w:proofErr w:type="spellStart"/>
+      <w:r>
+        <w:rPr>
+          <w:rFonts w:ascii="Cambria" w:hAnsi="Cambria"/>
+        </w:rPr>
+        <w:t>fas</w:t>
+      </w:r>
+      <w:proofErr w:type="spellEnd"/>
+      <w:r>
+        <w:rPr>
+          <w:rFonts w:ascii="Cambria" w:hAnsi="Cambria"/>
+        </w:rPr>
+        <w:t xml:space="preserve">: [1x1 </w:t>
+      </w:r>
+      <w:proofErr w:type="spellStart"/>
+      <w:r>
+        <w:rPr>
+          <w:rFonts w:ascii="Cambria" w:hAnsi="Cambria"/>
+        </w:rPr>
+        <w:t>struct</w:t>
+      </w:r>
+      <w:proofErr w:type="spellEnd"/>
+      <w:r>
+        <w:rPr>
+          <w:rFonts w:ascii="Cambria" w:hAnsi="Cambria"/>
+        </w:rPr>
+        <w:t>]</w:t>
       </w:r>
     </w:p>
     <w:p>
@@ -2071,7 +2481,21 @@
         <w:rPr>
           <w:rFonts w:ascii="Cambria" w:hAnsi="Cambria"/>
         </w:rPr>
-        <w:t>modality: [1x1 struct]</w:t>
+        <w:t xml:space="preserve">modality: [1x1 </w:t>
+      </w:r>
+      <w:proofErr w:type="spellStart"/>
+      <w:r>
+        <w:rPr>
+          <w:rFonts w:ascii="Cambria" w:hAnsi="Cambria"/>
+        </w:rPr>
+        <w:t>struct</w:t>
+      </w:r>
+      <w:proofErr w:type="spellEnd"/>
+      <w:r>
+        <w:rPr>
+          <w:rFonts w:ascii="Cambria" w:hAnsi="Cambria"/>
+        </w:rPr>
+        <w:t>]</w:t>
       </w:r>
     </w:p>
     <w:p>
@@ -2085,11 +2509,19 @@
           <w:rFonts w:ascii="Cambria" w:hAnsi="Cambria"/>
         </w:rPr>
       </w:pPr>
-      <w:r>
-        <w:rPr>
-          <w:rFonts w:ascii="Cambria" w:hAnsi="Cambria"/>
-        </w:rPr>
-        <w:t>id_mat: [550x6 double]</w:t>
+      <w:proofErr w:type="spellStart"/>
+      <w:r>
+        <w:rPr>
+          <w:rFonts w:ascii="Cambria" w:hAnsi="Cambria"/>
+        </w:rPr>
+        <w:t>id_mat</w:t>
+      </w:r>
+      <w:proofErr w:type="spellEnd"/>
+      <w:r>
+        <w:rPr>
+          <w:rFonts w:ascii="Cambria" w:hAnsi="Cambria"/>
+        </w:rPr>
+        <w:t>: [550x6 double]</w:t>
       </w:r>
     </w:p>
     <w:p>
@@ -2103,11 +2535,19 @@
           <w:rFonts w:ascii="Cambria" w:hAnsi="Cambria"/>
         </w:rPr>
       </w:pPr>
-      <w:r>
-        <w:rPr>
-          <w:rFonts w:ascii="Cambria" w:hAnsi="Cambria"/>
-        </w:rPr>
-        <w:t>multkernelROI: 1</w:t>
+      <w:proofErr w:type="spellStart"/>
+      <w:r>
+        <w:rPr>
+          <w:rFonts w:ascii="Cambria" w:hAnsi="Cambria"/>
+        </w:rPr>
+        <w:t>multkernelROI</w:t>
+      </w:r>
+      <w:proofErr w:type="spellEnd"/>
+      <w:r>
+        <w:rPr>
+          <w:rFonts w:ascii="Cambria" w:hAnsi="Cambria"/>
+        </w:rPr>
+        <w:t>: 1</w:t>
       </w:r>
     </w:p>
     <w:p>
@@ -2121,11 +2561,19 @@
           <w:rFonts w:ascii="Cambria" w:hAnsi="Cambria"/>
         </w:rPr>
       </w:pPr>
-      <w:r>
-        <w:rPr>
-          <w:rFonts w:ascii="Cambria" w:hAnsi="Cambria"/>
-        </w:rPr>
-        <w:t>multkernel: 0</w:t>
+      <w:proofErr w:type="spellStart"/>
+      <w:r>
+        <w:rPr>
+          <w:rFonts w:ascii="Cambria" w:hAnsi="Cambria"/>
+        </w:rPr>
+        <w:t>multkernel</w:t>
+      </w:r>
+      <w:proofErr w:type="spellEnd"/>
+      <w:r>
+        <w:rPr>
+          <w:rFonts w:ascii="Cambria" w:hAnsi="Cambria"/>
+        </w:rPr>
+        <w:t>: 0</w:t>
       </w:r>
     </w:p>
     <w:p>
@@ -2139,11 +2587,33 @@
           <w:rFonts w:ascii="Cambria" w:hAnsi="Cambria"/>
         </w:rPr>
       </w:pPr>
-      <w:r>
-        <w:rPr>
-          <w:rFonts w:ascii="Cambria" w:hAnsi="Cambria"/>
-        </w:rPr>
-        <w:t>atlas_name: 'Ch_fr_tp'</w:t>
+      <w:proofErr w:type="spellStart"/>
+      <w:r>
+        <w:rPr>
+          <w:rFonts w:ascii="Cambria" w:hAnsi="Cambria"/>
+        </w:rPr>
+        <w:t>atlas_name</w:t>
+      </w:r>
+      <w:proofErr w:type="spellEnd"/>
+      <w:r>
+        <w:rPr>
+          <w:rFonts w:ascii="Cambria" w:hAnsi="Cambria"/>
+        </w:rPr>
+        <w:t>: '</w:t>
+      </w:r>
+      <w:proofErr w:type="spellStart"/>
+      <w:r>
+        <w:rPr>
+          <w:rFonts w:ascii="Cambria" w:hAnsi="Cambria"/>
+        </w:rPr>
+        <w:t>Ch_fr_tp</w:t>
+      </w:r>
+      <w:proofErr w:type="spellEnd"/>
+      <w:r>
+        <w:rPr>
+          <w:rFonts w:ascii="Cambria" w:hAnsi="Cambria"/>
+        </w:rPr>
+        <w:t>'</w:t>
       </w:r>
     </w:p>
     <w:p>
@@ -2162,11 +2632,27 @@
           <w:rFonts w:ascii="Cambria" w:hAnsi="Cambria"/>
         </w:rPr>
       </w:pPr>
-      <w:r>
-        <w:rPr>
-          <w:rFonts w:ascii="Cambria" w:hAnsi="Cambria"/>
-        </w:rPr>
-        <w:t>PRT.fs(1).modality</w:t>
+      <w:proofErr w:type="spellStart"/>
+      <w:proofErr w:type="gramStart"/>
+      <w:r>
+        <w:rPr>
+          <w:rFonts w:ascii="Cambria" w:hAnsi="Cambria"/>
+        </w:rPr>
+        <w:t>PRT.fs</w:t>
+      </w:r>
+      <w:proofErr w:type="spellEnd"/>
+      <w:r>
+        <w:rPr>
+          <w:rFonts w:ascii="Cambria" w:hAnsi="Cambria"/>
+        </w:rPr>
+        <w:t>(</w:t>
+      </w:r>
+      <w:proofErr w:type="gramEnd"/>
+      <w:r>
+        <w:rPr>
+          <w:rFonts w:ascii="Cambria" w:hAnsi="Cambria"/>
+        </w:rPr>
+        <w:t>1).modality</w:t>
       </w:r>
     </w:p>
     <w:p>
@@ -2180,11 +2666,33 @@
           <w:rFonts w:ascii="Cambria" w:hAnsi="Cambria"/>
         </w:rPr>
       </w:pPr>
-      <w:r>
-        <w:rPr>
-          <w:rFonts w:ascii="Cambria" w:hAnsi="Cambria"/>
-        </w:rPr>
-        <w:t>mod_name: {'ECoG'}</w:t>
+      <w:proofErr w:type="spellStart"/>
+      <w:r>
+        <w:rPr>
+          <w:rFonts w:ascii="Cambria" w:hAnsi="Cambria"/>
+        </w:rPr>
+        <w:t>mod_name</w:t>
+      </w:r>
+      <w:proofErr w:type="spellEnd"/>
+      <w:r>
+        <w:rPr>
+          <w:rFonts w:ascii="Cambria" w:hAnsi="Cambria"/>
+        </w:rPr>
+        <w:t>: {'</w:t>
+      </w:r>
+      <w:proofErr w:type="spellStart"/>
+      <w:r>
+        <w:rPr>
+          <w:rFonts w:ascii="Cambria" w:hAnsi="Cambria"/>
+        </w:rPr>
+        <w:t>ECoG</w:t>
+      </w:r>
+      <w:proofErr w:type="spellEnd"/>
+      <w:r>
+        <w:rPr>
+          <w:rFonts w:ascii="Cambria" w:hAnsi="Cambria"/>
+        </w:rPr>
+        <w:t>'}</w:t>
       </w:r>
     </w:p>
     <w:p>
@@ -2216,11 +2724,19 @@
           <w:rFonts w:ascii="Cambria" w:hAnsi="Cambria"/>
         </w:rPr>
       </w:pPr>
-      <w:r>
-        <w:rPr>
-          <w:rFonts w:ascii="Cambria" w:hAnsi="Cambria"/>
-        </w:rPr>
-        <w:t>multkern: [1 0 0]</w:t>
+      <w:proofErr w:type="spellStart"/>
+      <w:r>
+        <w:rPr>
+          <w:rFonts w:ascii="Cambria" w:hAnsi="Cambria"/>
+        </w:rPr>
+        <w:t>multkern</w:t>
+      </w:r>
+      <w:proofErr w:type="spellEnd"/>
+      <w:r>
+        <w:rPr>
+          <w:rFonts w:ascii="Cambria" w:hAnsi="Cambria"/>
+        </w:rPr>
+        <w:t>: [1 0 0]</w:t>
       </w:r>
     </w:p>
     <w:p>
@@ -2234,11 +2750,33 @@
           <w:rFonts w:ascii="Cambria" w:hAnsi="Cambria"/>
         </w:rPr>
       </w:pPr>
-      <w:r>
-        <w:rPr>
-          <w:rFonts w:ascii="Cambria" w:hAnsi="Cambria"/>
-        </w:rPr>
-        <w:t>normalise: [1x1 struct]</w:t>
+      <w:proofErr w:type="spellStart"/>
+      <w:r>
+        <w:rPr>
+          <w:rFonts w:ascii="Cambria" w:hAnsi="Cambria"/>
+        </w:rPr>
+        <w:t>normalise</w:t>
+      </w:r>
+      <w:proofErr w:type="spellEnd"/>
+      <w:r>
+        <w:rPr>
+          <w:rFonts w:ascii="Cambria" w:hAnsi="Cambria"/>
+        </w:rPr>
+        <w:t xml:space="preserve">: [1x1 </w:t>
+      </w:r>
+      <w:proofErr w:type="spellStart"/>
+      <w:r>
+        <w:rPr>
+          <w:rFonts w:ascii="Cambria" w:hAnsi="Cambria"/>
+        </w:rPr>
+        <w:t>struct</w:t>
+      </w:r>
+      <w:proofErr w:type="spellEnd"/>
+      <w:r>
+        <w:rPr>
+          <w:rFonts w:ascii="Cambria" w:hAnsi="Cambria"/>
+        </w:rPr>
+        <w:t>]</w:t>
       </w:r>
     </w:p>
     <w:p>
@@ -2252,11 +2790,19 @@
           <w:rFonts w:ascii="Cambria" w:hAnsi="Cambria"/>
         </w:rPr>
       </w:pPr>
-      <w:r>
-        <w:rPr>
-          <w:rFonts w:ascii="Cambria" w:hAnsi="Cambria"/>
-        </w:rPr>
-        <w:t>idfeat_fas: [17199x1 double]</w:t>
+      <w:proofErr w:type="spellStart"/>
+      <w:r>
+        <w:rPr>
+          <w:rFonts w:ascii="Cambria" w:hAnsi="Cambria"/>
+        </w:rPr>
+        <w:t>idfeat_fas</w:t>
+      </w:r>
+      <w:proofErr w:type="spellEnd"/>
+      <w:r>
+        <w:rPr>
+          <w:rFonts w:ascii="Cambria" w:hAnsi="Cambria"/>
+        </w:rPr>
+        <w:t>: [17199x1 double]</w:t>
       </w:r>
     </w:p>
     <w:p>
@@ -2270,11 +2816,19 @@
           <w:rFonts w:ascii="Cambria" w:hAnsi="Cambria"/>
         </w:rPr>
       </w:pPr>
-      <w:r>
-        <w:rPr>
-          <w:rFonts w:ascii="Cambria" w:hAnsi="Cambria"/>
-        </w:rPr>
-        <w:t>dim_m: {[49x1 double]  [1]  [1x351 double]}</w:t>
+      <w:proofErr w:type="spellStart"/>
+      <w:r>
+        <w:rPr>
+          <w:rFonts w:ascii="Cambria" w:hAnsi="Cambria"/>
+        </w:rPr>
+        <w:t>dim_m</w:t>
+      </w:r>
+      <w:proofErr w:type="spellEnd"/>
+      <w:r>
+        <w:rPr>
+          <w:rFonts w:ascii="Cambria" w:hAnsi="Cambria"/>
+        </w:rPr>
+        <w:t>: {[49x1 double]  [1]  [1x351 double]}</w:t>
       </w:r>
     </w:p>
     <w:p>
@@ -2288,11 +2842,19 @@
           <w:rFonts w:ascii="Cambria" w:hAnsi="Cambria"/>
         </w:rPr>
       </w:pPr>
-      <w:r>
-        <w:rPr>
-          <w:rFonts w:ascii="Cambria" w:hAnsi="Cambria"/>
-        </w:rPr>
-        <w:t>idfeat_img: {49x1 cell}</w:t>
+      <w:proofErr w:type="spellStart"/>
+      <w:r>
+        <w:rPr>
+          <w:rFonts w:ascii="Cambria" w:hAnsi="Cambria"/>
+        </w:rPr>
+        <w:t>idfeat_img</w:t>
+      </w:r>
+      <w:proofErr w:type="spellEnd"/>
+      <w:r>
+        <w:rPr>
+          <w:rFonts w:ascii="Cambria" w:hAnsi="Cambria"/>
+        </w:rPr>
+        <w:t>: {49x1 cell}</w:t>
       </w:r>
     </w:p>
     <w:p>
@@ -2306,17 +2868,49 @@
           <w:rFonts w:ascii="Cambria" w:hAnsi="Cambria"/>
         </w:rPr>
       </w:pPr>
-      <w:r>
-        <w:rPr>
-          <w:rFonts w:ascii="Cambria" w:hAnsi="Cambria"/>
-        </w:rPr>
-        <w:t>igood_kerns: [1x49 double]</w:t>
+      <w:proofErr w:type="spellStart"/>
+      <w:r>
+        <w:rPr>
+          <w:rFonts w:ascii="Cambria" w:hAnsi="Cambria"/>
+        </w:rPr>
+        <w:t>igood_kerns</w:t>
+      </w:r>
+      <w:proofErr w:type="spellEnd"/>
+      <w:r>
+        <w:rPr>
+          <w:rFonts w:ascii="Cambria" w:hAnsi="Cambria"/>
+        </w:rPr>
+        <w:t>: [1x49 double]</w:t>
       </w:r>
     </w:p>
     <w:p/>
     <w:p>
       <w:r>
-        <w:t>In PRT.fs.modality, the fields ‘aver’ and ‘multkern’ were added. They represent on which dimensions averaging or multiple kernels were performed. It is important for the construction of the weights later on. The ‘dim_m’ field also keeps the indexes of which channels, frequency bins and time points were used. Again, it is useful for the weights and the display of the weights (to obtain channel labels for example)</w:t>
+        <w:t xml:space="preserve">In </w:t>
+      </w:r>
+      <w:proofErr w:type="spellStart"/>
+      <w:r>
+        <w:t>PRT.fs.modality</w:t>
+      </w:r>
+      <w:proofErr w:type="spellEnd"/>
+      <w:r>
+        <w:t>, the fields ‘aver’ and ‘</w:t>
+      </w:r>
+      <w:proofErr w:type="spellStart"/>
+      <w:r>
+        <w:t>multkern</w:t>
+      </w:r>
+      <w:proofErr w:type="spellEnd"/>
+      <w:r>
+        <w:t>’ were added. They represent on which dimensions averaging or multiple kernels were performed. It is important for the construction of the weights later on. The ‘</w:t>
+      </w:r>
+      <w:proofErr w:type="spellStart"/>
+      <w:r>
+        <w:t>dim_m</w:t>
+      </w:r>
+      <w:proofErr w:type="spellEnd"/>
+      <w:r>
+        <w:t>’ field also keeps the indexes of which channels, frequency bins and time points were used. Again, it is useful for the weights and the display of the weights (to obtain channel labels for example)</w:t>
       </w:r>
       <w:r>
         <w:t>.</w:t>
@@ -2324,7 +2918,23 @@
     </w:p>
     <w:p>
       <w:r>
-        <w:t>Regarding the file array structure, the hdr is the object of the first file for the first subject of the modality. It allows to keep the channel labels, time points and frequency bins, as we would for image orientation or so. ‘idfeat_img’ is empty as it is not possible/useful to have a 1</w:t>
+        <w:t xml:space="preserve">Regarding the file array structure, the </w:t>
+      </w:r>
+      <w:proofErr w:type="spellStart"/>
+      <w:r>
+        <w:t>hdr</w:t>
+      </w:r>
+      <w:proofErr w:type="spellEnd"/>
+      <w:r>
+        <w:t xml:space="preserve"> is the object of the first file for the first subject of the modality. It allows to keep the channel labels, time points and frequency bins, as we would for image orientation or so. ‘</w:t>
+      </w:r>
+      <w:proofErr w:type="spellStart"/>
+      <w:r>
+        <w:t>idfeat_img</w:t>
+      </w:r>
+      <w:proofErr w:type="spellEnd"/>
+      <w:r>
+        <w:t>’ is empty as it is not possible/useful to have a 1</w:t>
       </w:r>
       <w:r>
         <w:rPr>
@@ -2343,12 +2953,14 @@
           <w:rFonts w:ascii="Cambria" w:hAnsi="Cambria"/>
         </w:rPr>
       </w:pPr>
+      <w:proofErr w:type="spellStart"/>
       <w:r>
         <w:rPr>
           <w:rFonts w:ascii="Cambria" w:hAnsi="Cambria"/>
         </w:rPr>
         <w:t>PRT.fas</w:t>
       </w:r>
+      <w:proofErr w:type="spellEnd"/>
     </w:p>
     <w:p>
       <w:pPr>
@@ -2361,12 +2973,34 @@
           <w:rFonts w:ascii="Cambria" w:hAnsi="Cambria"/>
         </w:rPr>
       </w:pPr>
+      <w:proofErr w:type="spellStart"/>
       <w:r>
         <w:rPr>
           <w:rFonts w:ascii="Cambria" w:hAnsi="Cambria"/>
         </w:rPr>
         <w:lastRenderedPageBreak/>
-        <w:t>mod_name: {'ECoG'}</w:t>
+        <w:t>mod_name</w:t>
+      </w:r>
+      <w:proofErr w:type="spellEnd"/>
+      <w:r>
+        <w:rPr>
+          <w:rFonts w:ascii="Cambria" w:hAnsi="Cambria"/>
+        </w:rPr>
+        <w:t>: {'</w:t>
+      </w:r>
+      <w:proofErr w:type="spellStart"/>
+      <w:r>
+        <w:rPr>
+          <w:rFonts w:ascii="Cambria" w:hAnsi="Cambria"/>
+        </w:rPr>
+        <w:t>ECoG</w:t>
+      </w:r>
+      <w:proofErr w:type="spellEnd"/>
+      <w:r>
+        <w:rPr>
+          <w:rFonts w:ascii="Cambria" w:hAnsi="Cambria"/>
+        </w:rPr>
+        <w:t>'}</w:t>
       </w:r>
     </w:p>
     <w:p>
@@ -2380,11 +3014,33 @@
           <w:rFonts w:ascii="Cambria" w:hAnsi="Cambria"/>
         </w:rPr>
       </w:pPr>
-      <w:r>
-        <w:rPr>
-          <w:rFonts w:ascii="Cambria" w:hAnsi="Cambria"/>
-        </w:rPr>
-        <w:t>dat: [550x33696 file_array]</w:t>
+      <w:proofErr w:type="spellStart"/>
+      <w:r>
+        <w:rPr>
+          <w:rFonts w:ascii="Cambria" w:hAnsi="Cambria"/>
+        </w:rPr>
+        <w:t>dat</w:t>
+      </w:r>
+      <w:proofErr w:type="spellEnd"/>
+      <w:r>
+        <w:rPr>
+          <w:rFonts w:ascii="Cambria" w:hAnsi="Cambria"/>
+        </w:rPr>
+        <w:t xml:space="preserve">: [550x33696 </w:t>
+      </w:r>
+      <w:proofErr w:type="spellStart"/>
+      <w:r>
+        <w:rPr>
+          <w:rFonts w:ascii="Cambria" w:hAnsi="Cambria"/>
+        </w:rPr>
+        <w:t>file_array</w:t>
+      </w:r>
+      <w:proofErr w:type="spellEnd"/>
+      <w:r>
+        <w:rPr>
+          <w:rFonts w:ascii="Cambria" w:hAnsi="Cambria"/>
+        </w:rPr>
+        <w:t>]</w:t>
       </w:r>
     </w:p>
     <w:p>
@@ -2398,11 +3054,33 @@
           <w:rFonts w:ascii="Cambria" w:hAnsi="Cambria"/>
         </w:rPr>
       </w:pPr>
-      <w:r>
-        <w:rPr>
-          <w:rFonts w:ascii="Cambria" w:hAnsi="Cambria"/>
-        </w:rPr>
-        <w:t>hdr: [96x351x550 meeg]</w:t>
+      <w:proofErr w:type="spellStart"/>
+      <w:r>
+        <w:rPr>
+          <w:rFonts w:ascii="Cambria" w:hAnsi="Cambria"/>
+        </w:rPr>
+        <w:t>hdr</w:t>
+      </w:r>
+      <w:proofErr w:type="spellEnd"/>
+      <w:r>
+        <w:rPr>
+          <w:rFonts w:ascii="Cambria" w:hAnsi="Cambria"/>
+        </w:rPr>
+        <w:t xml:space="preserve">: [96x351x550 </w:t>
+      </w:r>
+      <w:proofErr w:type="spellStart"/>
+      <w:r>
+        <w:rPr>
+          <w:rFonts w:ascii="Cambria" w:hAnsi="Cambria"/>
+        </w:rPr>
+        <w:t>meeg</w:t>
+      </w:r>
+      <w:proofErr w:type="spellEnd"/>
+      <w:r>
+        <w:rPr>
+          <w:rFonts w:ascii="Cambria" w:hAnsi="Cambria"/>
+        </w:rPr>
+        <w:t>]</w:t>
       </w:r>
     </w:p>
     <w:p>
@@ -2416,11 +3094,19 @@
           <w:rFonts w:ascii="Cambria" w:hAnsi="Cambria"/>
         </w:rPr>
       </w:pPr>
-      <w:r>
-        <w:rPr>
-          <w:rFonts w:ascii="Cambria" w:hAnsi="Cambria"/>
-        </w:rPr>
-        <w:t>idfeat_img: []</w:t>
+      <w:proofErr w:type="spellStart"/>
+      <w:r>
+        <w:rPr>
+          <w:rFonts w:ascii="Cambria" w:hAnsi="Cambria"/>
+        </w:rPr>
+        <w:t>idfeat_img</w:t>
+      </w:r>
+      <w:proofErr w:type="spellEnd"/>
+      <w:r>
+        <w:rPr>
+          <w:rFonts w:ascii="Cambria" w:hAnsi="Cambria"/>
+        </w:rPr>
+        <w:t>: []</w:t>
       </w:r>
     </w:p>
     <w:p>
@@ -2433,6 +3119,45 @@
     </w:p>
     <w:p/>
     <w:p>
+      <w:r>
+        <w:t>Batch:</w:t>
+      </w:r>
+    </w:p>
+    <w:p/>
+    <w:p>
+      <w:r>
+        <w:t>The user specifies what type of modality to build between ‘</w:t>
+      </w:r>
+      <w:proofErr w:type="spellStart"/>
+      <w:r>
+        <w:t>nifti</w:t>
+      </w:r>
+      <w:proofErr w:type="spellEnd"/>
+      <w:r>
+        <w:t>’, ‘MEEG’ and ‘mat’. He can choose as many modalities of the same type as he wants. They will be concatenated in trials (so should have the same number of features).</w:t>
+      </w:r>
+    </w:p>
+    <w:p>
+      <w:r>
+        <w:t>The nifty modality is the same as before. For .mat, it is only possible to choose a second-level mask (the ‘</w:t>
+      </w:r>
+      <w:proofErr w:type="spellStart"/>
+      <w:r>
+        <w:t>all_conds</w:t>
+      </w:r>
+      <w:proofErr w:type="spellEnd"/>
+      <w:r>
+        <w:t>’ option might be restored when a design is available for this format).</w:t>
+      </w:r>
+    </w:p>
+    <w:p/>
+    <w:p>
+      <w:bookmarkStart w:id="0" w:name="_GoBack"/>
+      <w:bookmarkEnd w:id="0"/>
+    </w:p>
+    <w:p/>
+    <w:p/>
+    <w:p>
       <w:pPr>
         <w:rPr>
           <w:b/>
@@ -2544,6 +3269,32 @@
           <w:noProof/>
         </w:rPr>
         <w:t xml:space="preserve"> </w:t>
+      </w:r>
+    </w:p>
+    <w:p>
+      <w:pPr>
+        <w:pStyle w:val="ListParagraph"/>
+        <w:numPr>
+          <w:ilvl w:val="0"/>
+          <w:numId w:val="7"/>
+        </w:numPr>
+        <w:rPr>
+          <w:color w:val="C00000"/>
+        </w:rPr>
+      </w:pPr>
+      <w:r>
+        <w:rPr>
+          <w:noProof/>
+          <w:color w:val="C00000"/>
+        </w:rPr>
+        <w:t>Bad channels in channel list: displayed in red in windows based on html code but does not work in Mac</w:t>
+      </w:r>
+      <w:r>
+        <w:rPr>
+          <w:noProof/>
+          <w:color w:val="C00000"/>
+        </w:rPr>
+        <w:t xml:space="preserve"> (haven’t tried on Linux). Right-clicks do not work properly on Mac either….</w:t>
       </w:r>
     </w:p>
     <w:p>
@@ -2603,7 +3354,7 @@
                     </pic:cNvPicPr>
                   </pic:nvPicPr>
                   <pic:blipFill>
-                    <a:blip r:embed="rId20">
+                    <a:blip r:embed="rId19">
                       <a:extLst>
                         <a:ext uri="{28A0092B-C50C-407E-A947-70E740481C1C}">
                           <a14:useLocalDpi xmlns:a14="http://schemas.microsoft.com/office/drawing/2010/main" val="0"/>
@@ -2669,7 +3420,15 @@
         <w:t>In relation with this addition, a new cross-validation was added</w:t>
       </w:r>
       <w:r>
-        <w:t xml:space="preserve">: Leave-One-Block-per-Class-Out (and its k-folds counterpart). It gets complex with pooling and subsampling, as the code is selecting the trials condition by condition. I added a random shuffling of the train/test division in the class containing pooled categories to make sure that one category is not left aside entirely in one fold, another in another fold, etc… </w:t>
+        <w:t xml:space="preserve">: Leave-One-Block-per-Class-Out (and its k-folds counterpart). It gets complex with pooling and subsampling, as the code is selecting the trials condition by condition. I added a random shuffling of the train/test division in the class containing pooled categories to make sure that one category is not left aside entirely in one fold, another in another fold, </w:t>
+      </w:r>
+      <w:proofErr w:type="spellStart"/>
+      <w:r>
+        <w:t>etc</w:t>
+      </w:r>
+      <w:proofErr w:type="spellEnd"/>
+      <w:r>
+        <w:t xml:space="preserve">… </w:t>
       </w:r>
     </w:p>
     <w:p>
@@ -2683,27 +3442,46 @@
         <w:t>When multiple kernels are present, it is possible to build a MK</w:t>
       </w:r>
       <w:r>
-        <w:t>L model with all of them (or signle kernel and they are added) or use single kernel methods on each of them independently. There is an extra flag: ‘Use kernels independently’ Yes or No (default: No). This turned out to be useful for me, when I selected ‘significant channels’ (FDR corrected) on one session and used them in a multivariate way on another session. It is also useful to determine the ‘best’ kernel when looking at the MKL results. I would expect this to be replaced by a proper feature selection module though.</w:t>
-      </w:r>
-    </w:p>
-    <w:p>
-      <w:r>
-        <w:t>Changes to the PRT: if only one model, then as usual. Otherwise, PRT.model.output is the same size as the number of independent models.</w:t>
-      </w:r>
-    </w:p>
-    <w:p>
-      <w:pPr>
-        <w:pStyle w:val="NoSpacing"/>
-        <w:rPr>
-          <w:rFonts w:ascii="Cambria" w:hAnsi="Cambria"/>
-        </w:rPr>
-      </w:pPr>
+        <w:t>L model with all of them (or si</w:t>
+      </w:r>
+      <w:r>
+        <w:t>n</w:t>
+      </w:r>
+      <w:r>
+        <w:t>g</w:t>
+      </w:r>
+      <w:r>
+        <w:t>le kernel and they are added) or use single kernel methods on each of them independently. There is an extra flag: ‘Use kernels independently’ Yes or No (default: No). This turned out to be useful for me, when I selected ‘significant channels’ (FDR corrected) on one session and used them in a multivariate way on another session. It is also useful to determine the ‘best’ kernel when looking at the MKL results. I would expect this to be replaced by a proper feature selection module though.</w:t>
+      </w:r>
+    </w:p>
+    <w:p>
+      <w:r>
+        <w:t xml:space="preserve">Changes to the PRT: if only one model, then as usual. Otherwise, </w:t>
+      </w:r>
+      <w:proofErr w:type="spellStart"/>
+      <w:r>
+        <w:t>PRT.model.output</w:t>
+      </w:r>
+      <w:proofErr w:type="spellEnd"/>
+      <w:r>
+        <w:t xml:space="preserve"> is the same size as the number of independent models.</w:t>
+      </w:r>
+    </w:p>
+    <w:p>
+      <w:pPr>
+        <w:pStyle w:val="NoSpacing"/>
+        <w:rPr>
+          <w:rFonts w:ascii="Cambria" w:hAnsi="Cambria"/>
+        </w:rPr>
+      </w:pPr>
+      <w:proofErr w:type="spellStart"/>
       <w:r>
         <w:rPr>
           <w:rFonts w:ascii="Cambria" w:hAnsi="Cambria"/>
         </w:rPr>
         <w:t>PRT.model</w:t>
       </w:r>
+      <w:proofErr w:type="spellEnd"/>
     </w:p>
     <w:p>
       <w:pPr>
@@ -2716,11 +3494,33 @@
           <w:rFonts w:ascii="Cambria" w:hAnsi="Cambria"/>
         </w:rPr>
       </w:pPr>
-      <w:r>
-        <w:rPr>
-          <w:rFonts w:ascii="Cambria" w:hAnsi="Cambria"/>
-        </w:rPr>
-        <w:t>model_name: 'Indmod_SVM_F_NF_TCChans'</w:t>
+      <w:proofErr w:type="spellStart"/>
+      <w:r>
+        <w:rPr>
+          <w:rFonts w:ascii="Cambria" w:hAnsi="Cambria"/>
+        </w:rPr>
+        <w:t>model_name</w:t>
+      </w:r>
+      <w:proofErr w:type="spellEnd"/>
+      <w:r>
+        <w:rPr>
+          <w:rFonts w:ascii="Cambria" w:hAnsi="Cambria"/>
+        </w:rPr>
+        <w:t>: '</w:t>
+      </w:r>
+      <w:proofErr w:type="spellStart"/>
+      <w:r>
+        <w:rPr>
+          <w:rFonts w:ascii="Cambria" w:hAnsi="Cambria"/>
+        </w:rPr>
+        <w:t>Indmod_SVM_F_NF_TCChans</w:t>
+      </w:r>
+      <w:proofErr w:type="spellEnd"/>
+      <w:r>
+        <w:rPr>
+          <w:rFonts w:ascii="Cambria" w:hAnsi="Cambria"/>
+        </w:rPr>
+        <w:t>'</w:t>
       </w:r>
     </w:p>
     <w:p>
@@ -2738,7 +3538,21 @@
         <w:rPr>
           <w:rFonts w:ascii="Cambria" w:hAnsi="Cambria"/>
         </w:rPr>
-        <w:t>input: [1x1 struct]</w:t>
+        <w:t xml:space="preserve">input: [1x1 </w:t>
+      </w:r>
+      <w:proofErr w:type="spellStart"/>
+      <w:r>
+        <w:rPr>
+          <w:rFonts w:ascii="Cambria" w:hAnsi="Cambria"/>
+        </w:rPr>
+        <w:t>struct</w:t>
+      </w:r>
+      <w:proofErr w:type="spellEnd"/>
+      <w:r>
+        <w:rPr>
+          <w:rFonts w:ascii="Cambria" w:hAnsi="Cambria"/>
+        </w:rPr>
+        <w:t>]</w:t>
       </w:r>
     </w:p>
     <w:p>
@@ -2756,7 +3570,21 @@
         <w:rPr>
           <w:rFonts w:ascii="Cambria" w:hAnsi="Cambria"/>
         </w:rPr>
-        <w:t>output: [1x49 struct]</w:t>
+        <w:t xml:space="preserve">output: [1x49 </w:t>
+      </w:r>
+      <w:proofErr w:type="spellStart"/>
+      <w:r>
+        <w:rPr>
+          <w:rFonts w:ascii="Cambria" w:hAnsi="Cambria"/>
+        </w:rPr>
+        <w:t>struct</w:t>
+      </w:r>
+      <w:proofErr w:type="spellEnd"/>
+      <w:r>
+        <w:rPr>
+          <w:rFonts w:ascii="Cambria" w:hAnsi="Cambria"/>
+        </w:rPr>
+        <w:t>]</w:t>
       </w:r>
     </w:p>
     <w:p>
@@ -2770,22 +3598,32 @@
     </w:p>
     <w:p>
       <w:r>
-        <w:t>Other fields were added to take into account the new functionalities (subsample, indmodels):</w:t>
-      </w:r>
-    </w:p>
-    <w:p>
-      <w:pPr>
-        <w:pStyle w:val="NoSpacing"/>
-        <w:rPr>
-          <w:rFonts w:ascii="Cambria" w:hAnsi="Cambria"/>
-        </w:rPr>
-      </w:pPr>
+        <w:t xml:space="preserve">Other fields were added to take into account the new functionalities (subsample, </w:t>
+      </w:r>
+      <w:proofErr w:type="spellStart"/>
+      <w:r>
+        <w:t>indmodels</w:t>
+      </w:r>
+      <w:proofErr w:type="spellEnd"/>
+      <w:r>
+        <w:t>):</w:t>
+      </w:r>
+    </w:p>
+    <w:p>
+      <w:pPr>
+        <w:pStyle w:val="NoSpacing"/>
+        <w:rPr>
+          <w:rFonts w:ascii="Cambria" w:hAnsi="Cambria"/>
+        </w:rPr>
+      </w:pPr>
+      <w:proofErr w:type="spellStart"/>
       <w:r>
         <w:rPr>
           <w:rFonts w:ascii="Cambria" w:hAnsi="Cambria"/>
         </w:rPr>
         <w:t>PRT.model.input</w:t>
       </w:r>
+      <w:proofErr w:type="spellEnd"/>
     </w:p>
     <w:p>
       <w:pPr>
@@ -2798,11 +3636,19 @@
           <w:rFonts w:ascii="Cambria" w:hAnsi="Cambria"/>
         </w:rPr>
       </w:pPr>
-      <w:r>
-        <w:rPr>
-          <w:rFonts w:ascii="Cambria" w:hAnsi="Cambria"/>
-        </w:rPr>
-        <w:t>use_kernel: 1</w:t>
+      <w:proofErr w:type="spellStart"/>
+      <w:r>
+        <w:rPr>
+          <w:rFonts w:ascii="Cambria" w:hAnsi="Cambria"/>
+        </w:rPr>
+        <w:t>use_kernel</w:t>
+      </w:r>
+      <w:proofErr w:type="spellEnd"/>
+      <w:r>
+        <w:rPr>
+          <w:rFonts w:ascii="Cambria" w:hAnsi="Cambria"/>
+        </w:rPr>
+        <w:t>: 1</w:t>
       </w:r>
     </w:p>
     <w:p>
@@ -2838,7 +3684,21 @@
         <w:rPr>
           <w:rFonts w:ascii="Cambria" w:hAnsi="Cambria"/>
         </w:rPr>
-        <w:t>machine: [1x1 struct]</w:t>
+        <w:t xml:space="preserve">machine: [1x1 </w:t>
+      </w:r>
+      <w:proofErr w:type="spellStart"/>
+      <w:r>
+        <w:rPr>
+          <w:rFonts w:ascii="Cambria" w:hAnsi="Cambria"/>
+        </w:rPr>
+        <w:t>struct</w:t>
+      </w:r>
+      <w:proofErr w:type="spellEnd"/>
+      <w:r>
+        <w:rPr>
+          <w:rFonts w:ascii="Cambria" w:hAnsi="Cambria"/>
+        </w:rPr>
+        <w:t>]</w:t>
       </w:r>
     </w:p>
     <w:p>
@@ -2852,11 +3712,19 @@
           <w:rFonts w:ascii="Cambria" w:hAnsi="Cambria"/>
         </w:rPr>
       </w:pPr>
-      <w:r>
-        <w:rPr>
-          <w:rFonts w:ascii="Cambria" w:hAnsi="Cambria"/>
-        </w:rPr>
-        <w:t>use_nested_cv: 0</w:t>
+      <w:proofErr w:type="spellStart"/>
+      <w:r>
+        <w:rPr>
+          <w:rFonts w:ascii="Cambria" w:hAnsi="Cambria"/>
+        </w:rPr>
+        <w:t>use_nested_cv</w:t>
+      </w:r>
+      <w:proofErr w:type="spellEnd"/>
+      <w:r>
+        <w:rPr>
+          <w:rFonts w:ascii="Cambria" w:hAnsi="Cambria"/>
+        </w:rPr>
+        <w:t>: 0</w:t>
       </w:r>
     </w:p>
     <w:p>
@@ -2870,11 +3738,19 @@
           <w:rFonts w:ascii="Cambria" w:hAnsi="Cambria"/>
         </w:rPr>
       </w:pPr>
-      <w:r>
-        <w:rPr>
-          <w:rFonts w:ascii="Cambria" w:hAnsi="Cambria"/>
-        </w:rPr>
-        <w:t>nested_param: []</w:t>
+      <w:proofErr w:type="spellStart"/>
+      <w:r>
+        <w:rPr>
+          <w:rFonts w:ascii="Cambria" w:hAnsi="Cambria"/>
+        </w:rPr>
+        <w:t>nested_param</w:t>
+      </w:r>
+      <w:proofErr w:type="spellEnd"/>
+      <w:r>
+        <w:rPr>
+          <w:rFonts w:ascii="Cambria" w:hAnsi="Cambria"/>
+        </w:rPr>
+        <w:t>: []</w:t>
       </w:r>
     </w:p>
     <w:p>
@@ -2906,11 +3782,19 @@
           <w:rFonts w:ascii="Cambria" w:hAnsi="Cambria"/>
         </w:rPr>
       </w:pPr>
-      <w:r>
-        <w:rPr>
-          <w:rFonts w:ascii="Cambria" w:hAnsi="Cambria"/>
-        </w:rPr>
-        <w:t>indmodels: 1</w:t>
+      <w:proofErr w:type="spellStart"/>
+      <w:r>
+        <w:rPr>
+          <w:rFonts w:ascii="Cambria" w:hAnsi="Cambria"/>
+        </w:rPr>
+        <w:t>indmodels</w:t>
+      </w:r>
+      <w:proofErr w:type="spellEnd"/>
+      <w:r>
+        <w:rPr>
+          <w:rFonts w:ascii="Cambria" w:hAnsi="Cambria"/>
+        </w:rPr>
+        <w:t>: 1</w:t>
       </w:r>
     </w:p>
     <w:p>
@@ -2928,7 +3812,21 @@
         <w:rPr>
           <w:rFonts w:ascii="Cambria" w:hAnsi="Cambria"/>
         </w:rPr>
-        <w:t>class: [1x2 struct]</w:t>
+        <w:t xml:space="preserve">class: [1x2 </w:t>
+      </w:r>
+      <w:proofErr w:type="spellStart"/>
+      <w:r>
+        <w:rPr>
+          <w:rFonts w:ascii="Cambria" w:hAnsi="Cambria"/>
+        </w:rPr>
+        <w:t>struct</w:t>
+      </w:r>
+      <w:proofErr w:type="spellEnd"/>
+      <w:r>
+        <w:rPr>
+          <w:rFonts w:ascii="Cambria" w:hAnsi="Cambria"/>
+        </w:rPr>
+        <w:t>]</w:t>
       </w:r>
     </w:p>
     <w:p>
@@ -2946,7 +3844,21 @@
         <w:rPr>
           <w:rFonts w:ascii="Cambria" w:hAnsi="Cambria"/>
         </w:rPr>
-        <w:t>fs: [1x1 struct]</w:t>
+        <w:t xml:space="preserve">fs: [1x1 </w:t>
+      </w:r>
+      <w:proofErr w:type="spellStart"/>
+      <w:r>
+        <w:rPr>
+          <w:rFonts w:ascii="Cambria" w:hAnsi="Cambria"/>
+        </w:rPr>
+        <w:t>struct</w:t>
+      </w:r>
+      <w:proofErr w:type="spellEnd"/>
+      <w:r>
+        <w:rPr>
+          <w:rFonts w:ascii="Cambria" w:hAnsi="Cambria"/>
+        </w:rPr>
+        <w:t>]</w:t>
       </w:r>
     </w:p>
     <w:p>
@@ -2960,11 +3872,19 @@
           <w:rFonts w:ascii="Cambria" w:hAnsi="Cambria"/>
         </w:rPr>
       </w:pPr>
-      <w:r>
-        <w:rPr>
-          <w:rFonts w:ascii="Cambria" w:hAnsi="Cambria"/>
-        </w:rPr>
-        <w:t>samp_idx: [71x1 double]</w:t>
+      <w:proofErr w:type="spellStart"/>
+      <w:r>
+        <w:rPr>
+          <w:rFonts w:ascii="Cambria" w:hAnsi="Cambria"/>
+        </w:rPr>
+        <w:t>samp_idx</w:t>
+      </w:r>
+      <w:proofErr w:type="spellEnd"/>
+      <w:r>
+        <w:rPr>
+          <w:rFonts w:ascii="Cambria" w:hAnsi="Cambria"/>
+        </w:rPr>
+        <w:t>: [71x1 double]</w:t>
       </w:r>
     </w:p>
     <w:p>
@@ -2978,11 +3898,19 @@
           <w:rFonts w:ascii="Cambria" w:hAnsi="Cambria"/>
         </w:rPr>
       </w:pPr>
-      <w:r>
-        <w:rPr>
-          <w:rFonts w:ascii="Cambria" w:hAnsi="Cambria"/>
-        </w:rPr>
-        <w:t>include_allscans: 0</w:t>
+      <w:proofErr w:type="spellStart"/>
+      <w:r>
+        <w:rPr>
+          <w:rFonts w:ascii="Cambria" w:hAnsi="Cambria"/>
+        </w:rPr>
+        <w:t>include_allscans</w:t>
+      </w:r>
+      <w:proofErr w:type="spellEnd"/>
+      <w:r>
+        <w:rPr>
+          <w:rFonts w:ascii="Cambria" w:hAnsi="Cambria"/>
+        </w:rPr>
+        <w:t>: 0</w:t>
       </w:r>
     </w:p>
     <w:p>
@@ -3014,12 +3942,20 @@
           <w:rFonts w:ascii="Cambria" w:hAnsi="Cambria"/>
         </w:rPr>
       </w:pPr>
+      <w:proofErr w:type="spellStart"/>
       <w:r>
         <w:rPr>
           <w:rFonts w:ascii="Cambria" w:hAnsi="Cambria"/>
         </w:rPr>
         <w:lastRenderedPageBreak/>
-        <w:t>targ_allscans: [324x1 double]</w:t>
+        <w:t>targ_allscans</w:t>
+      </w:r>
+      <w:proofErr w:type="spellEnd"/>
+      <w:r>
+        <w:rPr>
+          <w:rFonts w:ascii="Cambria" w:hAnsi="Cambria"/>
+        </w:rPr>
+        <w:t>: [324x1 double]</w:t>
       </w:r>
     </w:p>
     <w:p>
@@ -3033,11 +3969,19 @@
           <w:rFonts w:ascii="Cambria" w:hAnsi="Cambria"/>
         </w:rPr>
       </w:pPr>
-      <w:r>
-        <w:rPr>
-          <w:rFonts w:ascii="Cambria" w:hAnsi="Cambria"/>
-        </w:rPr>
-        <w:t>covar: [71x1 double]</w:t>
+      <w:proofErr w:type="spellStart"/>
+      <w:r>
+        <w:rPr>
+          <w:rFonts w:ascii="Cambria" w:hAnsi="Cambria"/>
+        </w:rPr>
+        <w:t>covar</w:t>
+      </w:r>
+      <w:proofErr w:type="spellEnd"/>
+      <w:r>
+        <w:rPr>
+          <w:rFonts w:ascii="Cambria" w:hAnsi="Cambria"/>
+        </w:rPr>
+        <w:t>: [71x1 double]</w:t>
       </w:r>
     </w:p>
     <w:p>
@@ -3051,11 +3995,19 @@
           <w:rFonts w:ascii="Cambria" w:hAnsi="Cambria"/>
         </w:rPr>
       </w:pPr>
-      <w:r>
-        <w:rPr>
-          <w:rFonts w:ascii="Cambria" w:hAnsi="Cambria"/>
-        </w:rPr>
-        <w:t>cov_allscans: [324x1 double]</w:t>
+      <w:proofErr w:type="spellStart"/>
+      <w:r>
+        <w:rPr>
+          <w:rFonts w:ascii="Cambria" w:hAnsi="Cambria"/>
+        </w:rPr>
+        <w:t>cov_allscans</w:t>
+      </w:r>
+      <w:proofErr w:type="spellEnd"/>
+      <w:r>
+        <w:rPr>
+          <w:rFonts w:ascii="Cambria" w:hAnsi="Cambria"/>
+        </w:rPr>
+        <w:t>: [324x1 double]</w:t>
       </w:r>
     </w:p>
     <w:p>
@@ -3069,11 +4021,19 @@
           <w:rFonts w:ascii="Cambria" w:hAnsi="Cambria"/>
         </w:rPr>
       </w:pPr>
-      <w:r>
-        <w:rPr>
-          <w:rFonts w:ascii="Cambria" w:hAnsi="Cambria"/>
-        </w:rPr>
-        <w:t>cv_k: 5</w:t>
+      <w:proofErr w:type="spellStart"/>
+      <w:r>
+        <w:rPr>
+          <w:rFonts w:ascii="Cambria" w:hAnsi="Cambria"/>
+        </w:rPr>
+        <w:t>cv_k</w:t>
+      </w:r>
+      <w:proofErr w:type="spellEnd"/>
+      <w:r>
+        <w:rPr>
+          <w:rFonts w:ascii="Cambria" w:hAnsi="Cambria"/>
+        </w:rPr>
+        <w:t>: 5</w:t>
       </w:r>
     </w:p>
     <w:p>
@@ -3087,11 +4047,19 @@
           <w:rFonts w:ascii="Cambria" w:hAnsi="Cambria"/>
         </w:rPr>
       </w:pPr>
-      <w:r>
-        <w:rPr>
-          <w:rFonts w:ascii="Cambria" w:hAnsi="Cambria"/>
-        </w:rPr>
-        <w:t>cv_mat: [71x5 double]</w:t>
+      <w:proofErr w:type="spellStart"/>
+      <w:r>
+        <w:rPr>
+          <w:rFonts w:ascii="Cambria" w:hAnsi="Cambria"/>
+        </w:rPr>
+        <w:t>cv_mat</w:t>
+      </w:r>
+      <w:proofErr w:type="spellEnd"/>
+      <w:r>
+        <w:rPr>
+          <w:rFonts w:ascii="Cambria" w:hAnsi="Cambria"/>
+        </w:rPr>
+        <w:t>: [71x5 double]</w:t>
       </w:r>
     </w:p>
     <w:p>
@@ -3105,11 +4073,33 @@
           <w:rFonts w:ascii="Cambria" w:hAnsi="Cambria"/>
         </w:rPr>
       </w:pPr>
-      <w:r>
-        <w:rPr>
-          <w:rFonts w:ascii="Cambria" w:hAnsi="Cambria"/>
-        </w:rPr>
-        <w:t>cv_type: 'locbo'</w:t>
+      <w:proofErr w:type="spellStart"/>
+      <w:r>
+        <w:rPr>
+          <w:rFonts w:ascii="Cambria" w:hAnsi="Cambria"/>
+        </w:rPr>
+        <w:t>cv_type</w:t>
+      </w:r>
+      <w:proofErr w:type="spellEnd"/>
+      <w:r>
+        <w:rPr>
+          <w:rFonts w:ascii="Cambria" w:hAnsi="Cambria"/>
+        </w:rPr>
+        <w:t>: '</w:t>
+      </w:r>
+      <w:proofErr w:type="spellStart"/>
+      <w:r>
+        <w:rPr>
+          <w:rFonts w:ascii="Cambria" w:hAnsi="Cambria"/>
+        </w:rPr>
+        <w:t>locbo</w:t>
+      </w:r>
+      <w:proofErr w:type="spellEnd"/>
+      <w:r>
+        <w:rPr>
+          <w:rFonts w:ascii="Cambria" w:hAnsi="Cambria"/>
+        </w:rPr>
+        <w:t>'</w:t>
       </w:r>
     </w:p>
     <w:p>
@@ -3123,11 +4113,19 @@
           <w:rFonts w:ascii="Cambria" w:hAnsi="Cambria"/>
         </w:rPr>
       </w:pPr>
-      <w:r>
-        <w:rPr>
-          <w:rFonts w:ascii="Cambria" w:hAnsi="Cambria"/>
-        </w:rPr>
-        <w:t>cv_type_nested: 'lobo'</w:t>
+      <w:proofErr w:type="spellStart"/>
+      <w:r>
+        <w:rPr>
+          <w:rFonts w:ascii="Cambria" w:hAnsi="Cambria"/>
+        </w:rPr>
+        <w:t>cv_type_nested</w:t>
+      </w:r>
+      <w:proofErr w:type="spellEnd"/>
+      <w:r>
+        <w:rPr>
+          <w:rFonts w:ascii="Cambria" w:hAnsi="Cambria"/>
+        </w:rPr>
+        <w:t>: 'lobo'</w:t>
       </w:r>
     </w:p>
     <w:p>
@@ -3141,11 +4139,19 @@
           <w:rFonts w:ascii="Cambria" w:hAnsi="Cambria"/>
         </w:rPr>
       </w:pPr>
-      <w:r>
-        <w:rPr>
-          <w:rFonts w:ascii="Cambria" w:hAnsi="Cambria"/>
-        </w:rPr>
-        <w:t>cv_k_nested: 0</w:t>
+      <w:proofErr w:type="spellStart"/>
+      <w:r>
+        <w:rPr>
+          <w:rFonts w:ascii="Cambria" w:hAnsi="Cambria"/>
+        </w:rPr>
+        <w:t>cv_k_nested</w:t>
+      </w:r>
+      <w:proofErr w:type="spellEnd"/>
+      <w:r>
+        <w:rPr>
+          <w:rFonts w:ascii="Cambria" w:hAnsi="Cambria"/>
+        </w:rPr>
+        <w:t>: 0</w:t>
       </w:r>
     </w:p>
     <w:p>
@@ -3192,7 +4198,7 @@
                     </pic:cNvPicPr>
                   </pic:nvPicPr>
                   <pic:blipFill>
-                    <a:blip r:embed="rId21">
+                    <a:blip r:embed="rId20">
                       <a:extLst>
                         <a:ext uri="{28A0092B-C50C-407E-A947-70E740481C1C}">
                           <a14:useLocalDpi xmlns:a14="http://schemas.microsoft.com/office/drawing/2010/main" val="0"/>
@@ -3366,7 +4372,7 @@
                     </pic:cNvPicPr>
                   </pic:nvPicPr>
                   <pic:blipFill>
-                    <a:blip r:embed="rId22">
+                    <a:blip r:embed="rId21">
                       <a:extLst>
                         <a:ext uri="{28A0092B-C50C-407E-A947-70E740481C1C}">
                           <a14:useLocalDpi xmlns:a14="http://schemas.microsoft.com/office/drawing/2010/main" val="0"/>
@@ -3400,7 +4406,15 @@
     </w:p>
     <w:p>
       <w:r>
-        <w:t>Fig 3: ‘Copy model’ batch. You enter the name of the PRT.mat, the name of the new model and the name of the model to copy. Then choose at least a ‘field’ to modify among ‘Feature set’ (one or multiple can be selected), ‘</w:t>
+        <w:t xml:space="preserve">Fig 3: ‘Copy model’ batch. You enter the name of the </w:t>
+      </w:r>
+      <w:proofErr w:type="spellStart"/>
+      <w:r>
+        <w:t>PRT.mat</w:t>
+      </w:r>
+      <w:proofErr w:type="spellEnd"/>
+      <w:r>
+        <w:t>, the name of the new model and the name of the model to copy. Then choose at least a ‘field’ to modify among ‘Feature set’ (one or multiple can be selected), ‘</w:t>
       </w:r>
       <w:r>
         <w:t>Model type</w:t>
@@ -3572,7 +4586,97 @@
         <w:rPr>
           <w:color w:val="C00000"/>
         </w:rPr>
-        <w:t>Use AUC instead of balanced accuracy to select best hyperparameter? More work should be done on how to select the best hyperparameter.</w:t>
+        <w:t xml:space="preserve">Use AUC instead of balanced accuracy to select best </w:t>
+      </w:r>
+      <w:proofErr w:type="spellStart"/>
+      <w:r>
+        <w:rPr>
+          <w:color w:val="C00000"/>
+        </w:rPr>
+        <w:t>hyperparameter</w:t>
+      </w:r>
+      <w:proofErr w:type="spellEnd"/>
+      <w:r>
+        <w:rPr>
+          <w:color w:val="C00000"/>
+        </w:rPr>
+        <w:t xml:space="preserve">? More work should be done on how to select the best </w:t>
+      </w:r>
+      <w:proofErr w:type="spellStart"/>
+      <w:r>
+        <w:rPr>
+          <w:color w:val="C00000"/>
+        </w:rPr>
+        <w:t>hyperparameter</w:t>
+      </w:r>
+      <w:proofErr w:type="spellEnd"/>
+      <w:r>
+        <w:rPr>
+          <w:color w:val="C00000"/>
+        </w:rPr>
+        <w:t>.</w:t>
+      </w:r>
+    </w:p>
+    <w:p>
+      <w:pPr>
+        <w:rPr>
+          <w:color w:val="C00000"/>
+        </w:rPr>
+      </w:pPr>
+    </w:p>
+    <w:p>
+      <w:pPr>
+        <w:rPr>
+          <w:color w:val="C00000"/>
+        </w:rPr>
+      </w:pPr>
+      <w:r>
+        <w:rPr>
+          <w:color w:val="C00000"/>
+        </w:rPr>
+        <w:t xml:space="preserve">Problem with </w:t>
+      </w:r>
+      <w:proofErr w:type="spellStart"/>
+      <w:r>
+        <w:rPr>
+          <w:color w:val="C00000"/>
+        </w:rPr>
+        <w:t>prt_apply_operation</w:t>
+      </w:r>
+      <w:proofErr w:type="spellEnd"/>
+      <w:r>
+        <w:rPr>
+          <w:color w:val="C00000"/>
+        </w:rPr>
+        <w:t xml:space="preserve"> when averaging within blocks/subject: the code takes the conditions as they are defined from the ID mat. However, multiple conditions can be pooled to create a class. The averaging should hence be based on the targets, not the conditions. Example: </w:t>
+      </w:r>
+      <w:proofErr w:type="spellStart"/>
+      <w:r>
+        <w:rPr>
+          <w:color w:val="C00000"/>
+        </w:rPr>
+        <w:t>cond</w:t>
+      </w:r>
+      <w:proofErr w:type="spellEnd"/>
+      <w:r>
+        <w:rPr>
+          <w:color w:val="C00000"/>
+        </w:rPr>
+        <w:t xml:space="preserve"> 1 and 2 in class 1, </w:t>
+      </w:r>
+      <w:proofErr w:type="spellStart"/>
+      <w:r>
+        <w:rPr>
+          <w:color w:val="C00000"/>
+        </w:rPr>
+        <w:t>cond</w:t>
+      </w:r>
+      <w:proofErr w:type="spellEnd"/>
+      <w:r>
+        <w:rPr>
+          <w:color w:val="C00000"/>
+        </w:rPr>
+        <w:t xml:space="preserve"> 3 in class 2. If the samples are balanced, when averaging you end up with 2 trials for class 1 and 1 trial for class 2 (so not balanced anymore).</w:t>
       </w:r>
     </w:p>
     <w:p>
@@ -3676,7 +4780,35 @@
         <w:rPr>
           <w:color w:val="C00000"/>
         </w:rPr>
-        <w:t>Not sure where to add the ‘Compare 2 models’. Maybe we can add a ‘Utils’ category?</w:t>
+        <w:t xml:space="preserve">Not sure where to add the ‘Compare 2 models’. Maybe we can add </w:t>
+      </w:r>
+      <w:proofErr w:type="gramStart"/>
+      <w:r>
+        <w:rPr>
+          <w:color w:val="C00000"/>
+        </w:rPr>
+        <w:t>a</w:t>
+      </w:r>
+      <w:proofErr w:type="gramEnd"/>
+      <w:r>
+        <w:rPr>
+          <w:color w:val="C00000"/>
+        </w:rPr>
+        <w:t xml:space="preserve"> ‘</w:t>
+      </w:r>
+      <w:proofErr w:type="spellStart"/>
+      <w:r>
+        <w:rPr>
+          <w:color w:val="C00000"/>
+        </w:rPr>
+        <w:t>Utils</w:t>
+      </w:r>
+      <w:proofErr w:type="spellEnd"/>
+      <w:r>
+        <w:rPr>
+          <w:color w:val="C00000"/>
+        </w:rPr>
+        <w:t>’ category?</w:t>
       </w:r>
     </w:p>
     <w:p>
@@ -3722,7 +4854,23 @@
         <w:rPr>
           <w:color w:val="FF0000"/>
         </w:rPr>
-        <w:t>Weights for .mat data can be computed using Pronto’s compute weights module. A .mat will be save</w:t>
+        <w:t xml:space="preserve">Weights for .mat data can be computed using </w:t>
+      </w:r>
+      <w:proofErr w:type="spellStart"/>
+      <w:proofErr w:type="gramStart"/>
+      <w:r>
+        <w:rPr>
+          <w:color w:val="FF0000"/>
+        </w:rPr>
+        <w:t>Pronto’s</w:t>
+      </w:r>
+      <w:proofErr w:type="spellEnd"/>
+      <w:proofErr w:type="gramEnd"/>
+      <w:r>
+        <w:rPr>
+          <w:color w:val="FF0000"/>
+        </w:rPr>
+        <w:t xml:space="preserve"> compute weights module. A .mat will be save</w:t>
       </w:r>
       <w:r>
         <w:rPr>
@@ -3760,8 +4908,6 @@
         </w:rPr>
         <w:t>has to be done outside pronto.</w:t>
       </w:r>
-      <w:bookmarkStart w:id="0" w:name="_GoBack"/>
-      <w:bookmarkEnd w:id="0"/>
     </w:p>
     <w:p/>
     <w:p>
@@ -3875,7 +5021,29 @@
         <w:rPr>
           <w:color w:val="C00000"/>
         </w:rPr>
-        <w:t>Change from folds to PRT.model.output(k) when one model per kernel specified. This will display the average performance for each kernel instead of for each fold.</w:t>
+        <w:t xml:space="preserve">Change from folds to </w:t>
+      </w:r>
+      <w:proofErr w:type="spellStart"/>
+      <w:proofErr w:type="gramStart"/>
+      <w:r>
+        <w:rPr>
+          <w:color w:val="C00000"/>
+        </w:rPr>
+        <w:t>PRT.model.output</w:t>
+      </w:r>
+      <w:proofErr w:type="spellEnd"/>
+      <w:r>
+        <w:rPr>
+          <w:color w:val="C00000"/>
+        </w:rPr>
+        <w:t>(</w:t>
+      </w:r>
+      <w:proofErr w:type="gramEnd"/>
+      <w:r>
+        <w:rPr>
+          <w:color w:val="C00000"/>
+        </w:rPr>
+        <w:t>k) when one model per kernel specified. This will display the average performance for each kernel instead of for each fold.</w:t>
       </w:r>
     </w:p>
     <w:p>
@@ -3976,8 +5144,8 @@
 </file>
 
 <file path=word/numbering.xml><?xml version="1.0" encoding="utf-8"?>
-<w:numbering xmlns:wpc="http://schemas.microsoft.com/office/word/2010/wordprocessingCanvas" xmlns:mo="http://schemas.microsoft.com/office/mac/office/2008/main" xmlns:mc="http://schemas.openxmlformats.org/markup-compatibility/2006" xmlns:mv="urn:schemas-microsoft-com:mac:vml" xmlns:o="urn:schemas-microsoft-com:office:office" xmlns:r="http://schemas.openxmlformats.org/officeDocument/2006/relationships" xmlns:m="http://schemas.openxmlformats.org/officeDocument/2006/math" xmlns:v="urn:schemas-microsoft-com:vml" xmlns:wp14="http://schemas.microsoft.com/office/word/2010/wordprocessingDrawing" xmlns:wp="http://schemas.openxmlformats.org/drawingml/2006/wordprocessingDrawing" xmlns:w10="urn:schemas-microsoft-com:office:word" xmlns:w="http://schemas.openxmlformats.org/wordprocessingml/2006/main" xmlns:w14="http://schemas.microsoft.com/office/word/2010/wordml" xmlns:wpg="http://schemas.microsoft.com/office/word/2010/wordprocessingGroup" xmlns:wpi="http://schemas.microsoft.com/office/word/2010/wordprocessingInk" xmlns:wne="http://schemas.microsoft.com/office/word/2006/wordml" xmlns:wps="http://schemas.microsoft.com/office/word/2010/wordprocessingShape" mc:Ignorable="w14 wp14">
-  <w:abstractNum w:abstractNumId="0">
+<w:numbering xmlns:wpc="http://schemas.microsoft.com/office/word/2010/wordprocessingCanvas" xmlns:mc="http://schemas.openxmlformats.org/markup-compatibility/2006" xmlns:o="urn:schemas-microsoft-com:office:office" xmlns:r="http://schemas.openxmlformats.org/officeDocument/2006/relationships" xmlns:m="http://schemas.openxmlformats.org/officeDocument/2006/math" xmlns:v="urn:schemas-microsoft-com:vml" xmlns:wp14="http://schemas.microsoft.com/office/word/2010/wordprocessingDrawing" xmlns:wp="http://schemas.openxmlformats.org/drawingml/2006/wordprocessingDrawing" xmlns:w10="urn:schemas-microsoft-com:office:word" xmlns:w="http://schemas.openxmlformats.org/wordprocessingml/2006/main" xmlns:w14="http://schemas.microsoft.com/office/word/2010/wordml" xmlns:w15="http://schemas.microsoft.com/office/word/2012/wordml" xmlns:wpg="http://schemas.microsoft.com/office/word/2010/wordprocessingGroup" xmlns:wpi="http://schemas.microsoft.com/office/word/2010/wordprocessingInk" xmlns:wne="http://schemas.microsoft.com/office/word/2006/wordml" xmlns:wps="http://schemas.microsoft.com/office/word/2010/wordprocessingShape" mc:Ignorable="w14 w15 wp14">
+  <w:abstractNum w:abstractNumId="0" w15:restartNumberingAfterBreak="0">
     <w:nsid w:val="0B031607"/>
     <w:multiLevelType w:val="hybridMultilevel"/>
     <w:tmpl w:val="188AE9FC"/>
@@ -4089,7 +5257,7 @@
       </w:rPr>
     </w:lvl>
   </w:abstractNum>
-  <w:abstractNum w:abstractNumId="1">
+  <w:abstractNum w:abstractNumId="1" w15:restartNumberingAfterBreak="0">
     <w:nsid w:val="0D84304B"/>
     <w:multiLevelType w:val="hybridMultilevel"/>
     <w:tmpl w:val="EB50169A"/>
@@ -4201,7 +5369,7 @@
       </w:rPr>
     </w:lvl>
   </w:abstractNum>
-  <w:abstractNum w:abstractNumId="2">
+  <w:abstractNum w:abstractNumId="2" w15:restartNumberingAfterBreak="0">
     <w:nsid w:val="27797ECF"/>
     <w:multiLevelType w:val="hybridMultilevel"/>
     <w:tmpl w:val="341EF100"/>
@@ -4313,7 +5481,7 @@
       </w:rPr>
     </w:lvl>
   </w:abstractNum>
-  <w:abstractNum w:abstractNumId="3">
+  <w:abstractNum w:abstractNumId="3" w15:restartNumberingAfterBreak="0">
     <w:nsid w:val="363D08DF"/>
     <w:multiLevelType w:val="hybridMultilevel"/>
     <w:tmpl w:val="1AD6CD34"/>
@@ -4425,7 +5593,7 @@
       </w:rPr>
     </w:lvl>
   </w:abstractNum>
-  <w:abstractNum w:abstractNumId="4">
+  <w:abstractNum w:abstractNumId="4" w15:restartNumberingAfterBreak="0">
     <w:nsid w:val="3B9333B8"/>
     <w:multiLevelType w:val="hybridMultilevel"/>
     <w:tmpl w:val="A502D1C8"/>
@@ -4537,7 +5705,7 @@
       </w:rPr>
     </w:lvl>
   </w:abstractNum>
-  <w:abstractNum w:abstractNumId="5">
+  <w:abstractNum w:abstractNumId="5" w15:restartNumberingAfterBreak="0">
     <w:nsid w:val="3C4E32FC"/>
     <w:multiLevelType w:val="hybridMultilevel"/>
     <w:tmpl w:val="766EDD44"/>
@@ -4649,7 +5817,7 @@
       </w:rPr>
     </w:lvl>
   </w:abstractNum>
-  <w:abstractNum w:abstractNumId="6">
+  <w:abstractNum w:abstractNumId="6" w15:restartNumberingAfterBreak="0">
     <w:nsid w:val="6A0E6508"/>
     <w:multiLevelType w:val="hybridMultilevel"/>
     <w:tmpl w:val="4020624C"/>
@@ -4786,7 +5954,7 @@
 </file>
 
 <file path=word/styles.xml><?xml version="1.0" encoding="utf-8"?>
-<w:styles xmlns:mc="http://schemas.openxmlformats.org/markup-compatibility/2006" xmlns:r="http://schemas.openxmlformats.org/officeDocument/2006/relationships" xmlns:w="http://schemas.openxmlformats.org/wordprocessingml/2006/main" xmlns:w14="http://schemas.microsoft.com/office/word/2010/wordml" mc:Ignorable="w14">
+<w:styles xmlns:mc="http://schemas.openxmlformats.org/markup-compatibility/2006" xmlns:r="http://schemas.openxmlformats.org/officeDocument/2006/relationships" xmlns:w="http://schemas.openxmlformats.org/wordprocessingml/2006/main" xmlns:w14="http://schemas.microsoft.com/office/word/2010/wordml" xmlns:w15="http://schemas.microsoft.com/office/word/2012/wordml" mc:Ignorable="w14 w15">
   <w:docDefaults>
     <w:rPrDefault>
       <w:rPr>
@@ -4802,402 +5970,369 @@
       </w:pPr>
     </w:pPrDefault>
   </w:docDefaults>
-  <w:latentStyles w:defLockedState="0" w:defUIPriority="99" w:defSemiHidden="1" w:defUnhideWhenUsed="1" w:defQFormat="0" w:count="276">
-    <w:lsdException w:name="Normal" w:semiHidden="0" w:uiPriority="0" w:unhideWhenUsed="0" w:qFormat="1"/>
-    <w:lsdException w:name="heading 1" w:semiHidden="0" w:uiPriority="9" w:unhideWhenUsed="0" w:qFormat="1"/>
-    <w:lsdException w:name="heading 2" w:uiPriority="9" w:qFormat="1"/>
-    <w:lsdException w:name="heading 3" w:uiPriority="9" w:qFormat="1"/>
-    <w:lsdException w:name="heading 4" w:uiPriority="9" w:qFormat="1"/>
-    <w:lsdException w:name="heading 5" w:uiPriority="9" w:qFormat="1"/>
-    <w:lsdException w:name="heading 6" w:uiPriority="9" w:qFormat="1"/>
-    <w:lsdException w:name="heading 7" w:uiPriority="9" w:qFormat="1"/>
-    <w:lsdException w:name="heading 8" w:uiPriority="9" w:qFormat="1"/>
-    <w:lsdException w:name="heading 9" w:uiPriority="9" w:qFormat="1"/>
-    <w:lsdException w:name="toc 1" w:uiPriority="39"/>
-    <w:lsdException w:name="toc 2" w:uiPriority="39"/>
-    <w:lsdException w:name="toc 3" w:uiPriority="39"/>
-    <w:lsdException w:name="toc 4" w:uiPriority="39"/>
-    <w:lsdException w:name="toc 5" w:uiPriority="39"/>
-    <w:lsdException w:name="toc 6" w:uiPriority="39"/>
-    <w:lsdException w:name="toc 7" w:uiPriority="39"/>
-    <w:lsdException w:name="toc 8" w:uiPriority="39"/>
-    <w:lsdException w:name="toc 9" w:uiPriority="39"/>
-    <w:lsdException w:name="caption" w:uiPriority="35" w:qFormat="1"/>
-    <w:lsdException w:name="Title" w:semiHidden="0" w:uiPriority="10" w:unhideWhenUsed="0" w:qFormat="1"/>
-    <w:lsdException w:name="Default Paragraph Font" w:uiPriority="1"/>
-    <w:lsdException w:name="Subtitle" w:semiHidden="0" w:uiPriority="11" w:unhideWhenUsed="0" w:qFormat="1"/>
-    <w:lsdException w:name="Strong" w:semiHidden="0" w:uiPriority="22" w:unhideWhenUsed="0" w:qFormat="1"/>
-    <w:lsdException w:name="Emphasis" w:semiHidden="0" w:uiPriority="20" w:unhideWhenUsed="0" w:qFormat="1"/>
-    <w:lsdException w:name="Table Grid" w:semiHidden="0" w:uiPriority="39" w:unhideWhenUsed="0"/>
-    <w:lsdException w:name="Note Level 1" w:semiHidden="0" w:unhideWhenUsed="0"/>
-    <w:lsdException w:name="Note Level 2" w:semiHidden="0" w:unhideWhenUsed="0"/>
-    <w:lsdException w:name="Note Level 3" w:semiHidden="0" w:unhideWhenUsed="0"/>
-    <w:lsdException w:name="Note Level 4" w:semiHidden="0" w:unhideWhenUsed="0"/>
-    <w:lsdException w:name="Note Level 5" w:semiHidden="0" w:unhideWhenUsed="0"/>
-    <w:lsdException w:name="Note Level 6" w:semiHidden="0" w:unhideWhenUsed="0"/>
-    <w:lsdException w:name="Note Level 7" w:semiHidden="0" w:unhideWhenUsed="0"/>
-    <w:lsdException w:name="Note Level 8" w:semiHidden="0" w:unhideWhenUsed="0"/>
-    <w:lsdException w:name="Note Level 9" w:semiHidden="0" w:unhideWhenUsed="0"/>
-    <w:lsdException w:name="Placeholder Text" w:unhideWhenUsed="0"/>
-    <w:lsdException w:name="No Spacing" w:semiHidden="0" w:uiPriority="1" w:unhideWhenUsed="0" w:qFormat="1"/>
-    <w:lsdException w:name="Light Shading" w:semiHidden="0" w:uiPriority="60" w:unhideWhenUsed="0"/>
-    <w:lsdException w:name="Light List" w:semiHidden="0" w:uiPriority="61" w:unhideWhenUsed="0"/>
-    <w:lsdException w:name="Light Grid" w:semiHidden="0" w:uiPriority="62" w:unhideWhenUsed="0"/>
-    <w:lsdException w:name="Medium Shading 1" w:semiHidden="0" w:uiPriority="63" w:unhideWhenUsed="0"/>
-    <w:lsdException w:name="Medium Shading 2" w:semiHidden="0" w:uiPriority="64" w:unhideWhenUsed="0"/>
-    <w:lsdException w:name="Medium List 1" w:semiHidden="0" w:uiPriority="65" w:unhideWhenUsed="0"/>
-    <w:lsdException w:name="Medium List 2" w:semiHidden="0" w:uiPriority="66" w:unhideWhenUsed="0"/>
-    <w:lsdException w:name="Medium Grid 1" w:semiHidden="0" w:uiPriority="67" w:unhideWhenUsed="0"/>
-    <w:lsdException w:name="Medium Grid 2" w:semiHidden="0" w:uiPriority="68" w:unhideWhenUsed="0"/>
-    <w:lsdException w:name="Medium Grid 3" w:semiHidden="0" w:uiPriority="69" w:unhideWhenUsed="0"/>
-    <w:lsdException w:name="Dark List" w:semiHidden="0" w:uiPriority="70" w:unhideWhenUsed="0"/>
-    <w:lsdException w:name="Colorful Shading" w:semiHidden="0" w:uiPriority="71" w:unhideWhenUsed="0"/>
-    <w:lsdException w:name="Colorful List" w:semiHidden="0" w:uiPriority="72" w:unhideWhenUsed="0"/>
-    <w:lsdException w:name="Colorful Grid" w:semiHidden="0" w:uiPriority="73" w:unhideWhenUsed="0"/>
-    <w:lsdException w:name="Light Shading Accent 1" w:semiHidden="0" w:uiPriority="60" w:unhideWhenUsed="0"/>
-    <w:lsdException w:name="Light List Accent 1" w:semiHidden="0" w:uiPriority="61" w:unhideWhenUsed="0"/>
-    <w:lsdException w:name="Light Grid Accent 1" w:semiHidden="0" w:uiPriority="62" w:unhideWhenUsed="0"/>
-    <w:lsdException w:name="Medium Shading 1 Accent 1" w:semiHidden="0" w:uiPriority="63" w:unhideWhenUsed="0"/>
-    <w:lsdException w:name="Medium Shading 2 Accent 1" w:semiHidden="0" w:uiPriority="64" w:unhideWhenUsed="0"/>
-    <w:lsdException w:name="Medium List 1 Accent 1" w:semiHidden="0" w:uiPriority="65" w:unhideWhenUsed="0"/>
-    <w:lsdException w:name="Revision" w:unhideWhenUsed="0"/>
-    <w:lsdException w:name="List Paragraph" w:semiHidden="0" w:uiPriority="34" w:unhideWhenUsed="0" w:qFormat="1"/>
-    <w:lsdException w:name="Quote" w:semiHidden="0" w:uiPriority="29" w:unhideWhenUsed="0" w:qFormat="1"/>
-    <w:lsdException w:name="Intense Quote" w:semiHidden="0" w:uiPriority="30" w:unhideWhenUsed="0" w:qFormat="1"/>
-    <w:lsdException w:name="Medium List 2 Accent 1" w:semiHidden="0" w:uiPriority="66" w:unhideWhenUsed="0"/>
-    <w:lsdException w:name="Medium Grid 1 Accent 1" w:semiHidden="0" w:uiPriority="67" w:unhideWhenUsed="0"/>
-    <w:lsdException w:name="Medium Grid 2 Accent 1" w:semiHidden="0" w:uiPriority="68" w:unhideWhenUsed="0"/>
-    <w:lsdException w:name="Medium Grid 3 Accent 1" w:semiHidden="0" w:uiPriority="69" w:unhideWhenUsed="0"/>
-    <w:lsdException w:name="Dark List Accent 1" w:semiHidden="0" w:uiPriority="70" w:unhideWhenUsed="0"/>
-    <w:lsdException w:name="Colorful Shading Accent 1" w:semiHidden="0" w:uiPriority="71" w:unhideWhenUsed="0"/>
-    <w:lsdException w:name="Colorful List Accent 1" w:semiHidden="0" w:uiPriority="72" w:unhideWhenUsed="0"/>
-    <w:lsdException w:name="Colorful Grid Accent 1" w:semiHidden="0" w:uiPriority="73" w:unhideWhenUsed="0"/>
-    <w:lsdException w:name="Light Shading Accent 2" w:semiHidden="0" w:uiPriority="60" w:unhideWhenUsed="0"/>
-    <w:lsdException w:name="Light List Accent 2" w:semiHidden="0" w:uiPriority="61" w:unhideWhenUsed="0"/>
-    <w:lsdException w:name="Light Grid Accent 2" w:semiHidden="0" w:uiPriority="62" w:unhideWhenUsed="0"/>
-    <w:lsdException w:name="Medium Shading 1 Accent 2" w:semiHidden="0" w:uiPriority="63" w:unhideWhenUsed="0"/>
-    <w:lsdException w:name="Medium Shading 2 Accent 2" w:semiHidden="0" w:uiPriority="64" w:unhideWhenUsed="0"/>
-    <w:lsdException w:name="Medium List 1 Accent 2" w:semiHidden="0" w:uiPriority="65" w:unhideWhenUsed="0"/>
-    <w:lsdException w:name="Medium List 2 Accent 2" w:semiHidden="0" w:uiPriority="66" w:unhideWhenUsed="0"/>
-    <w:lsdException w:name="Medium Grid 1 Accent 2" w:semiHidden="0" w:uiPriority="67" w:unhideWhenUsed="0"/>
-    <w:lsdException w:name="Medium Grid 2 Accent 2" w:semiHidden="0" w:uiPriority="68" w:unhideWhenUsed="0"/>
-    <w:lsdException w:name="Medium Grid 3 Accent 2" w:semiHidden="0" w:uiPriority="69" w:unhideWhenUsed="0"/>
-    <w:lsdException w:name="Dark List Accent 2" w:semiHidden="0" w:uiPriority="70" w:unhideWhenUsed="0"/>
-    <w:lsdException w:name="Colorful Shading Accent 2" w:semiHidden="0" w:uiPriority="71" w:unhideWhenUsed="0"/>
-    <w:lsdException w:name="Colorful List Accent 2" w:semiHidden="0" w:uiPriority="72" w:unhideWhenUsed="0"/>
-    <w:lsdException w:name="Colorful Grid Accent 2" w:semiHidden="0" w:uiPriority="73" w:unhideWhenUsed="0"/>
-    <w:lsdException w:name="Light Shading Accent 3" w:semiHidden="0" w:uiPriority="60" w:unhideWhenUsed="0"/>
-    <w:lsdException w:name="Light List Accent 3" w:semiHidden="0" w:uiPriority="61" w:unhideWhenUsed="0"/>
-    <w:lsdException w:name="Light Grid Accent 3" w:semiHidden="0" w:uiPriority="62" w:unhideWhenUsed="0"/>
-    <w:lsdException w:name="Medium Shading 1 Accent 3" w:semiHidden="0" w:uiPriority="63" w:unhideWhenUsed="0"/>
-    <w:lsdException w:name="Medium Shading 2 Accent 3" w:semiHidden="0" w:uiPriority="64" w:unhideWhenUsed="0"/>
-    <w:lsdException w:name="Medium List 1 Accent 3" w:semiHidden="0" w:uiPriority="65" w:unhideWhenUsed="0"/>
-    <w:lsdException w:name="Medium List 2 Accent 3" w:semiHidden="0" w:uiPriority="66" w:unhideWhenUsed="0"/>
-    <w:lsdException w:name="Medium Grid 1 Accent 3" w:semiHidden="0" w:uiPriority="67" w:unhideWhenUsed="0"/>
-    <w:lsdException w:name="Medium Grid 2 Accent 3" w:semiHidden="0" w:uiPriority="68" w:unhideWhenUsed="0"/>
-    <w:lsdException w:name="Medium Grid 3 Accent 3" w:semiHidden="0" w:uiPriority="69" w:unhideWhenUsed="0"/>
-    <w:lsdException w:name="Dark List Accent 3" w:semiHidden="0" w:uiPriority="70" w:unhideWhenUsed="0"/>
-    <w:lsdException w:name="Colorful Shading Accent 3" w:semiHidden="0" w:uiPriority="71" w:unhideWhenUsed="0"/>
-    <w:lsdException w:name="Colorful List Accent 3" w:semiHidden="0" w:uiPriority="72" w:unhideWhenUsed="0"/>
-    <w:lsdException w:name="Colorful Grid Accent 3" w:semiHidden="0" w:uiPriority="73" w:unhideWhenUsed="0"/>
-    <w:lsdException w:name="Light Shading Accent 4" w:semiHidden="0" w:uiPriority="60" w:unhideWhenUsed="0"/>
-    <w:lsdException w:name="Light List Accent 4" w:semiHidden="0" w:uiPriority="61" w:unhideWhenUsed="0"/>
-    <w:lsdException w:name="Light Grid Accent 4" w:semiHidden="0" w:uiPriority="62" w:unhideWhenUsed="0"/>
-    <w:lsdException w:name="Medium Shading 1 Accent 4" w:semiHidden="0" w:uiPriority="63" w:unhideWhenUsed="0"/>
-    <w:lsdException w:name="Medium Shading 2 Accent 4" w:semiHidden="0" w:uiPriority="64" w:unhideWhenUsed="0"/>
-    <w:lsdException w:name="Medium List 1 Accent 4" w:semiHidden="0" w:uiPriority="65" w:unhideWhenUsed="0"/>
-    <w:lsdException w:name="Medium List 2 Accent 4" w:semiHidden="0" w:uiPriority="66" w:unhideWhenUsed="0"/>
-    <w:lsdException w:name="Medium Grid 1 Accent 4" w:semiHidden="0" w:uiPriority="67" w:unhideWhenUsed="0"/>
-    <w:lsdException w:name="Medium Grid 2 Accent 4" w:semiHidden="0" w:uiPriority="68" w:unhideWhenUsed="0"/>
-    <w:lsdException w:name="Medium Grid 3 Accent 4" w:semiHidden="0" w:uiPriority="69" w:unhideWhenUsed="0"/>
-    <w:lsdException w:name="Dark List Accent 4" w:semiHidden="0" w:uiPriority="70" w:unhideWhenUsed="0"/>
-    <w:lsdException w:name="Colorful Shading Accent 4" w:semiHidden="0" w:uiPriority="71" w:unhideWhenUsed="0"/>
-    <w:lsdException w:name="Colorful List Accent 4" w:semiHidden="0" w:uiPriority="72" w:unhideWhenUsed="0"/>
-    <w:lsdException w:name="Colorful Grid Accent 4" w:semiHidden="0" w:uiPriority="73" w:unhideWhenUsed="0"/>
-    <w:lsdException w:name="Light Shading Accent 5" w:semiHidden="0" w:uiPriority="60" w:unhideWhenUsed="0"/>
-    <w:lsdException w:name="Light List Accent 5" w:semiHidden="0" w:uiPriority="61" w:unhideWhenUsed="0"/>
-    <w:lsdException w:name="Light Grid Accent 5" w:semiHidden="0" w:uiPriority="62" w:unhideWhenUsed="0"/>
-    <w:lsdException w:name="Medium Shading 1 Accent 5" w:semiHidden="0" w:uiPriority="63" w:unhideWhenUsed="0"/>
-    <w:lsdException w:name="Medium Shading 2 Accent 5" w:semiHidden="0" w:uiPriority="64" w:unhideWhenUsed="0"/>
-    <w:lsdException w:name="Medium List 1 Accent 5" w:semiHidden="0" w:uiPriority="65" w:unhideWhenUsed="0"/>
-    <w:lsdException w:name="Medium List 2 Accent 5" w:semiHidden="0" w:uiPriority="66" w:unhideWhenUsed="0"/>
-    <w:lsdException w:name="Medium Grid 1 Accent 5" w:semiHidden="0" w:uiPriority="67" w:unhideWhenUsed="0"/>
-    <w:lsdException w:name="Medium Grid 2 Accent 5" w:semiHidden="0" w:uiPriority="68" w:unhideWhenUsed="0"/>
-    <w:lsdException w:name="Medium Grid 3 Accent 5" w:semiHidden="0" w:uiPriority="69" w:unhideWhenUsed="0"/>
-    <w:lsdException w:name="Dark List Accent 5" w:semiHidden="0" w:uiPriority="70" w:unhideWhenUsed="0"/>
-    <w:lsdException w:name="Colorful Shading Accent 5" w:semiHidden="0" w:uiPriority="71" w:unhideWhenUsed="0"/>
-    <w:lsdException w:name="Colorful List Accent 5" w:semiHidden="0" w:uiPriority="72" w:unhideWhenUsed="0"/>
-    <w:lsdException w:name="Colorful Grid Accent 5" w:semiHidden="0" w:uiPriority="73" w:unhideWhenUsed="0"/>
-    <w:lsdException w:name="Light Shading Accent 6" w:semiHidden="0" w:uiPriority="60" w:unhideWhenUsed="0"/>
-    <w:lsdException w:name="Light List Accent 6" w:semiHidden="0" w:uiPriority="61" w:unhideWhenUsed="0"/>
-    <w:lsdException w:name="Light Grid Accent 6" w:semiHidden="0" w:uiPriority="62" w:unhideWhenUsed="0"/>
-    <w:lsdException w:name="Medium Shading 1 Accent 6" w:semiHidden="0" w:uiPriority="63" w:unhideWhenUsed="0"/>
-    <w:lsdException w:name="Medium Shading 2 Accent 6" w:semiHidden="0" w:uiPriority="64" w:unhideWhenUsed="0"/>
-    <w:lsdException w:name="Medium List 1 Accent 6" w:semiHidden="0" w:uiPriority="65" w:unhideWhenUsed="0"/>
-    <w:lsdException w:name="Medium List 2 Accent 6" w:semiHidden="0" w:uiPriority="66" w:unhideWhenUsed="0"/>
-    <w:lsdException w:name="Medium Grid 1 Accent 6" w:semiHidden="0" w:uiPriority="67" w:unhideWhenUsed="0"/>
-    <w:lsdException w:name="Medium Grid 2 Accent 6" w:semiHidden="0" w:uiPriority="68" w:unhideWhenUsed="0"/>
-    <w:lsdException w:name="Medium Grid 3 Accent 6" w:semiHidden="0" w:uiPriority="69" w:unhideWhenUsed="0"/>
-    <w:lsdException w:name="Dark List Accent 6" w:semiHidden="0" w:uiPriority="70" w:unhideWhenUsed="0"/>
-    <w:lsdException w:name="Colorful Shading Accent 6" w:semiHidden="0" w:uiPriority="71" w:unhideWhenUsed="0"/>
-    <w:lsdException w:name="Colorful List Accent 6" w:semiHidden="0" w:uiPriority="72" w:unhideWhenUsed="0"/>
-    <w:lsdException w:name="Colorful Grid Accent 6" w:semiHidden="0" w:uiPriority="73" w:unhideWhenUsed="0"/>
-    <w:lsdException w:name="Subtle Emphasis" w:semiHidden="0" w:uiPriority="19" w:unhideWhenUsed="0" w:qFormat="1"/>
-    <w:lsdException w:name="Intense Emphasis" w:semiHidden="0" w:uiPriority="21" w:unhideWhenUsed="0" w:qFormat="1"/>
-    <w:lsdException w:name="Subtle Reference" w:semiHidden="0" w:uiPriority="31" w:unhideWhenUsed="0" w:qFormat="1"/>
-    <w:lsdException w:name="Intense Reference" w:semiHidden="0" w:uiPriority="32" w:unhideWhenUsed="0" w:qFormat="1"/>
-    <w:lsdException w:name="Book Title" w:semiHidden="0" w:uiPriority="33" w:unhideWhenUsed="0" w:qFormat="1"/>
-    <w:lsdException w:name="Bibliography" w:uiPriority="37"/>
-    <w:lsdException w:name="TOC Heading" w:uiPriority="39" w:qFormat="1"/>
-  </w:latentStyles>
-  <w:style w:type="paragraph" w:default="1" w:styleId="Normal">
-    <w:name w:val="Normal"/>
-    <w:qFormat/>
-  </w:style>
-  <w:style w:type="character" w:default="1" w:styleId="DefaultParagraphFont">
-    <w:name w:val="Default Paragraph Font"/>
-    <w:uiPriority w:val="1"/>
-    <w:semiHidden/>
-    <w:unhideWhenUsed/>
-  </w:style>
-  <w:style w:type="table" w:default="1" w:styleId="TableNormal">
-    <w:name w:val="Normal Table"/>
-    <w:uiPriority w:val="99"/>
-    <w:semiHidden/>
-    <w:unhideWhenUsed/>
-    <w:tblPr>
-      <w:tblInd w:w="0" w:type="dxa"/>
-      <w:tblCellMar>
-        <w:top w:w="0" w:type="dxa"/>
-        <w:left w:w="108" w:type="dxa"/>
-        <w:bottom w:w="0" w:type="dxa"/>
-        <w:right w:w="108" w:type="dxa"/>
-      </w:tblCellMar>
-    </w:tblPr>
-  </w:style>
-  <w:style w:type="numbering" w:default="1" w:styleId="NoList">
-    <w:name w:val="No List"/>
-    <w:uiPriority w:val="99"/>
-    <w:semiHidden/>
-    <w:unhideWhenUsed/>
-  </w:style>
-  <w:style w:type="paragraph" w:styleId="ListParagraph">
-    <w:name w:val="List Paragraph"/>
-    <w:basedOn w:val="Normal"/>
-    <w:uiPriority w:val="34"/>
-    <w:qFormat/>
-    <w:rsid w:val="005572EC"/>
-    <w:pPr>
-      <w:ind w:left="720"/>
-      <w:contextualSpacing/>
-    </w:pPr>
-  </w:style>
-  <w:style w:type="paragraph" w:styleId="NoSpacing">
-    <w:name w:val="No Spacing"/>
-    <w:uiPriority w:val="1"/>
-    <w:qFormat/>
-    <w:rsid w:val="004624D6"/>
-    <w:pPr>
-      <w:spacing w:after="0" w:line="240" w:lineRule="auto"/>
-    </w:pPr>
-  </w:style>
-  <w:style w:type="paragraph" w:styleId="BalloonText">
-    <w:name w:val="Balloon Text"/>
-    <w:basedOn w:val="Normal"/>
-    <w:link w:val="BalloonTextChar"/>
-    <w:uiPriority w:val="99"/>
-    <w:semiHidden/>
-    <w:unhideWhenUsed/>
-    <w:rsid w:val="00763CAA"/>
-    <w:pPr>
-      <w:spacing w:after="0" w:line="240" w:lineRule="auto"/>
-    </w:pPr>
-    <w:rPr>
-      <w:rFonts w:ascii="Lucida Grande" w:hAnsi="Lucida Grande" w:cs="Lucida Grande"/>
-      <w:sz w:val="18"/>
-      <w:szCs w:val="18"/>
-    </w:rPr>
-  </w:style>
-  <w:style w:type="character" w:customStyle="1" w:styleId="BalloonTextChar">
-    <w:name w:val="Balloon Text Char"/>
-    <w:basedOn w:val="DefaultParagraphFont"/>
-    <w:link w:val="BalloonText"/>
-    <w:uiPriority w:val="99"/>
-    <w:semiHidden/>
-    <w:rsid w:val="00763CAA"/>
-    <w:rPr>
-      <w:rFonts w:ascii="Lucida Grande" w:hAnsi="Lucida Grande" w:cs="Lucida Grande"/>
-      <w:sz w:val="18"/>
-      <w:szCs w:val="18"/>
-    </w:rPr>
-  </w:style>
-</w:styles>
-</file>
-
-<file path=word/stylesWithEffects.xml><?xml version="1.0" encoding="utf-8"?>
-<w:styles xmlns:wpc="http://schemas.microsoft.com/office/word/2010/wordprocessingCanvas" xmlns:mo="http://schemas.microsoft.com/office/mac/office/2008/main" xmlns:mc="http://schemas.openxmlformats.org/markup-compatibility/2006" xmlns:mv="urn:schemas-microsoft-com:mac:vml" xmlns:o="urn:schemas-microsoft-com:office:office" xmlns:r="http://schemas.openxmlformats.org/officeDocument/2006/relationships" xmlns:m="http://schemas.openxmlformats.org/officeDocument/2006/math" xmlns:v="urn:schemas-microsoft-com:vml" xmlns:wp14="http://schemas.microsoft.com/office/word/2010/wordprocessingDrawing" xmlns:wp="http://schemas.openxmlformats.org/drawingml/2006/wordprocessingDrawing" xmlns:w10="urn:schemas-microsoft-com:office:word" xmlns:w="http://schemas.openxmlformats.org/wordprocessingml/2006/main" xmlns:w14="http://schemas.microsoft.com/office/word/2010/wordml" xmlns:wpg="http://schemas.microsoft.com/office/word/2010/wordprocessingGroup" xmlns:wpi="http://schemas.microsoft.com/office/word/2010/wordprocessingInk" xmlns:wne="http://schemas.microsoft.com/office/word/2006/wordml" xmlns:wps="http://schemas.microsoft.com/office/word/2010/wordprocessingShape" mc:Ignorable="w14 wp14">
-  <w:docDefaults>
-    <w:rPrDefault>
-      <w:rPr>
-        <w:rFonts w:asciiTheme="minorHAnsi" w:eastAsiaTheme="minorHAnsi" w:hAnsiTheme="minorHAnsi" w:cstheme="minorBidi"/>
-        <w:sz w:val="22"/>
-        <w:szCs w:val="22"/>
-        <w:lang w:val="en-US" w:eastAsia="en-US" w:bidi="ar-SA"/>
-      </w:rPr>
-    </w:rPrDefault>
-    <w:pPrDefault>
-      <w:pPr>
-        <w:spacing w:after="160" w:line="259" w:lineRule="auto"/>
-      </w:pPr>
-    </w:pPrDefault>
-  </w:docDefaults>
-  <w:latentStyles w:defLockedState="0" w:defUIPriority="99" w:defSemiHidden="1" w:defUnhideWhenUsed="1" w:defQFormat="0" w:count="276">
-    <w:lsdException w:name="Normal" w:semiHidden="0" w:uiPriority="0" w:unhideWhenUsed="0" w:qFormat="1"/>
-    <w:lsdException w:name="heading 1" w:semiHidden="0" w:uiPriority="9" w:unhideWhenUsed="0" w:qFormat="1"/>
-    <w:lsdException w:name="heading 2" w:uiPriority="9" w:qFormat="1"/>
-    <w:lsdException w:name="heading 3" w:uiPriority="9" w:qFormat="1"/>
-    <w:lsdException w:name="heading 4" w:uiPriority="9" w:qFormat="1"/>
-    <w:lsdException w:name="heading 5" w:uiPriority="9" w:qFormat="1"/>
-    <w:lsdException w:name="heading 6" w:uiPriority="9" w:qFormat="1"/>
-    <w:lsdException w:name="heading 7" w:uiPriority="9" w:qFormat="1"/>
-    <w:lsdException w:name="heading 8" w:uiPriority="9" w:qFormat="1"/>
-    <w:lsdException w:name="heading 9" w:uiPriority="9" w:qFormat="1"/>
-    <w:lsdException w:name="toc 1" w:uiPriority="39"/>
-    <w:lsdException w:name="toc 2" w:uiPriority="39"/>
-    <w:lsdException w:name="toc 3" w:uiPriority="39"/>
-    <w:lsdException w:name="toc 4" w:uiPriority="39"/>
-    <w:lsdException w:name="toc 5" w:uiPriority="39"/>
-    <w:lsdException w:name="toc 6" w:uiPriority="39"/>
-    <w:lsdException w:name="toc 7" w:uiPriority="39"/>
-    <w:lsdException w:name="toc 8" w:uiPriority="39"/>
-    <w:lsdException w:name="toc 9" w:uiPriority="39"/>
-    <w:lsdException w:name="caption" w:uiPriority="35" w:qFormat="1"/>
-    <w:lsdException w:name="Title" w:semiHidden="0" w:uiPriority="10" w:unhideWhenUsed="0" w:qFormat="1"/>
-    <w:lsdException w:name="Default Paragraph Font" w:uiPriority="1"/>
-    <w:lsdException w:name="Subtitle" w:semiHidden="0" w:uiPriority="11" w:unhideWhenUsed="0" w:qFormat="1"/>
-    <w:lsdException w:name="Strong" w:semiHidden="0" w:uiPriority="22" w:unhideWhenUsed="0" w:qFormat="1"/>
-    <w:lsdException w:name="Emphasis" w:semiHidden="0" w:uiPriority="20" w:unhideWhenUsed="0" w:qFormat="1"/>
-    <w:lsdException w:name="Table Grid" w:semiHidden="0" w:uiPriority="39" w:unhideWhenUsed="0"/>
-    <w:lsdException w:name="Note Level 1" w:semiHidden="0" w:unhideWhenUsed="0"/>
-    <w:lsdException w:name="Note Level 2" w:semiHidden="0" w:unhideWhenUsed="0"/>
-    <w:lsdException w:name="Note Level 3" w:semiHidden="0" w:unhideWhenUsed="0"/>
-    <w:lsdException w:name="Note Level 4" w:semiHidden="0" w:unhideWhenUsed="0"/>
-    <w:lsdException w:name="Note Level 5" w:semiHidden="0" w:unhideWhenUsed="0"/>
-    <w:lsdException w:name="Note Level 6" w:semiHidden="0" w:unhideWhenUsed="0"/>
-    <w:lsdException w:name="Note Level 7" w:semiHidden="0" w:unhideWhenUsed="0"/>
-    <w:lsdException w:name="Note Level 8" w:semiHidden="0" w:unhideWhenUsed="0"/>
-    <w:lsdException w:name="Note Level 9" w:semiHidden="0" w:unhideWhenUsed="0"/>
-    <w:lsdException w:name="Placeholder Text" w:unhideWhenUsed="0"/>
-    <w:lsdException w:name="No Spacing" w:semiHidden="0" w:uiPriority="1" w:unhideWhenUsed="0" w:qFormat="1"/>
-    <w:lsdException w:name="Light Shading" w:semiHidden="0" w:uiPriority="60" w:unhideWhenUsed="0"/>
-    <w:lsdException w:name="Light List" w:semiHidden="0" w:uiPriority="61" w:unhideWhenUsed="0"/>
-    <w:lsdException w:name="Light Grid" w:semiHidden="0" w:uiPriority="62" w:unhideWhenUsed="0"/>
-    <w:lsdException w:name="Medium Shading 1" w:semiHidden="0" w:uiPriority="63" w:unhideWhenUsed="0"/>
-    <w:lsdException w:name="Medium Shading 2" w:semiHidden="0" w:uiPriority="64" w:unhideWhenUsed="0"/>
-    <w:lsdException w:name="Medium List 1" w:semiHidden="0" w:uiPriority="65" w:unhideWhenUsed="0"/>
-    <w:lsdException w:name="Medium List 2" w:semiHidden="0" w:uiPriority="66" w:unhideWhenUsed="0"/>
-    <w:lsdException w:name="Medium Grid 1" w:semiHidden="0" w:uiPriority="67" w:unhideWhenUsed="0"/>
-    <w:lsdException w:name="Medium Grid 2" w:semiHidden="0" w:uiPriority="68" w:unhideWhenUsed="0"/>
-    <w:lsdException w:name="Medium Grid 3" w:semiHidden="0" w:uiPriority="69" w:unhideWhenUsed="0"/>
-    <w:lsdException w:name="Dark List" w:semiHidden="0" w:uiPriority="70" w:unhideWhenUsed="0"/>
-    <w:lsdException w:name="Colorful Shading" w:semiHidden="0" w:uiPriority="71" w:unhideWhenUsed="0"/>
-    <w:lsdException w:name="Colorful List" w:semiHidden="0" w:uiPriority="72" w:unhideWhenUsed="0"/>
-    <w:lsdException w:name="Colorful Grid" w:semiHidden="0" w:uiPriority="73" w:unhideWhenUsed="0"/>
-    <w:lsdException w:name="Light Shading Accent 1" w:semiHidden="0" w:uiPriority="60" w:unhideWhenUsed="0"/>
-    <w:lsdException w:name="Light List Accent 1" w:semiHidden="0" w:uiPriority="61" w:unhideWhenUsed="0"/>
-    <w:lsdException w:name="Light Grid Accent 1" w:semiHidden="0" w:uiPriority="62" w:unhideWhenUsed="0"/>
-    <w:lsdException w:name="Medium Shading 1 Accent 1" w:semiHidden="0" w:uiPriority="63" w:unhideWhenUsed="0"/>
-    <w:lsdException w:name="Medium Shading 2 Accent 1" w:semiHidden="0" w:uiPriority="64" w:unhideWhenUsed="0"/>
-    <w:lsdException w:name="Medium List 1 Accent 1" w:semiHidden="0" w:uiPriority="65" w:unhideWhenUsed="0"/>
-    <w:lsdException w:name="Revision" w:unhideWhenUsed="0"/>
-    <w:lsdException w:name="List Paragraph" w:semiHidden="0" w:uiPriority="34" w:unhideWhenUsed="0" w:qFormat="1"/>
-    <w:lsdException w:name="Quote" w:semiHidden="0" w:uiPriority="29" w:unhideWhenUsed="0" w:qFormat="1"/>
-    <w:lsdException w:name="Intense Quote" w:semiHidden="0" w:uiPriority="30" w:unhideWhenUsed="0" w:qFormat="1"/>
-    <w:lsdException w:name="Medium List 2 Accent 1" w:semiHidden="0" w:uiPriority="66" w:unhideWhenUsed="0"/>
-    <w:lsdException w:name="Medium Grid 1 Accent 1" w:semiHidden="0" w:uiPriority="67" w:unhideWhenUsed="0"/>
-    <w:lsdException w:name="Medium Grid 2 Accent 1" w:semiHidden="0" w:uiPriority="68" w:unhideWhenUsed="0"/>
-    <w:lsdException w:name="Medium Grid 3 Accent 1" w:semiHidden="0" w:uiPriority="69" w:unhideWhenUsed="0"/>
-    <w:lsdException w:name="Dark List Accent 1" w:semiHidden="0" w:uiPriority="70" w:unhideWhenUsed="0"/>
-    <w:lsdException w:name="Colorful Shading Accent 1" w:semiHidden="0" w:uiPriority="71" w:unhideWhenUsed="0"/>
-    <w:lsdException w:name="Colorful List Accent 1" w:semiHidden="0" w:uiPriority="72" w:unhideWhenUsed="0"/>
-    <w:lsdException w:name="Colorful Grid Accent 1" w:semiHidden="0" w:uiPriority="73" w:unhideWhenUsed="0"/>
-    <w:lsdException w:name="Light Shading Accent 2" w:semiHidden="0" w:uiPriority="60" w:unhideWhenUsed="0"/>
-    <w:lsdException w:name="Light List Accent 2" w:semiHidden="0" w:uiPriority="61" w:unhideWhenUsed="0"/>
-    <w:lsdException w:name="Light Grid Accent 2" w:semiHidden="0" w:uiPriority="62" w:unhideWhenUsed="0"/>
-    <w:lsdException w:name="Medium Shading 1 Accent 2" w:semiHidden="0" w:uiPriority="63" w:unhideWhenUsed="0"/>
-    <w:lsdException w:name="Medium Shading 2 Accent 2" w:semiHidden="0" w:uiPriority="64" w:unhideWhenUsed="0"/>
-    <w:lsdException w:name="Medium List 1 Accent 2" w:semiHidden="0" w:uiPriority="65" w:unhideWhenUsed="0"/>
-    <w:lsdException w:name="Medium List 2 Accent 2" w:semiHidden="0" w:uiPriority="66" w:unhideWhenUsed="0"/>
-    <w:lsdException w:name="Medium Grid 1 Accent 2" w:semiHidden="0" w:uiPriority="67" w:unhideWhenUsed="0"/>
-    <w:lsdException w:name="Medium Grid 2 Accent 2" w:semiHidden="0" w:uiPriority="68" w:unhideWhenUsed="0"/>
-    <w:lsdException w:name="Medium Grid 3 Accent 2" w:semiHidden="0" w:uiPriority="69" w:unhideWhenUsed="0"/>
-    <w:lsdException w:name="Dark List Accent 2" w:semiHidden="0" w:uiPriority="70" w:unhideWhenUsed="0"/>
-    <w:lsdException w:name="Colorful Shading Accent 2" w:semiHidden="0" w:uiPriority="71" w:unhideWhenUsed="0"/>
-    <w:lsdException w:name="Colorful List Accent 2" w:semiHidden="0" w:uiPriority="72" w:unhideWhenUsed="0"/>
-    <w:lsdException w:name="Colorful Grid Accent 2" w:semiHidden="0" w:uiPriority="73" w:unhideWhenUsed="0"/>
-    <w:lsdException w:name="Light Shading Accent 3" w:semiHidden="0" w:uiPriority="60" w:unhideWhenUsed="0"/>
-    <w:lsdException w:name="Light List Accent 3" w:semiHidden="0" w:uiPriority="61" w:unhideWhenUsed="0"/>
-    <w:lsdException w:name="Light Grid Accent 3" w:semiHidden="0" w:uiPriority="62" w:unhideWhenUsed="0"/>
-    <w:lsdException w:name="Medium Shading 1 Accent 3" w:semiHidden="0" w:uiPriority="63" w:unhideWhenUsed="0"/>
-    <w:lsdException w:name="Medium Shading 2 Accent 3" w:semiHidden="0" w:uiPriority="64" w:unhideWhenUsed="0"/>
-    <w:lsdException w:name="Medium List 1 Accent 3" w:semiHidden="0" w:uiPriority="65" w:unhideWhenUsed="0"/>
-    <w:lsdException w:name="Medium List 2 Accent 3" w:semiHidden="0" w:uiPriority="66" w:unhideWhenUsed="0"/>
-    <w:lsdException w:name="Medium Grid 1 Accent 3" w:semiHidden="0" w:uiPriority="67" w:unhideWhenUsed="0"/>
-    <w:lsdException w:name="Medium Grid 2 Accent 3" w:semiHidden="0" w:uiPriority="68" w:unhideWhenUsed="0"/>
-    <w:lsdException w:name="Medium Grid 3 Accent 3" w:semiHidden="0" w:uiPriority="69" w:unhideWhenUsed="0"/>
-    <w:lsdException w:name="Dark List Accent 3" w:semiHidden="0" w:uiPriority="70" w:unhideWhenUsed="0"/>
-    <w:lsdException w:name="Colorful Shading Accent 3" w:semiHidden="0" w:uiPriority="71" w:unhideWhenUsed="0"/>
-    <w:lsdException w:name="Colorful List Accent 3" w:semiHidden="0" w:uiPriority="72" w:unhideWhenUsed="0"/>
-    <w:lsdException w:name="Colorful Grid Accent 3" w:semiHidden="0" w:uiPriority="73" w:unhideWhenUsed="0"/>
-    <w:lsdException w:name="Light Shading Accent 4" w:semiHidden="0" w:uiPriority="60" w:unhideWhenUsed="0"/>
-    <w:lsdException w:name="Light List Accent 4" w:semiHidden="0" w:uiPriority="61" w:unhideWhenUsed="0"/>
-    <w:lsdException w:name="Light Grid Accent 4" w:semiHidden="0" w:uiPriority="62" w:unhideWhenUsed="0"/>
-    <w:lsdException w:name="Medium Shading 1 Accent 4" w:semiHidden="0" w:uiPriority="63" w:unhideWhenUsed="0"/>
-    <w:lsdException w:name="Medium Shading 2 Accent 4" w:semiHidden="0" w:uiPriority="64" w:unhideWhenUsed="0"/>
-    <w:lsdException w:name="Medium List 1 Accent 4" w:semiHidden="0" w:uiPriority="65" w:unhideWhenUsed="0"/>
-    <w:lsdException w:name="Medium List 2 Accent 4" w:semiHidden="0" w:uiPriority="66" w:unhideWhenUsed="0"/>
-    <w:lsdException w:name="Medium Grid 1 Accent 4" w:semiHidden="0" w:uiPriority="67" w:unhideWhenUsed="0"/>
-    <w:lsdException w:name="Medium Grid 2 Accent 4" w:semiHidden="0" w:uiPriority="68" w:unhideWhenUsed="0"/>
-    <w:lsdException w:name="Medium Grid 3 Accent 4" w:semiHidden="0" w:uiPriority="69" w:unhideWhenUsed="0"/>
-    <w:lsdException w:name="Dark List Accent 4" w:semiHidden="0" w:uiPriority="70" w:unhideWhenUsed="0"/>
-    <w:lsdException w:name="Colorful Shading Accent 4" w:semiHidden="0" w:uiPriority="71" w:unhideWhenUsed="0"/>
-    <w:lsdException w:name="Colorful List Accent 4" w:semiHidden="0" w:uiPriority="72" w:unhideWhenUsed="0"/>
-    <w:lsdException w:name="Colorful Grid Accent 4" w:semiHidden="0" w:uiPriority="73" w:unhideWhenUsed="0"/>
-    <w:lsdException w:name="Light Shading Accent 5" w:semiHidden="0" w:uiPriority="60" w:unhideWhenUsed="0"/>
-    <w:lsdException w:name="Light List Accent 5" w:semiHidden="0" w:uiPriority="61" w:unhideWhenUsed="0"/>
-    <w:lsdException w:name="Light Grid Accent 5" w:semiHidden="0" w:uiPriority="62" w:unhideWhenUsed="0"/>
-    <w:lsdException w:name="Medium Shading 1 Accent 5" w:semiHidden="0" w:uiPriority="63" w:unhideWhenUsed="0"/>
-    <w:lsdException w:name="Medium Shading 2 Accent 5" w:semiHidden="0" w:uiPriority="64" w:unhideWhenUsed="0"/>
-    <w:lsdException w:name="Medium List 1 Accent 5" w:semiHidden="0" w:uiPriority="65" w:unhideWhenUsed="0"/>
-    <w:lsdException w:name="Medium List 2 Accent 5" w:semiHidden="0" w:uiPriority="66" w:unhideWhenUsed="0"/>
-    <w:lsdException w:name="Medium Grid 1 Accent 5" w:semiHidden="0" w:uiPriority="67" w:unhideWhenUsed="0"/>
-    <w:lsdException w:name="Medium Grid 2 Accent 5" w:semiHidden="0" w:uiPriority="68" w:unhideWhenUsed="0"/>
-    <w:lsdException w:name="Medium Grid 3 Accent 5" w:semiHidden="0" w:uiPriority="69" w:unhideWhenUsed="0"/>
-    <w:lsdException w:name="Dark List Accent 5" w:semiHidden="0" w:uiPriority="70" w:unhideWhenUsed="0"/>
-    <w:lsdException w:name="Colorful Shading Accent 5" w:semiHidden="0" w:uiPriority="71" w:unhideWhenUsed="0"/>
-    <w:lsdException w:name="Colorful List Accent 5" w:semiHidden="0" w:uiPriority="72" w:unhideWhenUsed="0"/>
-    <w:lsdException w:name="Colorful Grid Accent 5" w:semiHidden="0" w:uiPriority="73" w:unhideWhenUsed="0"/>
-    <w:lsdException w:name="Light Shading Accent 6" w:semiHidden="0" w:uiPriority="60" w:unhideWhenUsed="0"/>
-    <w:lsdException w:name="Light List Accent 6" w:semiHidden="0" w:uiPriority="61" w:unhideWhenUsed="0"/>
-    <w:lsdException w:name="Light Grid Accent 6" w:semiHidden="0" w:uiPriority="62" w:unhideWhenUsed="0"/>
-    <w:lsdException w:name="Medium Shading 1 Accent 6" w:semiHidden="0" w:uiPriority="63" w:unhideWhenUsed="0"/>
-    <w:lsdException w:name="Medium Shading 2 Accent 6" w:semiHidden="0" w:uiPriority="64" w:unhideWhenUsed="0"/>
-    <w:lsdException w:name="Medium List 1 Accent 6" w:semiHidden="0" w:uiPriority="65" w:unhideWhenUsed="0"/>
-    <w:lsdException w:name="Medium List 2 Accent 6" w:semiHidden="0" w:uiPriority="66" w:unhideWhenUsed="0"/>
-    <w:lsdException w:name="Medium Grid 1 Accent 6" w:semiHidden="0" w:uiPriority="67" w:unhideWhenUsed="0"/>
-    <w:lsdException w:name="Medium Grid 2 Accent 6" w:semiHidden="0" w:uiPriority="68" w:unhideWhenUsed="0"/>
-    <w:lsdException w:name="Medium Grid 3 Accent 6" w:semiHidden="0" w:uiPriority="69" w:unhideWhenUsed="0"/>
-    <w:lsdException w:name="Dark List Accent 6" w:semiHidden="0" w:uiPriority="70" w:unhideWhenUsed="0"/>
-    <w:lsdException w:name="Colorful Shading Accent 6" w:semiHidden="0" w:uiPriority="71" w:unhideWhenUsed="0"/>
-    <w:lsdException w:name="Colorful List Accent 6" w:semiHidden="0" w:uiPriority="72" w:unhideWhenUsed="0"/>
-    <w:lsdException w:name="Colorful Grid Accent 6" w:semiHidden="0" w:uiPriority="73" w:unhideWhenUsed="0"/>
-    <w:lsdException w:name="Subtle Emphasis" w:semiHidden="0" w:uiPriority="19" w:unhideWhenUsed="0" w:qFormat="1"/>
-    <w:lsdException w:name="Intense Emphasis" w:semiHidden="0" w:uiPriority="21" w:unhideWhenUsed="0" w:qFormat="1"/>
-    <w:lsdException w:name="Subtle Reference" w:semiHidden="0" w:uiPriority="31" w:unhideWhenUsed="0" w:qFormat="1"/>
-    <w:lsdException w:name="Intense Reference" w:semiHidden="0" w:uiPriority="32" w:unhideWhenUsed="0" w:qFormat="1"/>
-    <w:lsdException w:name="Book Title" w:semiHidden="0" w:uiPriority="33" w:unhideWhenUsed="0" w:qFormat="1"/>
-    <w:lsdException w:name="Bibliography" w:uiPriority="37"/>
-    <w:lsdException w:name="TOC Heading" w:uiPriority="39" w:qFormat="1"/>
+  <w:latentStyles w:defLockedState="0" w:defUIPriority="99" w:defSemiHidden="0" w:defUnhideWhenUsed="0" w:defQFormat="0" w:count="371">
+    <w:lsdException w:name="Normal" w:uiPriority="0" w:qFormat="1"/>
+    <w:lsdException w:name="heading 1" w:uiPriority="9" w:qFormat="1"/>
+    <w:lsdException w:name="heading 2" w:semiHidden="1" w:uiPriority="9" w:unhideWhenUsed="1" w:qFormat="1"/>
+    <w:lsdException w:name="heading 3" w:semiHidden="1" w:uiPriority="9" w:unhideWhenUsed="1" w:qFormat="1"/>
+    <w:lsdException w:name="heading 4" w:semiHidden="1" w:uiPriority="9" w:unhideWhenUsed="1" w:qFormat="1"/>
+    <w:lsdException w:name="heading 5" w:semiHidden="1" w:uiPriority="9" w:unhideWhenUsed="1" w:qFormat="1"/>
+    <w:lsdException w:name="heading 6" w:semiHidden="1" w:uiPriority="9" w:unhideWhenUsed="1" w:qFormat="1"/>
+    <w:lsdException w:name="heading 7" w:semiHidden="1" w:uiPriority="9" w:unhideWhenUsed="1" w:qFormat="1"/>
+    <w:lsdException w:name="heading 8" w:semiHidden="1" w:uiPriority="9" w:unhideWhenUsed="1" w:qFormat="1"/>
+    <w:lsdException w:name="heading 9" w:semiHidden="1" w:uiPriority="9" w:unhideWhenUsed="1" w:qFormat="1"/>
+    <w:lsdException w:name="index 1" w:semiHidden="1" w:unhideWhenUsed="1"/>
+    <w:lsdException w:name="index 2" w:semiHidden="1" w:unhideWhenUsed="1"/>
+    <w:lsdException w:name="index 3" w:semiHidden="1" w:unhideWhenUsed="1"/>
+    <w:lsdException w:name="index 4" w:semiHidden="1" w:unhideWhenUsed="1"/>
+    <w:lsdException w:name="index 5" w:semiHidden="1" w:unhideWhenUsed="1"/>
+    <w:lsdException w:name="index 6" w:semiHidden="1" w:unhideWhenUsed="1"/>
+    <w:lsdException w:name="index 7" w:semiHidden="1" w:unhideWhenUsed="1"/>
+    <w:lsdException w:name="index 8" w:semiHidden="1" w:unhideWhenUsed="1"/>
+    <w:lsdException w:name="index 9" w:semiHidden="1" w:unhideWhenUsed="1"/>
+    <w:lsdException w:name="toc 1" w:semiHidden="1" w:uiPriority="39" w:unhideWhenUsed="1"/>
+    <w:lsdException w:name="toc 2" w:semiHidden="1" w:uiPriority="39" w:unhideWhenUsed="1"/>
+    <w:lsdException w:name="toc 3" w:semiHidden="1" w:uiPriority="39" w:unhideWhenUsed="1"/>
+    <w:lsdException w:name="toc 4" w:semiHidden="1" w:uiPriority="39" w:unhideWhenUsed="1"/>
+    <w:lsdException w:name="toc 5" w:semiHidden="1" w:uiPriority="39" w:unhideWhenUsed="1"/>
+    <w:lsdException w:name="toc 6" w:semiHidden="1" w:uiPriority="39" w:unhideWhenUsed="1"/>
+    <w:lsdException w:name="toc 7" w:semiHidden="1" w:uiPriority="39" w:unhideWhenUsed="1"/>
+    <w:lsdException w:name="toc 8" w:semiHidden="1" w:uiPriority="39" w:unhideWhenUsed="1"/>
+    <w:lsdException w:name="toc 9" w:semiHidden="1" w:uiPriority="39" w:unhideWhenUsed="1"/>
+    <w:lsdException w:name="Normal Indent" w:semiHidden="1" w:unhideWhenUsed="1"/>
+    <w:lsdException w:name="footnote text" w:semiHidden="1" w:unhideWhenUsed="1"/>
+    <w:lsdException w:name="annotation text" w:semiHidden="1" w:unhideWhenUsed="1"/>
+    <w:lsdException w:name="header" w:semiHidden="1" w:unhideWhenUsed="1"/>
+    <w:lsdException w:name="footer" w:semiHidden="1" w:unhideWhenUsed="1"/>
+    <w:lsdException w:name="index heading" w:semiHidden="1" w:unhideWhenUsed="1"/>
+    <w:lsdException w:name="caption" w:semiHidden="1" w:uiPriority="35" w:unhideWhenUsed="1" w:qFormat="1"/>
+    <w:lsdException w:name="table of figures" w:semiHidden="1" w:unhideWhenUsed="1"/>
+    <w:lsdException w:name="envelope address" w:semiHidden="1" w:unhideWhenUsed="1"/>
+    <w:lsdException w:name="envelope return" w:semiHidden="1" w:unhideWhenUsed="1"/>
+    <w:lsdException w:name="footnote reference" w:semiHidden="1" w:unhideWhenUsed="1"/>
+    <w:lsdException w:name="annotation reference" w:semiHidden="1" w:unhideWhenUsed="1"/>
+    <w:lsdException w:name="line number" w:semiHidden="1" w:unhideWhenUsed="1"/>
+    <w:lsdException w:name="page number" w:semiHidden="1" w:unhideWhenUsed="1"/>
+    <w:lsdException w:name="endnote reference" w:semiHidden="1" w:unhideWhenUsed="1"/>
+    <w:lsdException w:name="endnote text" w:semiHidden="1" w:unhideWhenUsed="1"/>
+    <w:lsdException w:name="table of authorities" w:semiHidden="1" w:unhideWhenUsed="1"/>
+    <w:lsdException w:name="macro" w:semiHidden="1" w:unhideWhenUsed="1"/>
+    <w:lsdException w:name="toa heading" w:semiHidden="1" w:unhideWhenUsed="1"/>
+    <w:lsdException w:name="List" w:semiHidden="1" w:unhideWhenUsed="1"/>
+    <w:lsdException w:name="List Bullet" w:semiHidden="1" w:unhideWhenUsed="1"/>
+    <w:lsdException w:name="List Number" w:semiHidden="1" w:unhideWhenUsed="1"/>
+    <w:lsdException w:name="List 2" w:semiHidden="1" w:unhideWhenUsed="1"/>
+    <w:lsdException w:name="List 3" w:semiHidden="1" w:unhideWhenUsed="1"/>
+    <w:lsdException w:name="List 4" w:semiHidden="1" w:unhideWhenUsed="1"/>
+    <w:lsdException w:name="List 5" w:semiHidden="1" w:unhideWhenUsed="1"/>
+    <w:lsdException w:name="List Bullet 2" w:semiHidden="1" w:unhideWhenUsed="1"/>
+    <w:lsdException w:name="List Bullet 3" w:semiHidden="1" w:unhideWhenUsed="1"/>
+    <w:lsdException w:name="List Bullet 4" w:semiHidden="1" w:unhideWhenUsed="1"/>
+    <w:lsdException w:name="List Bullet 5" w:semiHidden="1" w:unhideWhenUsed="1"/>
+    <w:lsdException w:name="List Number 2" w:semiHidden="1" w:unhideWhenUsed="1"/>
+    <w:lsdException w:name="List Number 3" w:semiHidden="1" w:unhideWhenUsed="1"/>
+    <w:lsdException w:name="List Number 4" w:semiHidden="1" w:unhideWhenUsed="1"/>
+    <w:lsdException w:name="List Number 5" w:semiHidden="1" w:unhideWhenUsed="1"/>
+    <w:lsdException w:name="Title" w:uiPriority="10" w:qFormat="1"/>
+    <w:lsdException w:name="Closing" w:semiHidden="1" w:unhideWhenUsed="1"/>
+    <w:lsdException w:name="Signature" w:semiHidden="1" w:unhideWhenUsed="1"/>
+    <w:lsdException w:name="Default Paragraph Font" w:semiHidden="1" w:uiPriority="1" w:unhideWhenUsed="1"/>
+    <w:lsdException w:name="Body Text" w:semiHidden="1" w:unhideWhenUsed="1"/>
+    <w:lsdException w:name="Body Text Indent" w:semiHidden="1" w:unhideWhenUsed="1"/>
+    <w:lsdException w:name="List Continue" w:semiHidden="1" w:unhideWhenUsed="1"/>
+    <w:lsdException w:name="List Continue 2" w:semiHidden="1" w:unhideWhenUsed="1"/>
+    <w:lsdException w:name="List Continue 3" w:semiHidden="1" w:unhideWhenUsed="1"/>
+    <w:lsdException w:name="List Continue 4" w:semiHidden="1" w:unhideWhenUsed="1"/>
+    <w:lsdException w:name="List Continue 5" w:semiHidden="1" w:unhideWhenUsed="1"/>
+    <w:lsdException w:name="Message Header" w:semiHidden="1" w:unhideWhenUsed="1"/>
+    <w:lsdException w:name="Subtitle" w:uiPriority="11" w:qFormat="1"/>
+    <w:lsdException w:name="Salutation" w:semiHidden="1" w:unhideWhenUsed="1"/>
+    <w:lsdException w:name="Date" w:semiHidden="1" w:unhideWhenUsed="1"/>
+    <w:lsdException w:name="Body Text First Indent" w:semiHidden="1" w:unhideWhenUsed="1"/>
+    <w:lsdException w:name="Body Text First Indent 2" w:semiHidden="1" w:unhideWhenUsed="1"/>
+    <w:lsdException w:name="Note Heading" w:semiHidden="1" w:unhideWhenUsed="1"/>
+    <w:lsdException w:name="Body Text 2" w:semiHidden="1" w:unhideWhenUsed="1"/>
+    <w:lsdException w:name="Body Text 3" w:semiHidden="1" w:unhideWhenUsed="1"/>
+    <w:lsdException w:name="Body Text Indent 2" w:semiHidden="1" w:unhideWhenUsed="1"/>
+    <w:lsdException w:name="Body Text Indent 3" w:semiHidden="1" w:unhideWhenUsed="1"/>
+    <w:lsdException w:name="Block Text" w:semiHidden="1" w:unhideWhenUsed="1"/>
+    <w:lsdException w:name="Hyperlink" w:semiHidden="1" w:unhideWhenUsed="1"/>
+    <w:lsdException w:name="FollowedHyperlink" w:semiHidden="1" w:unhideWhenUsed="1"/>
+    <w:lsdException w:name="Strong" w:uiPriority="22" w:qFormat="1"/>
+    <w:lsdException w:name="Emphasis" w:uiPriority="20" w:qFormat="1"/>
+    <w:lsdException w:name="Document Map" w:semiHidden="1" w:unhideWhenUsed="1"/>
+    <w:lsdException w:name="Plain Text" w:semiHidden="1" w:unhideWhenUsed="1"/>
+    <w:lsdException w:name="E-mail Signature" w:semiHidden="1" w:unhideWhenUsed="1"/>
+    <w:lsdException w:name="HTML Top of Form" w:semiHidden="1" w:unhideWhenUsed="1"/>
+    <w:lsdException w:name="HTML Bottom of Form" w:semiHidden="1" w:unhideWhenUsed="1"/>
+    <w:lsdException w:name="Normal (Web)" w:semiHidden="1" w:unhideWhenUsed="1"/>
+    <w:lsdException w:name="HTML Acronym" w:semiHidden="1" w:unhideWhenUsed="1"/>
+    <w:lsdException w:name="HTML Address" w:semiHidden="1" w:unhideWhenUsed="1"/>
+    <w:lsdException w:name="HTML Cite" w:semiHidden="1" w:unhideWhenUsed="1"/>
+    <w:lsdException w:name="HTML Code" w:semiHidden="1" w:unhideWhenUsed="1"/>
+    <w:lsdException w:name="HTML Definition" w:semiHidden="1" w:unhideWhenUsed="1"/>
+    <w:lsdException w:name="HTML Keyboard" w:semiHidden="1" w:unhideWhenUsed="1"/>
+    <w:lsdException w:name="HTML Preformatted" w:semiHidden="1" w:unhideWhenUsed="1"/>
+    <w:lsdException w:name="HTML Sample" w:semiHidden="1" w:unhideWhenUsed="1"/>
+    <w:lsdException w:name="HTML Typewriter" w:semiHidden="1" w:unhideWhenUsed="1"/>
+    <w:lsdException w:name="HTML Variable" w:semiHidden="1" w:unhideWhenUsed="1"/>
+    <w:lsdException w:name="Normal Table" w:semiHidden="1" w:unhideWhenUsed="1"/>
+    <w:lsdException w:name="annotation subject" w:semiHidden="1" w:unhideWhenUsed="1"/>
+    <w:lsdException w:name="No List" w:semiHidden="1" w:unhideWhenUsed="1"/>
+    <w:lsdException w:name="Outline List 1" w:semiHidden="1" w:unhideWhenUsed="1"/>
+    <w:lsdException w:name="Outline List 2" w:semiHidden="1" w:unhideWhenUsed="1"/>
+    <w:lsdException w:name="Outline List 3" w:semiHidden="1" w:unhideWhenUsed="1"/>
+    <w:lsdException w:name="Table Simple 1" w:semiHidden="1" w:unhideWhenUsed="1"/>
+    <w:lsdException w:name="Table Simple 2" w:semiHidden="1" w:unhideWhenUsed="1"/>
+    <w:lsdException w:name="Table Simple 3" w:semiHidden="1" w:unhideWhenUsed="1"/>
+    <w:lsdException w:name="Table Classic 1" w:semiHidden="1" w:unhideWhenUsed="1"/>
+    <w:lsdException w:name="Table Classic 2" w:semiHidden="1" w:unhideWhenUsed="1"/>
+    <w:lsdException w:name="Table Classic 3" w:semiHidden="1" w:unhideWhenUsed="1"/>
+    <w:lsdException w:name="Table Classic 4" w:semiHidden="1" w:unhideWhenUsed="1"/>
+    <w:lsdException w:name="Table Colorful 1" w:semiHidden="1" w:unhideWhenUsed="1"/>
+    <w:lsdException w:name="Table Colorful 2" w:semiHidden="1" w:unhideWhenUsed="1"/>
+    <w:lsdException w:name="Table Colorful 3" w:semiHidden="1" w:unhideWhenUsed="1"/>
+    <w:lsdException w:name="Table Columns 1" w:semiHidden="1" w:unhideWhenUsed="1"/>
+    <w:lsdException w:name="Table Columns 2" w:semiHidden="1" w:unhideWhenUsed="1"/>
+    <w:lsdException w:name="Table Columns 3" w:semiHidden="1" w:unhideWhenUsed="1"/>
+    <w:lsdException w:name="Table Columns 4" w:semiHidden="1" w:unhideWhenUsed="1"/>
+    <w:lsdException w:name="Table Columns 5" w:semiHidden="1" w:unhideWhenUsed="1"/>
+    <w:lsdException w:name="Table Grid 1" w:semiHidden="1" w:unhideWhenUsed="1"/>
+    <w:lsdException w:name="Table Grid 2" w:semiHidden="1" w:unhideWhenUsed="1"/>
+    <w:lsdException w:name="Table Grid 3" w:semiHidden="1" w:unhideWhenUsed="1"/>
+    <w:lsdException w:name="Table Grid 4" w:semiHidden="1" w:unhideWhenUsed="1"/>
+    <w:lsdException w:name="Table Grid 5" w:semiHidden="1" w:unhideWhenUsed="1"/>
+    <w:lsdException w:name="Table Grid 6" w:semiHidden="1" w:unhideWhenUsed="1"/>
+    <w:lsdException w:name="Table Grid 7" w:semiHidden="1" w:unhideWhenUsed="1"/>
+    <w:lsdException w:name="Table Grid 8" w:semiHidden="1" w:unhideWhenUsed="1"/>
+    <w:lsdException w:name="Table List 1" w:semiHidden="1" w:unhideWhenUsed="1"/>
+    <w:lsdException w:name="Table List 2" w:semiHidden="1" w:unhideWhenUsed="1"/>
+    <w:lsdException w:name="Table List 3" w:semiHidden="1" w:unhideWhenUsed="1"/>
+    <w:lsdException w:name="Table List 4" w:semiHidden="1" w:unhideWhenUsed="1"/>
+    <w:lsdException w:name="Table List 5" w:semiHidden="1" w:unhideWhenUsed="1"/>
+    <w:lsdException w:name="Table List 6" w:semiHidden="1" w:unhideWhenUsed="1"/>
+    <w:lsdException w:name="Table List 7" w:semiHidden="1" w:unhideWhenUsed="1"/>
+    <w:lsdException w:name="Table List 8" w:semiHidden="1" w:unhideWhenUsed="1"/>
+    <w:lsdException w:name="Table 3D effects 1" w:semiHidden="1" w:unhideWhenUsed="1"/>
+    <w:lsdException w:name="Table 3D effects 2" w:semiHidden="1" w:unhideWhenUsed="1"/>
+    <w:lsdException w:name="Table 3D effects 3" w:semiHidden="1" w:unhideWhenUsed="1"/>
+    <w:lsdException w:name="Table Contemporary" w:semiHidden="1" w:unhideWhenUsed="1"/>
+    <w:lsdException w:name="Table Elegant" w:semiHidden="1" w:unhideWhenUsed="1"/>
+    <w:lsdException w:name="Table Professional" w:semiHidden="1" w:unhideWhenUsed="1"/>
+    <w:lsdException w:name="Table Subtle 1" w:semiHidden="1" w:unhideWhenUsed="1"/>
+    <w:lsdException w:name="Table Subtle 2" w:semiHidden="1" w:unhideWhenUsed="1"/>
+    <w:lsdException w:name="Table Web 1" w:semiHidden="1" w:unhideWhenUsed="1"/>
+    <w:lsdException w:name="Table Web 2" w:semiHidden="1" w:unhideWhenUsed="1"/>
+    <w:lsdException w:name="Table Web 3" w:semiHidden="1" w:unhideWhenUsed="1"/>
+    <w:lsdException w:name="Balloon Text" w:semiHidden="1" w:unhideWhenUsed="1"/>
+    <w:lsdException w:name="Table Grid" w:uiPriority="39"/>
+    <w:lsdException w:name="Table Theme" w:semiHidden="1" w:unhideWhenUsed="1"/>
+    <w:lsdException w:name="Placeholder Text" w:semiHidden="1"/>
+    <w:lsdException w:name="No Spacing" w:uiPriority="1" w:qFormat="1"/>
+    <w:lsdException w:name="Light Shading" w:uiPriority="60"/>
+    <w:lsdException w:name="Light List" w:uiPriority="61"/>
+    <w:lsdException w:name="Light Grid" w:uiPriority="62"/>
+    <w:lsdException w:name="Medium Shading 1" w:uiPriority="63"/>
+    <w:lsdException w:name="Medium Shading 2" w:uiPriority="64"/>
+    <w:lsdException w:name="Medium List 1" w:uiPriority="65"/>
+    <w:lsdException w:name="Medium List 2" w:uiPriority="66"/>
+    <w:lsdException w:name="Medium Grid 1" w:uiPriority="67"/>
+    <w:lsdException w:name="Medium Grid 2" w:uiPriority="68"/>
+    <w:lsdException w:name="Medium Grid 3" w:uiPriority="69"/>
+    <w:lsdException w:name="Dark List" w:uiPriority="70"/>
+    <w:lsdException w:name="Colorful Shading" w:uiPriority="71"/>
+    <w:lsdException w:name="Colorful List" w:uiPriority="72"/>
+    <w:lsdException w:name="Colorful Grid" w:uiPriority="73"/>
+    <w:lsdException w:name="Light Shading Accent 1" w:uiPriority="60"/>
+    <w:lsdException w:name="Light List Accent 1" w:uiPriority="61"/>
+    <w:lsdException w:name="Light Grid Accent 1" w:uiPriority="62"/>
+    <w:lsdException w:name="Medium Shading 1 Accent 1" w:uiPriority="63"/>
+    <w:lsdException w:name="Medium Shading 2 Accent 1" w:uiPriority="64"/>
+    <w:lsdException w:name="Medium List 1 Accent 1" w:uiPriority="65"/>
+    <w:lsdException w:name="Revision" w:semiHidden="1"/>
+    <w:lsdException w:name="List Paragraph" w:uiPriority="34" w:qFormat="1"/>
+    <w:lsdException w:name="Quote" w:uiPriority="29" w:qFormat="1"/>
+    <w:lsdException w:name="Intense Quote" w:uiPriority="30" w:qFormat="1"/>
+    <w:lsdException w:name="Medium List 2 Accent 1" w:uiPriority="66"/>
+    <w:lsdException w:name="Medium Grid 1 Accent 1" w:uiPriority="67"/>
+    <w:lsdException w:name="Medium Grid 2 Accent 1" w:uiPriority="68"/>
+    <w:lsdException w:name="Medium Grid 3 Accent 1" w:uiPriority="69"/>
+    <w:lsdException w:name="Dark List Accent 1" w:uiPriority="70"/>
+    <w:lsdException w:name="Colorful Shading Accent 1" w:uiPriority="71"/>
+    <w:lsdException w:name="Colorful List Accent 1" w:uiPriority="72"/>
+    <w:lsdException w:name="Colorful Grid Accent 1" w:uiPriority="73"/>
+    <w:lsdException w:name="Light Shading Accent 2" w:uiPriority="60"/>
+    <w:lsdException w:name="Light List Accent 2" w:uiPriority="61"/>
+    <w:lsdException w:name="Light Grid Accent 2" w:uiPriority="62"/>
+    <w:lsdException w:name="Medium Shading 1 Accent 2" w:uiPriority="63"/>
+    <w:lsdException w:name="Medium Shading 2 Accent 2" w:uiPriority="64"/>
+    <w:lsdException w:name="Medium List 1 Accent 2" w:uiPriority="65"/>
+    <w:lsdException w:name="Medium List 2 Accent 2" w:uiPriority="66"/>
+    <w:lsdException w:name="Medium Grid 1 Accent 2" w:uiPriority="67"/>
+    <w:lsdException w:name="Medium Grid 2 Accent 2" w:uiPriority="68"/>
+    <w:lsdException w:name="Medium Grid 3 Accent 2" w:uiPriority="69"/>
+    <w:lsdException w:name="Dark List Accent 2" w:uiPriority="70"/>
+    <w:lsdException w:name="Colorful Shading Accent 2" w:uiPriority="71"/>
+    <w:lsdException w:name="Colorful List Accent 2" w:uiPriority="72"/>
+    <w:lsdException w:name="Colorful Grid Accent 2" w:uiPriority="73"/>
+    <w:lsdException w:name="Light Shading Accent 3" w:uiPriority="60"/>
+    <w:lsdException w:name="Light List Accent 3" w:uiPriority="61"/>
+    <w:lsdException w:name="Light Grid Accent 3" w:uiPriority="62"/>
+    <w:lsdException w:name="Medium Shading 1 Accent 3" w:uiPriority="63"/>
+    <w:lsdException w:name="Medium Shading 2 Accent 3" w:uiPriority="64"/>
+    <w:lsdException w:name="Medium List 1 Accent 3" w:uiPriority="65"/>
+    <w:lsdException w:name="Medium List 2 Accent 3" w:uiPriority="66"/>
+    <w:lsdException w:name="Medium Grid 1 Accent 3" w:uiPriority="67"/>
+    <w:lsdException w:name="Medium Grid 2 Accent 3" w:uiPriority="68"/>
+    <w:lsdException w:name="Medium Grid 3 Accent 3" w:uiPriority="69"/>
+    <w:lsdException w:name="Dark List Accent 3" w:uiPriority="70"/>
+    <w:lsdException w:name="Colorful Shading Accent 3" w:uiPriority="71"/>
+    <w:lsdException w:name="Colorful List Accent 3" w:uiPriority="72"/>
+    <w:lsdException w:name="Colorful Grid Accent 3" w:uiPriority="73"/>
+    <w:lsdException w:name="Light Shading Accent 4" w:uiPriority="60"/>
+    <w:lsdException w:name="Light List Accent 4" w:uiPriority="61"/>
+    <w:lsdException w:name="Light Grid Accent 4" w:uiPriority="62"/>
+    <w:lsdException w:name="Medium Shading 1 Accent 4" w:uiPriority="63"/>
+    <w:lsdException w:name="Medium Shading 2 Accent 4" w:uiPriority="64"/>
+    <w:lsdException w:name="Medium List 1 Accent 4" w:uiPriority="65"/>
+    <w:lsdException w:name="Medium List 2 Accent 4" w:uiPriority="66"/>
+    <w:lsdException w:name="Medium Grid 1 Accent 4" w:uiPriority="67"/>
+    <w:lsdException w:name="Medium Grid 2 Accent 4" w:uiPriority="68"/>
+    <w:lsdException w:name="Medium Grid 3 Accent 4" w:uiPriority="69"/>
+    <w:lsdException w:name="Dark List Accent 4" w:uiPriority="70"/>
+    <w:lsdException w:name="Colorful Shading Accent 4" w:uiPriority="71"/>
+    <w:lsdException w:name="Colorful List Accent 4" w:uiPriority="72"/>
+    <w:lsdException w:name="Colorful Grid Accent 4" w:uiPriority="73"/>
+    <w:lsdException w:name="Light Shading Accent 5" w:uiPriority="60"/>
+    <w:lsdException w:name="Light List Accent 5" w:uiPriority="61"/>
+    <w:lsdException w:name="Light Grid Accent 5" w:uiPriority="62"/>
+    <w:lsdException w:name="Medium Shading 1 Accent 5" w:uiPriority="63"/>
+    <w:lsdException w:name="Medium Shading 2 Accent 5" w:uiPriority="64"/>
+    <w:lsdException w:name="Medium List 1 Accent 5" w:uiPriority="65"/>
+    <w:lsdException w:name="Medium List 2 Accent 5" w:uiPriority="66"/>
+    <w:lsdException w:name="Medium Grid 1 Accent 5" w:uiPriority="67"/>
+    <w:lsdException w:name="Medium Grid 2 Accent 5" w:uiPriority="68"/>
+    <w:lsdException w:name="Medium Grid 3 Accent 5" w:uiPriority="69"/>
+    <w:lsdException w:name="Dark List Accent 5" w:uiPriority="70"/>
+    <w:lsdException w:name="Colorful Shading Accent 5" w:uiPriority="71"/>
+    <w:lsdException w:name="Colorful List Accent 5" w:uiPriority="72"/>
+    <w:lsdException w:name="Colorful Grid Accent 5" w:uiPriority="73"/>
+    <w:lsdException w:name="Light Shading Accent 6" w:uiPriority="60"/>
+    <w:lsdException w:name="Light List Accent 6" w:uiPriority="61"/>
+    <w:lsdException w:name="Light Grid Accent 6" w:uiPriority="62"/>
+    <w:lsdException w:name="Medium Shading 1 Accent 6" w:uiPriority="63"/>
+    <w:lsdException w:name="Medium Shading 2 Accent 6" w:uiPriority="64"/>
+    <w:lsdException w:name="Medium List 1 Accent 6" w:uiPriority="65"/>
+    <w:lsdException w:name="Medium List 2 Accent 6" w:uiPriority="66"/>
+    <w:lsdException w:name="Medium Grid 1 Accent 6" w:uiPriority="67"/>
+    <w:lsdException w:name="Medium Grid 2 Accent 6" w:uiPriority="68"/>
+    <w:lsdException w:name="Medium Grid 3 Accent 6" w:uiPriority="69"/>
+    <w:lsdException w:name="Dark List Accent 6" w:uiPriority="70"/>
+    <w:lsdException w:name="Colorful Shading Accent 6" w:uiPriority="71"/>
+    <w:lsdException w:name="Colorful List Accent 6" w:uiPriority="72"/>
+    <w:lsdException w:name="Colorful Grid Accent 6" w:uiPriority="73"/>
+    <w:lsdException w:name="Subtle Emphasis" w:uiPriority="19" w:qFormat="1"/>
+    <w:lsdException w:name="Intense Emphasis" w:uiPriority="21" w:qFormat="1"/>
+    <w:lsdException w:name="Subtle Reference" w:uiPriority="31" w:qFormat="1"/>
+    <w:lsdException w:name="Intense Reference" w:uiPriority="32" w:qFormat="1"/>
+    <w:lsdException w:name="Book Title" w:uiPriority="33" w:qFormat="1"/>
+    <w:lsdException w:name="Bibliography" w:semiHidden="1" w:uiPriority="37" w:unhideWhenUsed="1"/>
+    <w:lsdException w:name="TOC Heading" w:semiHidden="1" w:uiPriority="39" w:unhideWhenUsed="1" w:qFormat="1"/>
+    <w:lsdException w:name="Grid Table 4" w:uiPriority="49"/>
+    <w:lsdException w:name="Grid Table 5 Dark" w:uiPriority="50"/>
+    <w:lsdException w:name="Grid Table 6 Colorful" w:uiPriority="51"/>
+    <w:lsdException w:name="Grid Table 7 Colorful" w:uiPriority="52"/>
+    <w:lsdException w:name="Grid Table 1 Light Accent 1" w:uiPriority="46"/>
+    <w:lsdException w:name="Grid Table 2 Accent 1" w:uiPriority="47"/>
+    <w:lsdException w:name="Grid Table 3 Accent 1" w:uiPriority="48"/>
+    <w:lsdException w:name="Grid Table 4 Accent 1" w:uiPriority="49"/>
+    <w:lsdException w:name="Grid Table 5 Dark Accent 1" w:uiPriority="50"/>
+    <w:lsdException w:name="Grid Table 6 Colorful Accent 1" w:uiPriority="51"/>
+    <w:lsdException w:name="Grid Table 7 Colorful Accent 1" w:uiPriority="52"/>
+    <w:lsdException w:name="Grid Table 1 Light Accent 2" w:uiPriority="46"/>
+    <w:lsdException w:name="Grid Table 2 Accent 2" w:uiPriority="47"/>
+    <w:lsdException w:name="Grid Table 3 Accent 2" w:uiPriority="48"/>
+    <w:lsdException w:name="Grid Table 4 Accent 2" w:uiPriority="49"/>
+    <w:lsdException w:name="Grid Table 5 Dark Accent 2" w:uiPriority="50"/>
+    <w:lsdException w:name="Grid Table 6 Colorful Accent 2" w:uiPriority="51"/>
+    <w:lsdException w:name="Grid Table 7 Colorful Accent 2" w:uiPriority="52"/>
+    <w:lsdException w:name="Grid Table 1 Light Accent 3" w:uiPriority="46"/>
+    <w:lsdException w:name="Grid Table 2 Accent 3" w:uiPriority="47"/>
+    <w:lsdException w:name="Grid Table 3 Accent 3" w:uiPriority="48"/>
+    <w:lsdException w:name="Grid Table 4 Accent 3" w:uiPriority="49"/>
+    <w:lsdException w:name="Grid Table 5 Dark Accent 3" w:uiPriority="50"/>
+    <w:lsdException w:name="Grid Table 6 Colorful Accent 3" w:uiPriority="51"/>
+    <w:lsdException w:name="Grid Table 7 Colorful Accent 3" w:uiPriority="52"/>
+    <w:lsdException w:name="Grid Table 1 Light Accent 4" w:uiPriority="46"/>
+    <w:lsdException w:name="Grid Table 2 Accent 4" w:uiPriority="47"/>
+    <w:lsdException w:name="Grid Table 3 Accent 4" w:uiPriority="48"/>
+    <w:lsdException w:name="Grid Table 4 Accent 4" w:uiPriority="49"/>
+    <w:lsdException w:name="Grid Table 5 Dark Accent 4" w:uiPriority="50"/>
+    <w:lsdException w:name="Grid Table 6 Colorful Accent 4" w:uiPriority="51"/>
+    <w:lsdException w:name="Grid Table 7 Colorful Accent 4" w:uiPriority="52"/>
+    <w:lsdException w:name="Grid Table 1 Light Accent 5" w:uiPriority="46"/>
+    <w:lsdException w:name="Grid Table 2 Accent 5" w:uiPriority="47"/>
+    <w:lsdException w:name="Grid Table 3 Accent 5" w:uiPriority="48"/>
+    <w:lsdException w:name="Grid Table 4 Accent 5" w:uiPriority="49"/>
+    <w:lsdException w:name="Grid Table 5 Dark Accent 5" w:uiPriority="50"/>
+    <w:lsdException w:name="Grid Table 6 Colorful Accent 5" w:uiPriority="51"/>
+    <w:lsdException w:name="Grid Table 7 Colorful Accent 5" w:uiPriority="52"/>
+    <w:lsdException w:name="Grid Table 1 Light Accent 6" w:uiPriority="46"/>
+    <w:lsdException w:name="Grid Table 2 Accent 6" w:uiPriority="47"/>
+    <w:lsdException w:name="Grid Table 3 Accent 6" w:uiPriority="48"/>
+    <w:lsdException w:name="Grid Table 4 Accent 6" w:uiPriority="49"/>
+    <w:lsdException w:name="Grid Table 5 Dark Accent 6" w:uiPriority="50"/>
+    <w:lsdException w:name="Grid Table 6 Colorful Accent 6" w:uiPriority="51"/>
+    <w:lsdException w:name="Grid Table 7 Colorful Accent 6" w:uiPriority="52"/>
+    <w:lsdException w:name="List Table 1 Light" w:uiPriority="46"/>
+    <w:lsdException w:name="List Table 2" w:uiPriority="47"/>
+    <w:lsdException w:name="List Table 3" w:uiPriority="48"/>
+    <w:lsdException w:name="List Table 4" w:uiPriority="49"/>
+    <w:lsdException w:name="List Table 5 Dark" w:uiPriority="50"/>
+    <w:lsdException w:name="List Table 6 Colorful" w:uiPriority="51"/>
+    <w:lsdException w:name="List Table 7 Colorful" w:uiPriority="52"/>
+    <w:lsdException w:name="List Table 1 Light Accent 1" w:uiPriority="46"/>
+    <w:lsdException w:name="List Table 2 Accent 1" w:uiPriority="47"/>
+    <w:lsdException w:name="List Table 3 Accent 1" w:uiPriority="48"/>
+    <w:lsdException w:name="List Table 4 Accent 1" w:uiPriority="49"/>
+    <w:lsdException w:name="List Table 5 Dark Accent 1" w:uiPriority="50"/>
+    <w:lsdException w:name="List Table 6 Colorful Accent 1" w:uiPriority="51"/>
+    <w:lsdException w:name="List Table 7 Colorful Accent 1" w:uiPriority="52"/>
+    <w:lsdException w:name="List Table 1 Light Accent 2" w:uiPriority="46"/>
+    <w:lsdException w:name="List Table 2 Accent 2" w:uiPriority="47"/>
+    <w:lsdException w:name="List Table 3 Accent 2" w:uiPriority="48"/>
+    <w:lsdException w:name="List Table 4 Accent 2" w:uiPriority="49"/>
+    <w:lsdException w:name="List Table 5 Dark Accent 2" w:uiPriority="50"/>
+    <w:lsdException w:name="List Table 6 Colorful Accent 2" w:uiPriority="51"/>
+    <w:lsdException w:name="List Table 7 Colorful Accent 2" w:uiPriority="52"/>
+    <w:lsdException w:name="List Table 1 Light Accent 3" w:uiPriority="46"/>
+    <w:lsdException w:name="List Table 2 Accent 3" w:uiPriority="47"/>
+    <w:lsdException w:name="List Table 3 Accent 3" w:uiPriority="48"/>
+    <w:lsdException w:name="List Table 4 Accent 3" w:uiPriority="49"/>
+    <w:lsdException w:name="List Table 5 Dark Accent 3" w:uiPriority="50"/>
+    <w:lsdException w:name="List Table 6 Colorful Accent 3" w:uiPriority="51"/>
+    <w:lsdException w:name="List Table 7 Colorful Accent 3" w:uiPriority="52"/>
+    <w:lsdException w:name="List Table 1 Light Accent 4" w:uiPriority="46"/>
+    <w:lsdException w:name="List Table 2 Accent 4" w:uiPriority="47"/>
+    <w:lsdException w:name="List Table 3 Accent 4" w:uiPriority="48"/>
+    <w:lsdException w:name="List Table 4 Accent 4" w:uiPriority="49"/>
+    <w:lsdException w:name="List Table 5 Dark Accent 4" w:uiPriority="50"/>
+    <w:lsdException w:name="List Table 6 Colorful Accent 4" w:uiPriority="51"/>
+    <w:lsdException w:name="List Table 7 Colorful Accent 4" w:uiPriority="52"/>
+    <w:lsdException w:name="List Table 1 Light Accent 5" w:uiPriority="46"/>
+    <w:lsdException w:name="List Table 2 Accent 5" w:uiPriority="47"/>
+    <w:lsdException w:name="List Table 3 Accent 5" w:uiPriority="48"/>
+    <w:lsdException w:name="List Table 4 Accent 5" w:uiPriority="49"/>
+    <w:lsdException w:name="List Table 5 Dark Accent 5" w:uiPriority="50"/>
+    <w:lsdException w:name="List Table 6 Colorful Accent 5" w:uiPriority="51"/>
+    <w:lsdException w:name="List Table 7 Colorful Accent 5" w:uiPriority="52"/>
+    <w:lsdException w:name="List Table 1 Light Accent 6" w:uiPriority="46"/>
+    <w:lsdException w:name="List Table 2 Accent 6" w:uiPriority="47"/>
+    <w:lsdException w:name="List Table 3 Accent 6" w:uiPriority="48"/>
+    <w:lsdException w:name="List Table 4 Accent 6" w:uiPriority="49"/>
+    <w:lsdException w:name="List Table 5 Dark Accent 6" w:uiPriority="50"/>
+    <w:lsdException w:name="List Table 6 Colorful Accent 6" w:uiPriority="51"/>
+    <w:lsdException w:name="List Table 7 Colorful Accent 6" w:uiPriority="52"/>
   </w:latentStyles>
   <w:style w:type="paragraph" w:default="1" w:styleId="Normal">
     <w:name w:val="Normal"/>
@@ -5538,7 +6673,7 @@
   <a:extraClrSchemeLst/>
   <a:extLst>
     <a:ext uri="{05A4C25C-085E-4340-85A3-A5531E510DB2}">
-      <thm15:themeFamily xmlns="" xmlns:thm15="http://schemas.microsoft.com/office/thememl/2012/main" name="Office Theme" id="{62F939B6-93AF-4DB8-9C6B-D6C7DFDC589F}" vid="{4A3C46E8-61CC-4603-A589-7422A47A8E4A}"/>
+      <thm15:themeFamily xmlns:thm15="http://schemas.microsoft.com/office/thememl/2012/main" name="Office Theme" id="{62F939B6-93AF-4DB8-9C6B-D6C7DFDC589F}" vid="{4A3C46E8-61CC-4603-A589-7422A47A8E4A}"/>
     </a:ext>
   </a:extLst>
 </a:theme>

</xml_diff>